<commit_message>
docs(manuals): the Calculator and Simulator entry panel
page_help, User Guide, Reference Guide and API Reference: no action
buttons, the chain grid (Bid sells, Ask buys, priced at the mark), the
leg table, the expiry strip, pricing assumptions, and
cache:options:sim_chain.

Co-Authored-By: Claude Opus 5 <noreply@anthropic.com>
</commit_message>
<xml_diff>
--- a/docs/manuals/api-reference/api-reference.docx
+++ b/docs/manuals/api-reference/api-reference.docx
@@ -895,6 +895,18 @@
                 <w:sz w:val="19"/>
               </w:rPr>
               <w:t>cache:options:sim_meta</w:t>
+            </w:r>
+            <w:r>
+              <w:rPr/>
+              <w:t xml:space="preserve">, </w:t>
+            </w:r>
+            <w:r>
+              <w:rPr>
+                <w:rFonts w:ascii="Consolas" w:hAnsi="Consolas"/>
+                <w:color w:val="334455"/>
+                <w:sz w:val="19"/>
+              </w:rPr>
+              <w:t>:sim_chain</w:t>
             </w:r>
             <w:r>
               <w:rPr/>
@@ -6721,6 +6733,18 @@
                 <w:color w:val="334455"/>
                 <w:sz w:val="19"/>
               </w:rPr>
+              <w:t>cache:options:sim_chain</w:t>
+            </w:r>
+            <w:r>
+              <w:rPr/>
+              <w:t xml:space="preserve"> (the thinned chain from the same fetch — written first), then </w:t>
+            </w:r>
+            <w:r>
+              <w:rPr>
+                <w:rFonts w:ascii="Consolas" w:hAnsi="Consolas"/>
+                <w:color w:val="334455"/>
+                <w:sz w:val="19"/>
+              </w:rPr>
               <w:t>cache:options:sim_meta</w:t>
             </w:r>
           </w:p>
@@ -12623,6 +12647,17 @@
           <w:sz w:val="18"/>
         </w:rPr>
         <w:t>cache:options:sim_result       events:options:sim_result</w:t>
+      </w:r>
+      <w:r>
+        <w:br/>
+      </w:r>
+      <w:r>
+        <w:rPr>
+          <w:rFonts w:ascii="Consolas" w:hAnsi="Consolas"/>
+          <w:color w:val="223344"/>
+          <w:sz w:val="18"/>
+        </w:rPr>
+        <w:t>cache:options:sim_chain        events:options:sim_chain</w:t>
       </w:r>
       <w:r>
         <w:br/>

</xml_diff>

<commit_message>
docs: every expiration listed, strikes on demand
Co-Authored-By: Claude Opus 5 <noreply@anthropic.com>
</commit_message>
<xml_diff>
--- a/docs/manuals/api-reference/api-reference.docx
+++ b/docs/manuals/api-reference/api-reference.docx
@@ -6717,7 +6717,31 @@
                 <w:color w:val="334455"/>
                 <w:sz w:val="19"/>
               </w:rPr>
-              <w:t>{symbol}</w:t>
+              <w:t>{symbol, lazy?, expiries?}</w:t>
+            </w:r>
+            <w:r>
+              <w:rPr/>
+              <w:t xml:space="preserve"> — </w:t>
+            </w:r>
+            <w:r>
+              <w:rPr>
+                <w:rFonts w:ascii="Consolas" w:hAnsi="Consolas"/>
+                <w:color w:val="334455"/>
+                <w:sz w:val="19"/>
+              </w:rPr>
+              <w:t>lazy</w:t>
+            </w:r>
+            <w:r>
+              <w:rPr/>
+              <w:t xml:space="preserve"> lists every expiration and fetches contracts for the nearest two plus </w:t>
+            </w:r>
+            <w:r>
+              <w:rPr>
+                <w:rFonts w:ascii="Consolas" w:hAnsi="Consolas"/>
+                <w:color w:val="334455"/>
+                <w:sz w:val="19"/>
+              </w:rPr>
+              <w:t>expiries</w:t>
             </w:r>
           </w:p>
         </w:tc>
@@ -6747,6 +6771,22 @@
               </w:rPr>
               <w:t>cache:options:sim_meta</w:t>
             </w:r>
+            <w:r>
+              <w:rPr/>
+              <w:t xml:space="preserve"> (a lazy fetch adds </w:t>
+            </w:r>
+            <w:r>
+              <w:rPr>
+                <w:rFonts w:ascii="Consolas" w:hAnsi="Consolas"/>
+                <w:color w:val="334455"/>
+                <w:sz w:val="19"/>
+              </w:rPr>
+              <w:t>expirations</w:t>
+            </w:r>
+            <w:r>
+              <w:rPr/>
+              <w:t>: every listed expiry)</w:t>
+            </w:r>
           </w:p>
         </w:tc>
       </w:tr>
@@ -6764,7 +6804,7 @@
                 <w:color w:val="334455"/>
                 <w:sz w:val="19"/>
               </w:rPr>
-              <w:t>sim_run</w:t>
+              <w:t>sim_fetch_expiry</w:t>
             </w:r>
           </w:p>
         </w:tc>
@@ -6781,6 +6821,89 @@
                 <w:color w:val="334455"/>
                 <w:sz w:val="19"/>
               </w:rPr>
+              <w:t>{symbol, expiry}</w:t>
+            </w:r>
+          </w:p>
+        </w:tc>
+        <w:tc>
+          <w:tcPr>
+            <w:tcW w:type="dxa" w:w="2880"/>
+            <w:shd w:val="clear" w:color="auto" w:fill="F4F6FA"/>
+          </w:tcPr>
+          <w:p>
+            <w:r/>
+            <w:r>
+              <w:rPr/>
+              <w:t xml:space="preserve">adds one expiry to the stashed snapshot; merges its chain into </w:t>
+            </w:r>
+            <w:r>
+              <w:rPr>
+                <w:rFonts w:ascii="Consolas" w:hAnsi="Consolas"/>
+                <w:color w:val="334455"/>
+                <w:sz w:val="19"/>
+              </w:rPr>
+              <w:t>cache:options:sim_chain</w:t>
+            </w:r>
+            <w:r>
+              <w:rPr/>
+              <w:t xml:space="preserve">, then </w:t>
+            </w:r>
+            <w:r>
+              <w:rPr>
+                <w:rFonts w:ascii="Consolas" w:hAnsi="Consolas"/>
+                <w:color w:val="334455"/>
+                <w:sz w:val="19"/>
+              </w:rPr>
+              <w:t>cache:options:sim_meta</w:t>
+            </w:r>
+            <w:r>
+              <w:rPr/>
+              <w:t xml:space="preserve"> with </w:t>
+            </w:r>
+            <w:r>
+              <w:rPr>
+                <w:rFonts w:ascii="Consolas" w:hAnsi="Consolas"/>
+                <w:color w:val="334455"/>
+                <w:sz w:val="19"/>
+              </w:rPr>
+              <w:t>added</w:t>
+            </w:r>
+            <w:r>
+              <w:rPr/>
+              <w:t>. A symbol with no snapshot or an unlisted expiry writes nothing</w:t>
+            </w:r>
+          </w:p>
+        </w:tc>
+      </w:tr>
+      <w:tr>
+        <w:tc>
+          <w:tcPr>
+            <w:tcW w:type="dxa" w:w="2880"/>
+          </w:tcPr>
+          <w:p>
+            <w:r/>
+            <w:r>
+              <w:rPr>
+                <w:rFonts w:ascii="Consolas" w:hAnsi="Consolas"/>
+                <w:color w:val="334455"/>
+                <w:sz w:val="19"/>
+              </w:rPr>
+              <w:t>sim_run</w:t>
+            </w:r>
+          </w:p>
+        </w:tc>
+        <w:tc>
+          <w:tcPr>
+            <w:tcW w:type="dxa" w:w="2880"/>
+          </w:tcPr>
+          <w:p>
+            <w:r/>
+            <w:r>
+              <w:rPr>
+                <w:rFonts w:ascii="Consolas" w:hAnsi="Consolas"/>
+                <w:color w:val="334455"/>
+                <w:sz w:val="19"/>
+              </w:rPr>
               <w:t>{symbol, legs[], dt, mult}</w:t>
             </w:r>
             <w:r>
@@ -6816,7 +6939,6 @@
         <w:tc>
           <w:tcPr>
             <w:tcW w:type="dxa" w:w="2880"/>
-            <w:shd w:val="clear" w:color="auto" w:fill="F4F6FA"/>
           </w:tcPr>
           <w:p>
             <w:r/>
@@ -6851,6 +6973,7 @@
         <w:tc>
           <w:tcPr>
             <w:tcW w:type="dxa" w:w="2880"/>
+            <w:shd w:val="clear" w:color="auto" w:fill="F4F6FA"/>
           </w:tcPr>
           <w:p>
             <w:r/>
@@ -6867,6 +6990,7 @@
         <w:tc>
           <w:tcPr>
             <w:tcW w:type="dxa" w:w="2880"/>
+            <w:shd w:val="clear" w:color="auto" w:fill="F4F6FA"/>
           </w:tcPr>
           <w:p>
             <w:r/>
@@ -6887,6 +7011,7 @@
         <w:tc>
           <w:tcPr>
             <w:tcW w:type="dxa" w:w="2880"/>
+            <w:shd w:val="clear" w:color="auto" w:fill="F4F6FA"/>
           </w:tcPr>
           <w:p>
             <w:r/>
@@ -6945,7 +7070,6 @@
         <w:tc>
           <w:tcPr>
             <w:tcW w:type="dxa" w:w="2880"/>
-            <w:shd w:val="clear" w:color="auto" w:fill="F4F6FA"/>
           </w:tcPr>
           <w:p>
             <w:r/>
@@ -6959,6 +7083,96 @@
             </w:r>
           </w:p>
         </w:tc>
+        <w:tc>
+          <w:tcPr>
+            <w:tcW w:type="dxa" w:w="2880"/>
+          </w:tcPr>
+          <w:p>
+            <w:r/>
+            <w:r>
+              <w:rPr>
+                <w:rFonts w:ascii="Consolas" w:hAnsi="Consolas"/>
+                <w:color w:val="334455"/>
+                <w:sz w:val="19"/>
+              </w:rPr>
+              <w:t>{symbol, lazy?, expiries?}</w:t>
+            </w:r>
+            <w:r>
+              <w:rPr/>
+              <w:t xml:space="preserve"> — </w:t>
+            </w:r>
+            <w:r>
+              <w:rPr>
+                <w:rFonts w:ascii="Consolas" w:hAnsi="Consolas"/>
+                <w:color w:val="334455"/>
+                <w:sz w:val="19"/>
+              </w:rPr>
+              <w:t>lazy</w:t>
+            </w:r>
+            <w:r>
+              <w:rPr/>
+              <w:t xml:space="preserve"> (the Calculator) lists every expiration via Schwab </w:t>
+            </w:r>
+            <w:r>
+              <w:rPr>
+                <w:rFonts w:ascii="Consolas" w:hAnsi="Consolas"/>
+                <w:color w:val="334455"/>
+                <w:sz w:val="19"/>
+              </w:rPr>
+              <w:t>/expirationchain</w:t>
+            </w:r>
+            <w:r>
+              <w:rPr/>
+              <w:t xml:space="preserve"> and fetches strikes for the nearest two plus </w:t>
+            </w:r>
+            <w:r>
+              <w:rPr>
+                <w:rFonts w:ascii="Consolas" w:hAnsi="Consolas"/>
+                <w:color w:val="334455"/>
+                <w:sz w:val="19"/>
+              </w:rPr>
+              <w:t>expiries</w:t>
+            </w:r>
+            <w:r>
+              <w:rPr/>
+              <w:t>; without it (Rescue) the fixed today..+60-day fetch</w:t>
+            </w:r>
+          </w:p>
+        </w:tc>
+        <w:tc>
+          <w:tcPr>
+            <w:tcW w:type="dxa" w:w="2880"/>
+          </w:tcPr>
+          <w:p>
+            <w:r/>
+            <w:r>
+              <w:rPr>
+                <w:rFonts w:ascii="Consolas" w:hAnsi="Consolas"/>
+                <w:color w:val="334455"/>
+                <w:sz w:val="19"/>
+              </w:rPr>
+              <w:t>cache:options:calc_chain</w:t>
+            </w:r>
+            <w:r>
+              <w:rPr/>
+              <w:t xml:space="preserve"> (a lazy load adds </w:t>
+            </w:r>
+            <w:r>
+              <w:rPr>
+                <w:rFonts w:ascii="Consolas" w:hAnsi="Consolas"/>
+                <w:color w:val="334455"/>
+                <w:sz w:val="19"/>
+              </w:rPr>
+              <w:t>expirations</w:t>
+            </w:r>
+            <w:r>
+              <w:rPr/>
+              <w:t>)</w:t>
+            </w:r>
+          </w:p>
+        </w:tc>
+      </w:tr>
+      <w:tr>
         <w:tc>
           <w:tcPr>
             <w:tcW w:type="dxa" w:w="2880"/>
@@ -6972,7 +7186,7 @@
                 <w:color w:val="334455"/>
                 <w:sz w:val="19"/>
               </w:rPr>
-              <w:t>{symbol}</w:t>
+              <w:t>calc_load_expiry</w:t>
             </w:r>
           </w:p>
         </w:tc>
@@ -6989,7 +7203,56 @@
                 <w:color w:val="334455"/>
                 <w:sz w:val="19"/>
               </w:rPr>
+              <w:t>{symbol, expiry}</w:t>
+            </w:r>
+          </w:p>
+        </w:tc>
+        <w:tc>
+          <w:tcPr>
+            <w:tcW w:type="dxa" w:w="2880"/>
+            <w:shd w:val="clear" w:color="auto" w:fill="F4F6FA"/>
+          </w:tcPr>
+          <w:p>
+            <w:r/>
+            <w:r>
+              <w:rPr/>
+              <w:t xml:space="preserve">merges one expiry's strikes into </w:t>
+            </w:r>
+            <w:r>
+              <w:rPr>
+                <w:rFonts w:ascii="Consolas" w:hAnsi="Consolas"/>
+                <w:color w:val="334455"/>
+                <w:sz w:val="19"/>
+              </w:rPr>
               <w:t>cache:options:calc_chain</w:t>
+            </w:r>
+            <w:r>
+              <w:rPr/>
+              <w:t xml:space="preserve">, marked </w:t>
+            </w:r>
+            <w:r>
+              <w:rPr>
+                <w:rFonts w:ascii="Consolas" w:hAnsi="Consolas"/>
+                <w:color w:val="334455"/>
+                <w:sz w:val="19"/>
+              </w:rPr>
+              <w:t>added</w:t>
+            </w:r>
+            <w:r>
+              <w:rPr/>
+              <w:t xml:space="preserve"> (and </w:t>
+            </w:r>
+            <w:r>
+              <w:rPr>
+                <w:rFonts w:ascii="Consolas" w:hAnsi="Consolas"/>
+                <w:color w:val="334455"/>
+                <w:sz w:val="19"/>
+              </w:rPr>
+              <w:t>failed</w:t>
+            </w:r>
+            <w:r>
+              <w:rPr/>
+              <w:t xml:space="preserve"> if Schwab returned nothing). A click for another symbol or an unlisted expiry writes nothing</w:t>
             </w:r>
           </w:p>
         </w:tc>

</xml_diff>

<commit_message>
docs(finder): whole chain, every expiry, earnings tag, spinner and empty answers
page_help, the User Guide, Reference Guide, Technical Reference and API
Reference describe the six presets and blank DTE max, every-expiry builds,
the best 25 per strategy type and the paged list, the earnings tag, the
spinner's count and 3-minute ceiling, and the price on every answer.
webgui-routes gains the whole-chain detail; CHANGELOG gets the new top entry
with the measurements; CLAUDE.md's route row, earnings section and chain
note are corrected in place.

Co-Authored-By: Claude Opus 5 <noreply@anthropic.com>
</commit_message>
<xml_diff>
--- a/docs/manuals/api-reference/api-reference.docx
+++ b/docs/manuals/api-reference/api-reference.docx
@@ -32,7 +32,7 @@
           <w:color w:val="5B6678"/>
           <w:sz w:val="18"/>
         </w:rPr>
-        <w:t>NeuralStrike · Generated 2026-09-12</w:t>
+        <w:t>NeuralStrike · Generated 2026-09-14</w:t>
       </w:r>
     </w:p>
     <w:p/>
@@ -5852,6 +5852,44 @@
               </w:rPr>
               <w:t>{symbol, dte_min, dte_max, put_d_min, put_d_max, call_d_min, call_d_max, min_cr_fraction}</w:t>
             </w:r>
+            <w:r>
+              <w:rPr/>
+              <w:t xml:space="preserve"> — </w:t>
+            </w:r>
+            <w:r>
+              <w:rPr>
+                <w:rFonts w:ascii="Consolas" w:hAnsi="Consolas"/>
+                <w:color w:val="334455"/>
+                <w:sz w:val="19"/>
+              </w:rPr>
+              <w:t>dte_max: null</w:t>
+            </w:r>
+            <w:r>
+              <w:rPr/>
+              <w:t xml:space="preserve"> is </w:t>
+            </w:r>
+            <w:r>
+              <w:rPr>
+                <w:b/>
+              </w:rPr>
+              <w:t>no upper limit</w:t>
+            </w:r>
+            <w:r>
+              <w:rPr/>
+              <w:t xml:space="preserve"> (every listed expiry); a MISSING key takes the handler default (5–30). Every listed expiry in the range is built, a report is flagged rather than dropped, and the best 25 rows of each </w:t>
+            </w:r>
+            <w:r>
+              <w:rPr>
+                <w:rFonts w:ascii="Consolas" w:hAnsi="Consolas"/>
+                <w:color w:val="334455"/>
+                <w:sz w:val="19"/>
+              </w:rPr>
+              <w:t>type</w:t>
+            </w:r>
+            <w:r>
+              <w:rPr/>
+              <w:t xml:space="preserve"> are kept</w:t>
+            </w:r>
           </w:p>
         </w:tc>
         <w:tc>
@@ -5868,6 +5906,136 @@
                 <w:sz w:val="19"/>
               </w:rPr>
               <w:t>cache:options:swing</w:t>
+            </w:r>
+            <w:r>
+              <w:rPr/>
+              <w:t xml:space="preserve"> — </w:t>
+            </w:r>
+            <w:r>
+              <w:rPr>
+                <w:rFonts w:ascii="Consolas" w:hAnsi="Consolas"/>
+                <w:color w:val="334455"/>
+                <w:sz w:val="19"/>
+              </w:rPr>
+              <w:t>{signals[], view, filtered_out, vol_filtered, not_shown, spot, chain_missing, no_expiries_in_range, expiries_failed, symbol, params, error?}</w:t>
+            </w:r>
+            <w:r>
+              <w:rPr/>
+              <w:t xml:space="preserve">. Published for </w:t>
+            </w:r>
+            <w:r>
+              <w:rPr>
+                <w:b/>
+              </w:rPr>
+              <w:t>every</w:t>
+            </w:r>
+            <w:r>
+              <w:rPr/>
+              <w:t xml:space="preserve"> request: a scan that raises still answers, with </w:t>
+            </w:r>
+            <w:r>
+              <w:rPr>
+                <w:rFonts w:ascii="Consolas" w:hAnsi="Consolas"/>
+                <w:color w:val="334455"/>
+                <w:sz w:val="19"/>
+              </w:rPr>
+              <w:t>signals: []</w:t>
+            </w:r>
+            <w:r>
+              <w:rPr/>
+              <w:t xml:space="preserve"> and </w:t>
+            </w:r>
+            <w:r>
+              <w:rPr>
+                <w:rFonts w:ascii="Consolas" w:hAnsi="Consolas"/>
+                <w:color w:val="334455"/>
+                <w:sz w:val="19"/>
+              </w:rPr>
+              <w:t>error</w:t>
+            </w:r>
+            <w:r>
+              <w:rPr/>
+              <w:t xml:space="preserve"> = the exception's class name (test it for truthiness). </w:t>
+            </w:r>
+            <w:r>
+              <w:rPr>
+                <w:rFonts w:ascii="Consolas" w:hAnsi="Consolas"/>
+                <w:color w:val="334455"/>
+                <w:sz w:val="19"/>
+              </w:rPr>
+              <w:t>spot</w:t>
+            </w:r>
+            <w:r>
+              <w:rPr/>
+              <w:t xml:space="preserve"> is </w:t>
+            </w:r>
+            <w:r>
+              <w:rPr>
+                <w:rFonts w:ascii="Consolas" w:hAnsi="Consolas"/>
+                <w:color w:val="334455"/>
+                <w:sz w:val="19"/>
+              </w:rPr>
+              <w:t>null</w:t>
+            </w:r>
+            <w:r>
+              <w:rPr/>
+              <w:t xml:space="preserve"> when no price was read, never 0; </w:t>
+            </w:r>
+            <w:r>
+              <w:rPr>
+                <w:rFonts w:ascii="Consolas" w:hAnsi="Consolas"/>
+                <w:color w:val="334455"/>
+                <w:sz w:val="19"/>
+              </w:rPr>
+              <w:t>expiries_failed</w:t>
+            </w:r>
+            <w:r>
+              <w:rPr/>
+              <w:t xml:space="preserve"> is </w:t>
+            </w:r>
+            <w:r>
+              <w:rPr>
+                <w:rFonts w:ascii="Consolas" w:hAnsi="Consolas"/>
+                <w:color w:val="334455"/>
+                <w:sz w:val="19"/>
+              </w:rPr>
+              <w:t>null</w:t>
+            </w:r>
+            <w:r>
+              <w:rPr/>
+              <w:t xml:space="preserve"> when the expiration list was unavailable (not counted, which is not zero). Each row carries </w:t>
+            </w:r>
+            <w:r>
+              <w:rPr>
+                <w:rFonts w:ascii="Consolas" w:hAnsi="Consolas"/>
+                <w:color w:val="334455"/>
+                <w:sz w:val="19"/>
+              </w:rPr>
+              <w:t>earnings_status</w:t>
+            </w:r>
+            <w:r>
+              <w:rPr/>
+              <w:t xml:space="preserve">, and a row open through a report adds </w:t>
+            </w:r>
+            <w:r>
+              <w:rPr>
+                <w:rFonts w:ascii="Consolas" w:hAnsi="Consolas"/>
+                <w:color w:val="334455"/>
+                <w:sz w:val="19"/>
+              </w:rPr>
+              <w:t>spans_earnings: true</w:t>
+            </w:r>
+            <w:r>
+              <w:rPr/>
+              <w:t xml:space="preserve"> + </w:t>
+            </w:r>
+            <w:r>
+              <w:rPr>
+                <w:rFonts w:ascii="Consolas" w:hAnsi="Consolas"/>
+                <w:color w:val="334455"/>
+                <w:sz w:val="19"/>
+              </w:rPr>
+              <w:t>earnings_date</w:t>
             </w:r>
           </w:p>
         </w:tc>

</xml_diff>

<commit_message>
docs(finder): correct the Paper, chain-size and count wording
- The paper ledger has no earnings check, so a tagged trade - credit or
  debit - opens like any other; the Calculator has no Paper route.
- A LARGE whole chain does not fit one proxy request (SPY's timed out at
  30 s); NVDA's did.
- expiries_failed counts the failed runs' expiries, not runs.
- A missing dte_min / dte_max defaults to 5 / 30 separately; the page always
  sends both. The stale _SWING_DEFAULTS comment is corrected (comment only).
- "0 ideas" always shows; only the cut and failure counts drop at zero.
- The empty-list sentence names the price only when one was read, and a
  failed scan names the symbol only; the no-expirations message looks from
  today to DTE max + 2 and ignores DTE min.
- A failed scan answers when it fails, which can follow the chain fetch.

Co-Authored-By: Claude Opus 5 <noreply@anthropic.com>
</commit_message>
<xml_diff>
--- a/docs/manuals/api-reference/api-reference.docx
+++ b/docs/manuals/api-reference/api-reference.docx
@@ -5876,7 +5876,43 @@
             </w:r>
             <w:r>
               <w:rPr/>
-              <w:t xml:space="preserve"> (every listed expiry); a MISSING key takes the handler default (5–30). Every listed expiry in the range is built, a report is flagged rather than dropped, and the best 25 rows of each </w:t>
+              <w:t xml:space="preserve"> (every listed expiry). A MISSING key takes the handler default, each on its own: </w:t>
+            </w:r>
+            <w:r>
+              <w:rPr>
+                <w:rFonts w:ascii="Consolas" w:hAnsi="Consolas"/>
+                <w:color w:val="334455"/>
+                <w:sz w:val="19"/>
+              </w:rPr>
+              <w:t>dte_min</w:t>
+            </w:r>
+            <w:r>
+              <w:rPr/>
+              <w:t xml:space="preserve"> 5, </w:t>
+            </w:r>
+            <w:r>
+              <w:rPr>
+                <w:rFonts w:ascii="Consolas" w:hAnsi="Consolas"/>
+                <w:color w:val="334455"/>
+                <w:sz w:val="19"/>
+              </w:rPr>
+              <w:t>dte_max</w:t>
+            </w:r>
+            <w:r>
+              <w:rPr/>
+              <w:t xml:space="preserve"> 30 (so an omitted </w:t>
+            </w:r>
+            <w:r>
+              <w:rPr>
+                <w:rFonts w:ascii="Consolas" w:hAnsi="Consolas"/>
+                <w:color w:val="334455"/>
+                <w:sz w:val="19"/>
+              </w:rPr>
+              <w:t>dte_max</w:t>
+            </w:r>
+            <w:r>
+              <w:rPr/>
+              <w:t xml:space="preserve"> is 30, not no limit). The page always sends both keys. Every listed expiry in the range is built, a report is flagged rather than dropped, and the best 25 rows of each </w:t>
             </w:r>
             <w:r>
               <w:rPr>

</xml_diff>

<commit_message>
docs(finder): choose what to load for a large chain; live scan times
The manuals, page help, routes doc and CLAUDE.md describe the large-chain
chooser: more than 30 expirations in range asks first, the four choices and
what each keeps, the pick remembered per symbol, Scanned N of M with Change,
the empty-pick sentence, calendars pairing only within a choice, and the IV
and expected move staying the whole chain's. The API reference adds
expiry_choice and the new payload keys.

The synthetic "about 20 s" figure is replaced by the live whole-chain times
(NVDA 13.5 s, SPY 26-27 s, $SPX 40.1 s), in docs and in the two code
comments that quoted it. The CHANGELOG gains the chooser entry; the
whole-chain entry is demoted and its still-to-measure bullet filled in.

Co-Authored-By: Claude Opus 5 <noreply@anthropic.com>
</commit_message>
<xml_diff>
--- a/docs/manuals/api-reference/api-reference.docx
+++ b/docs/manuals/api-reference/api-reference.docx
@@ -5850,7 +5850,7 @@
                 <w:color w:val="334455"/>
                 <w:sz w:val="19"/>
               </w:rPr>
-              <w:t>{symbol, dte_min, dte_max, put_d_min, put_d_max, call_d_min, call_d_max, min_cr_fraction}</w:t>
+              <w:t>{symbol, dte_min, dte_max, put_d_min, put_d_max, call_d_min, call_d_max, min_cr_fraction, expiry_choice?}</w:t>
             </w:r>
             <w:r>
               <w:rPr/>
@@ -5924,7 +5924,183 @@
             </w:r>
             <w:r>
               <w:rPr/>
-              <w:t xml:space="preserve"> are kept</w:t>
+              <w:t xml:space="preserve"> are kept. </w:t>
+            </w:r>
+            <w:r>
+              <w:rPr>
+                <w:b/>
+              </w:rPr>
+              <w:t>A large range asks first:</w:t>
+            </w:r>
+            <w:r>
+              <w:rPr/>
+              <w:t xml:space="preserve"> more than 30 listed expirations inside </w:t>
+            </w:r>
+            <w:r>
+              <w:rPr>
+                <w:rFonts w:ascii="Consolas" w:hAnsi="Consolas"/>
+                <w:color w:val="334455"/>
+                <w:sz w:val="19"/>
+              </w:rPr>
+              <w:t>dte_min</w:t>
+            </w:r>
+            <w:r>
+              <w:rPr/>
+              <w:t>..</w:t>
+            </w:r>
+            <w:r>
+              <w:rPr>
+                <w:rFonts w:ascii="Consolas" w:hAnsi="Consolas"/>
+                <w:color w:val="334455"/>
+                <w:sz w:val="19"/>
+              </w:rPr>
+              <w:t>dte_max</w:t>
+            </w:r>
+            <w:r>
+              <w:rPr/>
+              <w:t xml:space="preserve"> (counted on Schwab's </w:t>
+            </w:r>
+            <w:r>
+              <w:rPr>
+                <w:rFonts w:ascii="Consolas" w:hAnsi="Consolas"/>
+                <w:color w:val="334455"/>
+                <w:sz w:val="19"/>
+              </w:rPr>
+              <w:t>daysToExpiration</w:t>
+            </w:r>
+            <w:r>
+              <w:rPr/>
+              <w:t xml:space="preserve">) and no </w:t>
+            </w:r>
+            <w:r>
+              <w:rPr>
+                <w:rFonts w:ascii="Consolas" w:hAnsi="Consolas"/>
+                <w:color w:val="334455"/>
+                <w:sz w:val="19"/>
+              </w:rPr>
+              <w:t>expiry_choice</w:t>
+            </w:r>
+            <w:r>
+              <w:rPr/>
+              <w:t xml:space="preserve">, and the answer is the choices — no chain is fetched. </w:t>
+            </w:r>
+            <w:r>
+              <w:rPr>
+                <w:rFonts w:ascii="Consolas" w:hAnsi="Consolas"/>
+                <w:color w:val="334455"/>
+                <w:sz w:val="19"/>
+              </w:rPr>
+              <w:t>expiry_choice</w:t>
+            </w:r>
+            <w:r>
+              <w:rPr/>
+              <w:t xml:space="preserve"> is one of </w:t>
+            </w:r>
+            <w:r>
+              <w:rPr>
+                <w:rFonts w:ascii="Consolas" w:hAnsi="Consolas"/>
+                <w:color w:val="334455"/>
+                <w:sz w:val="19"/>
+              </w:rPr>
+              <w:t>next_30</w:t>
+            </w:r>
+            <w:r>
+              <w:rPr/>
+              <w:t xml:space="preserve"> (DTE ≤ 30) · </w:t>
+            </w:r>
+            <w:r>
+              <w:rPr>
+                <w:rFonts w:ascii="Consolas" w:hAnsi="Consolas"/>
+                <w:color w:val="334455"/>
+                <w:sz w:val="19"/>
+              </w:rPr>
+              <w:t>next_90</w:t>
+            </w:r>
+            <w:r>
+              <w:rPr/>
+              <w:t xml:space="preserve"> (DTE ≤ 90) · </w:t>
+            </w:r>
+            <w:r>
+              <w:rPr>
+                <w:rFonts w:ascii="Consolas" w:hAnsi="Consolas"/>
+                <w:color w:val="334455"/>
+                <w:sz w:val="19"/>
+              </w:rPr>
+              <w:t>monthly</w:t>
+            </w:r>
+            <w:r>
+              <w:rPr/>
+              <w:t xml:space="preserve"> (Schwab </w:t>
+            </w:r>
+            <w:r>
+              <w:rPr>
+                <w:rFonts w:ascii="Consolas" w:hAnsi="Consolas"/>
+                <w:color w:val="334455"/>
+                <w:sz w:val="19"/>
+              </w:rPr>
+              <w:t>expirationType</w:t>
+            </w:r>
+            <w:r>
+              <w:rPr/>
+              <w:t xml:space="preserve"> </w:t>
+            </w:r>
+            <w:r>
+              <w:rPr>
+                <w:rFonts w:ascii="Consolas" w:hAnsi="Consolas"/>
+                <w:color w:val="334455"/>
+                <w:sz w:val="19"/>
+              </w:rPr>
+              <w:t>S</w:t>
+            </w:r>
+            <w:r>
+              <w:rPr/>
+              <w:t xml:space="preserve"> only) · </w:t>
+            </w:r>
+            <w:r>
+              <w:rPr>
+                <w:rFonts w:ascii="Consolas" w:hAnsi="Consolas"/>
+                <w:color w:val="334455"/>
+                <w:sz w:val="19"/>
+              </w:rPr>
+              <w:t>all</w:t>
+            </w:r>
+            <w:r>
+              <w:rPr/>
+              <w:t xml:space="preserve">, and builds only those expirations; it is </w:t>
+            </w:r>
+            <w:r>
+              <w:rPr>
+                <w:b/>
+              </w:rPr>
+              <w:t>ignored</w:t>
+            </w:r>
+            <w:r>
+              <w:rPr/>
+              <w:t xml:space="preserve"> on a range of 30 or fewer (the whole range is scanned); an unknown key is refused and answers with </w:t>
+            </w:r>
+            <w:r>
+              <w:rPr>
+                <w:rFonts w:ascii="Consolas" w:hAnsi="Consolas"/>
+                <w:color w:val="334455"/>
+                <w:sz w:val="19"/>
+              </w:rPr>
+              <w:t>error</w:t>
+            </w:r>
+            <w:r>
+              <w:rPr/>
+              <w:t xml:space="preserve"> set. The Income Window never asks. Measured live, whole chain: NVDA 13.5 s, SPY 26–27 s, </w:t>
+            </w:r>
+            <w:r>
+              <w:rPr>
+                <w:rFonts w:ascii="Consolas" w:hAnsi="Consolas"/>
+                <w:color w:val="334455"/>
+                <w:sz w:val="19"/>
+              </w:rPr>
+              <w:t>$SPX</w:t>
+            </w:r>
+            <w:r>
+              <w:rPr/>
+              <w:t xml:space="preserve"> 40.1 s</w:t>
             </w:r>
           </w:p>
         </w:tc>
@@ -5953,7 +6129,7 @@
                 <w:color w:val="334455"/>
                 <w:sz w:val="19"/>
               </w:rPr>
-              <w:t>{signals[], view, filtered_out, vol_filtered, not_shown, spot, chain_missing, no_expiries_in_range, expiries_failed, symbol, params, error?}</w:t>
+              <w:t>{signals[], view, filtered_out, vol_filtered, not_shown, spot, chain_missing, no_expiries_in_range, expiries_failed, needs_choice, expiration_count, expirations_scanned, choices, expiry_choice, symbol, params, error?}</w:t>
             </w:r>
             <w:r>
               <w:rPr/>
@@ -6039,7 +6215,173 @@
             </w:r>
             <w:r>
               <w:rPr/>
-              <w:t xml:space="preserve"> when the expiration list was unavailable (not counted, which is not zero). Each row carries </w:t>
+              <w:t xml:space="preserve"> when the expiration list was unavailable (not counted, which is not zero), and on a choice counts only the </w:t>
+            </w:r>
+            <w:r>
+              <w:rPr>
+                <w:b/>
+              </w:rPr>
+              <w:t>chosen</w:t>
+            </w:r>
+            <w:r>
+              <w:rPr/>
+              <w:t xml:space="preserve"> expirations that failed. </w:t>
+            </w:r>
+            <w:r>
+              <w:rPr>
+                <w:rFonts w:ascii="Consolas" w:hAnsi="Consolas"/>
+                <w:color w:val="334455"/>
+                <w:sz w:val="19"/>
+              </w:rPr>
+              <w:t>needs_choice: true</w:t>
+            </w:r>
+            <w:r>
+              <w:rPr/>
+              <w:t xml:space="preserve"> marks the chooser answer (</w:t>
+            </w:r>
+            <w:r>
+              <w:rPr>
+                <w:rFonts w:ascii="Consolas" w:hAnsi="Consolas"/>
+                <w:color w:val="334455"/>
+                <w:sz w:val="19"/>
+              </w:rPr>
+              <w:t>signals: []</w:t>
+            </w:r>
+            <w:r>
+              <w:rPr/>
+              <w:t xml:space="preserve">, </w:t>
+            </w:r>
+            <w:r>
+              <w:rPr>
+                <w:rFonts w:ascii="Consolas" w:hAnsi="Consolas"/>
+                <w:color w:val="334455"/>
+                <w:sz w:val="19"/>
+              </w:rPr>
+              <w:t>expiries_failed</w:t>
+            </w:r>
+            <w:r>
+              <w:rPr/>
+              <w:t xml:space="preserve"> 0). </w:t>
+            </w:r>
+            <w:r>
+              <w:rPr>
+                <w:rFonts w:ascii="Consolas" w:hAnsi="Consolas"/>
+                <w:color w:val="334455"/>
+                <w:sz w:val="19"/>
+              </w:rPr>
+              <w:t>expiration_count</w:t>
+            </w:r>
+            <w:r>
+              <w:rPr/>
+              <w:t xml:space="preserve"> is the in-range count (</w:t>
+            </w:r>
+            <w:r>
+              <w:rPr>
+                <w:rFonts w:ascii="Consolas" w:hAnsi="Consolas"/>
+                <w:color w:val="334455"/>
+                <w:sz w:val="19"/>
+              </w:rPr>
+              <w:t>null</w:t>
+            </w:r>
+            <w:r>
+              <w:rPr/>
+              <w:t xml:space="preserve"> with no expiration list). </w:t>
+            </w:r>
+            <w:r>
+              <w:rPr>
+                <w:rFonts w:ascii="Consolas" w:hAnsi="Consolas"/>
+                <w:color w:val="334455"/>
+                <w:sz w:val="19"/>
+              </w:rPr>
+              <w:t>choices</w:t>
+            </w:r>
+            <w:r>
+              <w:rPr/>
+              <w:t xml:space="preserve"> (a large range only, else </w:t>
+            </w:r>
+            <w:r>
+              <w:rPr>
+                <w:rFonts w:ascii="Consolas" w:hAnsi="Consolas"/>
+                <w:color w:val="334455"/>
+                <w:sz w:val="19"/>
+              </w:rPr>
+              <w:t>null</w:t>
+            </w:r>
+            <w:r>
+              <w:rPr/>
+              <w:t xml:space="preserve">) is </w:t>
+            </w:r>
+            <w:r>
+              <w:rPr>
+                <w:rFonts w:ascii="Consolas" w:hAnsi="Consolas"/>
+                <w:color w:val="334455"/>
+                <w:sz w:val="19"/>
+              </w:rPr>
+              <w:t>[{key, label, count, est_seconds}]</w:t>
+            </w:r>
+            <w:r>
+              <w:rPr/>
+              <w:t xml:space="preserve"> in the order above, </w:t>
+            </w:r>
+            <w:r>
+              <w:rPr>
+                <w:rFonts w:ascii="Consolas" w:hAnsi="Consolas"/>
+                <w:color w:val="334455"/>
+                <w:sz w:val="19"/>
+              </w:rPr>
+              <w:t>est_seconds</w:t>
+            </w:r>
+            <w:r>
+              <w:rPr/>
+              <w:t xml:space="preserve"> = </w:t>
+            </w:r>
+            <w:r>
+              <w:rPr>
+                <w:rFonts w:ascii="Consolas" w:hAnsi="Consolas"/>
+                <w:color w:val="334455"/>
+                <w:sz w:val="19"/>
+              </w:rPr>
+              <w:t>count × 0.75</w:t>
+            </w:r>
+            <w:r>
+              <w:rPr/>
+              <w:t xml:space="preserve"> rounded half up; a count of 0 is still listed. </w:t>
+            </w:r>
+            <w:r>
+              <w:rPr>
+                <w:rFonts w:ascii="Consolas" w:hAnsi="Consolas"/>
+                <w:color w:val="334455"/>
+                <w:sz w:val="19"/>
+              </w:rPr>
+              <w:t>expiry_choice</w:t>
+            </w:r>
+            <w:r>
+              <w:rPr/>
+              <w:t xml:space="preserve"> is the key applied and </w:t>
+            </w:r>
+            <w:r>
+              <w:rPr>
+                <w:rFonts w:ascii="Consolas" w:hAnsi="Consolas"/>
+                <w:color w:val="334455"/>
+                <w:sz w:val="19"/>
+              </w:rPr>
+              <w:t>expirations_scanned</w:t>
+            </w:r>
+            <w:r>
+              <w:rPr/>
+              <w:t xml:space="preserve"> how many it kept — both </w:t>
+            </w:r>
+            <w:r>
+              <w:rPr>
+                <w:rFonts w:ascii="Consolas" w:hAnsi="Consolas"/>
+                <w:color w:val="334455"/>
+                <w:sz w:val="19"/>
+              </w:rPr>
+              <w:t>null</w:t>
+            </w:r>
+            <w:r>
+              <w:rPr/>
+              <w:t xml:space="preserve"> unless a choice was applied. The IV analysis and expected move stay the whole chain's under any choice. Each row carries </w:t>
             </w:r>
             <w:r>
               <w:rPr>

</xml_diff>

<commit_message>
docs: Paper Ledger caps in the API and Reference guides; limits pinned to config
Co-Authored-By: Claude Opus 5 <noreply@anthropic.com>
</commit_message>
<xml_diff>
--- a/docs/manuals/api-reference/api-reference.docx
+++ b/docs/manuals/api-reference/api-reference.docx
@@ -32,7 +32,7 @@
           <w:color w:val="5B6678"/>
           <w:sz w:val="18"/>
         </w:rPr>
-        <w:t>NeuralStrike · Generated 2026-09-14</w:t>
+        <w:t>NeuralStrike · Generated 2026-09-15</w:t>
       </w:r>
     </w:p>
     <w:p/>
@@ -1241,6 +1241,22 @@
                 <w:sz w:val="19"/>
               </w:rPr>
               <w:t>:paper_analyze</w:t>
+            </w:r>
+            <w:r>
+              <w:rPr/>
+              <w:t xml:space="preserve">, </w:t>
+            </w:r>
+            <w:r>
+              <w:rPr>
+                <w:rFonts w:ascii="Consolas" w:hAnsi="Consolas"/>
+                <w:color w:val="334455"/>
+                <w:sz w:val="19"/>
+              </w:rPr>
+              <w:t>:paper_create</w:t>
+            </w:r>
+            <w:r>
+              <w:rPr/>
+              <w:t xml:space="preserve"> (the Paper button's answer, read by Market Scanner and Strategy Finder)</w:t>
             </w:r>
           </w:p>
         </w:tc>
@@ -6643,6 +6659,32 @@
               </w:rPr>
               <w:t>{signal, qty}</w:t>
             </w:r>
+            <w:r>
+              <w:rPr/>
+              <w:t xml:space="preserve"> — opens into the Paper </w:t>
+            </w:r>
+            <w:r>
+              <w:rPr>
+                <w:b/>
+              </w:rPr>
+              <w:t>Ledger</w:t>
+            </w:r>
+            <w:r>
+              <w:rPr/>
+              <w:t xml:space="preserve"> only if every risk cap in </w:t>
+            </w:r>
+            <w:r>
+              <w:rPr>
+                <w:rFonts w:ascii="Consolas" w:hAnsi="Consolas"/>
+                <w:color w:val="334455"/>
+                <w:sz w:val="19"/>
+              </w:rPr>
+              <w:t>shared.book_caps</w:t>
+            </w:r>
+            <w:r>
+              <w:rPr/>
+              <w:t xml:space="preserve"> clears against the Ledger's own open trades ($750 per trade, plus the Account's symbol / sector / expiry / deployment caps); a refusal writes nothing</w:t>
+            </w:r>
           </w:p>
         </w:tc>
         <w:tc>
@@ -6658,6 +6700,496 @@
                 <w:sz w:val="19"/>
               </w:rPr>
               <w:t>cache:options:paper_trades</w:t>
+            </w:r>
+            <w:r>
+              <w:rPr/>
+              <w:t xml:space="preserve"> + </w:t>
+            </w:r>
+            <w:r>
+              <w:rPr>
+                <w:rFonts w:ascii="Consolas" w:hAnsi="Consolas"/>
+                <w:color w:val="334455"/>
+                <w:sz w:val="19"/>
+              </w:rPr>
+              <w:t>cache:options:paper_create</w:t>
+            </w:r>
+            <w:r>
+              <w:rPr/>
+              <w:t xml:space="preserve"> — the outcome, written on </w:t>
+            </w:r>
+            <w:r>
+              <w:rPr>
+                <w:b/>
+              </w:rPr>
+              <w:t>every</w:t>
+            </w:r>
+            <w:r>
+              <w:rPr/>
+              <w:t xml:space="preserve"> answer with a 600 s TTL: </w:t>
+            </w:r>
+            <w:r>
+              <w:rPr>
+                <w:rFonts w:ascii="Consolas" w:hAnsi="Consolas"/>
+                <w:color w:val="334455"/>
+                <w:sz w:val="19"/>
+              </w:rPr>
+              <w:t>{status, symbol, type, expiration, qty, rungs[], seq, ts}</w:t>
+            </w:r>
+            <w:r>
+              <w:rPr/>
+              <w:t xml:space="preserve"> plus, by </w:t>
+            </w:r>
+            <w:r>
+              <w:rPr>
+                <w:rFonts w:ascii="Consolas" w:hAnsi="Consolas"/>
+                <w:color w:val="334455"/>
+                <w:sz w:val="19"/>
+              </w:rPr>
+              <w:t>status</w:t>
+            </w:r>
+            <w:r>
+              <w:rPr/>
+              <w:t xml:space="preserve">: </w:t>
+            </w:r>
+            <w:r>
+              <w:rPr>
+                <w:rFonts w:ascii="Consolas" w:hAnsi="Consolas"/>
+                <w:color w:val="334455"/>
+                <w:sz w:val="19"/>
+              </w:rPr>
+              <w:t>opened</w:t>
+            </w:r>
+            <w:r>
+              <w:rPr/>
+              <w:t xml:space="preserve"> → </w:t>
+            </w:r>
+            <w:r>
+              <w:rPr>
+                <w:rFonts w:ascii="Consolas" w:hAnsi="Consolas"/>
+                <w:color w:val="334455"/>
+                <w:sz w:val="19"/>
+              </w:rPr>
+              <w:t>trade_id</w:t>
+            </w:r>
+            <w:r>
+              <w:rPr/>
+              <w:t xml:space="preserve">; </w:t>
+            </w:r>
+            <w:r>
+              <w:rPr>
+                <w:rFonts w:ascii="Consolas" w:hAnsi="Consolas"/>
+                <w:color w:val="334455"/>
+                <w:sz w:val="19"/>
+              </w:rPr>
+              <w:t>refused</w:t>
+            </w:r>
+            <w:r>
+              <w:rPr/>
+              <w:t xml:space="preserve"> → </w:t>
+            </w:r>
+            <w:r>
+              <w:rPr>
+                <w:rFonts w:ascii="Consolas" w:hAnsi="Consolas"/>
+                <w:color w:val="334455"/>
+                <w:sz w:val="19"/>
+              </w:rPr>
+              <w:t>code</w:t>
+            </w:r>
+            <w:r>
+              <w:rPr/>
+              <w:t xml:space="preserve"> (the binding rung), </w:t>
+            </w:r>
+            <w:r>
+              <w:rPr>
+                <w:rFonts w:ascii="Consolas" w:hAnsi="Consolas"/>
+                <w:color w:val="334455"/>
+                <w:sz w:val="19"/>
+              </w:rPr>
+              <w:t>message</w:t>
+            </w:r>
+            <w:r>
+              <w:rPr/>
+              <w:t xml:space="preserve"> (a plain sentence), </w:t>
+            </w:r>
+            <w:r>
+              <w:rPr>
+                <w:rFonts w:ascii="Consolas" w:hAnsi="Consolas"/>
+                <w:color w:val="334455"/>
+                <w:sz w:val="19"/>
+              </w:rPr>
+              <w:t>max_quantity</w:t>
+            </w:r>
+            <w:r>
+              <w:rPr/>
+              <w:t xml:space="preserve"> (the largest quantity that clears every cap now; </w:t>
+            </w:r>
+            <w:r>
+              <w:rPr>
+                <w:rFonts w:ascii="Consolas" w:hAnsi="Consolas"/>
+                <w:color w:val="334455"/>
+                <w:sz w:val="19"/>
+              </w:rPr>
+              <w:t>0</w:t>
+            </w:r>
+            <w:r>
+              <w:rPr/>
+              <w:t xml:space="preserve"> when none does); </w:t>
+            </w:r>
+            <w:r>
+              <w:rPr>
+                <w:rFonts w:ascii="Consolas" w:hAnsi="Consolas"/>
+                <w:color w:val="334455"/>
+                <w:sz w:val="19"/>
+              </w:rPr>
+              <w:t>error</w:t>
+            </w:r>
+            <w:r>
+              <w:rPr/>
+              <w:t xml:space="preserve"> / </w:t>
+            </w:r>
+            <w:r>
+              <w:rPr>
+                <w:rFonts w:ascii="Consolas" w:hAnsi="Consolas"/>
+                <w:color w:val="334455"/>
+                <w:sz w:val="19"/>
+              </w:rPr>
+              <w:t>stale</w:t>
+            </w:r>
+            <w:r>
+              <w:rPr/>
+              <w:t xml:space="preserve"> → </w:t>
+            </w:r>
+            <w:r>
+              <w:rPr>
+                <w:rFonts w:ascii="Consolas" w:hAnsi="Consolas"/>
+                <w:color w:val="334455"/>
+                <w:sz w:val="19"/>
+              </w:rPr>
+              <w:t>message</w:t>
+            </w:r>
+            <w:r>
+              <w:rPr/>
+              <w:t xml:space="preserve">. </w:t>
+            </w:r>
+            <w:r>
+              <w:rPr>
+                <w:rFonts w:ascii="Consolas" w:hAnsi="Consolas"/>
+                <w:color w:val="334455"/>
+                <w:sz w:val="19"/>
+              </w:rPr>
+              <w:t>status</w:t>
+            </w:r>
+            <w:r>
+              <w:rPr/>
+              <w:t xml:space="preserve"> is one of </w:t>
+            </w:r>
+            <w:r>
+              <w:rPr>
+                <w:rFonts w:ascii="Consolas" w:hAnsi="Consolas"/>
+                <w:color w:val="334455"/>
+                <w:sz w:val="19"/>
+              </w:rPr>
+              <w:t>opened</w:t>
+            </w:r>
+            <w:r>
+              <w:rPr/>
+              <w:t xml:space="preserve"> · </w:t>
+            </w:r>
+            <w:r>
+              <w:rPr>
+                <w:rFonts w:ascii="Consolas" w:hAnsi="Consolas"/>
+                <w:color w:val="334455"/>
+                <w:sz w:val="19"/>
+              </w:rPr>
+              <w:t>refused</w:t>
+            </w:r>
+            <w:r>
+              <w:rPr/>
+              <w:t xml:space="preserve"> · </w:t>
+            </w:r>
+            <w:r>
+              <w:rPr>
+                <w:rFonts w:ascii="Consolas" w:hAnsi="Consolas"/>
+                <w:color w:val="334455"/>
+                <w:sz w:val="19"/>
+              </w:rPr>
+              <w:t>stale</w:t>
+            </w:r>
+            <w:r>
+              <w:rPr/>
+              <w:t xml:space="preserve"> · </w:t>
+            </w:r>
+            <w:r>
+              <w:rPr>
+                <w:rFonts w:ascii="Consolas" w:hAnsi="Consolas"/>
+                <w:color w:val="334455"/>
+                <w:sz w:val="19"/>
+              </w:rPr>
+              <w:t>error</w:t>
+            </w:r>
+            <w:r>
+              <w:rPr/>
+              <w:t xml:space="preserve">. </w:t>
+            </w:r>
+            <w:r>
+              <w:rPr>
+                <w:rFonts w:ascii="Consolas" w:hAnsi="Consolas"/>
+                <w:color w:val="334455"/>
+                <w:sz w:val="19"/>
+              </w:rPr>
+              <w:t>seq</w:t>
+            </w:r>
+            <w:r>
+              <w:rPr/>
+              <w:t xml:space="preserve"> rises on each publish, so two identical refusals are two answers; the </w:t>
+            </w:r>
+            <w:r>
+              <w:rPr>
+                <w:rFonts w:ascii="Consolas" w:hAnsi="Consolas"/>
+                <w:color w:val="334455"/>
+                <w:sz w:val="19"/>
+              </w:rPr>
+              <w:t>:ver</w:t>
+            </w:r>
+            <w:r>
+              <w:rPr/>
+              <w:t xml:space="preserve"> counter can reset to 1 when the TTL expires, so compare versions with </w:t>
+            </w:r>
+            <w:r>
+              <w:rPr>
+                <w:rFonts w:ascii="Consolas" w:hAnsi="Consolas"/>
+                <w:color w:val="334455"/>
+                <w:sz w:val="19"/>
+              </w:rPr>
+              <w:t>!=</w:t>
+            </w:r>
+            <w:r>
+              <w:rPr/>
+              <w:t xml:space="preserve">. Each rung is </w:t>
+            </w:r>
+            <w:r>
+              <w:rPr>
+                <w:rFonts w:ascii="Consolas" w:hAnsi="Consolas"/>
+                <w:color w:val="334455"/>
+                <w:sz w:val="19"/>
+              </w:rPr>
+              <w:t>{code, kind, scope, used, after, cap, binds, skipped}</w:t>
+            </w:r>
+            <w:r>
+              <w:rPr/>
+              <w:t xml:space="preserve"> — </w:t>
+            </w:r>
+            <w:r>
+              <w:rPr>
+                <w:rFonts w:ascii="Consolas" w:hAnsi="Consolas"/>
+                <w:color w:val="334455"/>
+                <w:sz w:val="19"/>
+              </w:rPr>
+              <w:t>kind</w:t>
+            </w:r>
+            <w:r>
+              <w:rPr/>
+              <w:t xml:space="preserve"> </w:t>
+            </w:r>
+            <w:r>
+              <w:rPr>
+                <w:rFonts w:ascii="Consolas" w:hAnsi="Consolas"/>
+                <w:color w:val="334455"/>
+                <w:sz w:val="19"/>
+              </w:rPr>
+              <w:t>count</w:t>
+            </w:r>
+            <w:r>
+              <w:rPr/>
+              <w:t xml:space="preserve"> or </w:t>
+            </w:r>
+            <w:r>
+              <w:rPr>
+                <w:rFonts w:ascii="Consolas" w:hAnsi="Consolas"/>
+                <w:color w:val="334455"/>
+                <w:sz w:val="19"/>
+              </w:rPr>
+              <w:t>risk</w:t>
+            </w:r>
+            <w:r>
+              <w:rPr/>
+              <w:t xml:space="preserve">, a skipped rung has </w:t>
+            </w:r>
+            <w:r>
+              <w:rPr>
+                <w:rFonts w:ascii="Consolas" w:hAnsi="Consolas"/>
+                <w:color w:val="334455"/>
+                <w:sz w:val="19"/>
+              </w:rPr>
+              <w:t>used</w:t>
+            </w:r>
+            <w:r>
+              <w:rPr/>
+              <w:t>/</w:t>
+            </w:r>
+            <w:r>
+              <w:rPr>
+                <w:rFonts w:ascii="Consolas" w:hAnsi="Consolas"/>
+                <w:color w:val="334455"/>
+                <w:sz w:val="19"/>
+              </w:rPr>
+              <w:t>after</w:t>
+            </w:r>
+            <w:r>
+              <w:rPr/>
+              <w:t>/</w:t>
+            </w:r>
+            <w:r>
+              <w:rPr>
+                <w:rFonts w:ascii="Consolas" w:hAnsi="Consolas"/>
+                <w:color w:val="334455"/>
+                <w:sz w:val="19"/>
+              </w:rPr>
+              <w:t>cap</w:t>
+            </w:r>
+            <w:r>
+              <w:rPr/>
+              <w:t xml:space="preserve"> </w:t>
+            </w:r>
+            <w:r>
+              <w:rPr>
+                <w:rFonts w:ascii="Consolas" w:hAnsi="Consolas"/>
+                <w:color w:val="334455"/>
+                <w:sz w:val="19"/>
+              </w:rPr>
+              <w:t>null</w:t>
+            </w:r>
+            <w:r>
+              <w:rPr/>
+              <w:t xml:space="preserve"> and </w:t>
+            </w:r>
+            <w:r>
+              <w:rPr>
+                <w:rFonts w:ascii="Consolas" w:hAnsi="Consolas"/>
+                <w:color w:val="334455"/>
+                <w:sz w:val="19"/>
+              </w:rPr>
+              <w:t>binds: false</w:t>
+            </w:r>
+            <w:r>
+              <w:rPr/>
+              <w:t xml:space="preserve">; </w:t>
+            </w:r>
+            <w:r>
+              <w:rPr>
+                <w:rFonts w:ascii="Consolas" w:hAnsi="Consolas"/>
+                <w:color w:val="334455"/>
+                <w:sz w:val="19"/>
+              </w:rPr>
+              <w:t>rungs</w:t>
+            </w:r>
+            <w:r>
+              <w:rPr/>
+              <w:t xml:space="preserve"> is </w:t>
+            </w:r>
+            <w:r>
+              <w:rPr>
+                <w:rFonts w:ascii="Consolas" w:hAnsi="Consolas"/>
+                <w:color w:val="334455"/>
+                <w:sz w:val="19"/>
+              </w:rPr>
+              <w:t>[]</w:t>
+            </w:r>
+            <w:r>
+              <w:rPr/>
+              <w:t xml:space="preserve"> on </w:t>
+            </w:r>
+            <w:r>
+              <w:rPr>
+                <w:rFonts w:ascii="Consolas" w:hAnsi="Consolas"/>
+                <w:color w:val="334455"/>
+                <w:sz w:val="19"/>
+              </w:rPr>
+              <w:t>stale</w:t>
+            </w:r>
+            <w:r>
+              <w:rPr/>
+              <w:t xml:space="preserve"> and on errors raised before the caps ran. </w:t>
+            </w:r>
+            <w:r>
+              <w:rPr>
+                <w:rFonts w:ascii="Consolas" w:hAnsi="Consolas"/>
+                <w:color w:val="334455"/>
+                <w:sz w:val="19"/>
+              </w:rPr>
+              <w:t>qty</w:t>
+            </w:r>
+            <w:r>
+              <w:rPr/>
+              <w:t xml:space="preserve"> is </w:t>
+            </w:r>
+            <w:r>
+              <w:rPr>
+                <w:rFonts w:ascii="Consolas" w:hAnsi="Consolas"/>
+                <w:color w:val="334455"/>
+                <w:sz w:val="19"/>
+              </w:rPr>
+              <w:t>null</w:t>
+            </w:r>
+            <w:r>
+              <w:rPr/>
+              <w:t xml:space="preserve"> on </w:t>
+            </w:r>
+            <w:r>
+              <w:rPr>
+                <w:rFonts w:ascii="Consolas" w:hAnsi="Consolas"/>
+                <w:color w:val="334455"/>
+                <w:sz w:val="19"/>
+              </w:rPr>
+              <w:t>stale</w:t>
+            </w:r>
+            <w:r>
+              <w:rPr/>
+              <w:t xml:space="preserve">, the as-sent value on a bad quantity, and absent when the command raised. A command that </w:t>
+            </w:r>
+            <w:r>
+              <w:rPr>
+                <w:b/>
+              </w:rPr>
+              <w:t>raises</w:t>
+            </w:r>
+            <w:r>
+              <w:rPr/>
+              <w:t xml:space="preserve"> publishes an </w:t>
+            </w:r>
+            <w:r>
+              <w:rPr>
+                <w:rFonts w:ascii="Consolas" w:hAnsi="Consolas"/>
+                <w:color w:val="334455"/>
+                <w:sz w:val="19"/>
+              </w:rPr>
+              <w:t>error</w:t>
+            </w:r>
+            <w:r>
+              <w:rPr/>
+              <w:t xml:space="preserve"> (</w:t>
+            </w:r>
+            <w:r>
+              <w:rPr>
+                <w:rFonts w:ascii="Consolas" w:hAnsi="Consolas"/>
+                <w:color w:val="334455"/>
+                <w:sz w:val="19"/>
+              </w:rPr>
+              <w:t>message</w:t>
+            </w:r>
+            <w:r>
+              <w:rPr/>
+              <w:t xml:space="preserve"> </w:t>
+            </w:r>
+            <w:r>
+              <w:rPr>
+                <w:i/>
+              </w:rPr>
+              <w:t>The paper ledger could not process the request.</w:t>
+            </w:r>
+            <w:r>
+              <w:rPr/>
+              <w:t>) and is then dead-lettered</w:t>
             </w:r>
           </w:p>
         </w:tc>
@@ -13148,6 +13680,17 @@
           <w:sz w:val="18"/>
         </w:rPr>
         <w:t>cache:options:paper_trades     events:options:paper_trades</w:t>
+      </w:r>
+      <w:r>
+        <w:br/>
+      </w:r>
+      <w:r>
+        <w:rPr>
+          <w:rFonts w:ascii="Consolas" w:hAnsi="Consolas"/>
+          <w:color w:val="223344"/>
+          <w:sz w:val="18"/>
+        </w:rPr>
+        <w:t>cache:options:paper_create     events:options:paper_create   (TTL 600 s; the Paper button's answer)</w:t>
       </w:r>
       <w:r>
         <w:br/>

</xml_diff>

<commit_message>
docs: the Paper dialog previews the ledger's limits
Co-Authored-By: Claude Opus 5 <noreply@anthropic.com>
</commit_message>
<xml_diff>
--- a/docs/manuals/api-reference/api-reference.docx
+++ b/docs/manuals/api-reference/api-reference.docx
@@ -8723,6 +8723,905 @@
       </w:r>
     </w:p>
     <w:p>
+      <w:r>
+        <w:rPr>
+          <w:b/>
+        </w:rPr>
+        <w:t>Candidate stamps.</w:t>
+      </w:r>
+      <w:r>
+        <w:rPr/>
+        <w:t xml:space="preserve"> Every candidate row on </w:t>
+      </w:r>
+      <w:r>
+        <w:rPr>
+          <w:rFonts w:ascii="Consolas" w:hAnsi="Consolas"/>
+          <w:color w:val="334455"/>
+          <w:sz w:val="19"/>
+        </w:rPr>
+        <w:t>cache:options:scan</w:t>
+      </w:r>
+      <w:r>
+        <w:rPr/>
+        <w:t xml:space="preserve"> (and so</w:t>
+        <w:br/>
+      </w:r>
+      <w:r>
+        <w:rPr>
+          <w:rFonts w:ascii="Consolas" w:hAnsi="Consolas"/>
+          <w:color w:val="334455"/>
+          <w:sz w:val="19"/>
+        </w:rPr>
+        <w:t>scan_day</w:t>
+      </w:r>
+      <w:r>
+        <w:rPr/>
+        <w:t xml:space="preserve">), </w:t>
+      </w:r>
+      <w:r>
+        <w:rPr>
+          <w:rFonts w:ascii="Consolas" w:hAnsi="Consolas"/>
+          <w:color w:val="334455"/>
+          <w:sz w:val="19"/>
+        </w:rPr>
+        <w:t>cache:options:swing</w:t>
+      </w:r>
+      <w:r>
+        <w:rPr/>
+        <w:t xml:space="preserve"> and </w:t>
+      </w:r>
+      <w:r>
+        <w:rPr>
+          <w:rFonts w:ascii="Consolas" w:hAnsi="Consolas"/>
+          <w:color w:val="334455"/>
+          <w:sz w:val="19"/>
+        </w:rPr>
+        <w:t>cache:options:income</w:t>
+      </w:r>
+      <w:r>
+        <w:rPr/>
+        <w:t xml:space="preserve"> is stamped at publish</w:t>
+        <w:br/>
+        <w:t xml:space="preserve">time by </w:t>
+      </w:r>
+      <w:r>
+        <w:rPr>
+          <w:rFonts w:ascii="Consolas" w:hAnsi="Consolas"/>
+          <w:color w:val="334455"/>
+          <w:sz w:val="19"/>
+        </w:rPr>
+        <w:t>compute.stamp_candidate</w:t>
+      </w:r>
+      <w:r>
+        <w:rPr/>
+        <w:t xml:space="preserve"> — from </w:t>
+      </w:r>
+      <w:r>
+        <w:rPr>
+          <w:rFonts w:ascii="Consolas" w:hAnsi="Consolas"/>
+          <w:color w:val="334455"/>
+          <w:sz w:val="19"/>
+        </w:rPr>
+        <w:t>rescan</w:t>
+      </w:r>
+      <w:r>
+        <w:rPr/>
+        <w:t xml:space="preserve"> (the 0-DTE, swing and Directional</w:t>
+        <w:br/>
+        <w:t xml:space="preserve">lists), </w:t>
+      </w:r>
+      <w:r>
+        <w:rPr>
+          <w:rFonts w:ascii="Consolas" w:hAnsi="Consolas"/>
+          <w:color w:val="334455"/>
+          <w:sz w:val="19"/>
+        </w:rPr>
+        <w:t>swing_scan</w:t>
+      </w:r>
+      <w:r>
+        <w:rPr/>
+        <w:t xml:space="preserve"> and the income scan. Stamping is best-effort </w:t>
+      </w:r>
+      <w:r>
+        <w:rPr>
+          <w:b/>
+        </w:rPr>
+        <w:t>per row</w:t>
+      </w:r>
+      <w:r>
+        <w:rPr/>
+        <w:t>: a row</w:t>
+        <w:br/>
+        <w:t>whose stamping raises may be left without some stamps, the rows after it are still</w:t>
+        <w:br/>
+        <w:t>stamped, and the pass records one degrade (</w:t>
+      </w:r>
+      <w:r>
+        <w:rPr>
+          <w:rFonts w:ascii="Consolas" w:hAnsi="Consolas"/>
+          <w:color w:val="334455"/>
+          <w:sz w:val="19"/>
+        </w:rPr>
+        <w:t>options.stamp_scan</w:t>
+      </w:r>
+      <w:r>
+        <w:rPr/>
+        <w:t xml:space="preserve"> · </w:t>
+      </w:r>
+      <w:r>
+        <w:rPr>
+          <w:rFonts w:ascii="Consolas" w:hAnsi="Consolas"/>
+          <w:color w:val="334455"/>
+          <w:sz w:val="19"/>
+        </w:rPr>
+        <w:t>options.stamp_swing</w:t>
+      </w:r>
+      <w:r>
+        <w:rPr/>
+        <w:t xml:space="preserve"> ·</w:t>
+        <w:br/>
+      </w:r>
+      <w:r>
+        <w:rPr>
+          <w:rFonts w:ascii="Consolas" w:hAnsi="Consolas"/>
+          <w:color w:val="334455"/>
+          <w:sz w:val="19"/>
+        </w:rPr>
+        <w:t>options.stamp_income</w:t>
+      </w:r>
+      <w:r>
+        <w:rPr/>
+        <w:t xml:space="preserve">). Every stamp is </w:t>
+      </w:r>
+      <w:r>
+        <w:rPr>
+          <w:rFonts w:ascii="Consolas" w:hAnsi="Consolas"/>
+          <w:color w:val="334455"/>
+          <w:sz w:val="19"/>
+        </w:rPr>
+        <w:t>null</w:t>
+      </w:r>
+      <w:r>
+        <w:rPr/>
+        <w:t xml:space="preserve"> when unknown, never a guessed zero.</w:t>
+      </w:r>
+    </w:p>
+    <w:tbl>
+      <w:tblPr>
+        <w:tblW w:type="auto" w:w="0"/>
+        <w:jc w:val="left"/>
+        <w:tblLayout w:type="autofit"/>
+        <w:tblLook w:firstColumn="1" w:firstRow="1" w:lastColumn="0" w:lastRow="0" w:noHBand="0" w:noVBand="1" w:val="04A0"/>
+        <w:tblBorders>
+          <w:top w:val="single" w:sz="4" w:space="0" w:color="D8DEE9"/>
+          <w:left w:val="single" w:sz="4" w:space="0" w:color="D8DEE9"/>
+          <w:bottom w:val="single" w:sz="4" w:space="0" w:color="D8DEE9"/>
+          <w:right w:val="single" w:sz="4" w:space="0" w:color="D8DEE9"/>
+          <w:insideH w:val="single" w:sz="4" w:space="0" w:color="D8DEE9"/>
+          <w:insideV w:val="single" w:sz="4" w:space="0" w:color="D8DEE9"/>
+        </w:tblBorders>
+      </w:tblPr>
+      <w:tblGrid>
+        <w:gridCol w:w="4320"/>
+        <w:gridCol w:w="4320"/>
+      </w:tblGrid>
+      <w:tr>
+        <w:tc>
+          <w:tcPr>
+            <w:tcW w:type="dxa" w:w="4320"/>
+            <w:shd w:val="clear" w:color="auto" w:fill="EAF2FB"/>
+          </w:tcPr>
+          <w:p>
+            <w:r>
+              <w:rPr>
+                <w:b/>
+              </w:rPr>
+            </w:r>
+            <w:r>
+              <w:rPr>
+                <w:b/>
+              </w:rPr>
+              <w:t>Field</w:t>
+            </w:r>
+          </w:p>
+        </w:tc>
+        <w:tc>
+          <w:tcPr>
+            <w:tcW w:type="dxa" w:w="4320"/>
+            <w:shd w:val="clear" w:color="auto" w:fill="EAF2FB"/>
+          </w:tcPr>
+          <w:p>
+            <w:r>
+              <w:rPr>
+                <w:b/>
+              </w:rPr>
+            </w:r>
+            <w:r>
+              <w:rPr>
+                <w:b/>
+              </w:rPr>
+              <w:t>Meaning</w:t>
+            </w:r>
+          </w:p>
+        </w:tc>
+      </w:tr>
+      <w:tr>
+        <w:tc>
+          <w:tcPr>
+            <w:tcW w:type="dxa" w:w="4320"/>
+          </w:tcPr>
+          <w:p>
+            <w:r/>
+            <w:r>
+              <w:rPr>
+                <w:rFonts w:ascii="Consolas" w:hAnsi="Consolas"/>
+                <w:color w:val="334455"/>
+                <w:sz w:val="19"/>
+              </w:rPr>
+              <w:t>ledger_risk_basis</w:t>
+            </w:r>
+          </w:p>
+        </w:tc>
+        <w:tc>
+          <w:tcPr>
+            <w:tcW w:type="dxa" w:w="4320"/>
+          </w:tcPr>
+          <w:p>
+            <w:r/>
+            <w:r>
+              <w:rPr/>
+              <w:t xml:space="preserve">The unrounded figure the Paper Ledger books risk from: </w:t>
+            </w:r>
+            <w:r>
+              <w:rPr>
+                <w:rFonts w:ascii="Consolas" w:hAnsi="Consolas"/>
+                <w:color w:val="334455"/>
+                <w:sz w:val="19"/>
+              </w:rPr>
+              <w:t>{"per_share": x}</w:t>
+            </w:r>
+            <w:r>
+              <w:rPr/>
+              <w:t xml:space="preserve"> (credit structures) or </w:t>
+            </w:r>
+            <w:r>
+              <w:rPr>
+                <w:rFonts w:ascii="Consolas" w:hAnsi="Consolas"/>
+                <w:color w:val="334455"/>
+                <w:sz w:val="19"/>
+              </w:rPr>
+              <w:t>{"per_contract": y}</w:t>
+            </w:r>
+            <w:r>
+              <w:rPr/>
+              <w:t xml:space="preserve"> (debit structures). </w:t>
+            </w:r>
+            <w:r>
+              <w:rPr>
+                <w:rFonts w:ascii="Consolas" w:hAnsi="Consolas"/>
+                <w:color w:val="334455"/>
+                <w:sz w:val="19"/>
+              </w:rPr>
+              <w:t>shared.book_caps.booked_risk(basis, qty)</w:t>
+            </w:r>
+            <w:r>
+              <w:rPr/>
+              <w:t xml:space="preserve"> is exactly the </w:t>
+            </w:r>
+            <w:r>
+              <w:rPr>
+                <w:rFonts w:ascii="Consolas" w:hAnsi="Consolas"/>
+                <w:color w:val="334455"/>
+                <w:sz w:val="19"/>
+              </w:rPr>
+              <w:t>max_loss_total</w:t>
+            </w:r>
+            <w:r>
+              <w:rPr/>
+              <w:t xml:space="preserve"> the Ledger books for </w:t>
+            </w:r>
+            <w:r>
+              <w:rPr>
+                <w:rFonts w:ascii="Consolas" w:hAnsi="Consolas"/>
+                <w:color w:val="334455"/>
+                <w:sz w:val="19"/>
+              </w:rPr>
+              <w:t>qty</w:t>
+            </w:r>
+            <w:r>
+              <w:rPr/>
+              <w:t xml:space="preserve"> contracts. </w:t>
+            </w:r>
+            <w:r>
+              <w:rPr>
+                <w:rFonts w:ascii="Consolas" w:hAnsi="Consolas"/>
+                <w:color w:val="334455"/>
+                <w:sz w:val="19"/>
+              </w:rPr>
+              <w:t>null</w:t>
+            </w:r>
+            <w:r>
+              <w:rPr/>
+              <w:t xml:space="preserve"> when the Ledger would refuse the structure or book no positive risk</w:t>
+            </w:r>
+          </w:p>
+        </w:tc>
+      </w:tr>
+      <w:tr>
+        <w:tc>
+          <w:tcPr>
+            <w:tcW w:type="dxa" w:w="4320"/>
+            <w:shd w:val="clear" w:color="auto" w:fill="F4F6FA"/>
+          </w:tcPr>
+          <w:p>
+            <w:r/>
+            <w:r>
+              <w:rPr>
+                <w:rFonts w:ascii="Consolas" w:hAnsi="Consolas"/>
+                <w:color w:val="334455"/>
+                <w:sz w:val="19"/>
+              </w:rPr>
+              <w:t>ledger_risk_per_contract</w:t>
+            </w:r>
+          </w:p>
+        </w:tc>
+        <w:tc>
+          <w:tcPr>
+            <w:tcW w:type="dxa" w:w="4320"/>
+            <w:shd w:val="clear" w:color="auto" w:fill="F4F6FA"/>
+          </w:tcPr>
+          <w:p>
+            <w:r/>
+            <w:r>
+              <w:rPr>
+                <w:rFonts w:ascii="Consolas" w:hAnsi="Consolas"/>
+                <w:color w:val="334455"/>
+                <w:sz w:val="19"/>
+              </w:rPr>
+              <w:t>booked_risk(basis, 1)</w:t>
+            </w:r>
+            <w:r>
+              <w:rPr/>
+              <w:t xml:space="preserve"> — the booked risk of one contract, for display. ⚠ Do not multiply it by a quantity: it is cent-rounded, and a sub-cent per-share figure books differently (use the basis)</w:t>
+            </w:r>
+          </w:p>
+        </w:tc>
+      </w:tr>
+      <w:tr>
+        <w:tc>
+          <w:tcPr>
+            <w:tcW w:type="dxa" w:w="4320"/>
+          </w:tcPr>
+          <w:p>
+            <w:r/>
+            <w:r>
+              <w:rPr>
+                <w:rFonts w:ascii="Consolas" w:hAnsi="Consolas"/>
+                <w:color w:val="334455"/>
+                <w:sz w:val="19"/>
+              </w:rPr>
+              <w:t>friction_pct</w:t>
+            </w:r>
+          </w:p>
+        </w:tc>
+        <w:tc>
+          <w:tcPr>
+            <w:tcW w:type="dxa" w:w="4320"/>
+          </w:tcPr>
+          <w:p>
+            <w:r/>
+            <w:r>
+              <w:rPr/>
+              <w:t xml:space="preserve">The round-trip bid-ask width as a percent of the per-share credit or debit. </w:t>
+            </w:r>
+            <w:r>
+              <w:rPr>
+                <w:rFonts w:ascii="Consolas" w:hAnsi="Consolas"/>
+                <w:color w:val="334455"/>
+                <w:sz w:val="19"/>
+              </w:rPr>
+              <w:t>null</w:t>
+            </w:r>
+            <w:r>
+              <w:rPr/>
+              <w:t xml:space="preserve"> for any row holding a share leg, and when a leg's quote is missing or crossed</w:t>
+            </w:r>
+          </w:p>
+        </w:tc>
+      </w:tr>
+      <w:tr>
+        <w:tc>
+          <w:tcPr>
+            <w:tcW w:type="dxa" w:w="4320"/>
+            <w:shd w:val="clear" w:color="auto" w:fill="F4F6FA"/>
+          </w:tcPr>
+          <w:p>
+            <w:r/>
+            <w:r>
+              <w:rPr>
+                <w:rFonts w:ascii="Consolas" w:hAnsi="Consolas"/>
+                <w:color w:val="334455"/>
+                <w:sz w:val="19"/>
+              </w:rPr>
+              <w:t>em_to_expiry</w:t>
+            </w:r>
+          </w:p>
+        </w:tc>
+        <w:tc>
+          <w:tcPr>
+            <w:tcW w:type="dxa" w:w="4320"/>
+            <w:shd w:val="clear" w:color="auto" w:fill="F4F6FA"/>
+          </w:tcPr>
+          <w:p>
+            <w:r/>
+            <w:r>
+              <w:rPr/>
+              <w:t>The daily expected move × √max(DTE, 1), in dollars</w:t>
+            </w:r>
+          </w:p>
+        </w:tc>
+      </w:tr>
+      <w:tr>
+        <w:tc>
+          <w:tcPr>
+            <w:tcW w:type="dxa" w:w="4320"/>
+          </w:tcPr>
+          <w:p>
+            <w:r/>
+            <w:r>
+              <w:rPr>
+                <w:rFonts w:ascii="Consolas" w:hAnsi="Consolas"/>
+                <w:color w:val="334455"/>
+                <w:sz w:val="19"/>
+              </w:rPr>
+              <w:t>vol_floor</w:t>
+            </w:r>
+          </w:p>
+        </w:tc>
+        <w:tc>
+          <w:tcPr>
+            <w:tcW w:type="dxa" w:w="4320"/>
+          </w:tcPr>
+          <w:p>
+            <w:r/>
+            <w:r>
+              <w:rPr/>
+              <w:t>The IV-rank floor for the row's trade type (</w:t>
+            </w:r>
+            <w:r>
+              <w:rPr>
+                <w:rFonts w:ascii="Consolas" w:hAnsi="Consolas"/>
+                <w:color w:val="334455"/>
+                <w:sz w:val="19"/>
+              </w:rPr>
+              <w:t>config/scanner.toml</w:t>
+            </w:r>
+            <w:r>
+              <w:rPr/>
+              <w:t>); a Directional row takes its DTE window's — DTE 0–4 the 0-DTE floor, later the swing floor</w:t>
+            </w:r>
+          </w:p>
+        </w:tc>
+      </w:tr>
+      <w:tr>
+        <w:tc>
+          <w:tcPr>
+            <w:tcW w:type="dxa" w:w="4320"/>
+            <w:shd w:val="clear" w:color="auto" w:fill="F4F6FA"/>
+          </w:tcPr>
+          <w:p>
+            <w:r/>
+            <w:r>
+              <w:rPr>
+                <w:rFonts w:ascii="Consolas" w:hAnsi="Consolas"/>
+                <w:color w:val="334455"/>
+                <w:sz w:val="19"/>
+              </w:rPr>
+              <w:t>iv_rank_known</w:t>
+            </w:r>
+          </w:p>
+        </w:tc>
+        <w:tc>
+          <w:tcPr>
+            <w:tcW w:type="dxa" w:w="4320"/>
+            <w:shd w:val="clear" w:color="auto" w:fill="F4F6FA"/>
+          </w:tcPr>
+          <w:p>
+            <w:r/>
+            <w:r>
+              <w:rPr/>
+              <w:t>Whether the row had an IV rank to gate on</w:t>
+            </w:r>
+          </w:p>
+        </w:tc>
+      </w:tr>
+      <w:tr>
+        <w:tc>
+          <w:tcPr>
+            <w:tcW w:type="dxa" w:w="4320"/>
+          </w:tcPr>
+          <w:p>
+            <w:r/>
+            <w:r>
+              <w:rPr>
+                <w:rFonts w:ascii="Consolas" w:hAnsi="Consolas"/>
+                <w:color w:val="334455"/>
+                <w:sz w:val="19"/>
+              </w:rPr>
+              <w:t>earnings_status</w:t>
+            </w:r>
+            <w:r>
+              <w:rPr/>
+              <w:t xml:space="preserve"> · </w:t>
+            </w:r>
+            <w:r>
+              <w:rPr>
+                <w:rFonts w:ascii="Consolas" w:hAnsi="Consolas"/>
+                <w:color w:val="334455"/>
+                <w:sz w:val="19"/>
+              </w:rPr>
+              <w:t>earnings_date</w:t>
+            </w:r>
+          </w:p>
+        </w:tc>
+        <w:tc>
+          <w:tcPr>
+            <w:tcW w:type="dxa" w:w="4320"/>
+          </w:tcPr>
+          <w:p>
+            <w:r/>
+            <w:r>
+              <w:rPr/>
+              <w:t>The earnings coverage and next report date. Stamped on scanner and Strategy Finder rows; an income row already carries its own</w:t>
+            </w:r>
+          </w:p>
+        </w:tc>
+      </w:tr>
+    </w:tbl>
+    <w:p/>
+    <w:p>
+      <w:r>
+        <w:rPr>
+          <w:rFonts w:ascii="Consolas" w:hAnsi="Consolas"/>
+          <w:color w:val="334455"/>
+          <w:sz w:val="19"/>
+        </w:rPr>
+        <w:t>cache:options:ledger_caps</w:t>
+      </w:r>
+      <w:r>
+        <w:rPr/>
+        <w:t xml:space="preserve"> (event </w:t>
+      </w:r>
+      <w:r>
+        <w:rPr>
+          <w:rFonts w:ascii="Consolas" w:hAnsi="Consolas"/>
+          <w:color w:val="334455"/>
+          <w:sz w:val="19"/>
+        </w:rPr>
+        <w:t>events:options:ledger_caps</w:t>
+      </w:r>
+      <w:r>
+        <w:rPr/>
+        <w:t>) — the Paper</w:t>
+        <w:br/>
+        <w:t>Ledger's book, as the Paper dialog's preview reads it:</w:t>
+        <w:br/>
+      </w:r>
+      <w:r>
+        <w:rPr>
+          <w:rFonts w:ascii="Consolas" w:hAnsi="Consolas"/>
+          <w:color w:val="334455"/>
+          <w:sz w:val="19"/>
+        </w:rPr>
+        <w:t>{limits, starting_balance, realized_pnl, equity, open[], sectors, unmapped_prefix}</w:t>
+      </w:r>
+      <w:r>
+        <w:rPr/>
+        <w:t>.</w:t>
+        <w:br/>
+      </w:r>
+      <w:r>
+        <w:rPr>
+          <w:rFonts w:ascii="Consolas" w:hAnsi="Consolas"/>
+          <w:color w:val="334455"/>
+          <w:sz w:val="19"/>
+        </w:rPr>
+        <w:t>limits</w:t>
+      </w:r>
+      <w:r>
+        <w:rPr/>
+        <w:t xml:space="preserve"> is the Ledger's rung map (</w:t>
+      </w:r>
+      <w:r>
+        <w:rPr>
+          <w:rFonts w:ascii="Consolas" w:hAnsi="Consolas"/>
+          <w:color w:val="334455"/>
+          <w:sz w:val="19"/>
+        </w:rPr>
+        <w:t>max_risk_per_trade</w:t>
+      </w:r>
+      <w:r>
+        <w:rPr/>
+        <w:t xml:space="preserve">, </w:t>
+      </w:r>
+      <w:r>
+        <w:rPr>
+          <w:rFonts w:ascii="Consolas" w:hAnsi="Consolas"/>
+          <w:color w:val="334455"/>
+          <w:sz w:val="19"/>
+        </w:rPr>
+        <w:t>max_deployed_risk_pct</w:t>
+      </w:r>
+      <w:r>
+        <w:rPr/>
+        <w:t>,</w:t>
+        <w:br/>
+      </w:r>
+      <w:r>
+        <w:rPr>
+          <w:rFonts w:ascii="Consolas" w:hAnsi="Consolas"/>
+          <w:color w:val="334455"/>
+          <w:sz w:val="19"/>
+        </w:rPr>
+        <w:t>max_positions_per_symbol</w:t>
+      </w:r>
+      <w:r>
+        <w:rPr/>
+        <w:t xml:space="preserve">, </w:t>
+      </w:r>
+      <w:r>
+        <w:rPr>
+          <w:rFonts w:ascii="Consolas" w:hAnsi="Consolas"/>
+          <w:color w:val="334455"/>
+          <w:sz w:val="19"/>
+        </w:rPr>
+        <w:t>max_risk_per_symbol</w:t>
+      </w:r>
+      <w:r>
+        <w:rPr/>
+        <w:t xml:space="preserve">, </w:t>
+      </w:r>
+      <w:r>
+        <w:rPr>
+          <w:rFonts w:ascii="Consolas" w:hAnsi="Consolas"/>
+          <w:color w:val="334455"/>
+          <w:sz w:val="19"/>
+        </w:rPr>
+        <w:t>max_positions_per_sector</w:t>
+      </w:r>
+      <w:r>
+        <w:rPr/>
+        <w:t>,</w:t>
+        <w:br/>
+      </w:r>
+      <w:r>
+        <w:rPr>
+          <w:rFonts w:ascii="Consolas" w:hAnsi="Consolas"/>
+          <w:color w:val="334455"/>
+          <w:sz w:val="19"/>
+        </w:rPr>
+        <w:t>max_risk_per_sector</w:t>
+      </w:r>
+      <w:r>
+        <w:rPr/>
+        <w:t xml:space="preserve">, </w:t>
+      </w:r>
+      <w:r>
+        <w:rPr>
+          <w:rFonts w:ascii="Consolas" w:hAnsi="Consolas"/>
+          <w:color w:val="334455"/>
+          <w:sz w:val="19"/>
+        </w:rPr>
+        <w:t>max_positions_per_expiry</w:t>
+      </w:r>
+      <w:r>
+        <w:rPr/>
+        <w:t xml:space="preserve">); </w:t>
+      </w:r>
+      <w:r>
+        <w:rPr>
+          <w:rFonts w:ascii="Consolas" w:hAnsi="Consolas"/>
+          <w:color w:val="334455"/>
+          <w:sz w:val="19"/>
+        </w:rPr>
+        <w:t>equity</w:t>
+      </w:r>
+      <w:r>
+        <w:rPr/>
+        <w:t xml:space="preserve"> is </w:t>
+      </w:r>
+      <w:r>
+        <w:rPr>
+          <w:rFonts w:ascii="Consolas" w:hAnsi="Consolas"/>
+          <w:color w:val="334455"/>
+          <w:sz w:val="19"/>
+        </w:rPr>
+        <w:t>starting_balance</w:t>
+      </w:r>
+      <w:r>
+        <w:rPr/>
+        <w:t xml:space="preserve"> +</w:t>
+        <w:br/>
+      </w:r>
+      <w:r>
+        <w:rPr>
+          <w:rFonts w:ascii="Consolas" w:hAnsi="Consolas"/>
+          <w:color w:val="334455"/>
+          <w:sz w:val="19"/>
+        </w:rPr>
+        <w:t>realized_pnl</w:t>
+      </w:r>
+      <w:r>
+        <w:rPr/>
+        <w:t xml:space="preserve"> of closed trades; each </w:t>
+      </w:r>
+      <w:r>
+        <w:rPr>
+          <w:rFonts w:ascii="Consolas" w:hAnsi="Consolas"/>
+          <w:color w:val="334455"/>
+          <w:sz w:val="19"/>
+        </w:rPr>
+        <w:t>open</w:t>
+      </w:r>
+      <w:r>
+        <w:rPr/>
+        <w:t xml:space="preserve"> row is</w:t>
+        <w:br/>
+      </w:r>
+      <w:r>
+        <w:rPr>
+          <w:rFonts w:ascii="Consolas" w:hAnsi="Consolas"/>
+          <w:color w:val="334455"/>
+          <w:sz w:val="19"/>
+        </w:rPr>
+        <w:t>{symbol, expiration, max_loss_total, sector}</w:t>
+      </w:r>
+      <w:r>
+        <w:rPr/>
+        <w:t xml:space="preserve">; </w:t>
+      </w:r>
+      <w:r>
+        <w:rPr>
+          <w:rFonts w:ascii="Consolas" w:hAnsi="Consolas"/>
+          <w:color w:val="334455"/>
+          <w:sz w:val="19"/>
+        </w:rPr>
+        <w:t>sectors</w:t>
+      </w:r>
+      <w:r>
+        <w:rPr/>
+        <w:t xml:space="preserve"> is the </w:t>
+      </w:r>
+      <w:r>
+        <w:rPr>
+          <w:b/>
+        </w:rPr>
+        <w:t>whole</w:t>
+      </w:r>
+      <w:r>
+        <w:rPr/>
+        <w:br/>
+      </w:r>
+      <w:r>
+        <w:rPr>
+          <w:rFonts w:ascii="Consolas" w:hAnsi="Consolas"/>
+          <w:color w:val="334455"/>
+          <w:sz w:val="19"/>
+        </w:rPr>
+        <w:t>config/sectors.toml</w:t>
+      </w:r>
+      <w:r>
+        <w:rPr/>
+        <w:t xml:space="preserve"> symbol → sector table, so a reader buckets any symbol with</w:t>
+        <w:br/>
+      </w:r>
+      <w:r>
+        <w:rPr>
+          <w:rFonts w:ascii="Consolas" w:hAnsi="Consolas"/>
+          <w:color w:val="334455"/>
+          <w:sz w:val="19"/>
+        </w:rPr>
+        <w:t>shared.book_caps.sector_bucket(sectors, symbol)</w:t>
+      </w:r>
+      <w:r>
+        <w:rPr/>
+        <w:t xml:space="preserve"> (an unmapped symbol is its own</w:t>
+        <w:br/>
+      </w:r>
+      <w:r>
+        <w:rPr>
+          <w:rFonts w:ascii="Consolas" w:hAnsi="Consolas"/>
+          <w:color w:val="334455"/>
+          <w:sz w:val="19"/>
+        </w:rPr>
+        <w:t>unmapped_prefix</w:t>
+      </w:r>
+      <w:r>
+        <w:rPr/>
+        <w:t xml:space="preserve"> + symbol bucket; </w:t>
+      </w:r>
+      <w:r>
+        <w:rPr>
+          <w:rFonts w:ascii="Consolas" w:hAnsi="Consolas"/>
+          <w:color w:val="334455"/>
+          <w:sz w:val="19"/>
+        </w:rPr>
+        <w:t>unmapped_prefix</w:t>
+      </w:r>
+      <w:r>
+        <w:rPr/>
+        <w:t xml:space="preserve"> is informational). Written by</w:t>
+        <w:br/>
+      </w:r>
+      <w:r>
+        <w:rPr>
+          <w:rFonts w:ascii="Consolas" w:hAnsi="Consolas"/>
+          <w:color w:val="334455"/>
+          <w:sz w:val="19"/>
+        </w:rPr>
+        <w:t>handlers.refresh_ledger_caps</w:t>
+      </w:r>
+      <w:r>
+        <w:rPr/>
+        <w:t xml:space="preserve"> with </w:t>
+      </w:r>
+      <w:r>
+        <w:rPr>
+          <w:rFonts w:ascii="Consolas" w:hAnsi="Consolas"/>
+          <w:color w:val="334455"/>
+          <w:sz w:val="19"/>
+        </w:rPr>
+        <w:t>skip_unchanged</w:t>
+      </w:r>
+      <w:r>
+        <w:rPr/>
+        <w:t xml:space="preserve"> (an unchanged book bumps no</w:t>
+        <w:br/>
+        <w:t xml:space="preserve">version and fires no event), under a lock, at the end of every </w:t>
+      </w:r>
+      <w:r>
+        <w:rPr>
+          <w:rFonts w:ascii="Consolas" w:hAnsi="Consolas"/>
+          <w:color w:val="334455"/>
+          <w:sz w:val="19"/>
+        </w:rPr>
+        <w:t>refresh_paper_trades</w:t>
+      </w:r>
+      <w:r>
+        <w:rPr/>
+        <w:br/>
+        <w:t xml:space="preserve">— every </w:t>
+      </w:r>
+      <w:r>
+        <w:rPr>
+          <w:rFonts w:ascii="Consolas" w:hAnsi="Consolas"/>
+          <w:color w:val="334455"/>
+          <w:sz w:val="19"/>
+        </w:rPr>
+        <w:t>paper_*</w:t>
+      </w:r>
+      <w:r>
+        <w:rPr/>
+        <w:t xml:space="preserve"> Ledger command and the paper-manage cycle — even when that view's</w:t>
+        <w:br/>
+        <w:t>own publish raises, and once at service start. A failure is a degrade</w:t>
+        <w:br/>
+        <w:t>(</w:t>
+      </w:r>
+      <w:r>
+        <w:rPr>
+          <w:rFonts w:ascii="Consolas" w:hAnsi="Consolas"/>
+          <w:color w:val="334455"/>
+          <w:sz w:val="19"/>
+        </w:rPr>
+        <w:t>options.ledger_caps</w:t>
+      </w:r>
+      <w:r>
+        <w:rPr/>
+        <w:t>), never a raise. No TTL.</w:t>
+      </w:r>
+    </w:p>
+    <w:p>
       <w:pPr>
         <w:pStyle w:val="Heading2"/>
       </w:pPr>
@@ -13691,6 +14590,17 @@
           <w:sz w:val="18"/>
         </w:rPr>
         <w:t>cache:options:paper_create     events:options:paper_create   (TTL 600 s; the Paper button's answer)</w:t>
+      </w:r>
+      <w:r>
+        <w:br/>
+      </w:r>
+      <w:r>
+        <w:rPr>
+          <w:rFonts w:ascii="Consolas" w:hAnsi="Consolas"/>
+          <w:color w:val="223344"/>
+          <w:sz w:val="18"/>
+        </w:rPr>
+        <w:t>cache:options:ledger_caps      events:options:ledger_caps    (the Paper Ledger's book, for the Paper dialog preview)</w:t>
       </w:r>
       <w:r>
         <w:br/>

</xml_diff>

<commit_message>
docs: Phase 3 wording fixes from review
Co-Authored-By: Claude Opus 5 <noreply@anthropic.com>
</commit_message>
<xml_diff>
--- a/docs/manuals/api-reference/api-reference.docx
+++ b/docs/manuals/api-reference/api-reference.docx
@@ -8871,7 +8871,34 @@
       </w:r>
       <w:r>
         <w:rPr/>
-        <w:t xml:space="preserve">). Every stamp is </w:t>
+        <w:t>). On a scan, a symbol whose earnings lookup fails also records</w:t>
+        <w:br/>
+      </w:r>
+      <w:r>
+        <w:rPr>
+          <w:rFonts w:ascii="Consolas" w:hAnsi="Consolas"/>
+          <w:color w:val="334455"/>
+          <w:sz w:val="19"/>
+        </w:rPr>
+        <w:t>options.stamp_scan_earnings</w:t>
+      </w:r>
+      <w:r>
+        <w:rPr/>
+        <w:t xml:space="preserve"> (once per symbol) and is stamped </w:t>
+      </w:r>
+      <w:r>
+        <w:rPr>
+          <w:rFonts w:ascii="Consolas" w:hAnsi="Consolas"/>
+          <w:color w:val="334455"/>
+          <w:sz w:val="19"/>
+        </w:rPr>
+        <w:t>not_listed</w:t>
+      </w:r>
+      <w:r>
+        <w:rPr/>
+        <w:t xml:space="preserve"> with no</w:t>
+        <w:br/>
+        <w:t xml:space="preserve">date. Every stamp is </w:t>
       </w:r>
       <w:r>
         <w:rPr>
@@ -9590,7 +9617,7 @@
       <w:r>
         <w:rPr/>
         <w:br/>
-        <w:t xml:space="preserve">— every </w:t>
+        <w:t>— after every Ledger-changing command (</w:t>
       </w:r>
       <w:r>
         <w:rPr>
@@ -9598,11 +9625,85 @@
           <w:color w:val="334455"/>
           <w:sz w:val="19"/>
         </w:rPr>
-        <w:t>paper_*</w:t>
+        <w:t>paper_create</w:t>
       </w:r>
       <w:r>
         <w:rPr/>
-        <w:t xml:space="preserve"> Ledger command and the paper-manage cycle — even when that view's</w:t>
+        <w:t xml:space="preserve">, </w:t>
+      </w:r>
+      <w:r>
+        <w:rPr>
+          <w:rFonts w:ascii="Consolas" w:hAnsi="Consolas"/>
+          <w:color w:val="334455"/>
+          <w:sz w:val="19"/>
+        </w:rPr>
+        <w:t>paper_reload</w:t>
+      </w:r>
+      <w:r>
+        <w:rPr/>
+        <w:t xml:space="preserve">, </w:t>
+      </w:r>
+      <w:r>
+        <w:rPr>
+          <w:rFonts w:ascii="Consolas" w:hAnsi="Consolas"/>
+          <w:color w:val="334455"/>
+          <w:sz w:val="19"/>
+        </w:rPr>
+        <w:t>paper_close</w:t>
+      </w:r>
+      <w:r>
+        <w:rPr/>
+        <w:t>,</w:t>
+        <w:br/>
+      </w:r>
+      <w:r>
+        <w:rPr>
+          <w:rFonts w:ascii="Consolas" w:hAnsi="Consolas"/>
+          <w:color w:val="334455"/>
+          <w:sz w:val="19"/>
+        </w:rPr>
+        <w:t>paper_delete</w:t>
+      </w:r>
+      <w:r>
+        <w:rPr/>
+        <w:t xml:space="preserve">, </w:t>
+      </w:r>
+      <w:r>
+        <w:rPr>
+          <w:rFonts w:ascii="Consolas" w:hAnsi="Consolas"/>
+          <w:color w:val="334455"/>
+          <w:sz w:val="19"/>
+        </w:rPr>
+        <w:t>paper_delete_closed</w:t>
+      </w:r>
+      <w:r>
+        <w:rPr/>
+        <w:t xml:space="preserve">; not </w:t>
+      </w:r>
+      <w:r>
+        <w:rPr>
+          <w:rFonts w:ascii="Consolas" w:hAnsi="Consolas"/>
+          <w:color w:val="334455"/>
+          <w:sz w:val="19"/>
+        </w:rPr>
+        <w:t>paper_analyze</w:t>
+      </w:r>
+      <w:r>
+        <w:rPr/>
+        <w:t>, which publishes only</w:t>
+        <w:br/>
+      </w:r>
+      <w:r>
+        <w:rPr>
+          <w:rFonts w:ascii="Consolas" w:hAnsi="Consolas"/>
+          <w:color w:val="334455"/>
+          <w:sz w:val="19"/>
+        </w:rPr>
+        <w:t>cache:options:paper_analyze</w:t>
+      </w:r>
+      <w:r>
+        <w:rPr/>
+        <w:t>) and the paper-manage cycle — even when that view's</w:t>
         <w:br/>
         <w:t>own publish raises, and once at service start. A failure is a degrade</w:t>
         <w:br/>

</xml_diff>

<commit_message>
docs(manuals): correct the Tier-1 import list and options_svc cadences
The API Reference said the GUI imports `shared.contracts` (it imports it
nowhere) and gave GEX collection as 2-min slots from 08:30 CT and paper
auto-manage as every 5 minutes. Verified against the code: GEX is 1-min
from 08:00 CT (06:30 for ETH-eligible symbols), the Paper Portfolio
entry+manage cycle is hourly 09:00-14:00 CT, the driver book manages every
minute and captured signals every five.

Same stale cadences corrected in the Technical Reference's intraday
collection paragraph, the User Guide's Rescue detection line, and the
options_svc scheduler/handlers comments and docstrings. Rebuilt the three
changed manuals (glossary + reference guide rebuilt only a date stamp and
were left out).

Co-Authored-By: Claude Opus 5 <noreply@anthropic.com>
</commit_message>
<xml_diff>
--- a/docs/manuals/api-reference/api-reference.docx
+++ b/docs/manuals/api-reference/api-reference.docx
@@ -32,7 +32,7 @@
           <w:color w:val="5B6678"/>
           <w:sz w:val="18"/>
         </w:rPr>
-        <w:t>NeuralStrike · Generated 2026-09-15</w:t>
+        <w:t>NeuralStrike · Generated 2026-09-16</w:t>
       </w:r>
     </w:p>
     <w:p/>
@@ -1871,7 +1871,7 @@
         <w:pStyle w:val="ListBullet"/>
       </w:pPr>
       <w:r>
-        <w:t xml:space="preserve">The GUI imports only </w:t>
+        <w:t xml:space="preserve">The GUI imports </w:t>
       </w:r>
       <w:r>
         <w:rPr>
@@ -1882,7 +1882,7 @@
         <w:t>nicegui</w:t>
       </w:r>
       <w:r>
-        <w:t xml:space="preserve"> + </w:t>
+        <w:t xml:space="preserve"> and </w:t>
       </w:r>
       <w:r>
         <w:rPr>
@@ -1893,7 +1893,7 @@
         <w:t>shared.bus</w:t>
       </w:r>
       <w:r>
-        <w:t xml:space="preserve"> + </w:t>
+        <w:t xml:space="preserve"> (never </w:t>
       </w:r>
       <w:r>
         <w:rPr>
@@ -1901,12 +1901,140 @@
           <w:color w:val="334455"/>
           <w:sz w:val="19"/>
         </w:rPr>
+        <w:t>redis</w:t>
+      </w:r>
+      <w:r>
+        <w:t xml:space="preserve"> directly), plus a short</w:t>
+        <w:br/>
+        <w:t xml:space="preserve">  allow-list: </w:t>
+      </w:r>
+      <w:r>
+        <w:rPr>
+          <w:rFonts w:ascii="Consolas" w:hAnsi="Consolas"/>
+          <w:color w:val="334455"/>
+          <w:sz w:val="19"/>
+        </w:rPr>
+        <w:t>shared.market_calendar</w:t>
+      </w:r>
+      <w:r>
+        <w:t xml:space="preserve">, </w:t>
+      </w:r>
+      <w:r>
+        <w:rPr>
+          <w:rFonts w:ascii="Consolas" w:hAnsi="Consolas"/>
+          <w:color w:val="334455"/>
+          <w:sz w:val="19"/>
+        </w:rPr>
+        <w:t>shared.symbols</w:t>
+      </w:r>
+      <w:r>
+        <w:t xml:space="preserve">, </w:t>
+      </w:r>
+      <w:r>
+        <w:rPr>
+          <w:rFonts w:ascii="Consolas" w:hAnsi="Consolas"/>
+          <w:color w:val="334455"/>
+          <w:sz w:val="19"/>
+        </w:rPr>
+        <w:t>shared.calibration</w:t>
+      </w:r>
+      <w:r>
+        <w:br/>
+        <w:t xml:space="preserve">  (only </w:t>
+      </w:r>
+      <w:r>
+        <w:rPr>
+          <w:rFonts w:ascii="Consolas" w:hAnsi="Consolas"/>
+          <w:color w:val="334455"/>
+          <w:sz w:val="19"/>
+        </w:rPr>
+        <w:t>bucket_key</w:t>
+      </w:r>
+      <w:r>
+        <w:t xml:space="preserve">), </w:t>
+      </w:r>
+      <w:r>
+        <w:rPr>
+          <w:rFonts w:ascii="Consolas" w:hAnsi="Consolas"/>
+          <w:color w:val="334455"/>
+          <w:sz w:val="19"/>
+        </w:rPr>
+        <w:t>repo_paths</w:t>
+      </w:r>
+      <w:r>
+        <w:t xml:space="preserve">, </w:t>
+      </w:r>
+      <w:r>
+        <w:rPr>
+          <w:rFonts w:ascii="Consolas" w:hAnsi="Consolas"/>
+          <w:color w:val="334455"/>
+          <w:sz w:val="19"/>
+        </w:rPr>
+        <w:t>requests</w:t>
+      </w:r>
+      <w:r>
+        <w:t xml:space="preserve"> (only for the </w:t>
+      </w:r>
+      <w:r>
+        <w:rPr>
+          <w:rFonts w:ascii="Consolas" w:hAnsi="Consolas"/>
+          <w:color w:val="334455"/>
+          <w:sz w:val="19"/>
+        </w:rPr>
+        <w:t>/health</w:t>
+      </w:r>
+      <w:r>
+        <w:t xml:space="preserve"> fan-out),</w:t>
+        <w:br/>
+        <w:t xml:space="preserve">  </w:t>
+      </w:r>
+      <w:r>
+        <w:rPr>
+          <w:rFonts w:ascii="Consolas" w:hAnsi="Consolas"/>
+          <w:color w:val="334455"/>
+          <w:sz w:val="19"/>
+        </w:rPr>
+        <w:t>fastapi.responses</w:t>
+      </w:r>
+      <w:r>
+        <w:t xml:space="preserve"> (report routes) and a lazy </w:t>
+      </w:r>
+      <w:r>
+        <w:rPr>
+          <w:rFonts w:ascii="Consolas" w:hAnsi="Consolas"/>
+          <w:color w:val="334455"/>
+          <w:sz w:val="19"/>
+        </w:rPr>
+        <w:t>edge_tts</w:t>
+      </w:r>
+      <w:r>
+        <w:t xml:space="preserve"> (spoken alerts). It</w:t>
+        <w:br/>
+        <w:t xml:space="preserve">  does </w:t>
+      </w:r>
+      <w:r>
+        <w:rPr>
+          <w:b/>
+        </w:rPr>
+        <w:t>not</w:t>
+      </w:r>
+      <w:r>
+        <w:t xml:space="preserve"> import </w:t>
+      </w:r>
+      <w:r>
+        <w:rPr>
+          <w:rFonts w:ascii="Consolas" w:hAnsi="Consolas"/>
+          <w:color w:val="334455"/>
+          <w:sz w:val="19"/>
+        </w:rPr>
         <w:t>shared.contracts</w:t>
       </w:r>
       <w:r>
-        <w:t>. It never</w:t>
+        <w:t xml:space="preserve"> — contracts are validated service-side on</w:t>
         <w:br/>
-        <w:t xml:space="preserve">  imports an engine, never calls Schwab, and never computes domain results.</w:t>
+        <w:t xml:space="preserve">  write. It never imports an engine, never calls Schwab, and never computes domain</w:t>
+        <w:br/>
+        <w:t xml:space="preserve">  results.</w:t>
       </w:r>
     </w:p>
     <w:p>
@@ -5683,9 +5811,17 @@
         <w:rPr/>
         <w:t xml:space="preserve"> auto-scan (15-min slots,</w:t>
         <w:br/>
-        <w:t>08:00–15:15 CT), GEX collection (2-min slots, 08:30–15:20 CT), paper auto-manage</w:t>
+        <w:t>08:00–15:15 CT), GEX collection (1-min slots, 08:00–15:20 CT; from 06:30 for</w:t>
         <w:br/>
-        <w:t>(5 min in market hours), header tick (each 30 s, skip-unchanged).</w:t>
+        <w:t>ETH-eligible symbols), Paper Portfolio entry + manage (hourly at the top of the</w:t>
+        <w:br/>
+        <w:t>hour, 09:00–14:00 CT, no 15:00 run — also refreshes the Paper Ledger), driver paper</w:t>
+        <w:br/>
+        <w:t>auto-manage (1-min slots, 08:00–15:15 CT), captured-signal auto-manage (5-min</w:t>
+        <w:br/>
+        <w:t>slots, 08:00–15:15 CT, when auto-close is on), header tick (each 30 s,</w:t>
+        <w:br/>
+        <w:t>skip-unchanged).</w:t>
       </w:r>
     </w:p>
     <w:p>

</xml_diff>

<commit_message>
feat(desk): MARKET SUMMARY quotes the latest market report; retire market_svc's Claude summary
The Desk frame now shows up to five highlights (the published report's own
section headlines), which report they came from, and a link to the full
report. market_svc reads deploy/site/reports/latest.html when it changes
(a stat per poll) and publishes cache:market:summary; no Claude call.
The ticker leads with the report's headline. The change-driven Claude
sentence, its fingerprint gate, fact tables, checks and tests are removed.

Co-Authored-By: Claude Opus 5 <noreply@anthropic.com>
</commit_message>
<xml_diff>
--- a/docs/manuals/api-reference/api-reference.docx
+++ b/docs/manuals/api-reference/api-reference.docx
@@ -4591,35 +4591,131 @@
                 <w:color w:val="334455"/>
                 <w:sz w:val="19"/>
               </w:rPr>
-              <w:t>narrative</w:t>
-            </w:r>
-            <w:r>
-              <w:rPr/>
-              <w:t xml:space="preserve"> (a short Claude-written verdict; empty when there is no key or the call failed), </w:t>
-            </w:r>
-            <w:r>
-              <w:rPr>
-                <w:rFonts w:ascii="Consolas" w:hAnsi="Consolas"/>
-                <w:color w:val="334455"/>
-                <w:sz w:val="19"/>
-              </w:rPr>
-              <w:t>inputs</w:t>
-            </w:r>
-            <w:r>
-              <w:rPr/>
-              <w:t xml:space="preserve"> (the six-reading packet the sentence was written from — </w:t>
-            </w:r>
-            <w:r>
-              <w:rPr>
-                <w:rFonts w:ascii="Consolas" w:hAnsi="Consolas"/>
-                <w:color w:val="334455"/>
-                <w:sz w:val="19"/>
-              </w:rPr>
-              <w:t>{}</w:t>
-            </w:r>
-            <w:r>
-              <w:rPr/>
-              <w:t xml:space="preserve"> on an older writer), </w:t>
+              <w:t>headline</w:t>
+            </w:r>
+            <w:r>
+              <w:rPr/>
+              <w:t xml:space="preserve"> (the latest published market report's verdict title), </w:t>
+            </w:r>
+            <w:r>
+              <w:rPr>
+                <w:rFonts w:ascii="Consolas" w:hAnsi="Consolas"/>
+                <w:color w:val="334455"/>
+                <w:sz w:val="19"/>
+              </w:rPr>
+              <w:t>highlights</w:t>
+            </w:r>
+            <w:r>
+              <w:rPr/>
+              <w:t xml:space="preserve"> (its section headlines in report order, at most 5; the headline alone when the report has no sections), </w:t>
+            </w:r>
+            <w:r>
+              <w:rPr>
+                <w:rFonts w:ascii="Consolas" w:hAnsi="Consolas"/>
+                <w:color w:val="334455"/>
+                <w:sz w:val="19"/>
+              </w:rPr>
+              <w:t>slot</w:t>
+            </w:r>
+            <w:r>
+              <w:rPr/>
+              <w:t xml:space="preserve"> (</w:t>
+            </w:r>
+            <w:r>
+              <w:rPr>
+                <w:rFonts w:ascii="Consolas" w:hAnsi="Consolas"/>
+                <w:color w:val="334455"/>
+                <w:sz w:val="19"/>
+              </w:rPr>
+              <w:t>premarket</w:t>
+            </w:r>
+            <w:r>
+              <w:rPr/>
+              <w:t xml:space="preserve"> / </w:t>
+            </w:r>
+            <w:r>
+              <w:rPr>
+                <w:rFonts w:ascii="Consolas" w:hAnsi="Consolas"/>
+                <w:color w:val="334455"/>
+                <w:sz w:val="19"/>
+              </w:rPr>
+              <w:t>open</w:t>
+            </w:r>
+            <w:r>
+              <w:rPr/>
+              <w:t xml:space="preserve"> / </w:t>
+            </w:r>
+            <w:r>
+              <w:rPr>
+                <w:rFonts w:ascii="Consolas" w:hAnsi="Consolas"/>
+                <w:color w:val="334455"/>
+                <w:sz w:val="19"/>
+              </w:rPr>
+              <w:t>first_hour</w:t>
+            </w:r>
+            <w:r>
+              <w:rPr/>
+              <w:t xml:space="preserve"> / </w:t>
+            </w:r>
+            <w:r>
+              <w:rPr>
+                <w:rFonts w:ascii="Consolas" w:hAnsi="Consolas"/>
+                <w:color w:val="334455"/>
+                <w:sz w:val="19"/>
+              </w:rPr>
+              <w:t>midday</w:t>
+            </w:r>
+            <w:r>
+              <w:rPr/>
+              <w:t xml:space="preserve"> / </w:t>
+            </w:r>
+            <w:r>
+              <w:rPr>
+                <w:rFonts w:ascii="Consolas" w:hAnsi="Consolas"/>
+                <w:color w:val="334455"/>
+                <w:sz w:val="19"/>
+              </w:rPr>
+              <w:t>close</w:t>
+            </w:r>
+            <w:r>
+              <w:rPr/>
+              <w:t xml:space="preserve">), </w:t>
+            </w:r>
+            <w:r>
+              <w:rPr>
+                <w:rFonts w:ascii="Consolas" w:hAnsi="Consolas"/>
+                <w:color w:val="334455"/>
+                <w:sz w:val="19"/>
+              </w:rPr>
+              <w:t>slot_label</w:t>
+            </w:r>
+            <w:r>
+              <w:rPr/>
+              <w:t xml:space="preserve"> (the report's own name for the slot, e.g. "Market close"), </w:t>
+            </w:r>
+            <w:r>
+              <w:rPr>
+                <w:rFonts w:ascii="Consolas" w:hAnsi="Consolas"/>
+                <w:color w:val="334455"/>
+                <w:sz w:val="19"/>
+              </w:rPr>
+              <w:t>report_date</w:t>
+            </w:r>
+            <w:r>
+              <w:rPr/>
+              <w:t xml:space="preserve"> (</w:t>
+            </w:r>
+            <w:r>
+              <w:rPr>
+                <w:rFonts w:ascii="Consolas" w:hAnsi="Consolas"/>
+                <w:color w:val="334455"/>
+                <w:sz w:val="19"/>
+              </w:rPr>
+              <w:t>YYYY-MM-DD</w:t>
+            </w:r>
+            <w:r>
+              <w:rPr/>
+              <w:t xml:space="preserve">), </w:t>
             </w:r>
             <w:r>
               <w:rPr>
@@ -4631,7 +4727,31 @@
             </w:r>
             <w:r>
               <w:rPr/>
-              <w:t xml:space="preserve"> (UTC ISO of the write)</w:t>
+              <w:t xml:space="preserve"> (the report's own time stamp, e.g. "16:20 CT"), </w:t>
+            </w:r>
+            <w:r>
+              <w:rPr>
+                <w:rFonts w:ascii="Consolas" w:hAnsi="Consolas"/>
+                <w:color w:val="334455"/>
+                <w:sz w:val="19"/>
+              </w:rPr>
+              <w:t>report_url</w:t>
+            </w:r>
+            <w:r>
+              <w:rPr/>
+              <w:t xml:space="preserve"> (</w:t>
+            </w:r>
+            <w:r>
+              <w:rPr>
+                <w:rFonts w:ascii="Consolas" w:hAnsi="Consolas"/>
+                <w:color w:val="334455"/>
+                <w:sz w:val="19"/>
+              </w:rPr>
+              <w:t>https://&lt;SITE_HOST&gt;/report.html</w:t>
+            </w:r>
+            <w:r>
+              <w:rPr/>
+              <w:t>). Empty until a report has been published.</w:t>
             </w:r>
           </w:p>
         </w:tc>
@@ -12697,260 +12817,8 @@
           </w:p>
         </w:tc>
       </w:tr>
-      <w:tr>
-        <w:tc>
-          <w:tcPr>
-            <w:tcW w:type="dxa" w:w="2880"/>
-            <w:shd w:val="clear" w:color="auto" w:fill="F4F6FA"/>
-          </w:tcPr>
-          <w:p>
-            <w:r/>
-            <w:r>
-              <w:rPr>
-                <w:rFonts w:ascii="Consolas" w:hAnsi="Consolas"/>
-                <w:color w:val="334455"/>
-                <w:sz w:val="19"/>
-              </w:rPr>
-              <w:t>SUMMARY_MIN_GAP_SEC</w:t>
-            </w:r>
-          </w:p>
-        </w:tc>
-        <w:tc>
-          <w:tcPr>
-            <w:tcW w:type="dxa" w:w="2880"/>
-            <w:shd w:val="clear" w:color="auto" w:fill="F4F6FA"/>
-          </w:tcPr>
-          <w:p>
-            <w:r/>
-            <w:r>
-              <w:rPr>
-                <w:rFonts w:ascii="Consolas" w:hAnsi="Consolas"/>
-                <w:color w:val="334455"/>
-                <w:sz w:val="19"/>
-              </w:rPr>
-              <w:t>10 * 60</w:t>
-            </w:r>
-          </w:p>
-        </w:tc>
-        <w:tc>
-          <w:tcPr>
-            <w:tcW w:type="dxa" w:w="2880"/>
-            <w:shd w:val="clear" w:color="auto" w:fill="F4F6FA"/>
-          </w:tcPr>
-          <w:p>
-            <w:r/>
-            <w:r>
-              <w:rPr/>
-              <w:t>Minimum time between two Claude summary attempts, regardless of how often the readings change.</w:t>
-            </w:r>
-          </w:p>
-        </w:tc>
-      </w:tr>
-      <w:tr>
-        <w:tc>
-          <w:tcPr>
-            <w:tcW w:type="dxa" w:w="2880"/>
-          </w:tcPr>
-          <w:p>
-            <w:r/>
-            <w:r>
-              <w:rPr>
-                <w:rFonts w:ascii="Consolas" w:hAnsi="Consolas"/>
-                <w:color w:val="334455"/>
-                <w:sz w:val="19"/>
-              </w:rPr>
-              <w:t>SUMMARY_DAILY_CAP</w:t>
-            </w:r>
-          </w:p>
-        </w:tc>
-        <w:tc>
-          <w:tcPr>
-            <w:tcW w:type="dxa" w:w="2880"/>
-          </w:tcPr>
-          <w:p>
-            <w:r/>
-            <w:r>
-              <w:rPr>
-                <w:rFonts w:ascii="Consolas" w:hAnsi="Consolas"/>
-                <w:color w:val="334455"/>
-                <w:sz w:val="19"/>
-              </w:rPr>
-              <w:t>30</w:t>
-            </w:r>
-          </w:p>
-        </w:tc>
-        <w:tc>
-          <w:tcPr>
-            <w:tcW w:type="dxa" w:w="2880"/>
-          </w:tcPr>
-          <w:p>
-            <w:r/>
-            <w:r>
-              <w:rPr/>
-              <w:t>Maximum Claude summary attempts per CT calendar day; resets at the date change.</w:t>
-            </w:r>
-          </w:p>
-        </w:tc>
-      </w:tr>
     </w:tbl>
     <w:p/>
-    <w:p>
-      <w:r>
-        <w:rPr/>
-        <w:t xml:space="preserve">Also in </w:t>
-      </w:r>
-      <w:r>
-        <w:rPr>
-          <w:rFonts w:ascii="Consolas" w:hAnsi="Consolas"/>
-          <w:color w:val="334455"/>
-          <w:sz w:val="19"/>
-        </w:rPr>
-        <w:t>services/market_svc/compute.py</w:t>
-      </w:r>
-      <w:r>
-        <w:rPr/>
-        <w:t xml:space="preserve"> — the </w:t>
-      </w:r>
-      <w:r>
-        <w:rPr>
-          <w:b/>
-        </w:rPr>
-        <w:t>fingerprint</w:t>
-      </w:r>
-      <w:r>
-        <w:rPr/>
-        <w:t xml:space="preserve"> resolution the</w:t>
-        <w:br/>
-        <w:t xml:space="preserve">summary is written from, in </w:t>
-      </w:r>
-      <w:r>
-        <w:rPr>
-          <w:rFonts w:ascii="Consolas" w:hAnsi="Consolas"/>
-          <w:color w:val="334455"/>
-          <w:sz w:val="19"/>
-        </w:rPr>
-        <w:t>FINGERPRINT_COMPOSITE_STEP</w:t>
-      </w:r>
-      <w:r>
-        <w:rPr/>
-        <w:t xml:space="preserve"> (</w:t>
-      </w:r>
-      <w:r>
-        <w:rPr>
-          <w:rFonts w:ascii="Consolas" w:hAnsi="Consolas"/>
-          <w:color w:val="334455"/>
-          <w:sz w:val="19"/>
-        </w:rPr>
-        <w:t>0.5</w:t>
-      </w:r>
-      <w:r>
-        <w:rPr/>
-        <w:t>),</w:t>
-        <w:br/>
-      </w:r>
-      <w:r>
-        <w:rPr>
-          <w:rFonts w:ascii="Consolas" w:hAnsi="Consolas"/>
-          <w:color w:val="334455"/>
-          <w:sz w:val="19"/>
-        </w:rPr>
-        <w:t>FINGERPRINT_TREND_STEP</w:t>
-      </w:r>
-      <w:r>
-        <w:rPr/>
-        <w:t xml:space="preserve"> (</w:t>
-      </w:r>
-      <w:r>
-        <w:rPr>
-          <w:rFonts w:ascii="Consolas" w:hAnsi="Consolas"/>
-          <w:color w:val="334455"/>
-          <w:sz w:val="19"/>
-        </w:rPr>
-        <w:t>5.0</w:t>
-      </w:r>
-      <w:r>
-        <w:rPr/>
-        <w:t xml:space="preserve">), </w:t>
-      </w:r>
-      <w:r>
-        <w:rPr>
-          <w:rFonts w:ascii="Consolas" w:hAnsi="Consolas"/>
-          <w:color w:val="334455"/>
-          <w:sz w:val="19"/>
-        </w:rPr>
-        <w:t>FINGERPRINT_CONFIDENCE_STEP</w:t>
-      </w:r>
-      <w:r>
-        <w:rPr/>
-        <w:t xml:space="preserve"> (</w:t>
-      </w:r>
-      <w:r>
-        <w:rPr>
-          <w:rFonts w:ascii="Consolas" w:hAnsi="Consolas"/>
-          <w:color w:val="334455"/>
-          <w:sz w:val="19"/>
-        </w:rPr>
-        <w:t>0.1</w:t>
-      </w:r>
-      <w:r>
-        <w:rPr/>
-        <w:t>) and</w:t>
-        <w:br/>
-      </w:r>
-      <w:r>
-        <w:rPr>
-          <w:rFonts w:ascii="Consolas" w:hAnsi="Consolas"/>
-          <w:color w:val="334455"/>
-          <w:sz w:val="19"/>
-        </w:rPr>
-        <w:t>FINGERPRINT_SECTOR_TOLERANCE</w:t>
-      </w:r>
-      <w:r>
-        <w:rPr/>
-        <w:t xml:space="preserve"> (</w:t>
-      </w:r>
-      <w:r>
-        <w:rPr>
-          <w:rFonts w:ascii="Consolas" w:hAnsi="Consolas"/>
-          <w:color w:val="334455"/>
-          <w:sz w:val="19"/>
-        </w:rPr>
-        <w:t>1</w:t>
-      </w:r>
-      <w:r>
-        <w:rPr/>
-        <w:t>); words (trend, bias, signal, regime and the</w:t>
-        <w:br/>
-        <w:t>Bull/Bear horizon) compare exactly, while the Bull/Bear rising and beating counts</w:t>
-        <w:br/>
-        <w:t>may each differ by that many sectors. Compare two fingerprints with</w:t>
-        <w:br/>
-      </w:r>
-      <w:r>
-        <w:rPr>
-          <w:rFonts w:ascii="Consolas" w:hAnsi="Consolas"/>
-          <w:color w:val="334455"/>
-          <w:sz w:val="19"/>
-        </w:rPr>
-        <w:t>same_summary_readings</w:t>
-      </w:r>
-      <w:r>
-        <w:rPr/>
-        <w:t xml:space="preserve">, never with </w:t>
-      </w:r>
-      <w:r>
-        <w:rPr>
-          <w:rFonts w:ascii="Consolas" w:hAnsi="Consolas"/>
-          <w:color w:val="334455"/>
-          <w:sz w:val="19"/>
-        </w:rPr>
-        <w:t>==</w:t>
-      </w:r>
-      <w:r>
-        <w:rPr/>
-        <w:t>.</w:t>
-      </w:r>
-    </w:p>
     <w:p>
       <w:r>
         <w:rPr/>
@@ -13052,15 +12920,14 @@
         <w:rPr>
           <w:b/>
         </w:rPr>
-        <w:t>The Claude summary is written on change, not on a clock</w:t>
+        <w:t>The summary is read off the published market report, with no Claude call</w:t>
       </w:r>
       <w:r>
         <w:rPr/>
-        <w:t xml:space="preserve"> (2026-09-10). Each poll</w:t>
         <w:br/>
-        <w:t>builds a packet of six readings — sentiment, trend, bias, signal, regime,</w:t>
+        <w:t>(2026-09-16). The daily market reports are rendered outside this repo and uploaded</w:t>
         <w:br/>
-        <w:t xml:space="preserve">Bull/Bear — off </w:t>
+        <w:t xml:space="preserve">five times a trading day into </w:t>
       </w:r>
       <w:r>
         <w:rPr>
@@ -13068,11 +12935,11 @@
           <w:color w:val="334455"/>
           <w:sz w:val="19"/>
         </w:rPr>
-        <w:t>cache:sentiment:composite</w:t>
+        <w:t>deploy/site/reports/</w:t>
       </w:r>
       <w:r>
         <w:rPr/>
-        <w:t xml:space="preserve">, </w:t>
+        <w:t xml:space="preserve"> as </w:t>
       </w:r>
       <w:r>
         <w:rPr>
@@ -13080,11 +12947,13 @@
           <w:color w:val="334455"/>
           <w:sz w:val="19"/>
         </w:rPr>
-        <w:t>:regime</w:t>
+        <w:t>latest.html</w:t>
       </w:r>
       <w:r>
         <w:rPr/>
-        <w:t xml:space="preserve"> and </w:t>
+        <w:t xml:space="preserve"> (the page)</w:t>
+        <w:br/>
+        <w:t xml:space="preserve">and </w:t>
       </w:r>
       <w:r>
         <w:rPr>
@@ -13092,16 +12961,11 @@
           <w:color w:val="334455"/>
           <w:sz w:val="19"/>
         </w:rPr>
-        <w:t>:bullbear</w:t>
+        <w:t>latest.txt</w:t>
       </w:r>
       <w:r>
         <w:rPr/>
-        <w:t>, and a</w:t>
-        <w:br/>
-        <w:t>fingerprint of it at the resolution above. A new sentence is written only when the</w:t>
-        <w:br/>
-        <w:t>fingerprint differs from the one the current sentence was written from, at least</w:t>
-        <w:br/>
+        <w:t xml:space="preserve"> (</w:t>
       </w:r>
       <w:r>
         <w:rPr>
@@ -13109,11 +12973,11 @@
           <w:color w:val="334455"/>
           <w:sz w:val="19"/>
         </w:rPr>
-        <w:t>SUMMARY_MIN_GAP_SEC</w:t>
+        <w:t>"&lt;day&gt; &lt;n&gt; &lt;slot&gt; &lt;as_of&gt;"</w:t>
       </w:r>
       <w:r>
         <w:rPr/>
-        <w:t xml:space="preserve"> has passed since the last attempt, and fewer than</w:t>
+        <w:t>). On the same poll loop,</w:t>
         <w:br/>
       </w:r>
       <w:r>
@@ -13122,14 +12986,13 @@
           <w:color w:val="334455"/>
           <w:sz w:val="19"/>
         </w:rPr>
-        <w:t>SUMMARY_DAILY_CAP</w:t>
+        <w:t>scheduler.refresh_summary(bus, last_stamp)</w:t>
       </w:r>
       <w:r>
         <w:rPr/>
-        <w:t xml:space="preserve"> attempts have run today; the first poll after a restart with</w:t>
+        <w:t xml:space="preserve"> stats those two files</w:t>
         <w:br/>
-        <w:t>readings present always writes one. The model is sent only</w:t>
-        <w:br/>
+        <w:t>(</w:t>
       </w:r>
       <w:r>
         <w:rPr>
@@ -13137,24 +13000,13 @@
           <w:color w:val="334455"/>
           <w:sz w:val="19"/>
         </w:rPr>
-        <w:t>{"facts": summary_facts(packet)}</w:t>
+        <w:t>report_summary.report_stamp</w:t>
       </w:r>
       <w:r>
         <w:rPr/>
-        <w:t xml:space="preserve"> — one plain-English statement per reading,</w:t>
+        <w:t xml:space="preserve"> — modification time and size) and, only when the</w:t>
         <w:br/>
-        <w:t>written by the code — and may only join them and add a closing posture. A</w:t>
-        <w:br/>
-      </w:r>
-      <w:r>
-        <w:rPr>
-          <w:b/>
-        </w:rPr>
-        <w:t>failed</w:t>
-      </w:r>
-      <w:r>
-        <w:rPr/>
-        <w:t xml:space="preserve"> attempt (API error, timeout) returns </w:t>
+        <w:t>stamp has changed, parses the page (</w:t>
       </w:r>
       <w:r>
         <w:rPr>
@@ -13162,29 +13014,12 @@
           <w:color w:val="334455"/>
           <w:sz w:val="19"/>
         </w:rPr>
-        <w:t>None</w:t>
+        <w:t>report_summary.read_report</w:t>
       </w:r>
       <w:r>
         <w:rPr/>
-        <w:t>, publishes nothing — the</w:t>
+        <w:t>): the</w:t>
         <w:br/>
-        <w:t>last good sentence stays — and is retried on the same readings once the gap has</w:t>
-        <w:br/>
-        <w:t xml:space="preserve">passed. A </w:t>
-      </w:r>
-      <w:r>
-        <w:rPr>
-          <w:b/>
-        </w:rPr>
-        <w:t>withheld</w:t>
-      </w:r>
-      <w:r>
-        <w:rPr/>
-        <w:t xml:space="preserve"> reply (a fact dropped or reworded, a wrong sector count, a</w:t>
-        <w:br/>
-        <w:t>credit spread tied to the wrong direction, a cut-off reply with no complete</w:t>
-        <w:br/>
-        <w:t xml:space="preserve">sentence, or nothing to state at all) returns the </w:t>
       </w:r>
       <w:r>
         <w:rPr>
@@ -13192,41 +13027,142 @@
           <w:color w:val="334455"/>
           <w:sz w:val="19"/>
         </w:rPr>
-        <w:t>WITHHELD</w:t>
+        <w:t>div.slotchip</w:t>
       </w:r>
       <w:r>
         <w:rPr/>
-        <w:t xml:space="preserve"> sentinel and also</w:t>
+        <w:t xml:space="preserve"> text ("</w:t>
+      </w:r>
+      <w:r>
+        <w:rPr/>
+        <w:t xml:space="preserve"> · </w:t>
+      </w:r>
+      <w:r>
+        <w:rPr/>
+        <w:t xml:space="preserve">"), the </w:t>
+      </w:r>
+      <w:r>
+        <w:rPr>
+          <w:rFonts w:ascii="Consolas" w:hAnsi="Consolas"/>
+          <w:color w:val="334455"/>
+          <w:sz w:val="19"/>
+        </w:rPr>
+        <w:t>h1</w:t>
+      </w:r>
+      <w:r>
+        <w:rPr/>
+        <w:t xml:space="preserve"> verdict headline, and each</w:t>
         <w:br/>
-        <w:t xml:space="preserve">publishes nothing, but is </w:t>
-      </w:r>
-      <w:r>
-        <w:rPr>
-          <w:b/>
-        </w:rPr>
-        <w:t>not</w:t>
+        <w:t xml:space="preserve">section's </w:t>
+      </w:r>
+      <w:r>
+        <w:rPr>
+          <w:rFonts w:ascii="Consolas" w:hAnsi="Consolas"/>
+          <w:color w:val="334455"/>
+          <w:sz w:val="19"/>
+        </w:rPr>
+        <w:t>h2</w:t>
       </w:r>
       <w:r>
         <w:rPr/>
-        <w:t xml:space="preserve"> retried: the same readings are refused the same</w:t>
+        <w:t xml:space="preserve"> headline. Highlights are the section headlines in report order,</w:t>
         <w:br/>
-        <w:t>way, so a new sentence waits for the readings to move. Both still count toward the</w:t>
+        <w:t xml:space="preserve">capped at </w:t>
+      </w:r>
+      <w:r>
+        <w:rPr>
+          <w:rFonts w:ascii="Consolas" w:hAnsi="Consolas"/>
+          <w:color w:val="334455"/>
+          <w:sz w:val="19"/>
+        </w:rPr>
+        <w:t>MAX_HIGHLIGHTS</w:t>
+      </w:r>
+      <w:r>
+        <w:rPr/>
+        <w:t xml:space="preserve"> (</w:t>
+      </w:r>
+      <w:r>
+        <w:rPr>
+          <w:rFonts w:ascii="Consolas" w:hAnsi="Consolas"/>
+          <w:color w:val="334455"/>
+          <w:sz w:val="19"/>
+        </w:rPr>
+        <w:t>5</w:t>
+      </w:r>
+      <w:r>
+        <w:rPr/>
+        <w:t>), falling back to the headline when the report has</w:t>
         <w:br/>
-        <w:t>gap and the cap. It runs as</w:t>
+        <w:t xml:space="preserve">no sections. The payload is validated against </w:t>
+      </w:r>
+      <w:r>
+        <w:rPr>
+          <w:rFonts w:ascii="Consolas" w:hAnsi="Consolas"/>
+          <w:color w:val="334455"/>
+          <w:sz w:val="19"/>
+        </w:rPr>
+        <w:t>MarketSummary</w:t>
+      </w:r>
+      <w:r>
+        <w:rPr/>
+        <w:t xml:space="preserve"> and written with</w:t>
         <w:br/>
-        <w:t xml:space="preserve">a </w:t>
-      </w:r>
-      <w:r>
-        <w:rPr>
-          <w:b/>
-        </w:rPr>
-        <w:t>background task</w:t>
+      </w:r>
+      <w:r>
+        <w:rPr>
+          <w:rFonts w:ascii="Consolas" w:hAnsi="Consolas"/>
+          <w:color w:val="334455"/>
+          <w:sz w:val="19"/>
+        </w:rPr>
+        <w:t>skip_unchanged=True</w:t>
       </w:r>
       <w:r>
         <w:rPr/>
-        <w:t xml:space="preserve"> rather than inline, so a slow completion cannot stall the</w:t>
+        <w:t xml:space="preserve">. A report that does not parse (no </w:t>
+      </w:r>
+      <w:r>
+        <w:rPr>
+          <w:rFonts w:ascii="Consolas" w:hAnsi="Consolas"/>
+          <w:color w:val="334455"/>
+          <w:sz w:val="19"/>
+        </w:rPr>
+        <w:t>h1</w:t>
+      </w:r>
+      <w:r>
+        <w:rPr/>
+        <w:t>) publishes nothing —</w:t>
         <w:br/>
-        <w:t>poll loop.</w:t>
+        <w:t>the last good summary stays — and its stamp is still remembered, so the same</w:t>
+        <w:br/>
+        <w:t>bytes are not re-read until the report is replaced. A stat per poll is the whole</w:t>
+        <w:br/>
+        <w:t xml:space="preserve">steady-state cost; the service no longer uses </w:t>
+      </w:r>
+      <w:r>
+        <w:rPr>
+          <w:rFonts w:ascii="Consolas" w:hAnsi="Consolas"/>
+          <w:color w:val="334455"/>
+          <w:sz w:val="19"/>
+        </w:rPr>
+        <w:t>ANTHROPIC_API_KEY</w:t>
+      </w:r>
+      <w:r>
+        <w:rPr/>
+        <w:t xml:space="preserve"> or the</w:t>
+        <w:br/>
+        <w:t xml:space="preserve">environment's </w:t>
+      </w:r>
+      <w:r>
+        <w:rPr>
+          <w:rFonts w:ascii="Consolas" w:hAnsi="Consolas"/>
+          <w:color w:val="334455"/>
+          <w:sz w:val="19"/>
+        </w:rPr>
+        <w:t>allow_claude</w:t>
+      </w:r>
+      <w:r>
+        <w:rPr/>
+        <w:t xml:space="preserve"> flag.</w:t>
       </w:r>
     </w:p>
     <w:p>
@@ -13304,36 +13240,9 @@
       </w:r>
       <w:r>
         <w:rPr/>
-        <w:t xml:space="preserve"> key and the</w:t>
+        <w:t xml:space="preserve"> key they wrote,</w:t>
         <w:br/>
-      </w:r>
-      <w:r>
-        <w:rPr>
-          <w:rFonts w:ascii="Consolas" w:hAnsi="Consolas"/>
-          <w:color w:val="334455"/>
-          <w:sz w:val="19"/>
-        </w:rPr>
-        <w:t>SUMMARY_RTH_SEC</w:t>
-      </w:r>
-      <w:r>
-        <w:rPr/>
-        <w:t xml:space="preserve"> / </w:t>
-      </w:r>
-      <w:r>
-        <w:rPr>
-          <w:rFonts w:ascii="Consolas" w:hAnsi="Consolas"/>
-          <w:color w:val="334455"/>
-          <w:sz w:val="19"/>
-        </w:rPr>
-        <w:t>SUMMARY_OFFHOURS_SEC</w:t>
-      </w:r>
-      <w:r>
-        <w:rPr/>
-        <w:t xml:space="preserve"> clock they gated, were retired</w:t>
-        <w:br/>
-        <w:t>2026-09-10: the summary now feeds the Desk as well as the ticker, so the ticker</w:t>
-        <w:br/>
-        <w:t>toggle only hides the marquee and can no longer stop the Claude call.</w:t>
+        <w:t>were retired 2026-09-10. The ticker toggle only hides the marquee.</w:t>
       </w:r>
     </w:p>
     <w:p>

</xml_diff>

<commit_message>
docs: Rate my trade
Page help, User Guide, Reference Guide (what the word means and its limits),
API Reference (calc_rate + cache:options:calc_rating), routes doc, CHANGELOG,
and the design doc corrected to what was built.

Co-Authored-By: Claude Opus 5 <noreply@anthropic.com>
</commit_message>
<xml_diff>
--- a/docs/manuals/api-reference/api-reference.docx
+++ b/docs/manuals/api-reference/api-reference.docx
@@ -844,6 +844,18 @@
                 <w:sz w:val="19"/>
               </w:rPr>
               <w:t>:calc_iv</w:t>
+            </w:r>
+            <w:r>
+              <w:rPr/>
+              <w:t xml:space="preserve">, </w:t>
+            </w:r>
+            <w:r>
+              <w:rPr>
+                <w:rFonts w:ascii="Consolas" w:hAnsi="Consolas"/>
+                <w:color w:val="334455"/>
+                <w:sz w:val="19"/>
+              </w:rPr>
+              <w:t>:calc_rating</w:t>
             </w:r>
           </w:p>
         </w:tc>
@@ -8707,7 +8719,7 @@
                 <w:color w:val="334455"/>
                 <w:sz w:val="19"/>
               </w:rPr>
-              <w:t>expected_move</w:t>
+              <w:t>calc_rate</w:t>
             </w:r>
           </w:p>
         </w:tc>
@@ -8724,7 +8736,155 @@
                 <w:color w:val="334455"/>
                 <w:sz w:val="19"/>
               </w:rPr>
-              <w:t>{symbol, expiry, legs[], lookback}</w:t>
+              <w:t>{request_id, symbol, structure, legs[]}</w:t>
+            </w:r>
+            <w:r>
+              <w:rPr/>
+              <w:t xml:space="preserve"> — </w:t>
+            </w:r>
+            <w:r>
+              <w:rPr>
+                <w:rFonts w:ascii="Consolas" w:hAnsi="Consolas"/>
+                <w:color w:val="334455"/>
+                <w:sz w:val="19"/>
+              </w:rPr>
+              <w:t>legs</w:t>
+            </w:r>
+            <w:r>
+              <w:rPr/>
+              <w:t xml:space="preserve"> in the Calculator's shape (</w:t>
+            </w:r>
+            <w:r>
+              <w:rPr>
+                <w:rFonts w:ascii="Consolas" w:hAnsi="Consolas"/>
+                <w:color w:val="334455"/>
+                <w:sz w:val="19"/>
+              </w:rPr>
+              <w:t>option_type</w:t>
+            </w:r>
+            <w:r>
+              <w:rPr/>
+              <w:t xml:space="preserve">, </w:t>
+            </w:r>
+            <w:r>
+              <w:rPr>
+                <w:rFonts w:ascii="Consolas" w:hAnsi="Consolas"/>
+                <w:color w:val="334455"/>
+                <w:sz w:val="19"/>
+              </w:rPr>
+              <w:t>side</w:t>
+            </w:r>
+            <w:r>
+              <w:rPr/>
+              <w:t xml:space="preserve">, </w:t>
+            </w:r>
+            <w:r>
+              <w:rPr>
+                <w:rFonts w:ascii="Consolas" w:hAnsi="Consolas"/>
+                <w:color w:val="334455"/>
+                <w:sz w:val="19"/>
+              </w:rPr>
+              <w:t>strike</w:t>
+            </w:r>
+            <w:r>
+              <w:rPr/>
+              <w:t xml:space="preserve">, </w:t>
+            </w:r>
+            <w:r>
+              <w:rPr>
+                <w:rFonts w:ascii="Consolas" w:hAnsi="Consolas"/>
+                <w:color w:val="334455"/>
+                <w:sz w:val="19"/>
+              </w:rPr>
+              <w:t>expiry</w:t>
+            </w:r>
+            <w:r>
+              <w:rPr/>
+              <w:t xml:space="preserve">, </w:t>
+            </w:r>
+            <w:r>
+              <w:rPr>
+                <w:rFonts w:ascii="Consolas" w:hAnsi="Consolas"/>
+                <w:color w:val="334455"/>
+                <w:sz w:val="19"/>
+              </w:rPr>
+              <w:t>qty</w:t>
+            </w:r>
+            <w:r>
+              <w:rPr/>
+              <w:t xml:space="preserve">, </w:t>
+            </w:r>
+            <w:r>
+              <w:rPr>
+                <w:rFonts w:ascii="Consolas" w:hAnsi="Consolas"/>
+                <w:color w:val="334455"/>
+                <w:sz w:val="19"/>
+              </w:rPr>
+              <w:t>premium</w:t>
+            </w:r>
+            <w:r>
+              <w:rPr/>
+              <w:t xml:space="preserve">); </w:t>
+            </w:r>
+            <w:r>
+              <w:rPr>
+                <w:rFonts w:ascii="Consolas" w:hAnsi="Consolas"/>
+                <w:color w:val="334455"/>
+                <w:sz w:val="19"/>
+              </w:rPr>
+              <w:t>structure</w:t>
+            </w:r>
+            <w:r>
+              <w:rPr/>
+              <w:t xml:space="preserve"> a Calculator template code or </w:t>
+            </w:r>
+            <w:r>
+              <w:rPr>
+                <w:rFonts w:ascii="Consolas" w:hAnsi="Consolas"/>
+                <w:color w:val="334455"/>
+                <w:sz w:val="19"/>
+              </w:rPr>
+              <w:t>"CUSTOM"</w:t>
+            </w:r>
+            <w:r>
+              <w:rPr/>
+              <w:t xml:space="preserve">. Grades against </w:t>
+            </w:r>
+            <w:r>
+              <w:rPr>
+                <w:rFonts w:ascii="Consolas" w:hAnsi="Consolas"/>
+                <w:color w:val="334455"/>
+                <w:sz w:val="19"/>
+              </w:rPr>
+              <w:t>cache:options:calc_chain</w:t>
+            </w:r>
+            <w:r>
+              <w:rPr/>
+              <w:t xml:space="preserve"> (no chain fetch) with the Strategy Finder's </w:t>
+            </w:r>
+            <w:r>
+              <w:rPr>
+                <w:rFonts w:ascii="Consolas" w:hAnsi="Consolas"/>
+                <w:color w:val="334455"/>
+                <w:sz w:val="19"/>
+              </w:rPr>
+              <w:t>score_all</w:t>
+            </w:r>
+            <w:r>
+              <w:rPr/>
+              <w:t xml:space="preserve"> and </w:t>
+            </w:r>
+            <w:r>
+              <w:rPr>
+                <w:rFonts w:ascii="Consolas" w:hAnsi="Consolas"/>
+                <w:color w:val="334455"/>
+                <w:sz w:val="19"/>
+              </w:rPr>
+              <w:t>stamp_candidate</w:t>
+            </w:r>
+            <w:r>
+              <w:rPr/>
+              <w:t>, without the quality cut or the volatility drop. Replay-guarded</w:t>
             </w:r>
           </w:p>
         </w:tc>
@@ -8741,7 +8901,107 @@
                 <w:color w:val="334455"/>
                 <w:sz w:val="19"/>
               </w:rPr>
-              <w:t>cache:options:expected_move</w:t>
+              <w:t>cache:options:calc_rating</w:t>
+            </w:r>
+            <w:r>
+              <w:rPr/>
+              <w:t xml:space="preserve"> — </w:t>
+            </w:r>
+            <w:r>
+              <w:rPr>
+                <w:rFonts w:ascii="Consolas" w:hAnsi="Consolas"/>
+                <w:color w:val="334455"/>
+                <w:sz w:val="19"/>
+              </w:rPr>
+              <w:t>{request_id, symbol, legs, row, error}</w:t>
+            </w:r>
+            <w:r>
+              <w:rPr/>
+              <w:t xml:space="preserve">: </w:t>
+            </w:r>
+            <w:r>
+              <w:rPr>
+                <w:rFonts w:ascii="Consolas" w:hAnsi="Consolas"/>
+                <w:color w:val="334455"/>
+                <w:sz w:val="19"/>
+              </w:rPr>
+              <w:t>row</w:t>
+            </w:r>
+            <w:r>
+              <w:rPr/>
+              <w:t xml:space="preserve"> is a Strategy Finder candidate plus </w:t>
+            </w:r>
+            <w:r>
+              <w:rPr>
+                <w:rFonts w:ascii="Consolas" w:hAnsi="Consolas"/>
+                <w:color w:val="334455"/>
+                <w:sz w:val="19"/>
+              </w:rPr>
+              <w:t>grade</w:t>
+            </w:r>
+            <w:r>
+              <w:rPr/>
+              <w:t xml:space="preserve">, </w:t>
+            </w:r>
+            <w:r>
+              <w:rPr>
+                <w:rFonts w:ascii="Consolas" w:hAnsi="Consolas"/>
+                <w:color w:val="334455"/>
+                <w:sz w:val="19"/>
+              </w:rPr>
+              <w:t>composite_score</w:t>
+            </w:r>
+            <w:r>
+              <w:rPr/>
+              <w:t xml:space="preserve">, the checklist stamps, </w:t>
+            </w:r>
+            <w:r>
+              <w:rPr>
+                <w:rFonts w:ascii="Consolas" w:hAnsi="Consolas"/>
+                <w:color w:val="334455"/>
+                <w:sz w:val="19"/>
+              </w:rPr>
+              <w:t>vol_gate_blocks</w:t>
+            </w:r>
+            <w:r>
+              <w:rPr/>
+              <w:t xml:space="preserve"> and </w:t>
+            </w:r>
+            <w:r>
+              <w:rPr>
+                <w:rFonts w:ascii="Consolas" w:hAnsi="Consolas"/>
+                <w:color w:val="334455"/>
+                <w:sz w:val="19"/>
+              </w:rPr>
+              <w:t>structure_known</w:t>
+            </w:r>
+            <w:r>
+              <w:rPr/>
+              <w:t xml:space="preserve">; </w:t>
+            </w:r>
+            <w:r>
+              <w:rPr>
+                <w:rFonts w:ascii="Consolas" w:hAnsi="Consolas"/>
+                <w:color w:val="334455"/>
+                <w:sz w:val="19"/>
+              </w:rPr>
+              <w:t>error</w:t>
+            </w:r>
+            <w:r>
+              <w:rPr/>
+              <w:t xml:space="preserve"> is a sentence when </w:t>
+            </w:r>
+            <w:r>
+              <w:rPr>
+                <w:rFonts w:ascii="Consolas" w:hAnsi="Consolas"/>
+                <w:color w:val="334455"/>
+                <w:sz w:val="19"/>
+              </w:rPr>
+              <w:t>row</w:t>
+            </w:r>
+            <w:r>
+              <w:rPr/>
+              <w:t xml:space="preserve"> is None (no chain, another symbol's chain, a contract the chain lacks, a failure). Always written, so a request is never left unanswered</w:t>
             </w:r>
           </w:p>
         </w:tc>
@@ -8759,7 +9019,7 @@
                 <w:color w:val="334455"/>
                 <w:sz w:val="19"/>
               </w:rPr>
-              <w:t>rescue</w:t>
+              <w:t>expected_move</w:t>
             </w:r>
           </w:p>
         </w:tc>
@@ -8775,7 +9035,7 @@
                 <w:color w:val="334455"/>
                 <w:sz w:val="19"/>
               </w:rPr>
-              <w:t>{position_id}</w:t>
+              <w:t>{symbol, expiry, legs[], lookback}</w:t>
             </w:r>
           </w:p>
         </w:tc>
@@ -8791,7 +9051,7 @@
                 <w:color w:val="334455"/>
                 <w:sz w:val="19"/>
               </w:rPr>
-              <w:t>cache:options:rescue:&lt;position_id&gt;</w:t>
+              <w:t>cache:options:expected_move</w:t>
             </w:r>
           </w:p>
         </w:tc>
@@ -8810,7 +9070,7 @@
                 <w:color w:val="334455"/>
                 <w:sz w:val="19"/>
               </w:rPr>
-              <w:t>rescue_apply</w:t>
+              <w:t>rescue</w:t>
             </w:r>
           </w:p>
         </w:tc>
@@ -8827,7 +9087,7 @@
                 <w:color w:val="334455"/>
                 <w:sz w:val="19"/>
               </w:rPr>
-              <w:t>{position_id, candidate}</w:t>
+              <w:t>{position_id}</w:t>
             </w:r>
           </w:p>
         </w:tc>
@@ -8835,6 +9095,56 @@
           <w:tcPr>
             <w:tcW w:type="dxa" w:w="2880"/>
             <w:shd w:val="clear" w:color="auto" w:fill="F4F6FA"/>
+          </w:tcPr>
+          <w:p>
+            <w:r/>
+            <w:r>
+              <w:rPr>
+                <w:rFonts w:ascii="Consolas" w:hAnsi="Consolas"/>
+                <w:color w:val="334455"/>
+                <w:sz w:val="19"/>
+              </w:rPr>
+              <w:t>cache:options:rescue:&lt;position_id&gt;</w:t>
+            </w:r>
+          </w:p>
+        </w:tc>
+      </w:tr>
+      <w:tr>
+        <w:tc>
+          <w:tcPr>
+            <w:tcW w:type="dxa" w:w="2880"/>
+          </w:tcPr>
+          <w:p>
+            <w:r/>
+            <w:r>
+              <w:rPr>
+                <w:rFonts w:ascii="Consolas" w:hAnsi="Consolas"/>
+                <w:color w:val="334455"/>
+                <w:sz w:val="19"/>
+              </w:rPr>
+              <w:t>rescue_apply</w:t>
+            </w:r>
+          </w:p>
+        </w:tc>
+        <w:tc>
+          <w:tcPr>
+            <w:tcW w:type="dxa" w:w="2880"/>
+          </w:tcPr>
+          <w:p>
+            <w:r/>
+            <w:r>
+              <w:rPr>
+                <w:rFonts w:ascii="Consolas" w:hAnsi="Consolas"/>
+                <w:color w:val="334455"/>
+                <w:sz w:val="19"/>
+              </w:rPr>
+              <w:t>{position_id, candidate}</w:t>
+            </w:r>
+          </w:p>
+        </w:tc>
+        <w:tc>
+          <w:tcPr>
+            <w:tcW w:type="dxa" w:w="2880"/>
           </w:tcPr>
           <w:p>
             <w:r/>
@@ -14924,6 +15234,17 @@
           <w:sz w:val="18"/>
         </w:rPr>
         <w:t>cache:options:calc_iv          events:options:calc_iv</w:t>
+      </w:r>
+      <w:r>
+        <w:br/>
+      </w:r>
+      <w:r>
+        <w:rPr>
+          <w:rFonts w:ascii="Consolas" w:hAnsi="Consolas"/>
+          <w:color w:val="223344"/>
+          <w:sz w:val="18"/>
+        </w:rPr>
+        <w:t>cache:options:calc_rating      events:options:calc_rating   (Rate my trade)</w:t>
       </w:r>
       <w:r>
         <w:br/>

</xml_diff>

<commit_message>
feat(options_svc): hourly trade idea post to Discord and Telegram
One Strong/Good trade off the live Market Scanner every hour of the regular
session (08:35-14:35 CT), drawn as a branded 2x PNG with legs, grade, risk,
profit, probability of profit, breakevens and a payoff chart. Skips an hour
rather than post a stale, same-day, unbounded-loss or earnings-spanning trade,
and never repeats a trade in a day.

Co-Authored-By: Claude Opus 5 <noreply@anthropic.com>
</commit_message>
<xml_diff>
--- a/docs/manuals/api-reference/api-reference.docx
+++ b/docs/manuals/api-reference/api-reference.docx
@@ -32,7 +32,7 @@
           <w:color w:val="5B6678"/>
           <w:sz w:val="18"/>
         </w:rPr>
-        <w:t>NeuralStrike · Generated 2026-09-16</w:t>
+        <w:t>NeuralStrike · Generated 2026-09-17</w:t>
       </w:r>
     </w:p>
     <w:p/>
@@ -15212,6 +15212,17 @@
           <w:sz w:val="18"/>
         </w:rPr>
         <w:t>cache:options:market_snapshot  events:options:market_snapshot</w:t>
+      </w:r>
+      <w:r>
+        <w:br/>
+      </w:r>
+      <w:r>
+        <w:rPr>
+          <w:rFonts w:ascii="Consolas" w:hAnsi="Consolas"/>
+          <w:color w:val="223344"/>
+          <w:sz w:val="18"/>
+        </w:rPr>
+        <w:t>cache:options:trade_idea                                    (hourly post: last result + today's posted set)</w:t>
       </w:r>
       <w:r>
         <w:br/>

</xml_diff>

<commit_message>
docs: the Symbol Dossier and signal persistence
Route table row and rail count (17 items, Desk + Symbol) corrected in place in CLAUDE.md; the shared ticker allow-list and the setup_key lookup rule recorded as invariants. Full /symbol section, the Seen since / Score trend invariants, the Opportunity Board link and the Expected Move symbol-only hand-off in webgui-routes.md. CHANGELOG entries for both features. dossier command, scan_day setups and scan_funnel fields in the API Reference; IV vs HV bands, score-trend rule, setup key and look-up cost in the Technical Reference; QUEUED, dedup, wall and link rules in the User and Reference Guides. Manuals rebuilt.

Co-Authored-By: Claude Opus 5 <noreply@anthropic.com>
</commit_message>
<xml_diff>
--- a/docs/manuals/api-reference/api-reference.docx
+++ b/docs/manuals/api-reference/api-reference.docx
@@ -32,7 +32,7 @@
           <w:color w:val="5B6678"/>
           <w:sz w:val="18"/>
         </w:rPr>
-        <w:t>NeuralStrike · Generated 2026-09-17</w:t>
+        <w:t>NeuralStrike · Generated 2026-09-18</w:t>
       </w:r>
     </w:p>
     <w:p/>
@@ -261,7 +261,7 @@
               <w:rPr>
                 <w:b/>
               </w:rPr>
-              <w:t>Dealer Positioning</w:t>
+              <w:t>Symbol</w:t>
             </w:r>
           </w:p>
         </w:tc>
@@ -281,7 +281,19 @@
             </w:r>
             <w:r>
               <w:rPr/>
-              <w:t xml:space="preserve"> :8211</w:t>
+              <w:t xml:space="preserve"> (+ </w:t>
+            </w:r>
+            <w:r>
+              <w:rPr>
+                <w:rFonts w:ascii="Consolas" w:hAnsi="Consolas"/>
+                <w:color w:val="334455"/>
+                <w:sz w:val="19"/>
+              </w:rPr>
+              <w:t>sentiment_svc</w:t>
+            </w:r>
+            <w:r>
+              <w:rPr/>
+              <w:t xml:space="preserve"> for context)</w:t>
             </w:r>
           </w:p>
         </w:tc>
@@ -297,7 +309,7 @@
                 <w:color w:val="334455"/>
                 <w:sz w:val="19"/>
               </w:rPr>
-              <w:t>cache:options:gamma</w:t>
+              <w:t>cache:options:matrix</w:t>
             </w:r>
             <w:r>
               <w:rPr/>
@@ -309,7 +321,7 @@
                 <w:color w:val="334455"/>
                 <w:sz w:val="19"/>
               </w:rPr>
-              <w:t>:gamma_hist_*</w:t>
+              <w:t>:scan_funnel</w:t>
             </w:r>
             <w:r>
               <w:rPr/>
@@ -321,7 +333,7 @@
                 <w:color w:val="334455"/>
                 <w:sz w:val="19"/>
               </w:rPr>
-              <w:t>:gamma_symbols</w:t>
+              <w:t>:scan_day</w:t>
             </w:r>
             <w:r>
               <w:rPr/>
@@ -333,7 +345,7 @@
                 <w:color w:val="334455"/>
                 <w:sz w:val="19"/>
               </w:rPr>
-              <w:t>:net_premium</w:t>
+              <w:t>:gex_status</w:t>
             </w:r>
             <w:r>
               <w:rPr/>
@@ -345,7 +357,19 @@
                 <w:color w:val="334455"/>
                 <w:sz w:val="19"/>
               </w:rPr>
-              <w:t>:gamma_analyze*</w:t>
+              <w:t>:flow_alerts</w:t>
+            </w:r>
+            <w:r>
+              <w:rPr/>
+              <w:t xml:space="preserve">, the four paper books, </w:t>
+            </w:r>
+            <w:r>
+              <w:rPr>
+                <w:rFonts w:ascii="Consolas" w:hAnsi="Consolas"/>
+                <w:color w:val="334455"/>
+                <w:sz w:val="19"/>
+              </w:rPr>
+              <w:t>cache:sentiment:regime</w:t>
             </w:r>
             <w:r>
               <w:rPr/>
@@ -357,7 +381,35 @@
                 <w:color w:val="334455"/>
                 <w:sz w:val="19"/>
               </w:rPr>
-              <w:t>:gamma_briefings</w:t>
+              <w:t>:bullbear</w:t>
+            </w:r>
+            <w:r>
+              <w:rPr/>
+              <w:t xml:space="preserve">; </w:t>
+            </w:r>
+            <w:r>
+              <w:rPr>
+                <w:rFonts w:ascii="Consolas" w:hAnsi="Consolas"/>
+                <w:color w:val="334455"/>
+                <w:sz w:val="19"/>
+              </w:rPr>
+              <w:t>cache:options:dossier:&lt;SYMBOL&gt;</w:t>
+            </w:r>
+            <w:r>
+              <w:rPr/>
+              <w:t xml:space="preserve"> via the </w:t>
+            </w:r>
+            <w:r>
+              <w:rPr>
+                <w:rFonts w:ascii="Consolas" w:hAnsi="Consolas"/>
+                <w:color w:val="334455"/>
+                <w:sz w:val="19"/>
+              </w:rPr>
+              <w:t>dossier</w:t>
+            </w:r>
+            <w:r>
+              <w:rPr/>
+              <w:t xml:space="preserve"> command</w:t>
             </w:r>
           </w:p>
         </w:tc>
@@ -374,7 +426,7 @@
               <w:rPr>
                 <w:b/>
               </w:rPr>
-              <w:t>Opportunity Board</w:t>
+              <w:t>Dealer Positioning</w:t>
             </w:r>
           </w:p>
         </w:tc>
@@ -393,6 +445,10 @@
               </w:rPr>
               <w:t>options_svc</w:t>
             </w:r>
+            <w:r>
+              <w:rPr/>
+              <w:t xml:space="preserve"> :8211</w:t>
+            </w:r>
           </w:p>
         </w:tc>
         <w:tc>
@@ -408,7 +464,67 @@
                 <w:color w:val="334455"/>
                 <w:sz w:val="19"/>
               </w:rPr>
-              <w:t>cache:options:matrix</w:t>
+              <w:t>cache:options:gamma</w:t>
+            </w:r>
+            <w:r>
+              <w:rPr/>
+              <w:t xml:space="preserve">, </w:t>
+            </w:r>
+            <w:r>
+              <w:rPr>
+                <w:rFonts w:ascii="Consolas" w:hAnsi="Consolas"/>
+                <w:color w:val="334455"/>
+                <w:sz w:val="19"/>
+              </w:rPr>
+              <w:t>:gamma_hist_*</w:t>
+            </w:r>
+            <w:r>
+              <w:rPr/>
+              <w:t xml:space="preserve">, </w:t>
+            </w:r>
+            <w:r>
+              <w:rPr>
+                <w:rFonts w:ascii="Consolas" w:hAnsi="Consolas"/>
+                <w:color w:val="334455"/>
+                <w:sz w:val="19"/>
+              </w:rPr>
+              <w:t>:gamma_symbols</w:t>
+            </w:r>
+            <w:r>
+              <w:rPr/>
+              <w:t xml:space="preserve">, </w:t>
+            </w:r>
+            <w:r>
+              <w:rPr>
+                <w:rFonts w:ascii="Consolas" w:hAnsi="Consolas"/>
+                <w:color w:val="334455"/>
+                <w:sz w:val="19"/>
+              </w:rPr>
+              <w:t>:net_premium</w:t>
+            </w:r>
+            <w:r>
+              <w:rPr/>
+              <w:t xml:space="preserve">, </w:t>
+            </w:r>
+            <w:r>
+              <w:rPr>
+                <w:rFonts w:ascii="Consolas" w:hAnsi="Consolas"/>
+                <w:color w:val="334455"/>
+                <w:sz w:val="19"/>
+              </w:rPr>
+              <w:t>:gamma_analyze*</w:t>
+            </w:r>
+            <w:r>
+              <w:rPr/>
+              <w:t xml:space="preserve">, </w:t>
+            </w:r>
+            <w:r>
+              <w:rPr>
+                <w:rFonts w:ascii="Consolas" w:hAnsi="Consolas"/>
+                <w:color w:val="334455"/>
+                <w:sz w:val="19"/>
+              </w:rPr>
+              <w:t>:gamma_briefings</w:t>
             </w:r>
           </w:p>
         </w:tc>
@@ -424,7 +540,7 @@
               <w:rPr>
                 <w:b/>
               </w:rPr>
-              <w:t>Flow Alerts</w:t>
+              <w:t>Opportunity Board</w:t>
             </w:r>
           </w:p>
         </w:tc>
@@ -456,7 +572,7 @@
                 <w:color w:val="334455"/>
                 <w:sz w:val="19"/>
               </w:rPr>
-              <w:t>cache:options:flow_alerts</w:t>
+              <w:t>cache:options:matrix</w:t>
             </w:r>
           </w:p>
         </w:tc>
@@ -473,7 +589,7 @@
               <w:rPr>
                 <w:b/>
               </w:rPr>
-              <w:t>Market Dashboard</w:t>
+              <w:t>Flow Alerts</w:t>
             </w:r>
           </w:p>
         </w:tc>
@@ -490,11 +606,7 @@
                 <w:color w:val="334455"/>
                 <w:sz w:val="19"/>
               </w:rPr>
-              <w:t>market_svc</w:t>
-            </w:r>
-            <w:r>
-              <w:rPr/>
-              <w:t xml:space="preserve"> :8215</w:t>
+              <w:t>options_svc</w:t>
             </w:r>
           </w:p>
         </w:tc>
@@ -511,19 +623,7 @@
                 <w:color w:val="334455"/>
                 <w:sz w:val="19"/>
               </w:rPr>
-              <w:t>cache:market:dashboard</w:t>
-            </w:r>
-            <w:r>
-              <w:rPr/>
-              <w:t xml:space="preserve">, </w:t>
-            </w:r>
-            <w:r>
-              <w:rPr>
-                <w:rFonts w:ascii="Consolas" w:hAnsi="Consolas"/>
-                <w:color w:val="334455"/>
-                <w:sz w:val="19"/>
-              </w:rPr>
-              <w:t>:summary</w:t>
+              <w:t>cache:options:flow_alerts</w:t>
             </w:r>
           </w:p>
         </w:tc>
@@ -539,7 +639,7 @@
               <w:rPr>
                 <w:b/>
               </w:rPr>
-              <w:t>Sentiment</w:t>
+              <w:t>Market Dashboard</w:t>
             </w:r>
           </w:p>
         </w:tc>
@@ -555,11 +655,11 @@
                 <w:color w:val="334455"/>
                 <w:sz w:val="19"/>
               </w:rPr>
-              <w:t>sentiment_svc</w:t>
-            </w:r>
-            <w:r>
-              <w:rPr/>
-              <w:t xml:space="preserve"> :8210</w:t>
+              <w:t>market_svc</w:t>
+            </w:r>
+            <w:r>
+              <w:rPr/>
+              <w:t xml:space="preserve"> :8215</w:t>
             </w:r>
           </w:p>
         </w:tc>
@@ -575,7 +675,7 @@
                 <w:color w:val="334455"/>
                 <w:sz w:val="19"/>
               </w:rPr>
-              <w:t>cache:sentiment:composite</w:t>
+              <w:t>cache:market:dashboard</w:t>
             </w:r>
             <w:r>
               <w:rPr/>
@@ -587,31 +687,7 @@
                 <w:color w:val="334455"/>
                 <w:sz w:val="19"/>
               </w:rPr>
-              <w:t>:regime</w:t>
-            </w:r>
-            <w:r>
-              <w:rPr/>
-              <w:t xml:space="preserve">, </w:t>
-            </w:r>
-            <w:r>
-              <w:rPr>
-                <w:rFonts w:ascii="Consolas" w:hAnsi="Consolas"/>
-                <w:color w:val="334455"/>
-                <w:sz w:val="19"/>
-              </w:rPr>
-              <w:t>:regime_history</w:t>
-            </w:r>
-            <w:r>
-              <w:rPr/>
-              <w:t xml:space="preserve">, </w:t>
-            </w:r>
-            <w:r>
-              <w:rPr>
-                <w:rFonts w:ascii="Consolas" w:hAnsi="Consolas"/>
-                <w:color w:val="334455"/>
-                <w:sz w:val="19"/>
-              </w:rPr>
-              <w:t>:intraday_history</w:t>
+              <w:t>:summary</w:t>
             </w:r>
           </w:p>
         </w:tc>
@@ -628,7 +704,7 @@
               <w:rPr>
                 <w:b/>
               </w:rPr>
-              <w:t>Sector &amp; Industry</w:t>
+              <w:t>Sentiment</w:t>
             </w:r>
           </w:p>
         </w:tc>
@@ -647,6 +723,10 @@
               </w:rPr>
               <w:t>sentiment_svc</w:t>
             </w:r>
+            <w:r>
+              <w:rPr/>
+              <w:t xml:space="preserve"> :8210</w:t>
+            </w:r>
           </w:p>
         </w:tc>
         <w:tc>
@@ -662,7 +742,43 @@
                 <w:color w:val="334455"/>
                 <w:sz w:val="19"/>
               </w:rPr>
-              <w:t>cache:sentiment:sectors</w:t>
+              <w:t>cache:sentiment:composite</w:t>
+            </w:r>
+            <w:r>
+              <w:rPr/>
+              <w:t xml:space="preserve">, </w:t>
+            </w:r>
+            <w:r>
+              <w:rPr>
+                <w:rFonts w:ascii="Consolas" w:hAnsi="Consolas"/>
+                <w:color w:val="334455"/>
+                <w:sz w:val="19"/>
+              </w:rPr>
+              <w:t>:regime</w:t>
+            </w:r>
+            <w:r>
+              <w:rPr/>
+              <w:t xml:space="preserve">, </w:t>
+            </w:r>
+            <w:r>
+              <w:rPr>
+                <w:rFonts w:ascii="Consolas" w:hAnsi="Consolas"/>
+                <w:color w:val="334455"/>
+                <w:sz w:val="19"/>
+              </w:rPr>
+              <w:t>:regime_history</w:t>
+            </w:r>
+            <w:r>
+              <w:rPr/>
+              <w:t xml:space="preserve">, </w:t>
+            </w:r>
+            <w:r>
+              <w:rPr>
+                <w:rFonts w:ascii="Consolas" w:hAnsi="Consolas"/>
+                <w:color w:val="334455"/>
+                <w:sz w:val="19"/>
+              </w:rPr>
+              <w:t>:intraday_history</w:t>
             </w:r>
           </w:p>
         </w:tc>
@@ -678,17 +794,7 @@
               <w:rPr>
                 <w:b/>
               </w:rPr>
-              <w:t>Sector Rotation</w:t>
-            </w:r>
-            <w:r>
-              <w:rPr/>
-              <w:t xml:space="preserve"> · </w:t>
-            </w:r>
-            <w:r>
-              <w:rPr>
-                <w:b/>
-              </w:rPr>
-              <w:t>RRG</w:t>
+              <w:t>Sector &amp; Industry</w:t>
             </w:r>
           </w:p>
         </w:tc>
@@ -720,7 +826,7 @@
                 <w:color w:val="334455"/>
                 <w:sz w:val="19"/>
               </w:rPr>
-              <w:t>cache:sentiment:rotation</w:t>
+              <w:t>cache:sentiment:sectors</w:t>
             </w:r>
           </w:p>
         </w:tc>
@@ -737,7 +843,17 @@
               <w:rPr>
                 <w:b/>
               </w:rPr>
-              <w:t>Momentum</w:t>
+              <w:t>Sector Rotation</w:t>
+            </w:r>
+            <w:r>
+              <w:rPr/>
+              <w:t xml:space="preserve"> · </w:t>
+            </w:r>
+            <w:r>
+              <w:rPr>
+                <w:b/>
+              </w:rPr>
+              <w:t>RRG</w:t>
             </w:r>
           </w:p>
         </w:tc>
@@ -771,7 +887,7 @@
                 <w:color w:val="334455"/>
                 <w:sz w:val="19"/>
               </w:rPr>
-              <w:t>cache:sentiment:momentum</w:t>
+              <w:t>cache:sentiment:rotation</w:t>
             </w:r>
           </w:p>
         </w:tc>
@@ -787,7 +903,7 @@
               <w:rPr>
                 <w:b/>
               </w:rPr>
-              <w:t>Calculator</w:t>
+              <w:t>Momentum</w:t>
             </w:r>
           </w:p>
         </w:tc>
@@ -803,7 +919,7 @@
                 <w:color w:val="334455"/>
                 <w:sz w:val="19"/>
               </w:rPr>
-              <w:t>options_svc</w:t>
+              <w:t>sentiment_svc</w:t>
             </w:r>
           </w:p>
         </w:tc>
@@ -819,43 +935,7 @@
                 <w:color w:val="334455"/>
                 <w:sz w:val="19"/>
               </w:rPr>
-              <w:t>cache:options:calc_chain</w:t>
-            </w:r>
-            <w:r>
-              <w:rPr/>
-              <w:t xml:space="preserve">, </w:t>
-            </w:r>
-            <w:r>
-              <w:rPr>
-                <w:rFonts w:ascii="Consolas" w:hAnsi="Consolas"/>
-                <w:color w:val="334455"/>
-                <w:sz w:val="19"/>
-              </w:rPr>
-              <w:t>:calc_result</w:t>
-            </w:r>
-            <w:r>
-              <w:rPr/>
-              <w:t xml:space="preserve">, </w:t>
-            </w:r>
-            <w:r>
-              <w:rPr>
-                <w:rFonts w:ascii="Consolas" w:hAnsi="Consolas"/>
-                <w:color w:val="334455"/>
-                <w:sz w:val="19"/>
-              </w:rPr>
-              <w:t>:calc_iv</w:t>
-            </w:r>
-            <w:r>
-              <w:rPr/>
-              <w:t xml:space="preserve">, </w:t>
-            </w:r>
-            <w:r>
-              <w:rPr>
-                <w:rFonts w:ascii="Consolas" w:hAnsi="Consolas"/>
-                <w:color w:val="334455"/>
-                <w:sz w:val="19"/>
-              </w:rPr>
-              <w:t>:calc_rating</w:t>
+              <w:t>cache:sentiment:momentum</w:t>
             </w:r>
           </w:p>
         </w:tc>
@@ -872,7 +952,7 @@
               <w:rPr>
                 <w:b/>
               </w:rPr>
-              <w:t>Simulator</w:t>
+              <w:t>Calculator</w:t>
             </w:r>
           </w:p>
         </w:tc>
@@ -906,7 +986,7 @@
                 <w:color w:val="334455"/>
                 <w:sz w:val="19"/>
               </w:rPr>
-              <w:t>cache:options:sim_meta</w:t>
+              <w:t>cache:options:calc_chain</w:t>
             </w:r>
             <w:r>
               <w:rPr/>
@@ -918,7 +998,7 @@
                 <w:color w:val="334455"/>
                 <w:sz w:val="19"/>
               </w:rPr>
-              <w:t>:sim_chain</w:t>
+              <w:t>:calc_result</w:t>
             </w:r>
             <w:r>
               <w:rPr/>
@@ -930,7 +1010,7 @@
                 <w:color w:val="334455"/>
                 <w:sz w:val="19"/>
               </w:rPr>
-              <w:t>:sim_result</w:t>
+              <w:t>:calc_iv</w:t>
             </w:r>
             <w:r>
               <w:rPr/>
@@ -942,7 +1022,7 @@
                 <w:color w:val="334455"/>
                 <w:sz w:val="19"/>
               </w:rPr>
-              <w:t>:sim_replay</w:t>
+              <w:t>:calc_rating</w:t>
             </w:r>
           </w:p>
         </w:tc>
@@ -958,7 +1038,7 @@
               <w:rPr>
                 <w:b/>
               </w:rPr>
-              <w:t>Market Scanner</w:t>
+              <w:t>Simulator</w:t>
             </w:r>
           </w:p>
         </w:tc>
@@ -990,23 +1070,43 @@
                 <w:color w:val="334455"/>
                 <w:sz w:val="19"/>
               </w:rPr>
-              <w:t>cache:options:scan_day</w:t>
-            </w:r>
-            <w:r>
-              <w:rPr/>
-              <w:t xml:space="preserve"> (rendered), </w:t>
-            </w:r>
-            <w:r>
-              <w:rPr>
-                <w:rFonts w:ascii="Consolas" w:hAnsi="Consolas"/>
-                <w:color w:val="334455"/>
-                <w:sz w:val="19"/>
-              </w:rPr>
-              <w:t>:scan</w:t>
-            </w:r>
-            <w:r>
-              <w:rPr/>
-              <w:t xml:space="preserve"> (live counts)</w:t>
+              <w:t>cache:options:sim_meta</w:t>
+            </w:r>
+            <w:r>
+              <w:rPr/>
+              <w:t xml:space="preserve">, </w:t>
+            </w:r>
+            <w:r>
+              <w:rPr>
+                <w:rFonts w:ascii="Consolas" w:hAnsi="Consolas"/>
+                <w:color w:val="334455"/>
+                <w:sz w:val="19"/>
+              </w:rPr>
+              <w:t>:sim_chain</w:t>
+            </w:r>
+            <w:r>
+              <w:rPr/>
+              <w:t xml:space="preserve">, </w:t>
+            </w:r>
+            <w:r>
+              <w:rPr>
+                <w:rFonts w:ascii="Consolas" w:hAnsi="Consolas"/>
+                <w:color w:val="334455"/>
+                <w:sz w:val="19"/>
+              </w:rPr>
+              <w:t>:sim_result</w:t>
+            </w:r>
+            <w:r>
+              <w:rPr/>
+              <w:t xml:space="preserve">, </w:t>
+            </w:r>
+            <w:r>
+              <w:rPr>
+                <w:rFonts w:ascii="Consolas" w:hAnsi="Consolas"/>
+                <w:color w:val="334455"/>
+                <w:sz w:val="19"/>
+              </w:rPr>
+              <w:t>:sim_replay</w:t>
             </w:r>
           </w:p>
         </w:tc>
@@ -1023,7 +1123,7 @@
               <w:rPr>
                 <w:b/>
               </w:rPr>
-              <w:t>Strategy Finder</w:t>
+              <w:t>Market Scanner</w:t>
             </w:r>
           </w:p>
         </w:tc>
@@ -1057,7 +1157,23 @@
                 <w:color w:val="334455"/>
                 <w:sz w:val="19"/>
               </w:rPr>
-              <w:t>cache:options:swing</w:t>
+              <w:t>cache:options:scan_day</w:t>
+            </w:r>
+            <w:r>
+              <w:rPr/>
+              <w:t xml:space="preserve"> (rendered), </w:t>
+            </w:r>
+            <w:r>
+              <w:rPr>
+                <w:rFonts w:ascii="Consolas" w:hAnsi="Consolas"/>
+                <w:color w:val="334455"/>
+                <w:sz w:val="19"/>
+              </w:rPr>
+              <w:t>:scan</w:t>
+            </w:r>
+            <w:r>
+              <w:rPr/>
+              <w:t xml:space="preserve"> (live counts)</w:t>
             </w:r>
           </w:p>
         </w:tc>
@@ -1073,7 +1189,7 @@
               <w:rPr>
                 <w:b/>
               </w:rPr>
-              <w:t>Expected Move</w:t>
+              <w:t>Strategy Finder</w:t>
             </w:r>
           </w:p>
         </w:tc>
@@ -1105,19 +1221,7 @@
                 <w:color w:val="334455"/>
                 <w:sz w:val="19"/>
               </w:rPr>
-              <w:t>cache:options:em_chain</w:t>
-            </w:r>
-            <w:r>
-              <w:rPr/>
-              <w:t xml:space="preserve">, </w:t>
-            </w:r>
-            <w:r>
-              <w:rPr>
-                <w:rFonts w:ascii="Consolas" w:hAnsi="Consolas"/>
-                <w:color w:val="334455"/>
-                <w:sz w:val="19"/>
-              </w:rPr>
-              <w:t>:expected_move</w:t>
+              <w:t>cache:options:swing</w:t>
             </w:r>
           </w:p>
         </w:tc>
@@ -1134,7 +1238,7 @@
               <w:rPr>
                 <w:b/>
               </w:rPr>
-              <w:t>Captured Signals</w:t>
+              <w:t>Expected Move</w:t>
             </w:r>
           </w:p>
         </w:tc>
@@ -1168,7 +1272,7 @@
                 <w:color w:val="334455"/>
                 <w:sz w:val="19"/>
               </w:rPr>
-              <w:t>cache:options:captured</w:t>
+              <w:t>cache:options:em_chain</w:t>
             </w:r>
             <w:r>
               <w:rPr/>
@@ -1180,19 +1284,7 @@
                 <w:color w:val="334455"/>
                 <w:sz w:val="19"/>
               </w:rPr>
-              <w:t>:captured_flags</w:t>
-            </w:r>
-            <w:r>
-              <w:rPr/>
-              <w:t xml:space="preserve">, </w:t>
-            </w:r>
-            <w:r>
-              <w:rPr>
-                <w:rFonts w:ascii="Consolas" w:hAnsi="Consolas"/>
-                <w:color w:val="334455"/>
-                <w:sz w:val="19"/>
-              </w:rPr>
-              <w:t>:captured_closed</w:t>
+              <w:t>:expected_move</w:t>
             </w:r>
           </w:p>
         </w:tc>
@@ -1208,7 +1300,7 @@
               <w:rPr>
                 <w:b/>
               </w:rPr>
-              <w:t>Paper Ledger</w:t>
+              <w:t>Captured Signals</w:t>
             </w:r>
           </w:p>
         </w:tc>
@@ -1240,7 +1332,7 @@
                 <w:color w:val="334455"/>
                 <w:sz w:val="19"/>
               </w:rPr>
-              <w:t>cache:options:paper_trades</w:t>
+              <w:t>cache:options:captured</w:t>
             </w:r>
             <w:r>
               <w:rPr/>
@@ -1252,7 +1344,7 @@
                 <w:color w:val="334455"/>
                 <w:sz w:val="19"/>
               </w:rPr>
-              <w:t>:paper_analyze</w:t>
+              <w:t>:captured_flags</w:t>
             </w:r>
             <w:r>
               <w:rPr/>
@@ -1264,11 +1356,7 @@
                 <w:color w:val="334455"/>
                 <w:sz w:val="19"/>
               </w:rPr>
-              <w:t>:paper_create</w:t>
-            </w:r>
-            <w:r>
-              <w:rPr/>
-              <w:t xml:space="preserve"> (the Paper button's answer, read by Market Scanner and Strategy Finder)</w:t>
+              <w:t>:captured_closed</w:t>
             </w:r>
           </w:p>
         </w:tc>
@@ -1285,7 +1373,7 @@
               <w:rPr>
                 <w:b/>
               </w:rPr>
-              <w:t>Paper Account</w:t>
+              <w:t>Paper Ledger</w:t>
             </w:r>
           </w:p>
         </w:tc>
@@ -1319,7 +1407,7 @@
                 <w:color w:val="334455"/>
                 <w:sz w:val="19"/>
               </w:rPr>
-              <w:t>cache:options:paper_account</w:t>
+              <w:t>cache:options:paper_trades</w:t>
             </w:r>
             <w:r>
               <w:rPr/>
@@ -1331,7 +1419,23 @@
                 <w:color w:val="334455"/>
                 <w:sz w:val="19"/>
               </w:rPr>
-              <w:t>:paper_analytics</w:t>
+              <w:t>:paper_analyze</w:t>
+            </w:r>
+            <w:r>
+              <w:rPr/>
+              <w:t xml:space="preserve">, </w:t>
+            </w:r>
+            <w:r>
+              <w:rPr>
+                <w:rFonts w:ascii="Consolas" w:hAnsi="Consolas"/>
+                <w:color w:val="334455"/>
+                <w:sz w:val="19"/>
+              </w:rPr>
+              <w:t>:paper_create</w:t>
+            </w:r>
+            <w:r>
+              <w:rPr/>
+              <w:t xml:space="preserve"> (the Paper button's answer, read by Market Scanner and Strategy Finder)</w:t>
             </w:r>
           </w:p>
         </w:tc>
@@ -1347,7 +1451,7 @@
               <w:rPr>
                 <w:b/>
               </w:rPr>
-              <w:t>Rescue</w:t>
+              <w:t>Paper Account</w:t>
             </w:r>
           </w:p>
         </w:tc>
@@ -1379,7 +1483,7 @@
                 <w:color w:val="334455"/>
                 <w:sz w:val="19"/>
               </w:rPr>
-              <w:t>cache:options:rescue:&lt;position_id&gt;</w:t>
+              <w:t>cache:options:paper_account</w:t>
             </w:r>
             <w:r>
               <w:rPr/>
@@ -1391,7 +1495,7 @@
                 <w:color w:val="334455"/>
                 <w:sz w:val="19"/>
               </w:rPr>
-              <w:t>:rescue_summary</w:t>
+              <w:t>:paper_analytics</w:t>
             </w:r>
           </w:p>
         </w:tc>
@@ -1408,7 +1512,7 @@
               <w:rPr>
                 <w:b/>
               </w:rPr>
-              <w:t>Trade Analyzer</w:t>
+              <w:t>Rescue</w:t>
             </w:r>
           </w:p>
         </w:tc>
@@ -1425,11 +1529,7 @@
                 <w:color w:val="334455"/>
                 <w:sz w:val="19"/>
               </w:rPr>
-              <w:t>trade_svc</w:t>
-            </w:r>
-            <w:r>
-              <w:rPr/>
-              <w:t xml:space="preserve"> :8213</w:t>
+              <w:t>options_svc</w:t>
             </w:r>
           </w:p>
         </w:tc>
@@ -1446,7 +1546,7 @@
                 <w:color w:val="334455"/>
                 <w:sz w:val="19"/>
               </w:rPr>
-              <w:t>cache:trade:analysis</w:t>
+              <w:t>cache:options:rescue:&lt;position_id&gt;</w:t>
             </w:r>
             <w:r>
               <w:rPr/>
@@ -1458,19 +1558,7 @@
                 <w:color w:val="334455"/>
                 <w:sz w:val="19"/>
               </w:rPr>
-              <w:t>:deepdive</w:t>
-            </w:r>
-            <w:r>
-              <w:rPr/>
-              <w:t xml:space="preserve">, </w:t>
-            </w:r>
-            <w:r>
-              <w:rPr>
-                <w:rFonts w:ascii="Consolas" w:hAnsi="Consolas"/>
-                <w:color w:val="334455"/>
-                <w:sz w:val="19"/>
-              </w:rPr>
-              <w:t>:deepdive_query</w:t>
+              <w:t>:rescue_summary</w:t>
             </w:r>
           </w:p>
         </w:tc>
@@ -1486,7 +1574,7 @@
               <w:rPr>
                 <w:b/>
               </w:rPr>
-              <w:t>Claude Trades</w:t>
+              <w:t>Trade Analyzer</w:t>
             </w:r>
           </w:p>
         </w:tc>
@@ -1502,23 +1590,11 @@
                 <w:color w:val="334455"/>
                 <w:sz w:val="19"/>
               </w:rPr>
-              <w:t>driver_svc</w:t>
-            </w:r>
-            <w:r>
-              <w:rPr/>
-              <w:t xml:space="preserve"> :8214 decides, </w:t>
-            </w:r>
-            <w:r>
-              <w:rPr>
-                <w:rFonts w:ascii="Consolas" w:hAnsi="Consolas"/>
-                <w:color w:val="334455"/>
-                <w:sz w:val="19"/>
-              </w:rPr>
-              <w:t>options_svc</w:t>
-            </w:r>
-            <w:r>
-              <w:rPr/>
-              <w:t xml:space="preserve"> executes</w:t>
+              <w:t>trade_svc</w:t>
+            </w:r>
+            <w:r>
+              <w:rPr/>
+              <w:t xml:space="preserve"> :8213</w:t>
             </w:r>
           </w:p>
         </w:tc>
@@ -1534,7 +1610,7 @@
                 <w:color w:val="334455"/>
                 <w:sz w:val="19"/>
               </w:rPr>
-              <w:t>cache:driver:autonomous</w:t>
+              <w:t>cache:trade:analysis</w:t>
             </w:r>
             <w:r>
               <w:rPr/>
@@ -1546,7 +1622,7 @@
                 <w:color w:val="334455"/>
                 <w:sz w:val="19"/>
               </w:rPr>
-              <w:t>:control</w:t>
+              <w:t>:deepdive</w:t>
             </w:r>
             <w:r>
               <w:rPr/>
@@ -1558,19 +1634,7 @@
                 <w:color w:val="334455"/>
                 <w:sz w:val="19"/>
               </w:rPr>
-              <w:t>cache:options:driver_paper_account</w:t>
-            </w:r>
-            <w:r>
-              <w:rPr/>
-              <w:t xml:space="preserve">, </w:t>
-            </w:r>
-            <w:r>
-              <w:rPr>
-                <w:rFonts w:ascii="Consolas" w:hAnsi="Consolas"/>
-                <w:color w:val="334455"/>
-                <w:sz w:val="19"/>
-              </w:rPr>
-              <w:t>:driver_paper_perf</w:t>
+              <w:t>:deepdive_query</w:t>
             </w:r>
           </w:p>
         </w:tc>
@@ -1587,7 +1651,7 @@
               <w:rPr>
                 <w:b/>
               </w:rPr>
-              <w:t>Portfolio</w:t>
+              <w:t>Claude Trades</w:t>
             </w:r>
           </w:p>
         </w:tc>
@@ -1604,11 +1668,23 @@
                 <w:color w:val="334455"/>
                 <w:sz w:val="19"/>
               </w:rPr>
-              <w:t>portfolio_svc</w:t>
-            </w:r>
-            <w:r>
-              <w:rPr/>
-              <w:t xml:space="preserve"> :8212</w:t>
+              <w:t>driver_svc</w:t>
+            </w:r>
+            <w:r>
+              <w:rPr/>
+              <w:t xml:space="preserve"> :8214 decides, </w:t>
+            </w:r>
+            <w:r>
+              <w:rPr>
+                <w:rFonts w:ascii="Consolas" w:hAnsi="Consolas"/>
+                <w:color w:val="334455"/>
+                <w:sz w:val="19"/>
+              </w:rPr>
+              <w:t>options_svc</w:t>
+            </w:r>
+            <w:r>
+              <w:rPr/>
+              <w:t xml:space="preserve"> executes</w:t>
             </w:r>
           </w:p>
         </w:tc>
@@ -1625,7 +1701,43 @@
                 <w:color w:val="334455"/>
                 <w:sz w:val="19"/>
               </w:rPr>
-              <w:t>cache:portfolio:positions</w:t>
+              <w:t>cache:driver:autonomous</w:t>
+            </w:r>
+            <w:r>
+              <w:rPr/>
+              <w:t xml:space="preserve">, </w:t>
+            </w:r>
+            <w:r>
+              <w:rPr>
+                <w:rFonts w:ascii="Consolas" w:hAnsi="Consolas"/>
+                <w:color w:val="334455"/>
+                <w:sz w:val="19"/>
+              </w:rPr>
+              <w:t>:control</w:t>
+            </w:r>
+            <w:r>
+              <w:rPr/>
+              <w:t xml:space="preserve">, </w:t>
+            </w:r>
+            <w:r>
+              <w:rPr>
+                <w:rFonts w:ascii="Consolas" w:hAnsi="Consolas"/>
+                <w:color w:val="334455"/>
+                <w:sz w:val="19"/>
+              </w:rPr>
+              <w:t>cache:options:driver_paper_account</w:t>
+            </w:r>
+            <w:r>
+              <w:rPr/>
+              <w:t xml:space="preserve">, </w:t>
+            </w:r>
+            <w:r>
+              <w:rPr>
+                <w:rFonts w:ascii="Consolas" w:hAnsi="Consolas"/>
+                <w:color w:val="334455"/>
+                <w:sz w:val="19"/>
+              </w:rPr>
+              <w:t>:driver_paper_perf</w:t>
             </w:r>
           </w:p>
         </w:tc>
@@ -1641,7 +1753,7 @@
               <w:rPr>
                 <w:b/>
               </w:rPr>
-              <w:t>EOD Report</w:t>
+              <w:t>Portfolio</w:t>
             </w:r>
           </w:p>
         </w:tc>
@@ -1652,8 +1764,16 @@
           <w:p>
             <w:r/>
             <w:r>
-              <w:rPr/>
-              <w:t>none — pure Tier-1 reader</w:t>
+              <w:rPr>
+                <w:rFonts w:ascii="Consolas" w:hAnsi="Consolas"/>
+                <w:color w:val="334455"/>
+                <w:sz w:val="19"/>
+              </w:rPr>
+              <w:t>portfolio_svc</w:t>
+            </w:r>
+            <w:r>
+              <w:rPr/>
+              <w:t xml:space="preserve"> :8212</w:t>
             </w:r>
           </w:p>
         </w:tc>
@@ -1664,32 +1784,12 @@
           <w:p>
             <w:r/>
             <w:r>
-              <w:rPr/>
-              <w:t xml:space="preserve">aggregates the </w:t>
-            </w:r>
-            <w:r>
-              <w:rPr>
-                <w:rFonts w:ascii="Consolas" w:hAnsi="Consolas"/>
-                <w:color w:val="334455"/>
-                <w:sz w:val="19"/>
-              </w:rPr>
-              <w:t>options:*</w:t>
-            </w:r>
-            <w:r>
-              <w:rPr/>
-              <w:t xml:space="preserve"> and </w:t>
-            </w:r>
-            <w:r>
-              <w:rPr>
-                <w:rFonts w:ascii="Consolas" w:hAnsi="Consolas"/>
-                <w:color w:val="334455"/>
-                <w:sz w:val="19"/>
-              </w:rPr>
-              <w:t>driver:*</w:t>
-            </w:r>
-            <w:r>
-              <w:rPr/>
-              <w:t xml:space="preserve"> keys</w:t>
+              <w:rPr>
+                <w:rFonts w:ascii="Consolas" w:hAnsi="Consolas"/>
+                <w:color w:val="334455"/>
+                <w:sz w:val="19"/>
+              </w:rPr>
+              <w:t>cache:portfolio:positions</w:t>
             </w:r>
           </w:p>
         </w:tc>
@@ -1706,7 +1806,7 @@
               <w:rPr>
                 <w:b/>
               </w:rPr>
-              <w:t>System Status</w:t>
+              <w:t>EOD Report</w:t>
             </w:r>
           </w:p>
         </w:tc>
@@ -1719,19 +1819,7 @@
             <w:r/>
             <w:r>
               <w:rPr/>
-              <w:t xml:space="preserve">none — probes </w:t>
-            </w:r>
-            <w:r>
-              <w:rPr>
-                <w:rFonts w:ascii="Consolas" w:hAnsi="Consolas"/>
-                <w:color w:val="334455"/>
-                <w:sz w:val="19"/>
-              </w:rPr>
-              <w:t>/health</w:t>
-            </w:r>
-            <w:r>
-              <w:rPr/>
-              <w:t xml:space="preserve"> directly</w:t>
+              <w:t>none — pure Tier-1 reader</w:t>
             </w:r>
           </w:p>
         </w:tc>
@@ -1739,6 +1827,82 @@
           <w:tcPr>
             <w:tcW w:type="dxa" w:w="2880"/>
             <w:shd w:val="clear" w:color="auto" w:fill="F4F6FA"/>
+          </w:tcPr>
+          <w:p>
+            <w:r/>
+            <w:r>
+              <w:rPr/>
+              <w:t xml:space="preserve">aggregates the </w:t>
+            </w:r>
+            <w:r>
+              <w:rPr>
+                <w:rFonts w:ascii="Consolas" w:hAnsi="Consolas"/>
+                <w:color w:val="334455"/>
+                <w:sz w:val="19"/>
+              </w:rPr>
+              <w:t>options:*</w:t>
+            </w:r>
+            <w:r>
+              <w:rPr/>
+              <w:t xml:space="preserve"> and </w:t>
+            </w:r>
+            <w:r>
+              <w:rPr>
+                <w:rFonts w:ascii="Consolas" w:hAnsi="Consolas"/>
+                <w:color w:val="334455"/>
+                <w:sz w:val="19"/>
+              </w:rPr>
+              <w:t>driver:*</w:t>
+            </w:r>
+            <w:r>
+              <w:rPr/>
+              <w:t xml:space="preserve"> keys</w:t>
+            </w:r>
+          </w:p>
+        </w:tc>
+      </w:tr>
+      <w:tr>
+        <w:tc>
+          <w:tcPr>
+            <w:tcW w:type="dxa" w:w="2880"/>
+          </w:tcPr>
+          <w:p>
+            <w:r/>
+            <w:r>
+              <w:rPr>
+                <w:b/>
+              </w:rPr>
+              <w:t>System Status</w:t>
+            </w:r>
+          </w:p>
+        </w:tc>
+        <w:tc>
+          <w:tcPr>
+            <w:tcW w:type="dxa" w:w="2880"/>
+          </w:tcPr>
+          <w:p>
+            <w:r/>
+            <w:r>
+              <w:rPr/>
+              <w:t xml:space="preserve">none — probes </w:t>
+            </w:r>
+            <w:r>
+              <w:rPr>
+                <w:rFonts w:ascii="Consolas" w:hAnsi="Consolas"/>
+                <w:color w:val="334455"/>
+                <w:sz w:val="19"/>
+              </w:rPr>
+              <w:t>/health</w:t>
+            </w:r>
+            <w:r>
+              <w:rPr/>
+              <w:t xml:space="preserve"> directly</w:t>
+            </w:r>
+          </w:p>
+        </w:tc>
+        <w:tc>
+          <w:tcPr>
+            <w:tcW w:type="dxa" w:w="2880"/>
           </w:tcPr>
           <w:p>
             <w:r/>
@@ -9070,7 +9234,7 @@
                 <w:color w:val="334455"/>
                 <w:sz w:val="19"/>
               </w:rPr>
-              <w:t>rescue</w:t>
+              <w:t>dossier</w:t>
             </w:r>
           </w:p>
         </w:tc>
@@ -9087,7 +9251,137 @@
                 <w:color w:val="334455"/>
                 <w:sz w:val="19"/>
               </w:rPr>
-              <w:t>{position_id}</w:t>
+              <w:t>{symbol}</w:t>
+            </w:r>
+            <w:r>
+              <w:rPr/>
+              <w:t xml:space="preserve"> — cleaned by </w:t>
+            </w:r>
+            <w:r>
+              <w:rPr>
+                <w:rFonts w:ascii="Consolas" w:hAnsi="Consolas"/>
+                <w:color w:val="334455"/>
+                <w:sz w:val="19"/>
+              </w:rPr>
+              <w:t>shared.symbols.clean_symbol</w:t>
+            </w:r>
+            <w:r>
+              <w:rPr/>
+              <w:t xml:space="preserve"> (upper-cased, </w:t>
+            </w:r>
+            <w:r>
+              <w:rPr>
+                <w:rFonts w:ascii="Consolas" w:hAnsi="Consolas"/>
+                <w:color w:val="334455"/>
+                <w:sz w:val="19"/>
+              </w:rPr>
+              <w:t>[A-Z$][A-Z0-9$.]{0,7}</w:t>
+            </w:r>
+            <w:r>
+              <w:rPr/>
+              <w:t xml:space="preserve">); anything it refuses is logged and writes nothing, because the symbol becomes part of the key name. Replay-guarded (a command older than 180 s is dropped). </w:t>
+            </w:r>
+            <w:r>
+              <w:rPr>
+                <w:b/>
+              </w:rPr>
+              <w:t>Deduplicated</w:t>
+            </w:r>
+            <w:r>
+              <w:rPr/>
+              <w:t xml:space="preserve"> (</w:t>
+            </w:r>
+            <w:r>
+              <w:rPr>
+                <w:rFonts w:ascii="Consolas" w:hAnsi="Consolas"/>
+                <w:color w:val="334455"/>
+                <w:sz w:val="19"/>
+              </w:rPr>
+              <w:t>DOSSIER_DEDUP_SEC</w:t>
+            </w:r>
+            <w:r>
+              <w:rPr/>
+              <w:t xml:space="preserve"> = 60): if that symbol's dossier was written less than 60 s ago — measured on the envelope's own </w:t>
+            </w:r>
+            <w:r>
+              <w:rPr>
+                <w:rFonts w:ascii="Consolas" w:hAnsi="Consolas"/>
+                <w:color w:val="334455"/>
+                <w:sz w:val="19"/>
+              </w:rPr>
+              <w:t>ts</w:t>
+            </w:r>
+            <w:r>
+              <w:rPr/>
+              <w:t xml:space="preserve">, the write time — the command is dropped and nothing is fetched or re-published. A recent success or </w:t>
+            </w:r>
+            <w:r>
+              <w:rPr>
+                <w:rFonts w:ascii="Consolas" w:hAnsi="Consolas"/>
+                <w:color w:val="334455"/>
+                <w:sz w:val="19"/>
+              </w:rPr>
+              <w:t>no_quote</w:t>
+            </w:r>
+            <w:r>
+              <w:rPr/>
+              <w:t xml:space="preserve"> blocks the fetch; a recent </w:t>
+            </w:r>
+            <w:r>
+              <w:rPr>
+                <w:rFonts w:ascii="Consolas" w:hAnsi="Consolas"/>
+                <w:color w:val="334455"/>
+                <w:sz w:val="19"/>
+              </w:rPr>
+              <w:t>fetch_failed</w:t>
+            </w:r>
+            <w:r>
+              <w:rPr/>
+              <w:t xml:space="preserve"> does </w:t>
+            </w:r>
+            <w:r>
+              <w:rPr>
+                <w:b/>
+              </w:rPr>
+              <w:t>not</w:t>
+            </w:r>
+            <w:r>
+              <w:rPr/>
+              <w:t xml:space="preserve"> (a retry costs at most one quote call). An unreadable envelope counts as no recent dossier. Otherwise one fetch of </w:t>
+            </w:r>
+            <w:r>
+              <w:rPr>
+                <w:b/>
+              </w:rPr>
+              <w:t>4 Schwab calls, 5 at most</w:t>
+            </w:r>
+            <w:r>
+              <w:rPr/>
+              <w:t xml:space="preserve"> (quote · GEX chain today..+7 d · 1-year daily price history · IV chain +20..+45 d · the IV analysis' own today..+60 d fallback when that window is empty); a </w:t>
+            </w:r>
+            <w:r>
+              <w:rPr>
+                <w:rFonts w:ascii="Consolas" w:hAnsi="Consolas"/>
+                <w:color w:val="334455"/>
+                <w:sz w:val="19"/>
+              </w:rPr>
+              <w:t>no_quote</w:t>
+            </w:r>
+            <w:r>
+              <w:rPr/>
+              <w:t xml:space="preserve"> or </w:t>
+            </w:r>
+            <w:r>
+              <w:rPr>
+                <w:rFonts w:ascii="Consolas" w:hAnsi="Consolas"/>
+                <w:color w:val="334455"/>
+                <w:sz w:val="19"/>
+              </w:rPr>
+              <w:t>fetch_failed</w:t>
+            </w:r>
+            <w:r>
+              <w:rPr/>
+              <w:t xml:space="preserve"> answer spends one</w:t>
             </w:r>
           </w:p>
         </w:tc>
@@ -9104,7 +9398,329 @@
                 <w:color w:val="334455"/>
                 <w:sz w:val="19"/>
               </w:rPr>
-              <w:t>cache:options:rescue:&lt;position_id&gt;</w:t>
+              <w:t>cache:options:dossier:&lt;SYMBOL&gt;</w:t>
+            </w:r>
+            <w:r>
+              <w:rPr/>
+              <w:t xml:space="preserve"> (event </w:t>
+            </w:r>
+            <w:r>
+              <w:rPr>
+                <w:rFonts w:ascii="Consolas" w:hAnsi="Consolas"/>
+                <w:color w:val="334455"/>
+                <w:sz w:val="19"/>
+              </w:rPr>
+              <w:t>events:options:dossier:&lt;SYMBOL&gt;</w:t>
+            </w:r>
+            <w:r>
+              <w:rPr/>
+              <w:t xml:space="preserve">), </w:t>
+            </w:r>
+            <w:r>
+              <w:rPr>
+                <w:b/>
+              </w:rPr>
+              <w:t>TTL 900 s</w:t>
+            </w:r>
+            <w:r>
+              <w:rPr/>
+              <w:t xml:space="preserve">, per symbol so two tabs never share a slot — </w:t>
+            </w:r>
+            <w:r>
+              <w:rPr>
+                <w:rFonts w:ascii="Consolas" w:hAnsi="Consolas"/>
+                <w:color w:val="334455"/>
+                <w:sz w:val="19"/>
+              </w:rPr>
+              <w:t>{symbol, error, fetched_at, spot, day_pct, flip, put_wall, call_wall, net_gex, iv_rank, current_iv, hv_current, earnings_status, earnings_date}</w:t>
+            </w:r>
+            <w:r>
+              <w:rPr/>
+              <w:t xml:space="preserve">. Every key is always present; an absent reading is </w:t>
+            </w:r>
+            <w:r>
+              <w:rPr>
+                <w:rFonts w:ascii="Consolas" w:hAnsi="Consolas"/>
+                <w:color w:val="334455"/>
+                <w:sz w:val="19"/>
+              </w:rPr>
+              <w:t>null</w:t>
+            </w:r>
+            <w:r>
+              <w:rPr/>
+              <w:t xml:space="preserve">, never 0. </w:t>
+            </w:r>
+            <w:r>
+              <w:rPr>
+                <w:rFonts w:ascii="Consolas" w:hAnsi="Consolas"/>
+                <w:color w:val="334455"/>
+                <w:sz w:val="19"/>
+              </w:rPr>
+              <w:t>fetched_at</w:t>
+            </w:r>
+            <w:r>
+              <w:rPr/>
+              <w:t xml:space="preserve"> is naive Central ISO. </w:t>
+            </w:r>
+            <w:r>
+              <w:rPr>
+                <w:rFonts w:ascii="Consolas" w:hAnsi="Consolas"/>
+                <w:color w:val="334455"/>
+                <w:sz w:val="19"/>
+              </w:rPr>
+              <w:t>current_iv</w:t>
+            </w:r>
+            <w:r>
+              <w:rPr/>
+              <w:t xml:space="preserve"> / </w:t>
+            </w:r>
+            <w:r>
+              <w:rPr>
+                <w:rFonts w:ascii="Consolas" w:hAnsi="Consolas"/>
+                <w:color w:val="334455"/>
+                <w:sz w:val="19"/>
+              </w:rPr>
+              <w:t>hv_current</w:t>
+            </w:r>
+            <w:r>
+              <w:rPr/>
+              <w:t xml:space="preserve"> are </w:t>
+            </w:r>
+            <w:r>
+              <w:rPr>
+                <w:b/>
+              </w:rPr>
+              <w:t>percents</w:t>
+            </w:r>
+            <w:r>
+              <w:rPr/>
+              <w:t xml:space="preserve"> (48.5 = 48.5%); </w:t>
+            </w:r>
+            <w:r>
+              <w:rPr>
+                <w:rFonts w:ascii="Consolas" w:hAnsi="Consolas"/>
+                <w:color w:val="334455"/>
+                <w:sz w:val="19"/>
+              </w:rPr>
+              <w:t>iv_rank</w:t>
+            </w:r>
+            <w:r>
+              <w:rPr/>
+              <w:t xml:space="preserve"> is the scan's Vol Rank; </w:t>
+            </w:r>
+            <w:r>
+              <w:rPr>
+                <w:rFonts w:ascii="Consolas" w:hAnsi="Consolas"/>
+                <w:color w:val="334455"/>
+                <w:sz w:val="19"/>
+              </w:rPr>
+              <w:t>day_pct</w:t>
+            </w:r>
+            <w:r>
+              <w:rPr/>
+              <w:t xml:space="preserve"> is always </w:t>
+            </w:r>
+            <w:r>
+              <w:rPr>
+                <w:rFonts w:ascii="Consolas" w:hAnsi="Consolas"/>
+                <w:color w:val="334455"/>
+                <w:sz w:val="19"/>
+              </w:rPr>
+              <w:t>null</w:t>
+            </w:r>
+            <w:r>
+              <w:rPr/>
+              <w:t xml:space="preserve"> (no day-change parser is shared for a raw quote). </w:t>
+            </w:r>
+            <w:r>
+              <w:rPr>
+                <w:rFonts w:ascii="Consolas" w:hAnsi="Consolas"/>
+                <w:color w:val="334455"/>
+                <w:sz w:val="19"/>
+              </w:rPr>
+              <w:t>earnings_status</w:t>
+            </w:r>
+            <w:r>
+              <w:rPr/>
+              <w:t xml:space="preserve"> is three-valued: </w:t>
+            </w:r>
+            <w:r>
+              <w:rPr>
+                <w:rFonts w:ascii="Consolas" w:hAnsi="Consolas"/>
+                <w:color w:val="334455"/>
+                <w:sz w:val="19"/>
+              </w:rPr>
+              <w:t>upcoming</w:t>
+            </w:r>
+            <w:r>
+              <w:rPr/>
+              <w:t xml:space="preserve"> · </w:t>
+            </w:r>
+            <w:r>
+              <w:rPr>
+                <w:rFonts w:ascii="Consolas" w:hAnsi="Consolas"/>
+                <w:color w:val="334455"/>
+                <w:sz w:val="19"/>
+              </w:rPr>
+              <w:t>none_scheduled</w:t>
+            </w:r>
+            <w:r>
+              <w:rPr/>
+              <w:t xml:space="preserve"> · </w:t>
+            </w:r>
+            <w:r>
+              <w:rPr>
+                <w:rFonts w:ascii="Consolas" w:hAnsi="Consolas"/>
+                <w:color w:val="334455"/>
+                <w:sz w:val="19"/>
+              </w:rPr>
+              <w:t>not_listed</w:t>
+            </w:r>
+            <w:r>
+              <w:rPr/>
+              <w:t xml:space="preserve"> (the calendar has no data — not "no report"). Walls are assigned by side of spot, and both are </w:t>
+            </w:r>
+            <w:r>
+              <w:rPr>
+                <w:rFonts w:ascii="Consolas" w:hAnsi="Consolas"/>
+                <w:color w:val="334455"/>
+                <w:sz w:val="19"/>
+              </w:rPr>
+              <w:t>null</w:t>
+            </w:r>
+            <w:r>
+              <w:rPr/>
+              <w:t xml:space="preserve"> when </w:t>
+            </w:r>
+            <w:r>
+              <w:rPr>
+                <w:rFonts w:ascii="Consolas" w:hAnsi="Consolas"/>
+                <w:color w:val="334455"/>
+                <w:sz w:val="19"/>
+              </w:rPr>
+              <w:t>net_gex</w:t>
+            </w:r>
+            <w:r>
+              <w:rPr/>
+              <w:t xml:space="preserve"> is exactly </w:t>
+            </w:r>
+            <w:r>
+              <w:rPr>
+                <w:rFonts w:ascii="Consolas" w:hAnsi="Consolas"/>
+                <w:color w:val="334455"/>
+                <w:sz w:val="19"/>
+              </w:rPr>
+              <w:t>0.0</w:t>
+            </w:r>
+            <w:r>
+              <w:rPr/>
+              <w:t xml:space="preserve"> (the after-hours all-zero grid, whose walls would be an argmax tie-break); </w:t>
+            </w:r>
+            <w:r>
+              <w:rPr>
+                <w:rFonts w:ascii="Consolas" w:hAnsi="Consolas"/>
+                <w:color w:val="334455"/>
+                <w:sz w:val="19"/>
+              </w:rPr>
+              <w:t>flip</w:t>
+            </w:r>
+            <w:r>
+              <w:rPr/>
+              <w:t xml:space="preserve"> is kept either way. </w:t>
+            </w:r>
+            <w:r>
+              <w:rPr>
+                <w:rFonts w:ascii="Consolas" w:hAnsi="Consolas"/>
+                <w:color w:val="334455"/>
+                <w:sz w:val="19"/>
+              </w:rPr>
+              <w:t>error</w:t>
+            </w:r>
+            <w:r>
+              <w:rPr/>
+              <w:t xml:space="preserve"> is </w:t>
+            </w:r>
+            <w:r>
+              <w:rPr>
+                <w:rFonts w:ascii="Consolas" w:hAnsi="Consolas"/>
+                <w:color w:val="334455"/>
+                <w:sz w:val="19"/>
+              </w:rPr>
+              <w:t>null</w:t>
+            </w:r>
+            <w:r>
+              <w:rPr/>
+              <w:t xml:space="preserve"> on success, </w:t>
+            </w:r>
+            <w:r>
+              <w:rPr>
+                <w:rFonts w:ascii="Consolas" w:hAnsi="Consolas"/>
+                <w:color w:val="334455"/>
+                <w:sz w:val="19"/>
+              </w:rPr>
+              <w:t>"no_quote"</w:t>
+            </w:r>
+            <w:r>
+              <w:rPr/>
+              <w:t xml:space="preserve"> when Schwab </w:t>
+            </w:r>
+            <w:r>
+              <w:rPr>
+                <w:b/>
+              </w:rPr>
+              <w:t>answered</w:t>
+            </w:r>
+            <w:r>
+              <w:rPr/>
+              <w:t xml:space="preserve"> and quoted nothing usable for the symbol (a typo — the other legs are skipped), or </w:t>
+            </w:r>
+            <w:r>
+              <w:rPr>
+                <w:rFonts w:ascii="Consolas" w:hAnsi="Consolas"/>
+                <w:color w:val="334455"/>
+                <w:sz w:val="19"/>
+              </w:rPr>
+              <w:t>"fetch_failed"</w:t>
+            </w:r>
+            <w:r>
+              <w:rPr/>
+              <w:t xml:space="preserve"> when the quote request itself failed (non-200 or raised: proxy down, timeout, token) — the ticker may be fine. One of the three later legs failing blanks only its own keys and records a degrade (</w:t>
+            </w:r>
+            <w:r>
+              <w:rPr>
+                <w:rFonts w:ascii="Consolas" w:hAnsi="Consolas"/>
+                <w:color w:val="334455"/>
+                <w:sz w:val="19"/>
+              </w:rPr>
+              <w:t>options.dossier_gex</w:t>
+            </w:r>
+            <w:r>
+              <w:rPr/>
+              <w:t xml:space="preserve"> · </w:t>
+            </w:r>
+            <w:r>
+              <w:rPr>
+                <w:rFonts w:ascii="Consolas" w:hAnsi="Consolas"/>
+                <w:color w:val="334455"/>
+                <w:sz w:val="19"/>
+              </w:rPr>
+              <w:t>_vol</w:t>
+            </w:r>
+            <w:r>
+              <w:rPr/>
+              <w:t xml:space="preserve"> · </w:t>
+            </w:r>
+            <w:r>
+              <w:rPr>
+                <w:rFonts w:ascii="Consolas" w:hAnsi="Consolas"/>
+                <w:color w:val="334455"/>
+                <w:sz w:val="19"/>
+              </w:rPr>
+              <w:t>_earnings</w:t>
+            </w:r>
+            <w:r>
+              <w:rPr/>
+              <w:t>)</w:t>
             </w:r>
           </w:p>
         </w:tc>
@@ -9122,6 +9738,57 @@
                 <w:color w:val="334455"/>
                 <w:sz w:val="19"/>
               </w:rPr>
+              <w:t>rescue</w:t>
+            </w:r>
+          </w:p>
+        </w:tc>
+        <w:tc>
+          <w:tcPr>
+            <w:tcW w:type="dxa" w:w="2880"/>
+          </w:tcPr>
+          <w:p>
+            <w:r/>
+            <w:r>
+              <w:rPr>
+                <w:rFonts w:ascii="Consolas" w:hAnsi="Consolas"/>
+                <w:color w:val="334455"/>
+                <w:sz w:val="19"/>
+              </w:rPr>
+              <w:t>{position_id}</w:t>
+            </w:r>
+          </w:p>
+        </w:tc>
+        <w:tc>
+          <w:tcPr>
+            <w:tcW w:type="dxa" w:w="2880"/>
+          </w:tcPr>
+          <w:p>
+            <w:r/>
+            <w:r>
+              <w:rPr>
+                <w:rFonts w:ascii="Consolas" w:hAnsi="Consolas"/>
+                <w:color w:val="334455"/>
+                <w:sz w:val="19"/>
+              </w:rPr>
+              <w:t>cache:options:rescue:&lt;position_id&gt;</w:t>
+            </w:r>
+          </w:p>
+        </w:tc>
+      </w:tr>
+      <w:tr>
+        <w:tc>
+          <w:tcPr>
+            <w:tcW w:type="dxa" w:w="2880"/>
+            <w:shd w:val="clear" w:color="auto" w:fill="F4F6FA"/>
+          </w:tcPr>
+          <w:p>
+            <w:r/>
+            <w:r>
+              <w:rPr>
+                <w:rFonts w:ascii="Consolas" w:hAnsi="Consolas"/>
+                <w:color w:val="334455"/>
+                <w:sz w:val="19"/>
+              </w:rPr>
               <w:t>rescue_apply</w:t>
             </w:r>
           </w:p>
@@ -9129,6 +9796,7 @@
         <w:tc>
           <w:tcPr>
             <w:tcW w:type="dxa" w:w="2880"/>
+            <w:shd w:val="clear" w:color="auto" w:fill="F4F6FA"/>
           </w:tcPr>
           <w:p>
             <w:r/>
@@ -9145,6 +9813,7 @@
         <w:tc>
           <w:tcPr>
             <w:tcW w:type="dxa" w:w="2880"/>
+            <w:shd w:val="clear" w:color="auto" w:fill="F4F6FA"/>
           </w:tcPr>
           <w:p>
             <w:r/>
@@ -9884,6 +10553,585 @@
       </w:tr>
     </w:tbl>
     <w:p/>
+    <w:p>
+      <w:r>
+        <w:rPr>
+          <w:rFonts w:ascii="Consolas" w:hAnsi="Consolas"/>
+          <w:color w:val="334455"/>
+          <w:sz w:val="19"/>
+        </w:rPr>
+        <w:t>cache:options:scan_day</w:t>
+      </w:r>
+      <w:r>
+        <w:rPr/>
+        <w:t xml:space="preserve"> — the day union the Market Scanner and the Symbol</w:t>
+        <w:br/>
+        <w:t xml:space="preserve">Dossier render: </w:t>
+      </w:r>
+      <w:r>
+        <w:rPr>
+          <w:rFonts w:ascii="Consolas" w:hAnsi="Consolas"/>
+          <w:color w:val="334455"/>
+          <w:sz w:val="19"/>
+        </w:rPr>
+        <w:t>{date, scan_seq, signals_0dte[], signals_swing[],</w:t>
+        <w:br/>
+        <w:t>signals_directional[], setups, truncated?}</w:t>
+      </w:r>
+      <w:r>
+        <w:rPr/>
+        <w:t xml:space="preserve">. </w:t>
+      </w:r>
+      <w:r>
+        <w:rPr>
+          <w:rFonts w:ascii="Consolas" w:hAnsi="Consolas"/>
+          <w:color w:val="334455"/>
+          <w:sz w:val="19"/>
+        </w:rPr>
+        <w:t>date</w:t>
+      </w:r>
+      <w:r>
+        <w:rPr/>
+        <w:t xml:space="preserve"> is the </w:t>
+      </w:r>
+      <w:r>
+        <w:rPr>
+          <w:b/>
+        </w:rPr>
+        <w:t>Central</w:t>
+      </w:r>
+      <w:r>
+        <w:rPr/>
+        <w:t xml:space="preserve"> trading date —</w:t>
+        <w:br/>
+        <w:t xml:space="preserve">check it before trusting any row's </w:t>
+      </w:r>
+      <w:r>
+        <w:rPr>
+          <w:rFonts w:ascii="Consolas" w:hAnsi="Consolas"/>
+          <w:color w:val="334455"/>
+          <w:sz w:val="19"/>
+        </w:rPr>
+        <w:t>live</w:t>
+      </w:r>
+      <w:r>
+        <w:rPr/>
+        <w:t>, because a failed first merge of a new day</w:t>
+        <w:br/>
+        <w:t xml:space="preserve">leaves yesterday's envelope in place. </w:t>
+      </w:r>
+      <w:r>
+        <w:rPr>
+          <w:rFonts w:ascii="Consolas" w:hAnsi="Consolas"/>
+          <w:color w:val="334455"/>
+          <w:sz w:val="19"/>
+        </w:rPr>
+        <w:t>scan_seq</w:t>
+      </w:r>
+      <w:r>
+        <w:rPr/>
+        <w:t xml:space="preserve"> is this scan's 1-based number within</w:t>
+        <w:br/>
+        <w:t xml:space="preserve">the day. Each row is the scan's row plus </w:t>
+      </w:r>
+      <w:r>
+        <w:rPr>
+          <w:rFonts w:ascii="Consolas" w:hAnsi="Consolas"/>
+          <w:color w:val="334455"/>
+          <w:sz w:val="19"/>
+        </w:rPr>
+        <w:t>live</w:t>
+      </w:r>
+      <w:r>
+        <w:rPr/>
+        <w:t xml:space="preserve">, </w:t>
+      </w:r>
+      <w:r>
+        <w:rPr>
+          <w:rFonts w:ascii="Consolas" w:hAnsi="Consolas"/>
+          <w:color w:val="334455"/>
+          <w:sz w:val="19"/>
+        </w:rPr>
+        <w:t>stale_since</w:t>
+      </w:r>
+      <w:r>
+        <w:rPr/>
+        <w:t xml:space="preserve"> (when it dropped out;</w:t>
+        <w:br/>
+      </w:r>
+      <w:r>
+        <w:rPr>
+          <w:rFonts w:ascii="Consolas" w:hAnsi="Consolas"/>
+          <w:color w:val="334455"/>
+          <w:sz w:val="19"/>
+        </w:rPr>
+        <w:t>null</w:t>
+      </w:r>
+      <w:r>
+        <w:rPr/>
+        <w:t xml:space="preserve"> while live) and </w:t>
+      </w:r>
+      <w:r>
+        <w:rPr>
+          <w:rFonts w:ascii="Consolas" w:hAnsi="Consolas"/>
+          <w:color w:val="334455"/>
+          <w:sz w:val="19"/>
+        </w:rPr>
+        <w:t>setup_key</w:t>
+      </w:r>
+      <w:r>
+        <w:rPr/>
+        <w:t xml:space="preserve"> — </w:t>
+      </w:r>
+      <w:r>
+        <w:rPr>
+          <w:rFonts w:ascii="Consolas" w:hAnsi="Consolas"/>
+          <w:color w:val="334455"/>
+          <w:sz w:val="19"/>
+        </w:rPr>
+        <w:t>SYMBOL|TYPE|EXPIRATION</w:t>
+      </w:r>
+      <w:r>
+        <w:rPr/>
+        <w:t>, strikes excluded</w:t>
+        <w:br/>
+        <w:t xml:space="preserve">(the row's front expiration — its </w:t>
+      </w:r>
+      <w:r>
+        <w:rPr>
+          <w:rFonts w:ascii="Consolas" w:hAnsi="Consolas"/>
+          <w:color w:val="334455"/>
+          <w:sz w:val="19"/>
+        </w:rPr>
+        <w:t>legs</w:t>
+      </w:r>
+      <w:r>
+        <w:rPr/>
+        <w:t xml:space="preserve"> only when the top-level field is</w:t>
+        <w:br/>
+        <w:t xml:space="preserve">unreadable), or </w:t>
+      </w:r>
+      <w:r>
+        <w:rPr>
+          <w:rFonts w:ascii="Consolas" w:hAnsi="Consolas"/>
+          <w:color w:val="334455"/>
+          <w:sz w:val="19"/>
+        </w:rPr>
+        <w:t>null</w:t>
+      </w:r>
+      <w:r>
+        <w:rPr/>
+        <w:t xml:space="preserve"> when a part is</w:t>
+        <w:br/>
+        <w:t xml:space="preserve">missing. ⚠ </w:t>
+      </w:r>
+      <w:r>
+        <w:rPr>
+          <w:rFonts w:ascii="Consolas" w:hAnsi="Consolas"/>
+          <w:color w:val="334455"/>
+          <w:sz w:val="19"/>
+        </w:rPr>
+        <w:t>setup_key</w:t>
+      </w:r>
+      <w:r>
+        <w:rPr/>
+        <w:t xml:space="preserve"> is a </w:t>
+      </w:r>
+      <w:r>
+        <w:rPr>
+          <w:b/>
+        </w:rPr>
+        <w:t xml:space="preserve">lookup into </w:t>
+      </w:r>
+      <w:r>
+        <w:rPr>
+          <w:rFonts w:ascii="Consolas" w:hAnsi="Consolas"/>
+          <w:color w:val="334455"/>
+          <w:sz w:val="19"/>
+        </w:rPr>
+        <w:t>setups</w:t>
+      </w:r>
+      <w:r>
+        <w:rPr>
+          <w:b/>
+        </w:rPr>
+        <w:t>, never a row key</w:t>
+      </w:r>
+      <w:r>
+        <w:rPr/>
+        <w:t>: row identity</w:t>
+        <w:br/>
+        <w:t xml:space="preserve">stays </w:t>
+      </w:r>
+      <w:r>
+        <w:rPr>
+          <w:rFonts w:ascii="Consolas" w:hAnsi="Consolas"/>
+          <w:color w:val="334455"/>
+          <w:sz w:val="19"/>
+        </w:rPr>
+        <w:t>id</w:t>
+      </w:r>
+      <w:r>
+        <w:rPr/>
+        <w:t>, and two adjacent strikes on one expiry are two rows sharing one entry.</w:t>
+        <w:br/>
+      </w:r>
+      <w:r>
+        <w:rPr>
+          <w:rFonts w:ascii="Consolas" w:hAnsi="Consolas"/>
+          <w:color w:val="334455"/>
+          <w:sz w:val="19"/>
+        </w:rPr>
+        <w:t>setups</w:t>
+      </w:r>
+      <w:r>
+        <w:rPr/>
+        <w:t xml:space="preserve"> is </w:t>
+      </w:r>
+      <w:r>
+        <w:rPr>
+          <w:rFonts w:ascii="Consolas" w:hAnsi="Consolas"/>
+          <w:color w:val="334455"/>
+          <w:sz w:val="19"/>
+        </w:rPr>
+        <w:t>{setup_key: {seen, scores[], gaps, last_seq, last_live, first_seen |</w:t>
+        <w:br/>
+        <w:t>age_unknown}}</w:t>
+      </w:r>
+      <w:r>
+        <w:rPr/>
+        <w:t xml:space="preserve"> — </w:t>
+      </w:r>
+      <w:r>
+        <w:rPr>
+          <w:rFonts w:ascii="Consolas" w:hAnsi="Consolas"/>
+          <w:color w:val="334455"/>
+          <w:sz w:val="19"/>
+        </w:rPr>
+        <w:t>seen</w:t>
+      </w:r>
+      <w:r>
+        <w:rPr/>
+        <w:t xml:space="preserve"> the scans it was live in, </w:t>
+      </w:r>
+      <w:r>
+        <w:rPr>
+          <w:rFonts w:ascii="Consolas" w:hAnsi="Consolas"/>
+          <w:color w:val="334455"/>
+          <w:sz w:val="19"/>
+        </w:rPr>
+        <w:t>scores</w:t>
+      </w:r>
+      <w:r>
+        <w:rPr/>
+        <w:t xml:space="preserve"> its best composite per</w:t>
+        <w:br/>
+        <w:t xml:space="preserve">scan (the last 40), </w:t>
+      </w:r>
+      <w:r>
+        <w:rPr>
+          <w:rFonts w:ascii="Consolas" w:hAnsi="Consolas"/>
+          <w:color w:val="334455"/>
+          <w:sz w:val="19"/>
+        </w:rPr>
+        <w:t>gaps</w:t>
+      </w:r>
+      <w:r>
+        <w:rPr/>
+        <w:t xml:space="preserve"> how many times it went absent and came back. A setup whose</w:t>
+        <w:br/>
+        <w:t xml:space="preserve">start was not observed (the map rebuilt mid-session) carries </w:t>
+      </w:r>
+      <w:r>
+        <w:rPr>
+          <w:rFonts w:ascii="Consolas" w:hAnsi="Consolas"/>
+          <w:color w:val="334455"/>
+          <w:sz w:val="19"/>
+        </w:rPr>
+        <w:t>age_unknown: true</w:t>
+      </w:r>
+      <w:r>
+        <w:rPr/>
+        <w:t xml:space="preserve"> and</w:t>
+        <w:br/>
+      </w:r>
+      <w:r>
+        <w:rPr>
+          <w:b/>
+        </w:rPr>
+        <w:t>no</w:t>
+      </w:r>
+      <w:r>
+        <w:rPr/>
+        <w:t xml:space="preserve"> </w:t>
+      </w:r>
+      <w:r>
+        <w:rPr>
+          <w:rFonts w:ascii="Consolas" w:hAnsi="Consolas"/>
+          <w:color w:val="334455"/>
+          <w:sz w:val="19"/>
+        </w:rPr>
+        <w:t>first_seen</w:t>
+      </w:r>
+      <w:r>
+        <w:rPr/>
+        <w:t>; nothing is ever stamped with the current time to fill the gap.</w:t>
+        <w:br/>
+      </w:r>
+      <w:r>
+        <w:rPr>
+          <w:rFonts w:ascii="Consolas" w:hAnsi="Consolas"/>
+          <w:color w:val="334455"/>
+          <w:sz w:val="19"/>
+        </w:rPr>
+        <w:t>setups</w:t>
+      </w:r>
+      <w:r>
+        <w:rPr/>
+        <w:t xml:space="preserve"> is always present; an empty map on a scan whose persistence step failed</w:t>
+        <w:br/>
+        <w:t xml:space="preserve">(degrade </w:t>
+      </w:r>
+      <w:r>
+        <w:rPr>
+          <w:rFonts w:ascii="Consolas" w:hAnsi="Consolas"/>
+          <w:color w:val="334455"/>
+          <w:sz w:val="19"/>
+        </w:rPr>
+        <w:t>options.merge_setups</w:t>
+      </w:r>
+      <w:r>
+        <w:rPr/>
+        <w:t xml:space="preserve">) means "no reading", never "all new". </w:t>
+      </w:r>
+      <w:r>
+        <w:rPr>
+          <w:rFonts w:ascii="Consolas" w:hAnsi="Consolas"/>
+          <w:color w:val="334455"/>
+          <w:sz w:val="19"/>
+        </w:rPr>
+        <w:t>truncated</w:t>
+      </w:r>
+      <w:r>
+        <w:rPr/>
+        <w:br/>
+        <w:t>(</w:t>
+      </w:r>
+      <w:r>
+        <w:rPr>
+          <w:rFonts w:ascii="Consolas" w:hAnsi="Consolas"/>
+          <w:color w:val="334455"/>
+          <w:sz w:val="19"/>
+        </w:rPr>
+        <w:t>{list: n_dropped}</w:t>
+      </w:r>
+      <w:r>
+        <w:rPr/>
+        <w:t>) appears only when the 2000-per-list cap evicted stale rows; the</w:t>
+        <w:br/>
+        <w:t>map is trimmed after the rows and never loses an entry a surviving row references.</w:t>
+      </w:r>
+    </w:p>
+    <w:p>
+      <w:r>
+        <w:rPr>
+          <w:rFonts w:ascii="Consolas" w:hAnsi="Consolas"/>
+          <w:color w:val="334455"/>
+          <w:sz w:val="19"/>
+        </w:rPr>
+        <w:t>cache:options:scan_funnel</w:t>
+      </w:r>
+      <w:r>
+        <w:rPr/>
+        <w:t xml:space="preserve"> — </w:t>
+      </w:r>
+      <w:r>
+        <w:rPr>
+          <w:rFonts w:ascii="Consolas" w:hAnsi="Consolas"/>
+          <w:color w:val="334455"/>
+          <w:sz w:val="19"/>
+        </w:rPr>
+        <w:t>{timestamp, symbols: {SYMBOL: account}}</w:t>
+      </w:r>
+      <w:r>
+        <w:rPr/>
+        <w:t>, the</w:t>
+        <w:br/>
+        <w:t>per-symbol account of why a symbol did or did not produce a signal. Each account is</w:t>
+        <w:br/>
+      </w:r>
+      <w:r>
+        <w:rPr>
+          <w:rFonts w:ascii="Consolas" w:hAnsi="Consolas"/>
+          <w:color w:val="334455"/>
+          <w:sz w:val="19"/>
+        </w:rPr>
+        <w:t>{price, iv_rank, hv_current, current_iv, earnings_date, stop, buckets}</w:t>
+      </w:r>
+      <w:r>
+        <w:rPr/>
+        <w:t>:</w:t>
+        <w:br/>
+      </w:r>
+      <w:r>
+        <w:rPr>
+          <w:rFonts w:ascii="Consolas" w:hAnsi="Consolas"/>
+          <w:color w:val="334455"/>
+          <w:sz w:val="19"/>
+        </w:rPr>
+        <w:t>hv_current</w:t>
+      </w:r>
+      <w:r>
+        <w:rPr/>
+        <w:t xml:space="preserve"> is 30-day realised volatility and </w:t>
+      </w:r>
+      <w:r>
+        <w:rPr>
+          <w:rFonts w:ascii="Consolas" w:hAnsi="Consolas"/>
+          <w:color w:val="334455"/>
+          <w:sz w:val="19"/>
+        </w:rPr>
+        <w:t>current_iv</w:t>
+      </w:r>
+      <w:r>
+        <w:rPr/>
+        <w:t xml:space="preserve"> the ATM implied</w:t>
+        <w:br/>
+        <w:t xml:space="preserve">volatility, both </w:t>
+      </w:r>
+      <w:r>
+        <w:rPr>
+          <w:b/>
+        </w:rPr>
+        <w:t>percents</w:t>
+      </w:r>
+      <w:r>
+        <w:rPr/>
+        <w:t xml:space="preserve">, </w:t>
+      </w:r>
+      <w:r>
+        <w:rPr>
+          <w:rFonts w:ascii="Consolas" w:hAnsi="Consolas"/>
+          <w:color w:val="334455"/>
+          <w:sz w:val="19"/>
+        </w:rPr>
+        <w:t>null</w:t>
+      </w:r>
+      <w:r>
+        <w:rPr/>
+        <w:t xml:space="preserve"> when the IV analysis did not measure them;</w:t>
+        <w:br/>
+      </w:r>
+      <w:r>
+        <w:rPr>
+          <w:rFonts w:ascii="Consolas" w:hAnsi="Consolas"/>
+          <w:color w:val="334455"/>
+          <w:sz w:val="19"/>
+        </w:rPr>
+        <w:t>stop</w:t>
+      </w:r>
+      <w:r>
+        <w:rPr/>
+        <w:t xml:space="preserve"> is </w:t>
+      </w:r>
+      <w:r>
+        <w:rPr>
+          <w:rFonts w:ascii="Consolas" w:hAnsi="Consolas"/>
+          <w:color w:val="334455"/>
+          <w:sz w:val="19"/>
+        </w:rPr>
+        <w:t>null</w:t>
+      </w:r>
+      <w:r>
+        <w:rPr/>
+        <w:t xml:space="preserve">, </w:t>
+      </w:r>
+      <w:r>
+        <w:rPr>
+          <w:rFonts w:ascii="Consolas" w:hAnsi="Consolas"/>
+          <w:color w:val="334455"/>
+          <w:sz w:val="19"/>
+        </w:rPr>
+        <w:t>"no_quote"</w:t>
+      </w:r>
+      <w:r>
+        <w:rPr/>
+        <w:t xml:space="preserve"> or </w:t>
+      </w:r>
+      <w:r>
+        <w:rPr>
+          <w:rFonts w:ascii="Consolas" w:hAnsi="Consolas"/>
+          <w:color w:val="334455"/>
+          <w:sz w:val="19"/>
+        </w:rPr>
+        <w:t>"no_data"</w:t>
+      </w:r>
+      <w:r>
+        <w:rPr/>
+        <w:t xml:space="preserve">; </w:t>
+      </w:r>
+      <w:r>
+        <w:rPr>
+          <w:rFonts w:ascii="Consolas" w:hAnsi="Consolas"/>
+          <w:color w:val="334455"/>
+          <w:sz w:val="19"/>
+        </w:rPr>
+        <w:t>buckets</w:t>
+      </w:r>
+      <w:r>
+        <w:rPr/>
+        <w:t xml:space="preserve"> is keyed </w:t>
+      </w:r>
+      <w:r>
+        <w:rPr>
+          <w:rFonts w:ascii="Consolas" w:hAnsi="Consolas"/>
+          <w:color w:val="334455"/>
+          <w:sz w:val="19"/>
+        </w:rPr>
+        <w:t>0DTE</w:t>
+      </w:r>
+      <w:r>
+        <w:rPr/>
+        <w:t xml:space="preserve"> / </w:t>
+      </w:r>
+      <w:r>
+        <w:rPr>
+          <w:rFonts w:ascii="Consolas" w:hAnsi="Consolas"/>
+          <w:color w:val="334455"/>
+          <w:sz w:val="19"/>
+        </w:rPr>
+        <w:t>SWING</w:t>
+      </w:r>
+      <w:r>
+        <w:rPr/>
+        <w:t xml:space="preserve"> /</w:t>
+        <w:br/>
+      </w:r>
+      <w:r>
+        <w:rPr>
+          <w:rFonts w:ascii="Consolas" w:hAnsi="Consolas"/>
+          <w:color w:val="334455"/>
+          <w:sz w:val="19"/>
+        </w:rPr>
+        <w:t>DIRECTIONAL</w:t>
+      </w:r>
+      <w:r>
+        <w:rPr/>
+        <w:t xml:space="preserve">. Written after every scan with </w:t>
+      </w:r>
+      <w:r>
+        <w:rPr>
+          <w:rFonts w:ascii="Consolas" w:hAnsi="Consolas"/>
+          <w:color w:val="334455"/>
+          <w:sz w:val="19"/>
+        </w:rPr>
+        <w:t>skip_unchanged</w:t>
+      </w:r>
+      <w:r>
+        <w:rPr/>
+        <w:t>.</w:t>
+      </w:r>
+    </w:p>
     <w:p>
       <w:r>
         <w:rPr>
@@ -14947,7 +16195,29 @@
           <w:color w:val="223344"/>
           <w:sz w:val="18"/>
         </w:rPr>
-        <w:t>cache:options:scan_day         events:options:scan_day      (the DAY UNION the Scanner renders)</w:t>
+        <w:t>cache:options:scan_day         events:options:scan_day      (the DAY UNION the Scanner renders, + setups)</w:t>
+      </w:r>
+      <w:r>
+        <w:br/>
+      </w:r>
+      <w:r>
+        <w:rPr>
+          <w:rFonts w:ascii="Consolas" w:hAnsi="Consolas"/>
+          <w:color w:val="223344"/>
+          <w:sz w:val="18"/>
+        </w:rPr>
+        <w:t>cache:options:scan_funnel      events:options:scan_funnel   (per-symbol "why no trade?" account)</w:t>
+      </w:r>
+      <w:r>
+        <w:br/>
+      </w:r>
+      <w:r>
+        <w:rPr>
+          <w:rFonts w:ascii="Consolas" w:hAnsi="Consolas"/>
+          <w:color w:val="223344"/>
+          <w:sz w:val="18"/>
+        </w:rPr>
+        <w:t>cache:options:dossier:&lt;SYMBOL&gt; events:options:dossier:&lt;SYMBOL&gt;   (TTL 900 s; the Symbol Dossier's look-up)</w:t>
       </w:r>
       <w:r>
         <w:br/>

</xml_diff>

<commit_message>
docs(x): allow-list, routes, one-path invariant, changelog, API reference
Co-Authored-By: Claude Opus 5 <noreply@anthropic.com>
</commit_message>
<xml_diff>
--- a/docs/manuals/api-reference/api-reference.docx
+++ b/docs/manuals/api-reference/api-reference.docx
@@ -32,7 +32,7 @@
           <w:color w:val="5B6678"/>
           <w:sz w:val="18"/>
         </w:rPr>
-        <w:t>NeuralStrike · Generated 2026-09-18</w:t>
+        <w:t>NeuralStrike · Generated 2026-09-22</w:t>
       </w:r>
     </w:p>
     <w:p/>
@@ -7902,6 +7902,249 @@
                 <w:color w:val="334455"/>
                 <w:sz w:val="19"/>
               </w:rPr>
+              <w:t>x_post</w:t>
+            </w:r>
+          </w:p>
+        </w:tc>
+        <w:tc>
+          <w:tcPr>
+            <w:tcW w:type="dxa" w:w="2880"/>
+          </w:tcPr>
+          <w:p>
+            <w:r/>
+            <w:r>
+              <w:rPr>
+                <w:rFonts w:ascii="Consolas" w:hAnsi="Consolas"/>
+                <w:color w:val="334455"/>
+                <w:sz w:val="19"/>
+              </w:rPr>
+              <w:t>{text, tags[], link, image_b64?}</w:t>
+            </w:r>
+            <w:r>
+              <w:rPr/>
+              <w:t xml:space="preserve"> — an ad-hoc marketing post from the </w:t>
+            </w:r>
+            <w:r>
+              <w:rPr>
+                <w:rFonts w:ascii="Consolas" w:hAnsi="Consolas"/>
+                <w:color w:val="334455"/>
+                <w:sz w:val="19"/>
+              </w:rPr>
+              <w:t>/x</w:t>
+            </w:r>
+            <w:r>
+              <w:rPr/>
+              <w:t xml:space="preserve"> page. The image is refused over 5 MB or when it does not decode (logged, nothing posted). Replay-guarded</w:t>
+            </w:r>
+          </w:p>
+        </w:tc>
+        <w:tc>
+          <w:tcPr>
+            <w:tcW w:type="dxa" w:w="2880"/>
+          </w:tcPr>
+          <w:p>
+            <w:r/>
+            <w:r>
+              <w:rPr>
+                <w:rFonts w:ascii="Consolas" w:hAnsi="Consolas"/>
+                <w:color w:val="334455"/>
+                <w:sz w:val="19"/>
+              </w:rPr>
+              <w:t>cache:options:x_log</w:t>
+            </w:r>
+          </w:p>
+        </w:tc>
+      </w:tr>
+      <w:tr>
+        <w:tc>
+          <w:tcPr>
+            <w:tcW w:type="dxa" w:w="2880"/>
+            <w:shd w:val="clear" w:color="auto" w:fill="F4F6FA"/>
+          </w:tcPr>
+          <w:p>
+            <w:r/>
+            <w:r>
+              <w:rPr>
+                <w:rFonts w:ascii="Consolas" w:hAnsi="Consolas"/>
+                <w:color w:val="334455"/>
+                <w:sz w:val="19"/>
+              </w:rPr>
+              <w:t>x_post_report</w:t>
+            </w:r>
+          </w:p>
+        </w:tc>
+        <w:tc>
+          <w:tcPr>
+            <w:tcW w:type="dxa" w:w="2880"/>
+            <w:shd w:val="clear" w:color="auto" w:fill="F4F6FA"/>
+          </w:tcPr>
+          <w:p>
+            <w:r/>
+            <w:r>
+              <w:rPr>
+                <w:rFonts w:ascii="Consolas" w:hAnsi="Consolas"/>
+                <w:color w:val="334455"/>
+                <w:sz w:val="19"/>
+              </w:rPr>
+              <w:t>{report, mtime}</w:t>
+            </w:r>
+            <w:r>
+              <w:rPr/>
+              <w:t xml:space="preserve"> — enqueued by market_svc when the published market report changes; </w:t>
+            </w:r>
+            <w:r>
+              <w:rPr>
+                <w:rFonts w:ascii="Consolas" w:hAnsi="Consolas"/>
+                <w:color w:val="334455"/>
+                <w:sz w:val="19"/>
+              </w:rPr>
+              <w:t>report</w:t>
+            </w:r>
+            <w:r>
+              <w:rPr/>
+              <w:t xml:space="preserve"> is the </w:t>
+            </w:r>
+            <w:r>
+              <w:rPr>
+                <w:rFonts w:ascii="Consolas" w:hAnsi="Consolas"/>
+                <w:color w:val="334455"/>
+                <w:sz w:val="19"/>
+              </w:rPr>
+              <w:t>cache:market:summary</w:t>
+            </w:r>
+            <w:r>
+              <w:rPr/>
+              <w:t xml:space="preserve"> payload, </w:t>
+            </w:r>
+            <w:r>
+              <w:rPr>
+                <w:rFonts w:ascii="Consolas" w:hAnsi="Consolas"/>
+                <w:color w:val="334455"/>
+                <w:sz w:val="19"/>
+              </w:rPr>
+              <w:t>mtime</w:t>
+            </w:r>
+            <w:r>
+              <w:rPr/>
+              <w:t xml:space="preserve"> the epoch seconds of </w:t>
+            </w:r>
+            <w:r>
+              <w:rPr>
+                <w:rFonts w:ascii="Consolas" w:hAnsi="Consolas"/>
+                <w:color w:val="334455"/>
+                <w:sz w:val="19"/>
+              </w:rPr>
+              <w:t>latest.html</w:t>
+            </w:r>
+            <w:r>
+              <w:rPr/>
+              <w:t>. Posted once per report (</w:t>
+            </w:r>
+            <w:r>
+              <w:rPr>
+                <w:rFonts w:ascii="Consolas" w:hAnsi="Consolas"/>
+                <w:color w:val="334455"/>
+                <w:sz w:val="19"/>
+              </w:rPr>
+              <w:t>report_date</w:t>
+            </w:r>
+            <w:r>
+              <w:rPr/>
+              <w:t xml:space="preserve">, </w:t>
+            </w:r>
+            <w:r>
+              <w:rPr>
+                <w:rFonts w:ascii="Consolas" w:hAnsi="Consolas"/>
+                <w:color w:val="334455"/>
+                <w:sz w:val="19"/>
+              </w:rPr>
+              <w:t>slot</w:t>
+            </w:r>
+            <w:r>
+              <w:rPr/>
+              <w:t xml:space="preserve">, </w:t>
+            </w:r>
+            <w:r>
+              <w:rPr>
+                <w:rFonts w:ascii="Consolas" w:hAnsi="Consolas"/>
+                <w:color w:val="334455"/>
+                <w:sz w:val="19"/>
+              </w:rPr>
+              <w:t>as_of</w:t>
+            </w:r>
+            <w:r>
+              <w:rPr/>
+              <w:t xml:space="preserve">, </w:t>
+            </w:r>
+            <w:r>
+              <w:rPr>
+                <w:rFonts w:ascii="Consolas" w:hAnsi="Consolas"/>
+                <w:color w:val="334455"/>
+                <w:sz w:val="19"/>
+              </w:rPr>
+              <w:t>headline</w:t>
+            </w:r>
+            <w:r>
+              <w:rPr/>
+              <w:t xml:space="preserve">); a report older than </w:t>
+            </w:r>
+            <w:r>
+              <w:rPr>
+                <w:rFonts w:ascii="Consolas" w:hAnsi="Consolas"/>
+                <w:color w:val="334455"/>
+                <w:sz w:val="19"/>
+              </w:rPr>
+              <w:t>x.report_max_age_min</w:t>
+            </w:r>
+            <w:r>
+              <w:rPr/>
+              <w:t xml:space="preserve"> (45), or of unknown age, is skipped. Replay-guarded</w:t>
+            </w:r>
+          </w:p>
+        </w:tc>
+        <w:tc>
+          <w:tcPr>
+            <w:tcW w:type="dxa" w:w="2880"/>
+            <w:shd w:val="clear" w:color="auto" w:fill="F4F6FA"/>
+          </w:tcPr>
+          <w:p>
+            <w:r/>
+            <w:r>
+              <w:rPr>
+                <w:rFonts w:ascii="Consolas" w:hAnsi="Consolas"/>
+                <w:color w:val="334455"/>
+                <w:sz w:val="19"/>
+              </w:rPr>
+              <w:t>cache:options:x_log</w:t>
+            </w:r>
+            <w:r>
+              <w:rPr/>
+              <w:t xml:space="preserve"> + </w:t>
+            </w:r>
+            <w:r>
+              <w:rPr>
+                <w:rFonts w:ascii="Consolas" w:hAnsi="Consolas"/>
+                <w:color w:val="334455"/>
+                <w:sz w:val="19"/>
+              </w:rPr>
+              <w:t>cache:options:x_reports</w:t>
+            </w:r>
+          </w:p>
+        </w:tc>
+      </w:tr>
+      <w:tr>
+        <w:tc>
+          <w:tcPr>
+            <w:tcW w:type="dxa" w:w="2880"/>
+          </w:tcPr>
+          <w:p>
+            <w:r/>
+            <w:r>
+              <w:rPr>
+                <w:rFonts w:ascii="Consolas" w:hAnsi="Consolas"/>
+                <w:color w:val="334455"/>
+                <w:sz w:val="19"/>
+              </w:rPr>
               <w:t>captured_reload</w:t>
             </w:r>
           </w:p>
@@ -16503,6 +16746,39 @@
           <w:color w:val="223344"/>
           <w:sz w:val="18"/>
         </w:rPr>
+        <w:t>cache:options:x_log                                         (every X post attempt, newest first, last 100)</w:t>
+      </w:r>
+      <w:r>
+        <w:br/>
+      </w:r>
+      <w:r>
+        <w:rPr>
+          <w:rFonts w:ascii="Consolas" w:hAnsi="Consolas"/>
+          <w:color w:val="223344"/>
+          <w:sz w:val="18"/>
+        </w:rPr>
+        <w:t>cache:options:x_count                                       (X posts made today, CT day - the daily cap)</w:t>
+      </w:r>
+      <w:r>
+        <w:br/>
+      </w:r>
+      <w:r>
+        <w:rPr>
+          <w:rFonts w:ascii="Consolas" w:hAnsi="Consolas"/>
+          <w:color w:val="223344"/>
+          <w:sz w:val="18"/>
+        </w:rPr>
+        <w:t>cache:options:x_reports                                     (market reports already posted to X)</w:t>
+      </w:r>
+      <w:r>
+        <w:br/>
+      </w:r>
+      <w:r>
+        <w:rPr>
+          <w:rFonts w:ascii="Consolas" w:hAnsi="Consolas"/>
+          <w:color w:val="223344"/>
+          <w:sz w:val="18"/>
+        </w:rPr>
         <w:t>cache:options:em_chain         events:options:em_chain      (Expected Move ladders)</w:t>
       </w:r>
       <w:r>
@@ -18177,7 +18453,17 @@
       </w:pPr>
       <w:r>
         <w:rPr/>
-        <w:t xml:space="preserve">The </w:t>
+        <w:t xml:space="preserve">The web GUI is on </w:t>
+      </w:r>
+      <w:r>
+        <w:rPr>
+          <w:b/>
+        </w:rPr>
+        <w:t>8500</w:t>
+      </w:r>
+      <w:r>
+        <w:rPr/>
+        <w:t xml:space="preserve">. (The retired React frontend's </w:t>
       </w:r>
       <w:r>
         <w:rPr>
@@ -18189,7 +18475,8 @@
       </w:r>
       <w:r>
         <w:rPr/>
-        <w:t xml:space="preserve"> entry in </w:t>
+        <w:br/>
+        <w:t xml:space="preserve">entry was removed from </w:t>
       </w:r>
       <w:r>
         <w:rPr>
@@ -18201,29 +18488,7 @@
       </w:r>
       <w:r>
         <w:rPr/>
-        <w:t xml:space="preserve"> belongs to the retired</w:t>
-        <w:br/>
-        <w:t xml:space="preserve">React frontend and is </w:t>
-      </w:r>
-      <w:r>
-        <w:rPr>
-          <w:b/>
-        </w:rPr>
-        <w:t>not</w:t>
-      </w:r>
-      <w:r>
-        <w:rPr/>
-        <w:t xml:space="preserve"> used by this app. The web GUI is on </w:t>
-      </w:r>
-      <w:r>
-        <w:rPr>
-          <w:b/>
-        </w:rPr>
-        <w:t>8500</w:t>
-      </w:r>
-      <w:r>
-        <w:rPr/>
-        <w:t>.</w:t>
+        <w:t xml:space="preserve"> in September 2026.)</w:t>
       </w:r>
     </w:p>
     <w:p>

</xml_diff>

<commit_message>
docs(news): impact, SEC panel and economic calendar
Co-Authored-By: Claude Opus 5.5 <noreply@anthropic.com>
Claude-Session: https://claude.ai/code/session_014N2du2DmXUxAruBTFwyyAD
</commit_message>
<xml_diff>
--- a/docs/manuals/api-reference/api-reference.docx
+++ b/docs/manuals/api-reference/api-reference.docx
@@ -397,6 +397,18 @@
             </w:r>
             <w:r>
               <w:rPr/>
+              <w:t xml:space="preserve">, </w:t>
+            </w:r>
+            <w:r>
+              <w:rPr>
+                <w:rFonts w:ascii="Consolas" w:hAnsi="Consolas"/>
+                <w:color w:val="334455"/>
+                <w:sz w:val="19"/>
+              </w:rPr>
+              <w:t>:sec</w:t>
+            </w:r>
+            <w:r>
+              <w:rPr/>
               <w:t xml:space="preserve">; </w:t>
             </w:r>
             <w:r>
@@ -699,6 +711,30 @@
                 <w:color w:val="334455"/>
                 <w:sz w:val="19"/>
               </w:rPr>
+              <w:t>:sec</w:t>
+            </w:r>
+            <w:r>
+              <w:rPr/>
+              <w:t xml:space="preserve">, </w:t>
+            </w:r>
+            <w:r>
+              <w:rPr>
+                <w:rFonts w:ascii="Consolas" w:hAnsi="Consolas"/>
+                <w:color w:val="334455"/>
+                <w:sz w:val="19"/>
+              </w:rPr>
+              <w:t>:calendar</w:t>
+            </w:r>
+            <w:r>
+              <w:rPr/>
+              <w:t xml:space="preserve">, </w:t>
+            </w:r>
+            <w:r>
+              <w:rPr>
+                <w:rFonts w:ascii="Consolas" w:hAnsi="Consolas"/>
+                <w:color w:val="334455"/>
+                <w:sz w:val="19"/>
+              </w:rPr>
               <w:t>:status</w:t>
             </w:r>
             <w:r>
@@ -715,7 +751,67 @@
             </w:r>
             <w:r>
               <w:rPr/>
-              <w:t>); also the Desk's headlines strip and the Symbol page's news band</w:t>
+              <w:t xml:space="preserve">, </w:t>
+            </w:r>
+            <w:r>
+              <w:rPr>
+                <w:rFonts w:ascii="Consolas" w:hAnsi="Consolas"/>
+                <w:color w:val="334455"/>
+                <w:sz w:val="19"/>
+              </w:rPr>
+              <w:t>:sec_public</w:t>
+            </w:r>
+            <w:r>
+              <w:rPr/>
+              <w:t xml:space="preserve">, </w:t>
+            </w:r>
+            <w:r>
+              <w:rPr>
+                <w:rFonts w:ascii="Consolas" w:hAnsi="Consolas"/>
+                <w:color w:val="334455"/>
+                <w:sz w:val="19"/>
+              </w:rPr>
+              <w:t>:calendar_public</w:t>
+            </w:r>
+            <w:r>
+              <w:rPr/>
+              <w:t>); also the Desk's headlines strip (</w:t>
+            </w:r>
+            <w:r>
+              <w:rPr>
+                <w:rFonts w:ascii="Consolas" w:hAnsi="Consolas"/>
+                <w:color w:val="334455"/>
+                <w:sz w:val="19"/>
+              </w:rPr>
+              <w:t>:feed</w:t>
+            </w:r>
+            <w:r>
+              <w:rPr/>
+              <w:t>) and the Symbol page's news band (</w:t>
+            </w:r>
+            <w:r>
+              <w:rPr>
+                <w:rFonts w:ascii="Consolas" w:hAnsi="Consolas"/>
+                <w:color w:val="334455"/>
+                <w:sz w:val="19"/>
+              </w:rPr>
+              <w:t>:feed</w:t>
+            </w:r>
+            <w:r>
+              <w:rPr/>
+              <w:t xml:space="preserve"> + </w:t>
+            </w:r>
+            <w:r>
+              <w:rPr>
+                <w:rFonts w:ascii="Consolas" w:hAnsi="Consolas"/>
+                <w:color w:val="334455"/>
+                <w:sz w:val="19"/>
+              </w:rPr>
+              <w:t>:sec</w:t>
+            </w:r>
+            <w:r>
+              <w:rPr/>
+              <w:t>)</w:t>
             </w:r>
           </w:p>
         </w:tc>
@@ -11747,7 +11843,109 @@
       </w:r>
       <w:r>
         <w:rPr/>
-        <w:t xml:space="preserve"> none (on-demand only).</w:t>
+        <w:t xml:space="preserve"> </w:t>
+      </w:r>
+      <w:r>
+        <w:rPr>
+          <w:rFonts w:ascii="Consolas" w:hAnsi="Consolas"/>
+          <w:color w:val="334455"/>
+          <w:sz w:val="19"/>
+        </w:rPr>
+        <w:t>services/trade_svc/scheduler.py</w:t>
+      </w:r>
+      <w:r>
+        <w:rPr/>
+        <w:t>,</w:t>
+        <w:br/>
+        <w:t>one job — the watchlist dividend pull (</w:t>
+      </w:r>
+      <w:r>
+        <w:rPr>
+          <w:rFonts w:ascii="Consolas" w:hAnsi="Consolas"/>
+          <w:color w:val="334455"/>
+          <w:sz w:val="19"/>
+        </w:rPr>
+        <w:t>dividends.refresh</w:t>
+      </w:r>
+      <w:r>
+        <w:rPr/>
+        <w:t>), once a trading day at or</w:t>
+        <w:br/>
+        <w:t xml:space="preserve">after </w:t>
+      </w:r>
+      <w:r>
+        <w:rPr>
+          <w:rFonts w:ascii="Consolas" w:hAnsi="Consolas"/>
+          <w:color w:val="334455"/>
+          <w:sz w:val="19"/>
+        </w:rPr>
+        <w:t>[calendar.dividends] refresh_at</w:t>
+      </w:r>
+      <w:r>
+        <w:rPr/>
+        <w:t xml:space="preserve"> (06:40 CT) in </w:t>
+      </w:r>
+      <w:r>
+        <w:rPr>
+          <w:rFonts w:ascii="Consolas" w:hAnsi="Consolas"/>
+          <w:color w:val="334455"/>
+          <w:sz w:val="19"/>
+        </w:rPr>
+        <w:t>config/news.toml</w:t>
+      </w:r>
+      <w:r>
+        <w:rPr/>
+        <w:t>, one proxy</w:t>
+        <w:br/>
+      </w:r>
+      <w:r>
+        <w:rPr>
+          <w:rFonts w:ascii="Consolas" w:hAnsi="Consolas"/>
+          <w:color w:val="334455"/>
+          <w:sz w:val="19"/>
+        </w:rPr>
+        <w:t>/quotes</w:t>
+      </w:r>
+      <w:r>
+        <w:rPr/>
+        <w:t xml:space="preserve"> passthrough call per followed symbol, into </w:t>
+      </w:r>
+      <w:r>
+        <w:rPr>
+          <w:rFonts w:ascii="Consolas" w:hAnsi="Consolas"/>
+          <w:color w:val="334455"/>
+          <w:sz w:val="19"/>
+        </w:rPr>
+        <w:t>services/trade_svc/data/dividends.db</w:t>
+      </w:r>
+      <w:r>
+        <w:rPr/>
+        <w:br/>
+        <w:t>(</w:t>
+      </w:r>
+      <w:r>
+        <w:rPr>
+          <w:rFonts w:ascii="Consolas" w:hAnsi="Consolas"/>
+          <w:color w:val="334455"/>
+          <w:sz w:val="19"/>
+        </w:rPr>
+        <w:t>shared/dividends.py</w:t>
+      </w:r>
+      <w:r>
+        <w:rPr/>
+        <w:t xml:space="preserve">). Gated by the environment's </w:t>
+      </w:r>
+      <w:r>
+        <w:rPr>
+          <w:rFonts w:ascii="Consolas" w:hAnsi="Consolas"/>
+          <w:color w:val="334455"/>
+          <w:sz w:val="19"/>
+        </w:rPr>
+        <w:t>schedulers</w:t>
+      </w:r>
+      <w:r>
+        <w:rPr/>
+        <w:t xml:space="preserve"> flag.</w:t>
       </w:r>
     </w:p>
     <w:p>
@@ -11929,6 +12127,97 @@
           </w:p>
         </w:tc>
       </w:tr>
+      <w:tr>
+        <w:tc>
+          <w:tcPr>
+            <w:tcW w:type="dxa" w:w="2880"/>
+            <w:shd w:val="clear" w:color="auto" w:fill="F4F6FA"/>
+          </w:tcPr>
+          <w:p>
+            <w:r/>
+            <w:r>
+              <w:rPr>
+                <w:rFonts w:ascii="Consolas" w:hAnsi="Consolas"/>
+                <w:color w:val="334455"/>
+                <w:sz w:val="19"/>
+              </w:rPr>
+              <w:t>dividends_refresh</w:t>
+            </w:r>
+          </w:p>
+        </w:tc>
+        <w:tc>
+          <w:tcPr>
+            <w:tcW w:type="dxa" w:w="2880"/>
+            <w:shd w:val="clear" w:color="auto" w:fill="F4F6FA"/>
+          </w:tcPr>
+          <w:p>
+            <w:r/>
+            <w:r>
+              <w:rPr/>
+              <w:t>none</w:t>
+            </w:r>
+          </w:p>
+        </w:tc>
+        <w:tc>
+          <w:tcPr>
+            <w:tcW w:type="dxa" w:w="2880"/>
+            <w:shd w:val="clear" w:color="auto" w:fill="F4F6FA"/>
+          </w:tcPr>
+          <w:p>
+            <w:r/>
+            <w:r>
+              <w:rPr/>
+              <w:t xml:space="preserve">Runs the dividend pull now, past the once-a-day guard (~one proxy call per followed symbol). Writes the store only — </w:t>
+            </w:r>
+            <w:r>
+              <w:rPr>
+                <w:rFonts w:ascii="Consolas" w:hAnsi="Consolas"/>
+                <w:color w:val="334455"/>
+                <w:sz w:val="19"/>
+              </w:rPr>
+              <w:t>news_svc</w:t>
+            </w:r>
+            <w:r>
+              <w:rPr/>
+              <w:t xml:space="preserve"> picks it up on its next calendar pass. Ignored while </w:t>
+            </w:r>
+            <w:r>
+              <w:rPr>
+                <w:rFonts w:ascii="Consolas" w:hAnsi="Consolas"/>
+                <w:color w:val="334455"/>
+                <w:sz w:val="19"/>
+              </w:rPr>
+              <w:t>[calendar.dividends] enabled = false</w:t>
+            </w:r>
+            <w:r>
+              <w:rPr/>
+              <w:t xml:space="preserve">; a command older than </w:t>
+            </w:r>
+            <w:r>
+              <w:rPr>
+                <w:b/>
+              </w:rPr>
+              <w:t>180 s</w:t>
+            </w:r>
+            <w:r>
+              <w:rPr/>
+              <w:t xml:space="preserve"> (</w:t>
+            </w:r>
+            <w:r>
+              <w:rPr>
+                <w:rFonts w:ascii="Consolas" w:hAnsi="Consolas"/>
+                <w:color w:val="334455"/>
+                <w:sz w:val="19"/>
+              </w:rPr>
+              <w:t>DIVIDENDS_REFRESH_MAX_AGE_SEC</w:t>
+            </w:r>
+            <w:r>
+              <w:rPr/>
+              <w:t>) is dropped as a replay.</w:t>
+            </w:r>
+          </w:p>
+        </w:tc>
+      </w:tr>
     </w:tbl>
     <w:p/>
     <w:p>
@@ -13802,8 +14091,9 @@
       </w:r>
       <w:r>
         <w:rPr/>
-        <w:t xml:space="preserve"> — into</w:t>
+        <w:t xml:space="preserve"> — and the economic</w:t>
         <w:br/>
+        <w:t xml:space="preserve">calendar's sources into </w:t>
       </w:r>
       <w:r>
         <w:rPr>
@@ -13815,19 +14105,19 @@
       </w:r>
       <w:r>
         <w:rPr/>
-        <w:t xml:space="preserve">, and publishes three views. </w:t>
+        <w:t>, and publishes eight views.</w:t>
+        <w:br/>
       </w:r>
       <w:r>
         <w:rPr>
           <w:b/>
         </w:rPr>
-        <w:t>No Schwab call, no</w:t>
+        <w:t>No Schwab call, no Claude call, no proxy</w:t>
+      </w:r>
+      <w:r>
+        <w:rPr/>
+        <w:t>; the dividends come from a store</w:t>
         <w:br/>
-        <w:t>Claude call, no proxy.</w:t>
-      </w:r>
-      <w:r>
-        <w:rPr/>
-        <w:t xml:space="preserve"> Design: </w:t>
       </w:r>
       <w:r>
         <w:rPr>
@@ -13835,7 +14125,58 @@
           <w:color w:val="334455"/>
           <w:sz w:val="19"/>
         </w:rPr>
+        <w:t>trade_svc</w:t>
+      </w:r>
+      <w:r>
+        <w:rPr/>
+        <w:t xml:space="preserve"> writes, opened read-only. One optional credential, </w:t>
+      </w:r>
+      <w:r>
+        <w:rPr>
+          <w:rFonts w:ascii="Consolas" w:hAnsi="Consolas"/>
+          <w:color w:val="334455"/>
+          <w:sz w:val="19"/>
+        </w:rPr>
+        <w:t>FRED_API_KEY</w:t>
+      </w:r>
+      <w:r>
+        <w:rPr/>
+        <w:t>, read</w:t>
+        <w:br/>
+        <w:t xml:space="preserve">from the process environment (the stack </w:t>
+      </w:r>
+      <w:r>
+        <w:rPr>
+          <w:rFonts w:ascii="Consolas" w:hAnsi="Consolas"/>
+          <w:color w:val="334455"/>
+          <w:sz w:val="19"/>
+        </w:rPr>
+        <w:t>.env</w:t>
+      </w:r>
+      <w:r>
+        <w:rPr/>
+        <w:t>). Designs:</w:t>
+        <w:br/>
+      </w:r>
+      <w:r>
+        <w:rPr>
+          <w:rFonts w:ascii="Consolas" w:hAnsi="Consolas"/>
+          <w:color w:val="334455"/>
+          <w:sz w:val="19"/>
+        </w:rPr>
         <w:t>docs/plans/2026-09-25-news-feed-design.md</w:t>
+      </w:r>
+      <w:r>
+        <w:rPr/>
+        <w:t xml:space="preserve">, </w:t>
+      </w:r>
+      <w:r>
+        <w:rPr>
+          <w:rFonts w:ascii="Consolas" w:hAnsi="Consolas"/>
+          <w:color w:val="334455"/>
+          <w:sz w:val="19"/>
+        </w:rPr>
+        <w:t>docs/plans/2026-09-26-news-v2-design.md</w:t>
       </w:r>
       <w:r>
         <w:rPr/>
@@ -13847,7 +14188,7 @@
         <w:rPr>
           <w:b/>
         </w:rPr>
-        <w:t>Scheduler cadence</w:t>
+        <w:t>Scheduler</w:t>
       </w:r>
       <w:r>
         <w:rPr/>
@@ -13863,7 +14204,7 @@
       </w:r>
       <w:r>
         <w:rPr/>
-        <w:t xml:space="preserve">, values from </w:t>
+        <w:t xml:space="preserve">): the loop wakes every </w:t>
       </w:r>
       <w:r>
         <w:rPr>
@@ -13871,11 +14212,16 @@
           <w:color w:val="334455"/>
           <w:sz w:val="19"/>
         </w:rPr>
-        <w:t>[collector]</w:t>
+        <w:t>TICK_S</w:t>
       </w:r>
       <w:r>
         <w:rPr/>
-        <w:t>):</w:t>
+        <w:br/>
+        <w:t>(30 s), beats the heartbeat, and launches three branches as keyed background tasks —</w:t>
+        <w:br/>
+        <w:t>a branch whose previous task is still running is skipped, never doubled, and one</w:t>
+        <w:br/>
+        <w:t>branch's failure never stops another:</w:t>
       </w:r>
     </w:p>
     <w:tbl>
@@ -13914,7 +14260,7 @@
               <w:rPr>
                 <w:b/>
               </w:rPr>
-              <w:t>Key</w:t>
+              <w:t>Branch</w:t>
             </w:r>
           </w:p>
         </w:tc>
@@ -13933,7 +14279,7 @@
               <w:rPr>
                 <w:b/>
               </w:rPr>
-              <w:t>Default</w:t>
+              <w:t>Runs</w:t>
             </w:r>
           </w:p>
         </w:tc>
@@ -13952,7 +14298,7 @@
               <w:rPr>
                 <w:b/>
               </w:rPr>
-              <w:t>When</w:t>
+              <w:t>Cadence</w:t>
             </w:r>
           </w:p>
         </w:tc>
@@ -13970,47 +14316,101 @@
                 <w:color w:val="334455"/>
                 <w:sz w:val="19"/>
               </w:rPr>
+              <w:t>feeds</w:t>
+            </w:r>
+          </w:p>
+        </w:tc>
+        <w:tc>
+          <w:tcPr>
+            <w:tcW w:type="dxa" w:w="2880"/>
+          </w:tcPr>
+          <w:p>
+            <w:r/>
+            <w:r>
+              <w:rPr>
+                <w:rFonts w:ascii="Consolas" w:hAnsi="Consolas"/>
+                <w:color w:val="334455"/>
+                <w:sz w:val="19"/>
+              </w:rPr>
+              <w:t>compute.poll_now</w:t>
+            </w:r>
+          </w:p>
+        </w:tc>
+        <w:tc>
+          <w:tcPr>
+            <w:tcW w:type="dxa" w:w="2880"/>
+          </w:tcPr>
+          <w:p>
+            <w:r/>
+            <w:r>
+              <w:rPr>
+                <w:rFonts w:ascii="Consolas" w:hAnsi="Consolas"/>
+                <w:color w:val="334455"/>
+                <w:sz w:val="19"/>
+              </w:rPr>
+              <w:t>[collector]</w:t>
+            </w:r>
+            <w:r>
+              <w:rPr/>
+              <w:t xml:space="preserve">: </w:t>
+            </w:r>
+            <w:r>
+              <w:rPr>
+                <w:rFonts w:ascii="Consolas" w:hAnsi="Consolas"/>
+                <w:color w:val="334455"/>
+                <w:sz w:val="19"/>
+              </w:rPr>
               <w:t>rth_poll_min</w:t>
             </w:r>
-          </w:p>
-        </w:tc>
-        <w:tc>
-          <w:tcPr>
-            <w:tcW w:type="dxa" w:w="2880"/>
-          </w:tcPr>
-          <w:p>
-            <w:r/>
-            <w:r>
-              <w:rPr>
-                <w:rFonts w:ascii="Consolas" w:hAnsi="Consolas"/>
-                <w:color w:val="334455"/>
-                <w:sz w:val="19"/>
-              </w:rPr>
-              <w:t>5</w:t>
-            </w:r>
-          </w:p>
-        </w:tc>
-        <w:tc>
-          <w:tcPr>
-            <w:tcW w:type="dxa" w:w="2880"/>
-          </w:tcPr>
-          <w:p>
-            <w:r/>
-            <w:r>
-              <w:rPr/>
-              <w:t>08:30–15:00 CT on a trading day (</w:t>
-            </w:r>
-            <w:r>
-              <w:rPr>
-                <w:rFonts w:ascii="Consolas" w:hAnsi="Consolas"/>
-                <w:color w:val="334455"/>
-                <w:sz w:val="19"/>
-              </w:rPr>
-              <w:t>shared.market_calendar</w:t>
-            </w:r>
-            <w:r>
-              <w:rPr/>
-              <w:t>).</w:t>
+            <w:r>
+              <w:rPr/>
+              <w:t xml:space="preserve"> 5 (08:30–15:00 CT on a trading day), </w:t>
+            </w:r>
+            <w:r>
+              <w:rPr>
+                <w:rFonts w:ascii="Consolas" w:hAnsi="Consolas"/>
+                <w:color w:val="334455"/>
+                <w:sz w:val="19"/>
+              </w:rPr>
+              <w:t>offhours_poll_min</w:t>
+            </w:r>
+            <w:r>
+              <w:rPr/>
+              <w:t xml:space="preserve"> 15, </w:t>
+            </w:r>
+            <w:r>
+              <w:rPr>
+                <w:rFonts w:ascii="Consolas" w:hAnsi="Consolas"/>
+                <w:color w:val="334455"/>
+                <w:sz w:val="19"/>
+              </w:rPr>
+              <w:t>weekend_poll_min</w:t>
+            </w:r>
+            <w:r>
+              <w:rPr/>
+              <w:t xml:space="preserve"> 60 (weekends, NYSE holidays); counted from when the last poll </w:t>
+            </w:r>
+            <w:r>
+              <w:rPr>
+                <w:b/>
+              </w:rPr>
+              <w:t>ended</w:t>
+            </w:r>
+            <w:r>
+              <w:rPr/>
+              <w:t xml:space="preserve">; never faster than </w:t>
+            </w:r>
+            <w:r>
+              <w:rPr>
+                <w:rFonts w:ascii="Consolas" w:hAnsi="Consolas"/>
+                <w:color w:val="334455"/>
+                <w:sz w:val="19"/>
+              </w:rPr>
+              <w:t>MIN_INTERVAL_S</w:t>
+            </w:r>
+            <w:r>
+              <w:rPr/>
+              <w:t xml:space="preserve"> (60 s)</w:t>
             </w:r>
           </w:p>
         </w:tc>
@@ -14029,7 +14429,7 @@
                 <w:color w:val="334455"/>
                 <w:sz w:val="19"/>
               </w:rPr>
-              <w:t>offhours_poll_min</w:t>
+              <w:t>calendar</w:t>
             </w:r>
           </w:p>
         </w:tc>
@@ -14046,7 +14446,7 @@
                 <w:color w:val="334455"/>
                 <w:sz w:val="19"/>
               </w:rPr>
-              <w:t>15</w:t>
+              <w:t>econ_calendar.refresh_now</w:t>
             </w:r>
           </w:p>
         </w:tc>
@@ -14059,7 +14459,31 @@
             <w:r/>
             <w:r>
               <w:rPr/>
-              <w:t>A trading day outside that window.</w:t>
+              <w:t xml:space="preserve">every tick; fetches only the sources whose own </w:t>
+            </w:r>
+            <w:r>
+              <w:rPr>
+                <w:rFonts w:ascii="Consolas" w:hAnsi="Consolas"/>
+                <w:color w:val="334455"/>
+                <w:sz w:val="19"/>
+              </w:rPr>
+              <w:t>refresh_min</w:t>
+            </w:r>
+            <w:r>
+              <w:rPr/>
+              <w:t xml:space="preserve"> is due, then republishes (</w:t>
+            </w:r>
+            <w:r>
+              <w:rPr>
+                <w:rFonts w:ascii="Consolas" w:hAnsi="Consolas"/>
+                <w:color w:val="334455"/>
+                <w:sz w:val="19"/>
+              </w:rPr>
+              <w:t>skip_unchanged</w:t>
+            </w:r>
+            <w:r>
+              <w:rPr/>
+              <w:t>)</w:t>
             </w:r>
           </w:p>
         </w:tc>
@@ -14077,7 +14501,7 @@
                 <w:color w:val="334455"/>
                 <w:sz w:val="19"/>
               </w:rPr>
-              <w:t>weekend_poll_min</w:t>
+              <w:t>watch</w:t>
             </w:r>
           </w:p>
         </w:tc>
@@ -14093,7 +14517,7 @@
                 <w:color w:val="334455"/>
                 <w:sz w:val="19"/>
               </w:rPr>
-              <w:t>60</w:t>
+              <w:t>econ_calendar.watch_now</w:t>
             </w:r>
           </w:p>
         </w:tc>
@@ -14105,7 +14529,31 @@
             <w:r/>
             <w:r>
               <w:rPr/>
-              <w:t>Saturday, Sunday and NYSE holidays.</w:t>
+              <w:t xml:space="preserve">every tick; fetches only a series whose release just passed and whose value has not landed, every </w:t>
+            </w:r>
+            <w:r>
+              <w:rPr>
+                <w:rFonts w:ascii="Consolas" w:hAnsi="Consolas"/>
+                <w:color w:val="334455"/>
+                <w:sz w:val="19"/>
+              </w:rPr>
+              <w:t>release_poll_min</w:t>
+            </w:r>
+            <w:r>
+              <w:rPr/>
+              <w:t xml:space="preserve"> (2) for </w:t>
+            </w:r>
+            <w:r>
+              <w:rPr>
+                <w:rFonts w:ascii="Consolas" w:hAnsi="Consolas"/>
+                <w:color w:val="334455"/>
+                <w:sz w:val="19"/>
+              </w:rPr>
+              <w:t>release_watch_min</w:t>
+            </w:r>
+            <w:r>
+              <w:rPr/>
+              <w:t xml:space="preserve"> (60); does nothing otherwise</w:t>
             </w:r>
           </w:p>
         </w:tc>
@@ -14115,47 +14563,9 @@
     <w:p>
       <w:r>
         <w:rPr/>
-        <w:t xml:space="preserve">The loop wakes every </w:t>
-      </w:r>
-      <w:r>
-        <w:rPr>
-          <w:rFonts w:ascii="Consolas" w:hAnsi="Consolas"/>
-          <w:color w:val="334455"/>
-          <w:sz w:val="19"/>
-        </w:rPr>
-        <w:t>TICK_S</w:t>
-      </w:r>
-      <w:r>
-        <w:rPr/>
-        <w:t xml:space="preserve"> (30 s), re-reads the config (mtime-cached) and polls</w:t>
+        <w:t>Config is re-read every pass (mtime-cached), so an edit applies without a restart.</w:t>
         <w:br/>
-        <w:t xml:space="preserve">once the interval since the last poll </w:t>
-      </w:r>
-      <w:r>
-        <w:rPr>
-          <w:b/>
-        </w:rPr>
-        <w:t>ended</w:t>
-      </w:r>
-      <w:r>
-        <w:rPr/>
-        <w:t xml:space="preserve"> has passed, so an edit applies</w:t>
-        <w:br/>
-        <w:t xml:space="preserve">without a restart. Nothing polls faster than </w:t>
-      </w:r>
-      <w:r>
-        <w:rPr>
-          <w:rFonts w:ascii="Consolas" w:hAnsi="Consolas"/>
-          <w:color w:val="334455"/>
-          <w:sz w:val="19"/>
-        </w:rPr>
-        <w:t>MIN_INTERVAL_S</w:t>
-      </w:r>
-      <w:r>
-        <w:rPr/>
-        <w:t xml:space="preserve"> (60 s). Gated by the</w:t>
-        <w:br/>
-        <w:t xml:space="preserve">environment's </w:t>
+        <w:t xml:space="preserve">Gated by the environment's </w:t>
       </w:r>
       <w:r>
         <w:rPr>
@@ -14308,7 +14718,7 @@
             <w:r/>
             <w:r>
               <w:rPr/>
-              <w:t xml:space="preserve">Polls every enabled feed now (the private page's Refresh). One poll at a time: while one runs, the command returns at once and is logged as skipped. Its end is visible as a new </w:t>
+              <w:t xml:space="preserve">The private page's Refresh: re-checks the calendar (only the sources that are due — a click never forces one early), then polls every enabled feed. Each cycle runs one at a time: while one runs, that step returns at once and is logged as skipped; a calendar failure never costs the feed poll. Its end is visible as a new </w:t>
             </w:r>
             <w:r>
               <w:rPr>
@@ -14459,7 +14869,37 @@
             </w:r>
             <w:r>
               <w:rPr/>
-              <w:t xml:space="preserve"> (300), every enabled feed</w:t>
+              <w:t xml:space="preserve"> (300) </w:t>
+            </w:r>
+            <w:r>
+              <w:rPr>
+                <w:b/>
+              </w:rPr>
+              <w:t>headlines</w:t>
+            </w:r>
+            <w:r>
+              <w:rPr/>
+              <w:t xml:space="preserve">: every kind but </w:t>
+            </w:r>
+            <w:r>
+              <w:rPr>
+                <w:rFonts w:ascii="Consolas" w:hAnsi="Consolas"/>
+                <w:color w:val="334455"/>
+                <w:sz w:val="19"/>
+              </w:rPr>
+              <w:t>edgar_form4</w:t>
+            </w:r>
+            <w:r>
+              <w:rPr/>
+              <w:t xml:space="preserve"> / </w:t>
+            </w:r>
+            <w:r>
+              <w:rPr>
+                <w:rFonts w:ascii="Consolas" w:hAnsi="Consolas"/>
+                <w:color w:val="334455"/>
+                <w:sz w:val="19"/>
+              </w:rPr>
+              <w:t>edgar_filings</w:t>
             </w:r>
           </w:p>
         </w:tc>
@@ -14565,7 +15005,19 @@
             </w:r>
             <w:r>
               <w:rPr/>
-              <w:t xml:space="preserve"> cut to what public feeds contributed</w:t>
+              <w:t xml:space="preserve"> cut to what public feeds contributed; </w:t>
+            </w:r>
+            <w:r>
+              <w:rPr>
+                <w:rFonts w:ascii="Consolas" w:hAnsi="Consolas"/>
+                <w:color w:val="334455"/>
+                <w:sz w:val="19"/>
+              </w:rPr>
+              <w:t>impact</w:t>
+            </w:r>
+            <w:r>
+              <w:rPr/>
+              <w:t xml:space="preserve"> re-scored from that row</w:t>
             </w:r>
           </w:p>
         </w:tc>
@@ -14584,10 +15036,6 @@
               </w:rPr>
               <w:t>skip_unchanged</w:t>
             </w:r>
-            <w:r>
-              <w:rPr/>
-              <w:t>; the ONLY news key the public origin reads</w:t>
-            </w:r>
           </w:p>
         </w:tc>
       </w:tr>
@@ -14604,6 +15052,153 @@
                 <w:color w:val="334455"/>
                 <w:sz w:val="19"/>
               </w:rPr>
+              <w:t>cache:news:sec</w:t>
+            </w:r>
+          </w:p>
+        </w:tc>
+        <w:tc>
+          <w:tcPr>
+            <w:tcW w:type="dxa" w:w="2880"/>
+          </w:tcPr>
+          <w:p>
+            <w:r/>
+            <w:r>
+              <w:rPr>
+                <w:rFonts w:ascii="Consolas" w:hAnsi="Consolas"/>
+                <w:color w:val="334455"/>
+                <w:sz w:val="19"/>
+              </w:rPr>
+              <w:t>{"items": [...]}</w:t>
+            </w:r>
+            <w:r>
+              <w:rPr/>
+              <w:t xml:space="preserve"> — the newest </w:t>
+            </w:r>
+            <w:r>
+              <w:rPr>
+                <w:rFonts w:ascii="Consolas" w:hAnsi="Consolas"/>
+                <w:color w:val="334455"/>
+                <w:sz w:val="19"/>
+              </w:rPr>
+              <w:t>sec_view_items</w:t>
+            </w:r>
+            <w:r>
+              <w:rPr/>
+              <w:t xml:space="preserve"> (100) </w:t>
+            </w:r>
+            <w:r>
+              <w:rPr>
+                <w:rFonts w:ascii="Consolas" w:hAnsi="Consolas"/>
+                <w:color w:val="334455"/>
+                <w:sz w:val="19"/>
+              </w:rPr>
+              <w:t>edgar_form4</w:t>
+            </w:r>
+            <w:r>
+              <w:rPr/>
+              <w:t xml:space="preserve"> / </w:t>
+            </w:r>
+            <w:r>
+              <w:rPr>
+                <w:rFonts w:ascii="Consolas" w:hAnsi="Consolas"/>
+                <w:color w:val="334455"/>
+                <w:sz w:val="19"/>
+              </w:rPr>
+              <w:t>edgar_filings</w:t>
+            </w:r>
+            <w:r>
+              <w:rPr/>
+              <w:t xml:space="preserve"> items</w:t>
+            </w:r>
+          </w:p>
+        </w:tc>
+        <w:tc>
+          <w:tcPr>
+            <w:tcW w:type="dxa" w:w="2880"/>
+          </w:tcPr>
+          <w:p>
+            <w:r/>
+            <w:r>
+              <w:rPr>
+                <w:rFonts w:ascii="Consolas" w:hAnsi="Consolas"/>
+                <w:color w:val="334455"/>
+                <w:sz w:val="19"/>
+              </w:rPr>
+              <w:t>skip_unchanged</w:t>
+            </w:r>
+          </w:p>
+        </w:tc>
+      </w:tr>
+      <w:tr>
+        <w:tc>
+          <w:tcPr>
+            <w:tcW w:type="dxa" w:w="2880"/>
+            <w:shd w:val="clear" w:color="auto" w:fill="F4F6FA"/>
+          </w:tcPr>
+          <w:p>
+            <w:r/>
+            <w:r>
+              <w:rPr>
+                <w:rFonts w:ascii="Consolas" w:hAnsi="Consolas"/>
+                <w:color w:val="334455"/>
+                <w:sz w:val="19"/>
+              </w:rPr>
+              <w:t>cache:news:sec_public</w:t>
+            </w:r>
+          </w:p>
+        </w:tc>
+        <w:tc>
+          <w:tcPr>
+            <w:tcW w:type="dxa" w:w="2880"/>
+            <w:shd w:val="clear" w:color="auto" w:fill="F4F6FA"/>
+          </w:tcPr>
+          <w:p>
+            <w:r/>
+            <w:r>
+              <w:rPr/>
+              <w:t xml:space="preserve">the SEC items under the same public rule as </w:t>
+            </w:r>
+            <w:r>
+              <w:rPr>
+                <w:rFonts w:ascii="Consolas" w:hAnsi="Consolas"/>
+                <w:color w:val="334455"/>
+                <w:sz w:val="19"/>
+              </w:rPr>
+              <w:t>feed_public</w:t>
+            </w:r>
+          </w:p>
+        </w:tc>
+        <w:tc>
+          <w:tcPr>
+            <w:tcW w:type="dxa" w:w="2880"/>
+            <w:shd w:val="clear" w:color="auto" w:fill="F4F6FA"/>
+          </w:tcPr>
+          <w:p>
+            <w:r/>
+            <w:r>
+              <w:rPr>
+                <w:rFonts w:ascii="Consolas" w:hAnsi="Consolas"/>
+                <w:color w:val="334455"/>
+                <w:sz w:val="19"/>
+              </w:rPr>
+              <w:t>skip_unchanged</w:t>
+            </w:r>
+          </w:p>
+        </w:tc>
+      </w:tr>
+      <w:tr>
+        <w:tc>
+          <w:tcPr>
+            <w:tcW w:type="dxa" w:w="2880"/>
+          </w:tcPr>
+          <w:p>
+            <w:r/>
+            <w:r>
+              <w:rPr>
+                <w:rFonts w:ascii="Consolas" w:hAnsi="Consolas"/>
+                <w:color w:val="334455"/>
+                <w:sz w:val="19"/>
+              </w:rPr>
               <w:t>cache:news:status</w:t>
             </w:r>
           </w:p>
@@ -14649,6 +15244,216 @@
             <w:r>
               <w:rPr/>
               <w:t>every poll, even one that failed</w:t>
+            </w:r>
+          </w:p>
+        </w:tc>
+      </w:tr>
+      <w:tr>
+        <w:tc>
+          <w:tcPr>
+            <w:tcW w:type="dxa" w:w="2880"/>
+            <w:shd w:val="clear" w:color="auto" w:fill="F4F6FA"/>
+          </w:tcPr>
+          <w:p>
+            <w:r/>
+            <w:r>
+              <w:rPr>
+                <w:rFonts w:ascii="Consolas" w:hAnsi="Consolas"/>
+                <w:color w:val="334455"/>
+                <w:sz w:val="19"/>
+              </w:rPr>
+              <w:t>cache:news:calendar</w:t>
+            </w:r>
+          </w:p>
+        </w:tc>
+        <w:tc>
+          <w:tcPr>
+            <w:tcW w:type="dxa" w:w="2880"/>
+            <w:shd w:val="clear" w:color="auto" w:fill="F4F6FA"/>
+          </w:tcPr>
+          <w:p>
+            <w:r/>
+            <w:r>
+              <w:rPr/>
+              <w:t>the calendar payload (below), dividends for every followed ticker</w:t>
+            </w:r>
+          </w:p>
+        </w:tc>
+        <w:tc>
+          <w:tcPr>
+            <w:tcW w:type="dxa" w:w="2880"/>
+            <w:shd w:val="clear" w:color="auto" w:fill="F4F6FA"/>
+          </w:tcPr>
+          <w:p>
+            <w:r/>
+            <w:r>
+              <w:rPr>
+                <w:rFonts w:ascii="Consolas" w:hAnsi="Consolas"/>
+                <w:color w:val="334455"/>
+                <w:sz w:val="19"/>
+              </w:rPr>
+              <w:t>skip_unchanged</w:t>
+            </w:r>
+            <w:r>
+              <w:rPr/>
+              <w:t>; no timestamp</w:t>
+            </w:r>
+          </w:p>
+        </w:tc>
+      </w:tr>
+      <w:tr>
+        <w:tc>
+          <w:tcPr>
+            <w:tcW w:type="dxa" w:w="2880"/>
+          </w:tcPr>
+          <w:p>
+            <w:r/>
+            <w:r>
+              <w:rPr>
+                <w:rFonts w:ascii="Consolas" w:hAnsi="Consolas"/>
+                <w:color w:val="334455"/>
+                <w:sz w:val="19"/>
+              </w:rPr>
+              <w:t>cache:news:calendar_public</w:t>
+            </w:r>
+          </w:p>
+        </w:tc>
+        <w:tc>
+          <w:tcPr>
+            <w:tcW w:type="dxa" w:w="2880"/>
+          </w:tcPr>
+          <w:p>
+            <w:r/>
+            <w:r>
+              <w:rPr/>
+              <w:t xml:space="preserve">the same, BUILT with the GEX collection list as the dividend symbol set, so </w:t>
+            </w:r>
+            <w:r>
+              <w:rPr>
+                <w:rFonts w:ascii="Consolas" w:hAnsi="Consolas"/>
+                <w:color w:val="334455"/>
+                <w:sz w:val="19"/>
+              </w:rPr>
+              <w:t>[tickers] extras</w:t>
+            </w:r>
+            <w:r>
+              <w:rPr/>
+              <w:t xml:space="preserve"> never appear</w:t>
+            </w:r>
+          </w:p>
+        </w:tc>
+        <w:tc>
+          <w:tcPr>
+            <w:tcW w:type="dxa" w:w="2880"/>
+          </w:tcPr>
+          <w:p>
+            <w:r/>
+            <w:r>
+              <w:rPr>
+                <w:rFonts w:ascii="Consolas" w:hAnsi="Consolas"/>
+                <w:color w:val="334455"/>
+                <w:sz w:val="19"/>
+              </w:rPr>
+              <w:t>skip_unchanged</w:t>
+            </w:r>
+            <w:r>
+              <w:rPr/>
+              <w:t>; no timestamp</w:t>
+            </w:r>
+          </w:p>
+        </w:tc>
+      </w:tr>
+      <w:tr>
+        <w:tc>
+          <w:tcPr>
+            <w:tcW w:type="dxa" w:w="2880"/>
+            <w:shd w:val="clear" w:color="auto" w:fill="F4F6FA"/>
+          </w:tcPr>
+          <w:p>
+            <w:r/>
+            <w:r>
+              <w:rPr>
+                <w:rFonts w:ascii="Consolas" w:hAnsi="Consolas"/>
+                <w:color w:val="334455"/>
+                <w:sz w:val="19"/>
+              </w:rPr>
+              <w:t>cache:news:calendar_status</w:t>
+            </w:r>
+          </w:p>
+        </w:tc>
+        <w:tc>
+          <w:tcPr>
+            <w:tcW w:type="dxa" w:w="2880"/>
+            <w:shd w:val="clear" w:color="auto" w:fill="F4F6FA"/>
+          </w:tcPr>
+          <w:p>
+            <w:r/>
+            <w:r>
+              <w:rPr>
+                <w:rFonts w:ascii="Consolas" w:hAnsi="Consolas"/>
+                <w:color w:val="334455"/>
+                <w:sz w:val="19"/>
+              </w:rPr>
+              <w:t>{"sources": [{name, last_ok, last_poll, error}]}</w:t>
+            </w:r>
+            <w:r>
+              <w:rPr/>
+              <w:t xml:space="preserve"> — one row per source, </w:t>
+            </w:r>
+            <w:r>
+              <w:rPr>
+                <w:rFonts w:ascii="Consolas" w:hAnsi="Consolas"/>
+                <w:color w:val="334455"/>
+                <w:sz w:val="19"/>
+              </w:rPr>
+              <w:t>error</w:t>
+            </w:r>
+            <w:r>
+              <w:rPr/>
+              <w:t xml:space="preserve"> redacted. </w:t>
+            </w:r>
+            <w:r>
+              <w:rPr>
+                <w:b/>
+              </w:rPr>
+              <w:t>Private</w:t>
+            </w:r>
+          </w:p>
+        </w:tc>
+        <w:tc>
+          <w:tcPr>
+            <w:tcW w:type="dxa" w:w="2880"/>
+            <w:shd w:val="clear" w:color="auto" w:fill="F4F6FA"/>
+          </w:tcPr>
+          <w:p>
+            <w:r/>
+            <w:r>
+              <w:rPr/>
+              <w:t xml:space="preserve">every calendar pass, </w:t>
+            </w:r>
+            <w:r>
+              <w:rPr>
+                <w:rFonts w:ascii="Consolas" w:hAnsi="Consolas"/>
+                <w:color w:val="334455"/>
+                <w:sz w:val="19"/>
+              </w:rPr>
+              <w:t>skip_unchanged</w:t>
+            </w:r>
+            <w:r>
+              <w:rPr/>
+              <w:t xml:space="preserve">; no timestamp (read </w:t>
+            </w:r>
+            <w:r>
+              <w:rPr>
+                <w:rFonts w:ascii="Consolas" w:hAnsi="Consolas"/>
+                <w:color w:val="334455"/>
+                <w:sz w:val="19"/>
+              </w:rPr>
+              <w:t>cache:news:calendar_status:ts</w:t>
+            </w:r>
+            <w:r>
+              <w:rPr/>
+              <w:t>)</w:t>
             </w:r>
           </w:p>
         </w:tc>
@@ -14678,7 +15483,7 @@
         </w:rPr>
         <w:t>{id, source, sources, original_source, title, teaser, url,</w:t>
         <w:br/>
-        <w:t>published_at, first_seen, tickers, kind, topics, detail, public}</w:t>
+        <w:t>published_at, first_seen, tickers, kind, topics, detail, public, impact}</w:t>
       </w:r>
       <w:r>
         <w:rPr/>
@@ -14694,9 +15499,9 @@
       </w:r>
       <w:r>
         <w:rPr/>
-        <w:t xml:space="preserve"> a hash of the</w:t>
+        <w:t xml:space="preserve"> a hash</w:t>
         <w:br/>
-        <w:t xml:space="preserve">canonical URL; </w:t>
+        <w:t xml:space="preserve">of the canonical URL; </w:t>
       </w:r>
       <w:r>
         <w:rPr>
@@ -14708,7 +15513,8 @@
       </w:r>
       <w:r>
         <w:rPr/>
-        <w:t xml:space="preserve"> the feed whose title / url / teaser are stored and </w:t>
+        <w:t xml:space="preserve"> the feed whose title / url / teaser are stored and</w:t>
+        <w:br/>
       </w:r>
       <w:r>
         <w:rPr>
@@ -14720,10 +15526,9 @@
       </w:r>
       <w:r>
         <w:rPr/>
+        <w:t xml:space="preserve"> every feed that carried the story (primary first); times are UTC ISO strings</w:t>
         <w:br/>
-        <w:t>every feed that carried the story (primary first); times are UTC ISO strings (an</w:t>
-        <w:br/>
-        <w:t xml:space="preserve">unparseable publish time is stored as </w:t>
+        <w:t xml:space="preserve">(an unparseable publish time is stored as </w:t>
       </w:r>
       <w:r>
         <w:rPr>
@@ -14747,9 +15552,7 @@
       </w:r>
       <w:r>
         <w:rPr/>
-        <w:t xml:space="preserve"> is the adapter</w:t>
-        <w:br/>
-        <w:t>(</w:t>
+        <w:t xml:space="preserve"> is the adapter (</w:t>
       </w:r>
       <w:r>
         <w:rPr>
@@ -14761,7 +15564,8 @@
       </w:r>
       <w:r>
         <w:rPr/>
-        <w:t xml:space="preserve">, </w:t>
+        <w:t>,</w:t>
+        <w:br/>
       </w:r>
       <w:r>
         <w:rPr>
@@ -14818,12 +15622,113 @@
           <w:sz w:val="19"/>
         </w:rPr>
         <w:t>topics</w:t>
+      </w:r>
+      <w:r>
+        <w:rPr/>
+        <w:t xml:space="preserve"> is structural</w:t>
+        <w:br/>
+        <w:t>only (</w:t>
+      </w:r>
+      <w:r>
+        <w:rPr>
+          <w:rFonts w:ascii="Consolas" w:hAnsi="Consolas"/>
+          <w:color w:val="334455"/>
+          <w:sz w:val="19"/>
+        </w:rPr>
+        <w:t>SEC Filing</w:t>
+      </w:r>
+      <w:r>
+        <w:rPr/>
+        <w:t xml:space="preserve">, </w:t>
+      </w:r>
+      <w:r>
+        <w:rPr>
+          <w:rFonts w:ascii="Consolas" w:hAnsi="Consolas"/>
+          <w:color w:val="334455"/>
+          <w:sz w:val="19"/>
+        </w:rPr>
+        <w:t>Insider Transaction</w:t>
+      </w:r>
+      <w:r>
+        <w:rPr/>
+        <w:t xml:space="preserve">, </w:t>
+      </w:r>
+      <w:r>
+        <w:rPr>
+          <w:rFonts w:ascii="Consolas" w:hAnsi="Consolas"/>
+          <w:color w:val="334455"/>
+          <w:sz w:val="19"/>
+        </w:rPr>
+        <w:t>Offering</w:t>
+      </w:r>
+      <w:r>
+        <w:rPr/>
+        <w:t xml:space="preserve">); </w:t>
+      </w:r>
+      <w:r>
+        <w:rPr>
+          <w:rFonts w:ascii="Consolas" w:hAnsi="Consolas"/>
+          <w:color w:val="334455"/>
+          <w:sz w:val="19"/>
+        </w:rPr>
+        <w:t>detail</w:t>
+      </w:r>
+      <w:r>
+        <w:rPr/>
+        <w:t xml:space="preserve"> is </w:t>
+      </w:r>
+      <w:r>
+        <w:rPr>
+          <w:rFonts w:ascii="Consolas" w:hAnsi="Consolas"/>
+          <w:color w:val="334455"/>
+          <w:sz w:val="19"/>
+        </w:rPr>
+        <w:t>{}</w:t>
+      </w:r>
+      <w:r>
+        <w:rPr/>
+        <w:t xml:space="preserve"> except for</w:t>
+        <w:br/>
+        <w:t xml:space="preserve">EDGAR — a Form 4 carries </w:t>
+      </w:r>
+      <w:r>
+        <w:rPr>
+          <w:rFonts w:ascii="Consolas" w:hAnsi="Consolas"/>
+          <w:color w:val="334455"/>
+          <w:sz w:val="19"/>
+        </w:rPr>
+        <w:t>symbol, company, insider, insiders, relationship, groups,</w:t>
+        <w:br/>
+        <w:t>total_value, transaction_date</w:t>
+      </w:r>
+      <w:r>
+        <w:rPr/>
+        <w:t xml:space="preserve">, an offering </w:t>
+      </w:r>
+      <w:r>
+        <w:rPr>
+          <w:rFonts w:ascii="Consolas" w:hAnsi="Consolas"/>
+          <w:color w:val="334455"/>
+          <w:sz w:val="19"/>
+        </w:rPr>
+        <w:t>form, cik, accession</w:t>
+      </w:r>
+      <w:r>
+        <w:rPr/>
+        <w:t xml:space="preserve">. </w:t>
+      </w:r>
+      <w:r>
+        <w:rPr>
+          <w:rFonts w:ascii="Consolas" w:hAnsi="Consolas"/>
+          <w:color w:val="334455"/>
+          <w:sz w:val="19"/>
+        </w:rPr>
+        <w:t>impact</w:t>
       </w:r>
       <w:r>
         <w:rPr/>
         <w:t xml:space="preserve"> is</w:t>
         <w:br/>
-        <w:t>structural only (</w:t>
       </w:r>
       <w:r>
         <w:rPr>
@@ -14831,7 +15736,69 @@
           <w:color w:val="334455"/>
           <w:sz w:val="19"/>
         </w:rPr>
-        <w:t>SEC Filing</w:t>
+        <w:t>{"band": "high" | "med" | "low", "score": int, "reasons": [code, ...]}</w:t>
+      </w:r>
+      <w:r>
+        <w:rPr/>
+        <w:t xml:space="preserve">, or </w:t>
+      </w:r>
+      <w:r>
+        <w:rPr>
+          <w:rFonts w:ascii="Consolas" w:hAnsi="Consolas"/>
+          <w:color w:val="334455"/>
+          <w:sz w:val="19"/>
+        </w:rPr>
+        <w:t>null</w:t>
+      </w:r>
+      <w:r>
+        <w:rPr/>
+        <w:br/>
+        <w:t xml:space="preserve">when never scored; a High older than </w:t>
+      </w:r>
+      <w:r>
+        <w:rPr>
+          <w:rFonts w:ascii="Consolas" w:hAnsi="Consolas"/>
+          <w:color w:val="334455"/>
+          <w:sz w:val="19"/>
+        </w:rPr>
+        <w:t>[impact] stale_after_h</w:t>
+      </w:r>
+      <w:r>
+        <w:rPr/>
+        <w:t xml:space="preserve"> is published as </w:t>
+      </w:r>
+      <w:r>
+        <w:rPr>
+          <w:rFonts w:ascii="Consolas" w:hAnsi="Consolas"/>
+          <w:color w:val="334455"/>
+          <w:sz w:val="19"/>
+        </w:rPr>
+        <w:t>med</w:t>
+      </w:r>
+      <w:r>
+        <w:rPr/>
+        <w:br/>
+        <w:t xml:space="preserve">with </w:t>
+      </w:r>
+      <w:r>
+        <w:rPr>
+          <w:rFonts w:ascii="Consolas" w:hAnsi="Consolas"/>
+          <w:color w:val="334455"/>
+          <w:sz w:val="19"/>
+        </w:rPr>
+        <w:t>"stale"</w:t>
+      </w:r>
+      <w:r>
+        <w:rPr/>
+        <w:t xml:space="preserve"> appended. Reason codes: </w:t>
+      </w:r>
+      <w:r>
+        <w:rPr>
+          <w:rFonts w:ascii="Consolas" w:hAnsi="Consolas"/>
+          <w:color w:val="334455"/>
+          <w:sz w:val="19"/>
+        </w:rPr>
+        <w:t>kw:&lt;tier&gt;:&lt;word&gt;</w:t>
       </w:r>
       <w:r>
         <w:rPr/>
@@ -14843,7 +15810,20 @@
           <w:color w:val="334455"/>
           <w:sz w:val="19"/>
         </w:rPr>
-        <w:t>Insider Transaction</w:t>
+        <w:t>source:&lt;feed&gt;</w:t>
+      </w:r>
+      <w:r>
+        <w:rPr/>
+        <w:t>,</w:t>
+        <w:br/>
+      </w:r>
+      <w:r>
+        <w:rPr>
+          <w:rFonts w:ascii="Consolas" w:hAnsi="Consolas"/>
+          <w:color w:val="334455"/>
+          <w:sz w:val="19"/>
+        </w:rPr>
+        <w:t>sources:&lt;n&gt;</w:t>
       </w:r>
       <w:r>
         <w:rPr/>
@@ -14855,11 +15835,11 @@
           <w:color w:val="334455"/>
           <w:sz w:val="19"/>
         </w:rPr>
-        <w:t>Offering</w:t>
+        <w:t>watchlist</w:t>
       </w:r>
       <w:r>
         <w:rPr/>
-        <w:t xml:space="preserve">); </w:t>
+        <w:t xml:space="preserve">, </w:t>
       </w:r>
       <w:r>
         <w:rPr>
@@ -14867,11 +15847,11 @@
           <w:color w:val="334455"/>
           <w:sz w:val="19"/>
         </w:rPr>
-        <w:t>detail</w:t>
+        <w:t>form4:$&lt;total&gt;</w:t>
       </w:r>
       <w:r>
         <w:rPr/>
-        <w:t xml:space="preserve"> is </w:t>
+        <w:t xml:space="preserve">, </w:t>
       </w:r>
       <w:r>
         <w:rPr>
@@ -14879,12 +15859,11 @@
           <w:color w:val="334455"/>
           <w:sz w:val="19"/>
         </w:rPr>
-        <w:t>{}</w:t>
+        <w:t>officer</w:t>
       </w:r>
       <w:r>
         <w:rPr/>
-        <w:br/>
-        <w:t xml:space="preserve">except for EDGAR — a Form 4 carries </w:t>
+        <w:t xml:space="preserve">, </w:t>
       </w:r>
       <w:r>
         <w:rPr>
@@ -14892,13 +15871,12 @@
           <w:color w:val="334455"/>
           <w:sz w:val="19"/>
         </w:rPr>
-        <w:t>symbol, company, insider, insiders,</w:t>
+        <w:t>filing:&lt;form&gt;</w:t>
+      </w:r>
+      <w:r>
+        <w:rPr/>
+        <w:t>,</w:t>
         <w:br/>
-        <w:t>relationship, groups, total_value, transaction_date</w:t>
-      </w:r>
-      <w:r>
-        <w:rPr/>
-        <w:t xml:space="preserve">, an offering </w:t>
       </w:r>
       <w:r>
         <w:rPr>
@@ -14906,15 +15884,13 @@
           <w:color w:val="334455"/>
           <w:sz w:val="19"/>
         </w:rPr>
-        <w:t>form, cik,</w:t>
+        <w:t>untracked</w:t>
+      </w:r>
+      <w:r>
+        <w:rPr/>
+        <w:t>. Every string in an item is third-party text: render it escaped, and never</w:t>
         <w:br/>
-        <w:t>accession</w:t>
-      </w:r>
-      <w:r>
-        <w:rPr/>
-        <w:t>. Every string in an item is third-party text: render it escaped, and</w:t>
-        <w:br/>
-        <w:t xml:space="preserve">never use </w:t>
+        <w:t xml:space="preserve">use </w:t>
       </w:r>
       <w:r>
         <w:rPr>
@@ -14932,19 +15908,112 @@
     <w:p>
       <w:r>
         <w:rPr/>
-        <w:t xml:space="preserve">⚠ The public origin's Redis user reads </w:t>
-      </w:r>
+        <w:t xml:space="preserve">The </w:t>
+      </w:r>
+      <w:r>
+        <w:rPr>
+          <w:b/>
+        </w:rPr>
+        <w:t>calendar payload</w:t>
+      </w:r>
+      <w:r>
+        <w:rPr/>
+        <w:t>:</w:t>
+      </w:r>
+    </w:p>
+    <w:p>
+      <w:pPr>
+        <w:spacing w:before="80" w:after="160"/>
+        <w:ind w:left="216"/>
+        <w:shd w:val="clear" w:color="auto" w:fill="F4F6FA"/>
+      </w:pPr>
+      <w:r>
+        <w:rPr>
+          <w:rFonts w:ascii="Consolas" w:hAnsi="Consolas"/>
+          <w:color w:val="223344"/>
+          <w:sz w:val="18"/>
+        </w:rPr>
+        <w:t>{"events":    [{"title", "at", "date"}],</w:t>
+      </w:r>
+      <w:r>
+        <w:br/>
+      </w:r>
+      <w:r>
+        <w:rPr>
+          <w:rFonts w:ascii="Consolas" w:hAnsi="Consolas"/>
+          <w:color w:val="223344"/>
+          <w:sz w:val="18"/>
+        </w:rPr>
+        <w:t xml:space="preserve"> "dividends": [{"symbol", "ex_date", "pay_date", "amount"}],</w:t>
+      </w:r>
+      <w:r>
+        <w:br/>
+      </w:r>
+      <w:r>
+        <w:rPr>
+          <w:rFonts w:ascii="Consolas" w:hAnsi="Consolas"/>
+          <w:color w:val="223344"/>
+          <w:sz w:val="18"/>
+        </w:rPr>
+        <w:t xml:space="preserve"> "ipos":      [{"symbol", "company", "date", "price", "price_range", "offer_usd"}],</w:t>
+      </w:r>
+      <w:r>
+        <w:br/>
+      </w:r>
+      <w:r>
+        <w:rPr>
+          <w:rFonts w:ascii="Consolas" w:hAnsi="Consolas"/>
+          <w:color w:val="223344"/>
+          <w:sz w:val="18"/>
+        </w:rPr>
+        <w:t xml:space="preserve"> "data":      [{"key", "label", "tile", "unit", "next_release_at", "next_date",</w:t>
+      </w:r>
+      <w:r>
+        <w:br/>
+      </w:r>
+      <w:r>
+        <w:rPr>
+          <w:rFonts w:ascii="Consolas" w:hAnsi="Consolas"/>
+          <w:color w:val="223344"/>
+          <w:sz w:val="18"/>
+        </w:rPr>
+        <w:t xml:space="preserve">                "last_release_at", "latest", "prior"}],</w:t>
+      </w:r>
+      <w:r>
+        <w:br/>
+      </w:r>
+      <w:r>
+        <w:rPr>
+          <w:rFonts w:ascii="Consolas" w:hAnsi="Consolas"/>
+          <w:color w:val="223344"/>
+          <w:sz w:val="18"/>
+        </w:rPr>
+        <w:t xml:space="preserve"> "sources":   {name: "ok" | "stale" | "never" | "off"},</w:t>
+      </w:r>
+      <w:r>
+        <w:br/>
+      </w:r>
+      <w:r>
+        <w:rPr>
+          <w:rFonts w:ascii="Consolas" w:hAnsi="Consolas"/>
+          <w:color w:val="223344"/>
+          <w:sz w:val="18"/>
+        </w:rPr>
+        <w:t xml:space="preserve"> "settings":  {"release_watch_min", "actual_fresh_h"}}</w:t>
+      </w:r>
+    </w:p>
+    <w:p>
       <w:r>
         <w:rPr>
           <w:rFonts w:ascii="Consolas" w:hAnsi="Consolas"/>
           <w:color w:val="334455"/>
           <w:sz w:val="19"/>
         </w:rPr>
-        <w:t>~cache:*</w:t>
+        <w:t>at</w:t>
       </w:r>
       <w:r>
         <w:rPr/>
-        <w:t xml:space="preserve">, which covers </w:t>
+        <w:t xml:space="preserve"> / </w:t>
       </w:r>
       <w:r>
         <w:rPr>
@@ -14952,12 +16021,11 @@
           <w:color w:val="334455"/>
           <w:sz w:val="19"/>
         </w:rPr>
-        <w:t>cache:news:feed</w:t>
+        <w:t>*_release_at</w:t>
       </w:r>
       <w:r>
         <w:rPr/>
-        <w:br/>
-        <w:t xml:space="preserve">too. Keeping the private feed off </w:t>
+        <w:t xml:space="preserve"> / </w:t>
       </w:r>
       <w:r>
         <w:rPr>
@@ -14965,13 +16033,459 @@
           <w:color w:val="334455"/>
           <w:sz w:val="19"/>
         </w:rPr>
+        <w:t>first_seen</w:t>
+      </w:r>
+      <w:r>
+        <w:rPr/>
+        <w:t xml:space="preserve"> are aware UTC ISO instants or </w:t>
+      </w:r>
+      <w:r>
+        <w:rPr>
+          <w:rFonts w:ascii="Consolas" w:hAnsi="Consolas"/>
+          <w:color w:val="334455"/>
+          <w:sz w:val="19"/>
+        </w:rPr>
+        <w:t>null</w:t>
+      </w:r>
+      <w:r>
+        <w:rPr/>
+        <w:t>; dates are</w:t>
+        <w:br/>
+      </w:r>
+      <w:r>
+        <w:rPr>
+          <w:rFonts w:ascii="Consolas" w:hAnsi="Consolas"/>
+          <w:color w:val="334455"/>
+          <w:sz w:val="19"/>
+        </w:rPr>
+        <w:t>YYYY-MM-DD</w:t>
+      </w:r>
+      <w:r>
+        <w:rPr/>
+        <w:t xml:space="preserve">. </w:t>
+      </w:r>
+      <w:r>
+        <w:rPr>
+          <w:rFonts w:ascii="Consolas" w:hAnsi="Consolas"/>
+          <w:color w:val="334455"/>
+          <w:sz w:val="19"/>
+        </w:rPr>
+        <w:t>latest</w:t>
+      </w:r>
+      <w:r>
+        <w:rPr/>
+        <w:t xml:space="preserve"> / </w:t>
+      </w:r>
+      <w:r>
+        <w:rPr>
+          <w:rFonts w:ascii="Consolas" w:hAnsi="Consolas"/>
+          <w:color w:val="334455"/>
+          <w:sz w:val="19"/>
+        </w:rPr>
+        <w:t>prior</w:t>
+      </w:r>
+      <w:r>
+        <w:rPr/>
+        <w:t xml:space="preserve"> are </w:t>
+      </w:r>
+      <w:r>
+        <w:rPr>
+          <w:rFonts w:ascii="Consolas" w:hAnsi="Consolas"/>
+          <w:color w:val="334455"/>
+          <w:sz w:val="19"/>
+        </w:rPr>
+        <w:t>{obs_date, value, first_seen, bootstrap}</w:t>
+      </w:r>
+      <w:r>
+        <w:rPr/>
+        <w:t xml:space="preserve"> or</w:t>
+        <w:br/>
+      </w:r>
+      <w:r>
+        <w:rPr>
+          <w:rFonts w:ascii="Consolas" w:hAnsi="Consolas"/>
+          <w:color w:val="334455"/>
+          <w:sz w:val="19"/>
+        </w:rPr>
+        <w:t>null</w:t>
+      </w:r>
+      <w:r>
+        <w:rPr/>
+        <w:t xml:space="preserve">, </w:t>
+      </w:r>
+      <w:r>
+        <w:rPr>
+          <w:rFonts w:ascii="Consolas" w:hAnsi="Consolas"/>
+          <w:color w:val="334455"/>
+          <w:sz w:val="19"/>
+        </w:rPr>
+        <w:t>value</w:t>
+      </w:r>
+      <w:r>
+        <w:rPr/>
+        <w:t xml:space="preserve"> the DERIVED figure per </w:t>
+      </w:r>
+      <w:r>
+        <w:rPr>
+          <w:rFonts w:ascii="Consolas" w:hAnsi="Consolas"/>
+          <w:color w:val="334455"/>
+          <w:sz w:val="19"/>
+        </w:rPr>
+        <w:t>unit</w:t>
+      </w:r>
+      <w:r>
+        <w:rPr/>
+        <w:t xml:space="preserve"> (</w:t>
+      </w:r>
+      <w:r>
+        <w:rPr>
+          <w:rFonts w:ascii="Consolas" w:hAnsi="Consolas"/>
+          <w:color w:val="334455"/>
+          <w:sz w:val="19"/>
+        </w:rPr>
+        <w:t>pct_mom</w:t>
+      </w:r>
+      <w:r>
+        <w:rPr/>
+        <w:t xml:space="preserve">, </w:t>
+      </w:r>
+      <w:r>
+        <w:rPr>
+          <w:rFonts w:ascii="Consolas" w:hAnsi="Consolas"/>
+          <w:color w:val="334455"/>
+          <w:sz w:val="19"/>
+        </w:rPr>
+        <w:t>change_k</w:t>
+      </w:r>
+      <w:r>
+        <w:rPr/>
+        <w:t xml:space="preserve">, </w:t>
+      </w:r>
+      <w:r>
+        <w:rPr>
+          <w:rFonts w:ascii="Consolas" w:hAnsi="Consolas"/>
+          <w:color w:val="334455"/>
+          <w:sz w:val="19"/>
+        </w:rPr>
+        <w:t>level_pct</w:t>
+      </w:r>
+      <w:r>
+        <w:rPr/>
+        <w:t>,</w:t>
+        <w:br/>
+      </w:r>
+      <w:r>
+        <w:rPr>
+          <w:rFonts w:ascii="Consolas" w:hAnsi="Consolas"/>
+          <w:color w:val="334455"/>
+          <w:sz w:val="19"/>
+        </w:rPr>
+        <w:t>level_k</w:t>
+      </w:r>
+      <w:r>
+        <w:rPr/>
+        <w:t xml:space="preserve">, </w:t>
+      </w:r>
+      <w:r>
+        <w:rPr>
+          <w:rFonts w:ascii="Consolas" w:hAnsi="Consolas"/>
+          <w:color w:val="334455"/>
+          <w:sz w:val="19"/>
+        </w:rPr>
+        <w:t>pct_saar</w:t>
+      </w:r>
+      <w:r>
+        <w:rPr/>
+        <w:t xml:space="preserve">). </w:t>
+      </w:r>
+      <w:r>
+        <w:rPr>
+          <w:rFonts w:ascii="Consolas" w:hAnsi="Consolas"/>
+          <w:color w:val="334455"/>
+          <w:sz w:val="19"/>
+        </w:rPr>
+        <w:t>amount</w:t>
+      </w:r>
+      <w:r>
+        <w:rPr/>
+        <w:t xml:space="preserve"> is a positive per-payment figure or </w:t>
+      </w:r>
+      <w:r>
+        <w:rPr>
+          <w:rFonts w:ascii="Consolas" w:hAnsi="Consolas"/>
+          <w:color w:val="334455"/>
+          <w:sz w:val="19"/>
+        </w:rPr>
+        <w:t>null</w:t>
+      </w:r>
+      <w:r>
+        <w:rPr/>
+        <w:t xml:space="preserve"> (never 0).</w:t>
+        <w:br/>
+      </w:r>
+      <w:r>
+        <w:rPr>
+          <w:rFonts w:ascii="Consolas" w:hAnsi="Consolas"/>
+          <w:color w:val="334455"/>
+          <w:sz w:val="19"/>
+        </w:rPr>
+        <w:t>sources</w:t>
+      </w:r>
+      <w:r>
+        <w:rPr/>
+        <w:t xml:space="preserve"> names </w:t>
+      </w:r>
+      <w:r>
+        <w:rPr>
+          <w:rFonts w:ascii="Consolas" w:hAnsi="Consolas"/>
+          <w:color w:val="334455"/>
+          <w:sz w:val="19"/>
+        </w:rPr>
+        <w:t>fed</w:t>
+      </w:r>
+      <w:r>
+        <w:rPr/>
+        <w:t xml:space="preserve">, </w:t>
+      </w:r>
+      <w:r>
+        <w:rPr>
+          <w:rFonts w:ascii="Consolas" w:hAnsi="Consolas"/>
+          <w:color w:val="334455"/>
+          <w:sz w:val="19"/>
+        </w:rPr>
+        <w:t>bls</w:t>
+      </w:r>
+      <w:r>
+        <w:rPr/>
+        <w:t xml:space="preserve">, </w:t>
+      </w:r>
+      <w:r>
+        <w:rPr>
+          <w:rFonts w:ascii="Consolas" w:hAnsi="Consolas"/>
+          <w:color w:val="334455"/>
+          <w:sz w:val="19"/>
+        </w:rPr>
+        <w:t>bea</w:t>
+      </w:r>
+      <w:r>
+        <w:rPr/>
+        <w:t xml:space="preserve">, </w:t>
+      </w:r>
+      <w:r>
+        <w:rPr>
+          <w:rFonts w:ascii="Consolas" w:hAnsi="Consolas"/>
+          <w:color w:val="334455"/>
+          <w:sz w:val="19"/>
+        </w:rPr>
+        <w:t>dividends</w:t>
+      </w:r>
+      <w:r>
+        <w:rPr/>
+        <w:t xml:space="preserve">, </w:t>
+      </w:r>
+      <w:r>
+        <w:rPr>
+          <w:rFonts w:ascii="Consolas" w:hAnsi="Consolas"/>
+          <w:color w:val="334455"/>
+          <w:sz w:val="19"/>
+        </w:rPr>
+        <w:t>nasdaq_ipo</w:t>
+      </w:r>
+      <w:r>
+        <w:rPr/>
+        <w:t xml:space="preserve">, </w:t>
+      </w:r>
+      <w:r>
+        <w:rPr>
+          <w:rFonts w:ascii="Consolas" w:hAnsi="Consolas"/>
+          <w:color w:val="334455"/>
+          <w:sz w:val="19"/>
+        </w:rPr>
+        <w:t>fred_calendar</w:t>
+      </w:r>
+      <w:r>
+        <w:rPr/>
+        <w:t>,</w:t>
+        <w:br/>
+      </w:r>
+      <w:r>
+        <w:rPr>
+          <w:rFonts w:ascii="Consolas" w:hAnsi="Consolas"/>
+          <w:color w:val="334455"/>
+          <w:sz w:val="19"/>
+        </w:rPr>
+        <w:t>fred_api</w:t>
+      </w:r>
+      <w:r>
+        <w:rPr/>
+        <w:t xml:space="preserve">, </w:t>
+      </w:r>
+      <w:r>
+        <w:rPr>
+          <w:rFonts w:ascii="Consolas" w:hAnsi="Consolas"/>
+          <w:color w:val="334455"/>
+          <w:sz w:val="19"/>
+        </w:rPr>
+        <w:t>fredgraph</w:t>
+      </w:r>
+      <w:r>
+        <w:rPr/>
+        <w:t xml:space="preserve"> — the FRED observation path not in use reports </w:t>
+      </w:r>
+      <w:r>
+        <w:rPr>
+          <w:rFonts w:ascii="Consolas" w:hAnsi="Consolas"/>
+          <w:color w:val="334455"/>
+          <w:sz w:val="19"/>
+        </w:rPr>
+        <w:t>off</w:t>
+      </w:r>
+      <w:r>
+        <w:rPr/>
+        <w:t>. The</w:t>
+        <w:br/>
+        <w:t xml:space="preserve">payload carries FACTS only: whether an indicator is </w:t>
+      </w:r>
+      <w:r>
+        <w:rPr>
+          <w:i/>
+        </w:rPr>
+        <w:t>released</w:t>
+      </w:r>
+      <w:r>
+        <w:rPr/>
+        <w:t xml:space="preserve">, </w:t>
+      </w:r>
+      <w:r>
+        <w:rPr>
+          <w:i/>
+        </w:rPr>
+        <w:t>awaiting</w:t>
+      </w:r>
+      <w:r>
+        <w:rPr/>
+        <w:t xml:space="preserve"> or</w:t>
+        <w:br/>
+      </w:r>
+      <w:r>
+        <w:rPr>
+          <w:i/>
+        </w:rPr>
+        <w:t>upcoming</w:t>
+      </w:r>
+      <w:r>
+        <w:rPr/>
+        <w:t xml:space="preserve"> depends on </w:t>
+      </w:r>
+      <w:r>
+        <w:rPr>
+          <w:rFonts w:ascii="Consolas" w:hAnsi="Consolas"/>
+          <w:color w:val="334455"/>
+          <w:sz w:val="19"/>
+        </w:rPr>
+        <w:t>now</w:t>
+      </w:r>
+      <w:r>
+        <w:rPr/>
+        <w:t>, so the reader decides it</w:t>
+        <w:br/>
+        <w:t>(</w:t>
+      </w:r>
+      <w:r>
+        <w:rPr>
+          <w:rFonts w:ascii="Consolas" w:hAnsi="Consolas"/>
+          <w:color w:val="334455"/>
+          <w:sz w:val="19"/>
+        </w:rPr>
+        <w:t>webgui/pages/news_view.indicator_state</w:t>
+      </w:r>
+      <w:r>
+        <w:rPr/>
+        <w:t>).</w:t>
+      </w:r>
+    </w:p>
+    <w:p>
+      <w:r>
+        <w:rPr/>
+        <w:t xml:space="preserve">⚠ The public origin's Redis user reads </w:t>
+      </w:r>
+      <w:r>
+        <w:rPr>
+          <w:rFonts w:ascii="Consolas" w:hAnsi="Consolas"/>
+          <w:color w:val="334455"/>
+          <w:sz w:val="19"/>
+        </w:rPr>
+        <w:t>~cache:*</w:t>
+      </w:r>
+      <w:r>
+        <w:rPr/>
+        <w:t>, which covers every private news key</w:t>
+        <w:br/>
+        <w:t xml:space="preserve">too — </w:t>
+      </w:r>
+      <w:r>
+        <w:rPr>
+          <w:rFonts w:ascii="Consolas" w:hAnsi="Consolas"/>
+          <w:color w:val="334455"/>
+          <w:sz w:val="19"/>
+        </w:rPr>
+        <w:t>feed</w:t>
+      </w:r>
+      <w:r>
+        <w:rPr/>
+        <w:t xml:space="preserve">, </w:t>
+      </w:r>
+      <w:r>
+        <w:rPr>
+          <w:rFonts w:ascii="Consolas" w:hAnsi="Consolas"/>
+          <w:color w:val="334455"/>
+          <w:sz w:val="19"/>
+        </w:rPr>
+        <w:t>sec</w:t>
+      </w:r>
+      <w:r>
+        <w:rPr/>
+        <w:t xml:space="preserve">, </w:t>
+      </w:r>
+      <w:r>
+        <w:rPr>
+          <w:rFonts w:ascii="Consolas" w:hAnsi="Consolas"/>
+          <w:color w:val="334455"/>
+          <w:sz w:val="19"/>
+        </w:rPr>
+        <w:t>calendar</w:t>
+      </w:r>
+      <w:r>
+        <w:rPr/>
+        <w:t xml:space="preserve"> and </w:t>
+      </w:r>
+      <w:r>
+        <w:rPr>
+          <w:rFonts w:ascii="Consolas" w:hAnsi="Consolas"/>
+          <w:color w:val="334455"/>
+          <w:sz w:val="19"/>
+        </w:rPr>
+        <w:t>calendar_status</w:t>
+      </w:r>
+      <w:r>
+        <w:rPr/>
+        <w:t xml:space="preserve"> (which carries error text).</w:t>
+        <w:br/>
+        <w:t xml:space="preserve">Keeping them off </w:t>
+      </w:r>
+      <w:r>
+        <w:rPr>
+          <w:rFonts w:ascii="Consolas" w:hAnsi="Consolas"/>
+          <w:color w:val="334455"/>
+          <w:sz w:val="19"/>
+        </w:rPr>
         <w:t>live.neuralstrike.co</w:t>
       </w:r>
       <w:r>
         <w:rPr/>
-        <w:t xml:space="preserve"> is the job of the code that</w:t>
+        <w:t xml:space="preserve"> is the job of the code that chooses the key</w:t>
         <w:br/>
-        <w:t>chooses the key (</w:t>
+        <w:t>(</w:t>
       </w:r>
       <w:r>
         <w:rPr>
@@ -17050,7 +18564,7 @@
           <w:color w:val="223344"/>
           <w:sz w:val="18"/>
         </w:rPr>
-        <w:t>cache:news:feed                events:news:feed               (every feed)</w:t>
+        <w:t>cache:news:feed                events:news:feed               (headlines - every kind but the SEC ones)</w:t>
       </w:r>
       <w:r>
         <w:br/>
@@ -17061,7 +18575,62 @@
           <w:color w:val="223344"/>
           <w:sz w:val="18"/>
         </w:rPr>
-        <w:t>cache:news:feed_public         events:news:feed_public        (public feeds only - the live origin's key)</w:t>
+        <w:t>cache:news:feed_public         events:news:feed_public        (public feeds only - a live-origin key)</w:t>
+      </w:r>
+      <w:r>
+        <w:br/>
+      </w:r>
+      <w:r>
+        <w:rPr>
+          <w:rFonts w:ascii="Consolas" w:hAnsi="Consolas"/>
+          <w:color w:val="223344"/>
+          <w:sz w:val="18"/>
+        </w:rPr>
+        <w:t>cache:news:sec                 events:news:sec                (Form 4s and offering filings)</w:t>
+      </w:r>
+      <w:r>
+        <w:br/>
+      </w:r>
+      <w:r>
+        <w:rPr>
+          <w:rFonts w:ascii="Consolas" w:hAnsi="Consolas"/>
+          <w:color w:val="223344"/>
+          <w:sz w:val="18"/>
+        </w:rPr>
+        <w:t>cache:news:sec_public          events:news:sec_public         (public feeds only - a live-origin key)</w:t>
+      </w:r>
+      <w:r>
+        <w:br/>
+      </w:r>
+      <w:r>
+        <w:rPr>
+          <w:rFonts w:ascii="Consolas" w:hAnsi="Consolas"/>
+          <w:color w:val="223344"/>
+          <w:sz w:val="18"/>
+        </w:rPr>
+        <w:t>cache:news:calendar            events:news:calendar           (the economic calendar)</w:t>
+      </w:r>
+      <w:r>
+        <w:br/>
+      </w:r>
+      <w:r>
+        <w:rPr>
+          <w:rFonts w:ascii="Consolas" w:hAnsi="Consolas"/>
+          <w:color w:val="223344"/>
+          <w:sz w:val="18"/>
+        </w:rPr>
+        <w:t>cache:news:calendar_public     events:news:calendar_public    (dividends cut to the collection list - a live-origin key)</w:t>
+      </w:r>
+      <w:r>
+        <w:br/>
+      </w:r>
+      <w:r>
+        <w:rPr>
+          <w:rFonts w:ascii="Consolas" w:hAnsi="Consolas"/>
+          <w:color w:val="223344"/>
+          <w:sz w:val="18"/>
+        </w:rPr>
+        <w:t>cache:news:calendar_status     events:news:calendar_status    (private: per-source errors)</w:t>
       </w:r>
       <w:r>
         <w:br/>

</xml_diff>

<commit_message>
feat(deploy): refit the swing model monthly, shipping only past a gate
tools/refit_swing_model.sh described a systemd timer in a comment and
nothing installed it, so the live swing_model.json has been the
2026-08-22 fit since the Linux move.

- trading-<env>-swing-refit.{service,timer}: the 1st of each month at
  [slots.swing_refit] (19:00 CT), Persistent, waits for the proxy
  before starting, Nice=10, TimeoutStartSec 3600.
- Ship gate (operator's choice): trade_svc re-reads the artifact on
  every call, so the fit's write is the deploy. fit_swing_model now
  replaces the live model only with >= 90% of the universe loaded and
  an out-of-sample IC above 0.0 (config/swing_model.toml, in Settings).
  A refused fit is kept as *.rejected.*, the live files are untouched,
  and the run exits 1. NaN/unreadable IC is refused.
- --no-ship writes *.candidate.* for inspecting a fit by hand.
- Manuals and CHANGELOG updated.

Co-Authored-By: Claude Opus 5.5 <noreply@anthropic.com>
</commit_message>
<xml_diff>
--- a/docs/manuals/api-reference/api-reference.docx
+++ b/docs/manuals/api-reference/api-reference.docx
@@ -32,7 +32,7 @@
           <w:color w:val="5B6678"/>
           <w:sz w:val="18"/>
         </w:rPr>
-        <w:t>NeuralStrike · Generated 2026-09-26</w:t>
+        <w:t>NeuralStrike · Generated 2026-09-27</w:t>
       </w:r>
     </w:p>
     <w:p/>
@@ -13095,7 +13095,33 @@
       </w:r>
       <w:r>
         <w:rPr/>
-        <w:t xml:space="preserve"> (run manually/periodically — never imported by a</w:t>
+        <w:t xml:space="preserve"> (run monthly by </w:t>
+      </w:r>
+      <w:r>
+        <w:rPr>
+          <w:rFonts w:ascii="Consolas" w:hAnsi="Consolas"/>
+          <w:color w:val="334455"/>
+          <w:sz w:val="19"/>
+        </w:rPr>
+        <w:t>trading-&lt;env&gt;-swing-refit.timer</w:t>
+      </w:r>
+      <w:r>
+        <w:rPr/>
+        <w:t>,</w:t>
+        <w:br/>
+        <w:t xml:space="preserve">shipping only past </w:t>
+      </w:r>
+      <w:r>
+        <w:rPr>
+          <w:rFonts w:ascii="Consolas" w:hAnsi="Consolas"/>
+          <w:color w:val="334455"/>
+          <w:sz w:val="19"/>
+        </w:rPr>
+        <w:t>config/swing_model.toml</w:t>
+      </w:r>
+      <w:r>
+        <w:rPr/>
+        <w:t>'s gate — never imported by a</w:t>
         <w:br/>
         <w:t xml:space="preserve">service) using the pure </w:t>
       </w:r>
@@ -14364,7 +14390,19 @@
             </w:r>
             <w:r>
               <w:rPr/>
-              <w:t xml:space="preserve"> 5 (08:30–15:00 CT on a trading day), </w:t>
+              <w:t xml:space="preserve"> 2 (08:30–15:00 CT on a trading day), </w:t>
+            </w:r>
+            <w:r>
+              <w:rPr>
+                <w:rFonts w:ascii="Consolas" w:hAnsi="Consolas"/>
+                <w:color w:val="334455"/>
+                <w:sz w:val="19"/>
+              </w:rPr>
+              <w:t>eth_poll_min</w:t>
+            </w:r>
+            <w:r>
+              <w:rPr/>
+              <w:t xml:space="preserve"> 5 (06:30–08:25 and 15:00–15:15 CT), </w:t>
             </w:r>
             <w:r>
               <w:rPr>
@@ -14376,7 +14414,7 @@
             </w:r>
             <w:r>
               <w:rPr/>
-              <w:t xml:space="preserve"> 15, </w:t>
+              <w:t xml:space="preserve"> 30 (a trading day outside those), </w:t>
             </w:r>
             <w:r>
               <w:rPr>
@@ -14388,7 +14426,7 @@
             </w:r>
             <w:r>
               <w:rPr/>
-              <w:t xml:space="preserve"> 60 (weekends, NYSE holidays); counted from when the last poll </w:t>
+              <w:t xml:space="preserve"> 30 (weekends, NYSE holidays); counted from when the last poll </w:t>
             </w:r>
             <w:r>
               <w:rPr>

</xml_diff>

<commit_message>
docs: HIRO hedging-flow alerts
Design doc corrected in place (two alert types, quiet/public flags and the
gallery hide, Hotness/EOD exclusion, flow_hiro push category, seed-minute and
accumulate rules, the opening-minute limit, the report's base-rate method).
Flow Alerts help no longer claims every alert chimes and pushes. User Guide,
Reference Guide, Technical Reference (formula, rules, every [hiro] key,
hiro_minutes, cache:options:hiro, the 16:10 timer, limits), API Reference and
Glossary updated and rebuilt; routes doc, CHANGELOG, and one CLAUDE.md
invariant: new flow-alert readers go through flow._shown.

Co-Authored-By: Claude Opus 5.5 <noreply@anthropic.com>
</commit_message>
<xml_diff>
--- a/docs/manuals/api-reference/api-reference.docx
+++ b/docs/manuals/api-reference/api-reference.docx
@@ -32,7 +32,7 @@
           <w:color w:val="5B6678"/>
           <w:sz w:val="18"/>
         </w:rPr>
-        <w:t>NeuralStrike · Generated 2026-09-27</w:t>
+        <w:t>NeuralStrike · Generated 2026-10-01</w:t>
       </w:r>
     </w:p>
     <w:p/>
@@ -18086,7 +18086,7 @@
           <w:color w:val="223344"/>
           <w:sz w:val="18"/>
         </w:rPr>
-        <w:t>cache:options:flow_skew        events:options:flow_skew</w:t>
+        <w:t>cache:options:hiro             events:options:hiro          (HIRO-model hedging flow, per-symbol summary; no reader yet)</w:t>
       </w:r>
       <w:r>
         <w:br/>
@@ -18097,7 +18097,7 @@
           <w:color w:val="223344"/>
           <w:sz w:val="18"/>
         </w:rPr>
-        <w:t>cache:options:net_premium      events:options:net_premium   (Net Prem subtab, 28 symbols)</w:t>
+        <w:t>cache:options:flow_skew        events:options:flow_skew</w:t>
       </w:r>
       <w:r>
         <w:br/>
@@ -18108,7 +18108,7 @@
           <w:color w:val="223344"/>
           <w:sz w:val="18"/>
         </w:rPr>
-        <w:t>cache:options:header           events:options:header</w:t>
+        <w:t>cache:options:net_premium      events:options:net_premium   (Net Prem subtab, 28 symbols)</w:t>
       </w:r>
       <w:r>
         <w:br/>
@@ -18119,7 +18119,7 @@
           <w:color w:val="223344"/>
           <w:sz w:val="18"/>
         </w:rPr>
-        <w:t>cache:options:swing            events:options:swing</w:t>
+        <w:t>cache:options:header           events:options:header</w:t>
       </w:r>
       <w:r>
         <w:br/>
@@ -18130,7 +18130,7 @@
           <w:color w:val="223344"/>
           <w:sz w:val="18"/>
         </w:rPr>
-        <w:t>cache:options:paper_account    events:options:paper_account</w:t>
+        <w:t>cache:options:swing            events:options:swing</w:t>
       </w:r>
       <w:r>
         <w:br/>
@@ -18141,7 +18141,7 @@
           <w:color w:val="223344"/>
           <w:sz w:val="18"/>
         </w:rPr>
-        <w:t>cache:options:paper_trades     events:options:paper_trades</w:t>
+        <w:t>cache:options:paper_account    events:options:paper_account</w:t>
       </w:r>
       <w:r>
         <w:br/>
@@ -18152,7 +18152,7 @@
           <w:color w:val="223344"/>
           <w:sz w:val="18"/>
         </w:rPr>
-        <w:t>cache:options:paper_create     events:options:paper_create   (TTL 600 s; the Paper button's answer)</w:t>
+        <w:t>cache:options:paper_trades     events:options:paper_trades</w:t>
       </w:r>
       <w:r>
         <w:br/>
@@ -18163,7 +18163,7 @@
           <w:color w:val="223344"/>
           <w:sz w:val="18"/>
         </w:rPr>
-        <w:t>cache:options:ledger_caps      events:options:ledger_caps    (the Paper Ledger's book, for the Paper dialog preview)</w:t>
+        <w:t>cache:options:paper_create     events:options:paper_create   (TTL 600 s; the Paper button's answer)</w:t>
       </w:r>
       <w:r>
         <w:br/>
@@ -18174,7 +18174,7 @@
           <w:color w:val="223344"/>
           <w:sz w:val="18"/>
         </w:rPr>
-        <w:t>cache:options:paper_analyze    events:options:paper_analyze</w:t>
+        <w:t>cache:options:ledger_caps      events:options:ledger_caps    (the Paper Ledger's book, for the Paper dialog preview)</w:t>
       </w:r>
       <w:r>
         <w:br/>
@@ -18185,7 +18185,7 @@
           <w:color w:val="223344"/>
           <w:sz w:val="18"/>
         </w:rPr>
-        <w:t>cache:options:captured         events:options:captured</w:t>
+        <w:t>cache:options:paper_analyze    events:options:paper_analyze</w:t>
       </w:r>
       <w:r>
         <w:br/>
@@ -18196,7 +18196,7 @@
           <w:color w:val="223344"/>
           <w:sz w:val="18"/>
         </w:rPr>
-        <w:t>cache:options:captured_flags   events:options:captured_flags</w:t>
+        <w:t>cache:options:captured         events:options:captured</w:t>
       </w:r>
       <w:r>
         <w:br/>
@@ -18207,7 +18207,7 @@
           <w:color w:val="223344"/>
           <w:sz w:val="18"/>
         </w:rPr>
-        <w:t>cache:options:gamma            events:options:gamma</w:t>
+        <w:t>cache:options:captured_flags   events:options:captured_flags</w:t>
       </w:r>
       <w:r>
         <w:br/>
@@ -18218,7 +18218,7 @@
           <w:color w:val="223344"/>
           <w:sz w:val="18"/>
         </w:rPr>
-        <w:t>cache:options:gamma_hist_gex | _charm | _dex | _vanna   (per-view intraday history)</w:t>
+        <w:t>cache:options:gamma            events:options:gamma</w:t>
       </w:r>
       <w:r>
         <w:br/>
@@ -18229,7 +18229,7 @@
           <w:color w:val="223344"/>
           <w:sz w:val="18"/>
         </w:rPr>
-        <w:t>cache:options:gamma_explain    events:options:gamma_explain</w:t>
+        <w:t>cache:options:gamma_hist_gex | _charm | _dex | _vanna   (per-view intraday history)</w:t>
       </w:r>
       <w:r>
         <w:br/>
@@ -18240,7 +18240,7 @@
           <w:color w:val="223344"/>
           <w:sz w:val="18"/>
         </w:rPr>
-        <w:t>cache:options:gamma_analyze    events:options:gamma_analyze</w:t>
+        <w:t>cache:options:gamma_explain    events:options:gamma_explain</w:t>
       </w:r>
       <w:r>
         <w:br/>
@@ -18251,7 +18251,7 @@
           <w:color w:val="223344"/>
           <w:sz w:val="18"/>
         </w:rPr>
-        <w:t>cache:options:gamma_symbols    events:options:gamma_symbols</w:t>
+        <w:t>cache:options:gamma_analyze    events:options:gamma_analyze</w:t>
       </w:r>
       <w:r>
         <w:br/>
@@ -18262,7 +18262,7 @@
           <w:color w:val="223344"/>
           <w:sz w:val="18"/>
         </w:rPr>
-        <w:t>cache:options:gamma_history    events:options:gamma_history</w:t>
+        <w:t>cache:options:gamma_symbols    events:options:gamma_symbols</w:t>
       </w:r>
       <w:r>
         <w:br/>
@@ -18273,7 +18273,7 @@
           <w:color w:val="223344"/>
           <w:sz w:val="18"/>
         </w:rPr>
-        <w:t>cache:options:gamma_briefings  events:options:gamma_briefings</w:t>
+        <w:t>cache:options:gamma_history    events:options:gamma_history</w:t>
       </w:r>
       <w:r>
         <w:br/>
@@ -18284,7 +18284,7 @@
           <w:color w:val="223344"/>
           <w:sz w:val="18"/>
         </w:rPr>
-        <w:t>cache:options:gamma_analyze_premarket | _midday | _close    (per-slot auto briefings)</w:t>
+        <w:t>cache:options:gamma_briefings  events:options:gamma_briefings</w:t>
       </w:r>
       <w:r>
         <w:br/>
@@ -18295,7 +18295,7 @@
           <w:color w:val="223344"/>
           <w:sz w:val="18"/>
         </w:rPr>
-        <w:t>cache:options:gamma_regime_state</w:t>
+        <w:t>cache:options:gamma_analyze_premarket | _midday | _close    (per-slot auto briefings)</w:t>
       </w:r>
       <w:r>
         <w:br/>
@@ -18306,7 +18306,7 @@
           <w:color w:val="223344"/>
           <w:sz w:val="18"/>
         </w:rPr>
-        <w:t>cache:options:market_snapshot  events:options:market_snapshot</w:t>
+        <w:t>cache:options:gamma_regime_state</w:t>
       </w:r>
       <w:r>
         <w:br/>
@@ -18317,7 +18317,7 @@
           <w:color w:val="223344"/>
           <w:sz w:val="18"/>
         </w:rPr>
-        <w:t>cache:options:trade_idea                                    (hourly post: last result + today's posted set)</w:t>
+        <w:t>cache:options:market_snapshot  events:options:market_snapshot</w:t>
       </w:r>
       <w:r>
         <w:br/>
@@ -18328,7 +18328,7 @@
           <w:color w:val="223344"/>
           <w:sz w:val="18"/>
         </w:rPr>
-        <w:t>cache:options:x_log                                         (every X post attempt, newest first, last 100)</w:t>
+        <w:t>cache:options:trade_idea                                    (hourly post: last result + today's posted set)</w:t>
       </w:r>
       <w:r>
         <w:br/>
@@ -18339,7 +18339,7 @@
           <w:color w:val="223344"/>
           <w:sz w:val="18"/>
         </w:rPr>
-        <w:t>cache:options:x_count                                       (X posts made today, CT day - the daily cap)</w:t>
+        <w:t>cache:options:x_log                                         (every X post attempt, newest first, last 100)</w:t>
       </w:r>
       <w:r>
         <w:br/>
@@ -18350,7 +18350,7 @@
           <w:color w:val="223344"/>
           <w:sz w:val="18"/>
         </w:rPr>
-        <w:t>cache:options:x_reports                                     (market reports already posted to X)</w:t>
+        <w:t>cache:options:x_count                                       (X posts made today, CT day - the daily cap)</w:t>
       </w:r>
       <w:r>
         <w:br/>
@@ -18361,7 +18361,7 @@
           <w:color w:val="223344"/>
           <w:sz w:val="18"/>
         </w:rPr>
-        <w:t>cache:options:em_chain         events:options:em_chain      (Expected Move ladders)</w:t>
+        <w:t>cache:options:x_reports                                     (market reports already posted to X)</w:t>
       </w:r>
       <w:r>
         <w:br/>
@@ -18372,7 +18372,7 @@
           <w:color w:val="223344"/>
           <w:sz w:val="18"/>
         </w:rPr>
-        <w:t>cache:options:calc_iv          events:options:calc_iv</w:t>
+        <w:t>cache:options:em_chain         events:options:em_chain      (Expected Move ladders)</w:t>
       </w:r>
       <w:r>
         <w:br/>
@@ -18383,7 +18383,7 @@
           <w:color w:val="223344"/>
           <w:sz w:val="18"/>
         </w:rPr>
-        <w:t>cache:options:calc_rating      events:options:calc_rating   (Rate my trade)</w:t>
+        <w:t>cache:options:calc_iv          events:options:calc_iv</w:t>
       </w:r>
       <w:r>
         <w:br/>
@@ -18394,7 +18394,7 @@
           <w:color w:val="223344"/>
           <w:sz w:val="18"/>
         </w:rPr>
-        <w:t>cache:options:paper_analytics  events:options:paper_analytics</w:t>
+        <w:t>cache:options:calc_rating      events:options:calc_rating   (Rate my trade)</w:t>
       </w:r>
       <w:r>
         <w:br/>
@@ -18405,7 +18405,7 @@
           <w:color w:val="223344"/>
           <w:sz w:val="18"/>
         </w:rPr>
-        <w:t>cache:options:captured_closed  events:options:captured_closed</w:t>
+        <w:t>cache:options:paper_analytics  events:options:paper_analytics</w:t>
       </w:r>
       <w:r>
         <w:br/>
@@ -18416,7 +18416,7 @@
           <w:color w:val="223344"/>
           <w:sz w:val="18"/>
         </w:rPr>
-        <w:t>cache:options:action_alert     events:options:action_alert</w:t>
+        <w:t>cache:options:captured_closed  events:options:captured_closed</w:t>
       </w:r>
       <w:r>
         <w:br/>
@@ -18427,7 +18427,7 @@
           <w:color w:val="223344"/>
           <w:sz w:val="18"/>
         </w:rPr>
-        <w:t>cache:options:eod_summary      events:options:eod_summary</w:t>
+        <w:t>cache:options:action_alert     events:options:action_alert</w:t>
       </w:r>
       <w:r>
         <w:br/>
@@ -18438,7 +18438,7 @@
           <w:color w:val="223344"/>
           <w:sz w:val="18"/>
         </w:rPr>
-        <w:t>cache:options:autoclose_enabled           (Settings toggle)</w:t>
+        <w:t>cache:options:eod_summary      events:options:eod_summary</w:t>
       </w:r>
       <w:r>
         <w:br/>
@@ -18449,7 +18449,7 @@
           <w:color w:val="223344"/>
           <w:sz w:val="18"/>
         </w:rPr>
-        <w:t>cache:options:manual_paper_lifecycle      (Settings toggle)</w:t>
+        <w:t>cache:options:autoclose_enabled           (Settings toggle)</w:t>
       </w:r>
       <w:r>
         <w:br/>
@@ -18460,7 +18460,7 @@
           <w:color w:val="223344"/>
           <w:sz w:val="18"/>
         </w:rPr>
-        <w:t>cache:options:notified_scan | :notified_captured    (alert de-duplication)</w:t>
+        <w:t>cache:options:manual_paper_lifecycle      (Settings toggle)</w:t>
       </w:r>
       <w:r>
         <w:br/>
@@ -18471,7 +18471,7 @@
           <w:color w:val="223344"/>
           <w:sz w:val="18"/>
         </w:rPr>
-        <w:t>cache:options:eth_eligible</w:t>
+        <w:t>cache:options:notified_scan | :notified_captured    (alert de-duplication)</w:t>
       </w:r>
       <w:r>
         <w:br/>
@@ -18482,7 +18482,7 @@
           <w:color w:val="223344"/>
           <w:sz w:val="18"/>
         </w:rPr>
-        <w:t>cache:options:sim_meta         events:options:sim_meta</w:t>
+        <w:t>cache:options:eth_eligible</w:t>
       </w:r>
       <w:r>
         <w:br/>
@@ -18493,7 +18493,7 @@
           <w:color w:val="223344"/>
           <w:sz w:val="18"/>
         </w:rPr>
-        <w:t>cache:options:sim_result       events:options:sim_result</w:t>
+        <w:t>cache:options:sim_meta         events:options:sim_meta</w:t>
       </w:r>
       <w:r>
         <w:br/>
@@ -18504,7 +18504,7 @@
           <w:color w:val="223344"/>
           <w:sz w:val="18"/>
         </w:rPr>
-        <w:t>cache:options:sim_chain        events:options:sim_chain</w:t>
+        <w:t>cache:options:sim_result       events:options:sim_result</w:t>
       </w:r>
       <w:r>
         <w:br/>
@@ -18515,7 +18515,7 @@
           <w:color w:val="223344"/>
           <w:sz w:val="18"/>
         </w:rPr>
-        <w:t>cache:options:sim_replay       events:options:sim_replay</w:t>
+        <w:t>cache:options:sim_chain        events:options:sim_chain</w:t>
       </w:r>
       <w:r>
         <w:br/>
@@ -18526,7 +18526,7 @@
           <w:color w:val="223344"/>
           <w:sz w:val="18"/>
         </w:rPr>
-        <w:t>cache:options:calc_chain       events:options:calc_chain</w:t>
+        <w:t>cache:options:sim_replay       events:options:sim_replay</w:t>
       </w:r>
       <w:r>
         <w:br/>
@@ -18537,7 +18537,7 @@
           <w:color w:val="223344"/>
           <w:sz w:val="18"/>
         </w:rPr>
-        <w:t>cache:options:calc_result      events:options:calc_result</w:t>
+        <w:t>cache:options:calc_chain       events:options:calc_chain</w:t>
       </w:r>
       <w:r>
         <w:br/>
@@ -18548,7 +18548,7 @@
           <w:color w:val="223344"/>
           <w:sz w:val="18"/>
         </w:rPr>
-        <w:t>cache:options:gex_status       events:options:gex_status</w:t>
+        <w:t>cache:options:calc_result      events:options:calc_result</w:t>
       </w:r>
       <w:r>
         <w:br/>
@@ -18559,7 +18559,7 @@
           <w:color w:val="223344"/>
           <w:sz w:val="18"/>
         </w:rPr>
-        <w:t>cache:options:expected_move    events:options:expected_move</w:t>
+        <w:t>cache:options:gex_status       events:options:gex_status</w:t>
       </w:r>
       <w:r>
         <w:br/>
@@ -18570,7 +18570,7 @@
           <w:color w:val="223344"/>
           <w:sz w:val="18"/>
         </w:rPr>
-        <w:t>cache:options:rescue:&lt;position_id&gt;   events:options:rescue:&lt;position_id&gt;   (RescueAdvisory contract)</w:t>
+        <w:t>cache:options:expected_move    events:options:expected_move</w:t>
       </w:r>
       <w:r>
         <w:br/>
@@ -18581,7 +18581,7 @@
           <w:color w:val="223344"/>
           <w:sz w:val="18"/>
         </w:rPr>
-        <w:t>cache:options:rescue_summary   events:options:rescue_summary</w:t>
+        <w:t>cache:options:rescue:&lt;position_id&gt;   events:options:rescue:&lt;position_id&gt;   (RescueAdvisory contract)</w:t>
       </w:r>
       <w:r>
         <w:br/>
@@ -18592,7 +18592,436 @@
           <w:color w:val="223344"/>
           <w:sz w:val="18"/>
         </w:rPr>
+        <w:t>cache:options:rescue_summary   events:options:rescue_summary</w:t>
+      </w:r>
+      <w:r>
+        <w:br/>
+      </w:r>
+      <w:r>
+        <w:rPr>
+          <w:rFonts w:ascii="Consolas" w:hAnsi="Consolas"/>
+          <w:color w:val="223344"/>
+          <w:sz w:val="18"/>
+        </w:rPr>
         <w:t>cmd:options</w:t>
+      </w:r>
+    </w:p>
+    <w:p>
+      <w:r>
+        <w:rPr>
+          <w:rFonts w:ascii="Consolas" w:hAnsi="Consolas"/>
+          <w:color w:val="334455"/>
+          <w:sz w:val="19"/>
+        </w:rPr>
+        <w:t>cache:options:flow_alerts</w:t>
+      </w:r>
+      <w:r>
+        <w:rPr/>
+        <w:t xml:space="preserve"> is </w:t>
+      </w:r>
+      <w:r>
+        <w:rPr>
+          <w:rFonts w:ascii="Consolas" w:hAnsi="Consolas"/>
+          <w:color w:val="334455"/>
+          <w:sz w:val="19"/>
+        </w:rPr>
+        <w:t>{date, alerts: [...]}</w:t>
+      </w:r>
+      <w:r>
+        <w:rPr/>
+        <w:t>, oldest first, capped at</w:t>
+        <w:br/>
+        <w:t xml:space="preserve">300, today only. Each alert carries </w:t>
+      </w:r>
+      <w:r>
+        <w:rPr>
+          <w:rFonts w:ascii="Consolas" w:hAnsi="Consolas"/>
+          <w:color w:val="334455"/>
+          <w:sz w:val="19"/>
+        </w:rPr>
+        <w:t>type</w:t>
+      </w:r>
+      <w:r>
+        <w:rPr/>
+        <w:t xml:space="preserve"> — </w:t>
+      </w:r>
+      <w:r>
+        <w:rPr>
+          <w:rFonts w:ascii="Consolas" w:hAnsi="Consolas"/>
+          <w:color w:val="334455"/>
+          <w:sz w:val="19"/>
+        </w:rPr>
+        <w:t>crossover</w:t>
+      </w:r>
+      <w:r>
+        <w:rPr/>
+        <w:t xml:space="preserve">, </w:t>
+      </w:r>
+      <w:r>
+        <w:rPr>
+          <w:rFonts w:ascii="Consolas" w:hAnsi="Consolas"/>
+          <w:color w:val="334455"/>
+          <w:sz w:val="19"/>
+        </w:rPr>
+        <w:t>uoa</w:t>
+      </w:r>
+      <w:r>
+        <w:rPr/>
+        <w:t xml:space="preserve">, </w:t>
+      </w:r>
+      <w:r>
+        <w:rPr>
+          <w:rFonts w:ascii="Consolas" w:hAnsi="Consolas"/>
+          <w:color w:val="334455"/>
+          <w:sz w:val="19"/>
+        </w:rPr>
+        <w:t>gamma_flip</w:t>
+      </w:r>
+      <w:r>
+        <w:rPr/>
+        <w:t>,</w:t>
+        <w:br/>
+      </w:r>
+      <w:r>
+        <w:rPr>
+          <w:rFonts w:ascii="Consolas" w:hAnsi="Consolas"/>
+          <w:color w:val="334455"/>
+          <w:sz w:val="19"/>
+        </w:rPr>
+        <w:t>big_delta</w:t>
+      </w:r>
+      <w:r>
+        <w:rPr/>
+        <w:t xml:space="preserve">, </w:t>
+      </w:r>
+      <w:r>
+        <w:rPr>
+          <w:rFonts w:ascii="Consolas" w:hAnsi="Consolas"/>
+          <w:color w:val="334455"/>
+          <w:sz w:val="19"/>
+        </w:rPr>
+        <w:t>hiro_surge</w:t>
+      </w:r>
+      <w:r>
+        <w:rPr/>
+        <w:t xml:space="preserve"> or </w:t>
+      </w:r>
+      <w:r>
+        <w:rPr>
+          <w:rFonts w:ascii="Consolas" w:hAnsi="Consolas"/>
+          <w:color w:val="334455"/>
+          <w:sz w:val="19"/>
+        </w:rPr>
+        <w:t>hiro_flip</w:t>
+      </w:r>
+      <w:r>
+        <w:rPr/>
+        <w:t xml:space="preserve"> — plus </w:t>
+      </w:r>
+      <w:r>
+        <w:rPr>
+          <w:rFonts w:ascii="Consolas" w:hAnsi="Consolas"/>
+          <w:color w:val="334455"/>
+          <w:sz w:val="19"/>
+        </w:rPr>
+        <w:t>side</w:t>
+      </w:r>
+      <w:r>
+        <w:rPr/>
+        <w:t xml:space="preserve">, </w:t>
+      </w:r>
+      <w:r>
+        <w:rPr>
+          <w:rFonts w:ascii="Consolas" w:hAnsi="Consolas"/>
+          <w:color w:val="334455"/>
+          <w:sz w:val="19"/>
+        </w:rPr>
+        <w:t>symbol</w:t>
+      </w:r>
+      <w:r>
+        <w:rPr/>
+        <w:t xml:space="preserve">, </w:t>
+      </w:r>
+      <w:r>
+        <w:rPr>
+          <w:rFonts w:ascii="Consolas" w:hAnsi="Consolas"/>
+          <w:color w:val="334455"/>
+          <w:sz w:val="19"/>
+        </w:rPr>
+        <w:t>ts</w:t>
+      </w:r>
+      <w:r>
+        <w:rPr/>
+        <w:t xml:space="preserve">, </w:t>
+      </w:r>
+      <w:r>
+        <w:rPr>
+          <w:rFonts w:ascii="Consolas" w:hAnsi="Consolas"/>
+          <w:color w:val="334455"/>
+          <w:sz w:val="19"/>
+        </w:rPr>
+        <w:t>id</w:t>
+      </w:r>
+      <w:r>
+        <w:rPr/>
+        <w:t xml:space="preserve"> and</w:t>
+        <w:br/>
+      </w:r>
+      <w:r>
+        <w:rPr>
+          <w:rFonts w:ascii="Consolas" w:hAnsi="Consolas"/>
+          <w:color w:val="334455"/>
+          <w:sz w:val="19"/>
+        </w:rPr>
+        <w:t>text</w:t>
+      </w:r>
+      <w:r>
+        <w:rPr/>
+        <w:t xml:space="preserve">. The two </w:t>
+      </w:r>
+      <w:r>
+        <w:rPr>
+          <w:rFonts w:ascii="Consolas" w:hAnsi="Consolas"/>
+          <w:color w:val="334455"/>
+          <w:sz w:val="19"/>
+        </w:rPr>
+        <w:t>hiro_*</w:t>
+      </w:r>
+      <w:r>
+        <w:rPr/>
+        <w:t xml:space="preserve"> types also carry two flags the service stamps from</w:t>
+        <w:br/>
+      </w:r>
+      <w:r>
+        <w:rPr>
+          <w:rFonts w:ascii="Consolas" w:hAnsi="Consolas"/>
+          <w:color w:val="334455"/>
+          <w:sz w:val="19"/>
+        </w:rPr>
+        <w:t>[hiro]</w:t>
+      </w:r>
+      <w:r>
+        <w:rPr/>
+        <w:t xml:space="preserve"> in </w:t>
+      </w:r>
+      <w:r>
+        <w:rPr>
+          <w:rFonts w:ascii="Consolas" w:hAnsi="Consolas"/>
+          <w:color w:val="334455"/>
+          <w:sz w:val="19"/>
+        </w:rPr>
+        <w:t>config/flow_alerts.toml</w:t>
+      </w:r>
+      <w:r>
+        <w:rPr/>
+        <w:t xml:space="preserve">: </w:t>
+      </w:r>
+      <w:r>
+        <w:rPr>
+          <w:rFonts w:ascii="Consolas" w:hAnsi="Consolas"/>
+          <w:color w:val="334455"/>
+          <w:sz w:val="19"/>
+        </w:rPr>
+        <w:t>quiet</w:t>
+      </w:r>
+      <w:r>
+        <w:rPr/>
+        <w:t xml:space="preserve"> (true while </w:t>
+      </w:r>
+      <w:r>
+        <w:rPr>
+          <w:rFonts w:ascii="Consolas" w:hAnsi="Consolas"/>
+          <w:color w:val="334455"/>
+          <w:sz w:val="19"/>
+        </w:rPr>
+        <w:t>push</w:t>
+      </w:r>
+      <w:r>
+        <w:rPr/>
+        <w:t xml:space="preserve"> is off — not</w:t>
+        <w:br/>
+        <w:t xml:space="preserve">pushed, and the Desk does not speak it) and </w:t>
+      </w:r>
+      <w:r>
+        <w:rPr>
+          <w:rFonts w:ascii="Consolas" w:hAnsi="Consolas"/>
+          <w:color w:val="334455"/>
+          <w:sz w:val="19"/>
+        </w:rPr>
+        <w:t>public</w:t>
+      </w:r>
+      <w:r>
+        <w:rPr/>
+        <w:t xml:space="preserve"> (false while </w:t>
+      </w:r>
+      <w:r>
+        <w:rPr>
+          <w:rFonts w:ascii="Consolas" w:hAnsi="Consolas"/>
+          <w:color w:val="334455"/>
+          <w:sz w:val="19"/>
+        </w:rPr>
+        <w:t>public</w:t>
+      </w:r>
+      <w:r>
+        <w:rPr/>
+        <w:t xml:space="preserve"> is</w:t>
+        <w:br/>
+        <w:t>off — hidden on the public live screens and in gallery captures). A reader that</w:t>
+        <w:br/>
+        <w:t xml:space="preserve">shows flow-alert rows must go through </w:t>
+      </w:r>
+      <w:r>
+        <w:rPr>
+          <w:rFonts w:ascii="Consolas" w:hAnsi="Consolas"/>
+          <w:color w:val="334455"/>
+          <w:sz w:val="19"/>
+        </w:rPr>
+        <w:t>webgui/pages/options/flow.alert_rows</w:t>
+      </w:r>
+      <w:r>
+        <w:rPr/>
+        <w:t xml:space="preserve"> (its</w:t>
+        <w:br/>
+      </w:r>
+      <w:r>
+        <w:rPr>
+          <w:rFonts w:ascii="Consolas" w:hAnsi="Consolas"/>
+          <w:color w:val="334455"/>
+          <w:sz w:val="19"/>
+        </w:rPr>
+        <w:t>_shown</w:t>
+      </w:r>
+      <w:r>
+        <w:rPr/>
+        <w:t xml:space="preserve"> filter does the hiding); an alert with no </w:t>
+      </w:r>
+      <w:r>
+        <w:rPr>
+          <w:rFonts w:ascii="Consolas" w:hAnsi="Consolas"/>
+          <w:color w:val="334455"/>
+          <w:sz w:val="19"/>
+        </w:rPr>
+        <w:t>public</w:t>
+      </w:r>
+      <w:r>
+        <w:rPr/>
+        <w:t xml:space="preserve"> key is shown. The</w:t>
+        <w:br/>
+      </w:r>
+      <w:r>
+        <w:rPr>
+          <w:rFonts w:ascii="Consolas" w:hAnsi="Consolas"/>
+          <w:color w:val="334455"/>
+          <w:sz w:val="19"/>
+        </w:rPr>
+        <w:t>hiro_*</w:t>
+      </w:r>
+      <w:r>
+        <w:rPr/>
+        <w:t xml:space="preserve"> alerts are not counted in </w:t>
+      </w:r>
+      <w:r>
+        <w:rPr>
+          <w:rFonts w:ascii="Consolas" w:hAnsi="Consolas"/>
+          <w:color w:val="334455"/>
+          <w:sz w:val="19"/>
+        </w:rPr>
+        <w:t>flow_alert_cooldowns</w:t>
+      </w:r>
+      <w:r>
+        <w:rPr/>
+        <w:t>-derived counts (Hotness,</w:t>
+        <w:br/>
+      </w:r>
+      <w:r>
+        <w:rPr>
+          <w:rFonts w:ascii="Consolas" w:hAnsi="Consolas"/>
+          <w:color w:val="334455"/>
+          <w:sz w:val="19"/>
+        </w:rPr>
+        <w:t>n_alerts</w:t>
+      </w:r>
+      <w:r>
+        <w:rPr/>
+        <w:t>) while the model is unvalidated.</w:t>
+      </w:r>
+    </w:p>
+    <w:p>
+      <w:r>
+        <w:rPr>
+          <w:rFonts w:ascii="Consolas" w:hAnsi="Consolas"/>
+          <w:color w:val="334455"/>
+          <w:sz w:val="19"/>
+        </w:rPr>
+        <w:t>cache:options:hiro</w:t>
+      </w:r>
+      <w:r>
+        <w:rPr/>
+        <w:t xml:space="preserve"> is </w:t>
+      </w:r>
+      <w:r>
+        <w:rPr>
+          <w:rFonts w:ascii="Consolas" w:hAnsi="Consolas"/>
+          <w:color w:val="334455"/>
+          <w:sz w:val="19"/>
+        </w:rPr>
+        <w:t>{date, symbols: {SYM: {ts, spot, impact, cum,</w:t>
+        <w:br/>
+        <w:t>window_impact, sigma, mult, unclassified_share}}}</w:t>
+      </w:r>
+      <w:r>
+        <w:rPr/>
+        <w:t xml:space="preserve">, </w:t>
+      </w:r>
+      <w:r>
+        <w:rPr>
+          <w:rFonts w:ascii="Consolas" w:hAnsi="Consolas"/>
+          <w:color w:val="334455"/>
+          <w:sz w:val="19"/>
+        </w:rPr>
+        <w:t>ts</w:t>
+      </w:r>
+      <w:r>
+        <w:rPr/>
+        <w:t xml:space="preserve"> being that symbol's newest</w:t>
+        <w:br/>
+        <w:t xml:space="preserve">stored minute. Gate on </w:t>
+      </w:r>
+      <w:r>
+        <w:rPr>
+          <w:rFonts w:ascii="Consolas" w:hAnsi="Consolas"/>
+          <w:color w:val="334455"/>
+          <w:sz w:val="19"/>
+        </w:rPr>
+        <w:t>date</w:t>
+      </w:r>
+      <w:r>
+        <w:rPr/>
+        <w:t xml:space="preserve"> </w:t>
+      </w:r>
+      <w:r>
+        <w:rPr>
+          <w:b/>
+        </w:rPr>
+        <w:t>and</w:t>
+      </w:r>
+      <w:r>
+        <w:rPr/>
+        <w:t xml:space="preserve"> each symbol's </w:t>
+      </w:r>
+      <w:r>
+        <w:rPr>
+          <w:rFonts w:ascii="Consolas" w:hAnsi="Consolas"/>
+          <w:color w:val="334455"/>
+          <w:sz w:val="19"/>
+        </w:rPr>
+        <w:t>ts</w:t>
+      </w:r>
+      <w:r>
+        <w:rPr/>
+        <w:t xml:space="preserve"> against the clock — a stalled</w:t>
+        <w:br/>
+        <w:t>collector also leaves a today-dated view.</w:t>
       </w:r>
     </w:p>
     <w:p>

</xml_diff>

<commit_message>
docs(manuals): local market data, the API usage row, the proxy's new request and response fields
API Reference: maxAge, X-Caller, X-Store, X-Store-Age, the store block of
/stats/api_calls and config/marketdata.toml. Technical Reference: the proxy's
store and its three modes, the collector's two tiers and what carried forward
means, the autoscan's single wide fetch, each marked off as shipped, with the
measured baseline and the estimates labelled as estimates. User Guide,
Reference Guide and the Settings page help: the Local market data category and
the Answered locally today row. Built outputs included.

Co-Authored-By: Claude Opus 5.5 <noreply@anthropic.com>
</commit_message>
<xml_diff>
--- a/docs/manuals/api-reference/api-reference.docx
+++ b/docs/manuals/api-reference/api-reference.docx
@@ -32,7 +32,7 @@
           <w:color w:val="5B6678"/>
           <w:sz w:val="18"/>
         </w:rPr>
-        <w:t>NeuralStrike · Generated 2026-10-02</w:t>
+        <w:t>NeuralStrike · Generated 2026-10-03</w:t>
       </w:r>
     </w:p>
     <w:p/>
@@ -17029,6 +17029,69 @@
           </w:p>
         </w:tc>
       </w:tr>
+      <w:tr>
+        <w:tc>
+          <w:tcPr>
+            <w:tcW w:type="dxa" w:w="2880"/>
+            <w:shd w:val="clear" w:color="auto" w:fill="F4F6FA"/>
+          </w:tcPr>
+          <w:p>
+            <w:r/>
+            <w:r>
+              <w:rPr>
+                <w:rFonts w:ascii="Consolas" w:hAnsi="Consolas"/>
+                <w:color w:val="334455"/>
+                <w:sz w:val="19"/>
+              </w:rPr>
+              <w:t>/stats/api_calls</w:t>
+            </w:r>
+          </w:p>
+        </w:tc>
+        <w:tc>
+          <w:tcPr>
+            <w:tcW w:type="dxa" w:w="2880"/>
+            <w:shd w:val="clear" w:color="auto" w:fill="F4F6FA"/>
+          </w:tcPr>
+          <w:p>
+            <w:r/>
+            <w:r>
+              <w:rPr/>
+              <w:t>GET</w:t>
+            </w:r>
+          </w:p>
+        </w:tc>
+        <w:tc>
+          <w:tcPr>
+            <w:tcW w:type="dxa" w:w="2880"/>
+            <w:shd w:val="clear" w:color="auto" w:fill="F4F6FA"/>
+          </w:tcPr>
+          <w:p>
+            <w:r/>
+            <w:r>
+              <w:rPr>
+                <w:rFonts w:ascii="Consolas" w:hAnsi="Consolas"/>
+                <w:color w:val="334455"/>
+                <w:sz w:val="19"/>
+              </w:rPr>
+              <w:t>{today, last_7_days, last_30_days, since, store, store_degrades}</w:t>
+            </w:r>
+            <w:r>
+              <w:rPr/>
+              <w:t xml:space="preserve"> — calls sent to Schwab per day, plus today's request breakdown (see </w:t>
+            </w:r>
+            <w:r>
+              <w:rPr>
+                <w:i/>
+              </w:rPr>
+              <w:t>Local market-data store</w:t>
+            </w:r>
+            <w:r>
+              <w:rPr/>
+              <w:t xml:space="preserve"> below)</w:t>
+            </w:r>
+          </w:p>
+        </w:tc>
+      </w:tr>
     </w:tbl>
     <w:p/>
     <w:p>
@@ -17148,7 +17211,7 @@
                 <w:color w:val="334455"/>
                 <w:sz w:val="19"/>
               </w:rPr>
-              <w:t>symbol</w:t>
+              <w:t>symbol, maxAge?</w:t>
             </w:r>
           </w:p>
         </w:tc>
@@ -17200,7 +17263,15 @@
             </w:r>
             <w:r>
               <w:rPr/>
-              <w:t xml:space="preserve"> (comma-sep)</w:t>
+              <w:t xml:space="preserve"> (comma-sep), </w:t>
+            </w:r>
+            <w:r>
+              <w:rPr>
+                <w:rFonts w:ascii="Consolas" w:hAnsi="Consolas"/>
+                <w:color w:val="334455"/>
+                <w:sz w:val="19"/>
+              </w:rPr>
+              <w:t>maxAge?</w:t>
             </w:r>
           </w:p>
         </w:tc>
@@ -17213,7 +17284,7 @@
             <w:r/>
             <w:r>
               <w:rPr/>
-              <w:t>Quotes array</w:t>
+              <w:t>Quotes, keyed by symbol</w:t>
             </w:r>
           </w:p>
         </w:tc>
@@ -17247,7 +17318,7 @@
                 <w:color w:val="334455"/>
                 <w:sz w:val="19"/>
               </w:rPr>
-              <w:t>symbol, contractType, range, fromDate?, toDate?, strikeCount?</w:t>
+              <w:t>symbol, contractType, range, fromDate?, toDate?, strikeCount?, maxAge?</w:t>
             </w:r>
           </w:p>
         </w:tc>
@@ -17433,7 +17504,9 @@
     <w:p>
       <w:r>
         <w:rPr/>
-        <w:t xml:space="preserve">All return </w:t>
+        <w:t>Each returns Schwab's JSON body as Schwab sent it. A failure is the upstream HTTP</w:t>
+        <w:br/>
+        <w:t xml:space="preserve">status with </w:t>
       </w:r>
       <w:r>
         <w:rPr>
@@ -17441,13 +17514,1471 @@
           <w:color w:val="334455"/>
           <w:sz w:val="19"/>
         </w:rPr>
-        <w:t>{status_code, data, error}</w:t>
+        <w:t>{"detail": ...}</w:t>
+      </w:r>
+      <w:r>
+        <w:rPr/>
+        <w:t>. A token that cannot be made valid (none, or the</w:t>
+        <w:br/>
+        <w:t xml:space="preserve">refresh token expired or rejected) answers </w:t>
+      </w:r>
+      <w:r>
+        <w:rPr>
+          <w:b/>
+        </w:rPr>
+        <w:t>500</w:t>
+      </w:r>
+      <w:r>
+        <w:rPr/>
+        <w:t xml:space="preserve"> with a JSON </w:t>
+      </w:r>
+      <w:r>
+        <w:rPr>
+          <w:rFonts w:ascii="Consolas" w:hAnsi="Consolas"/>
+          <w:color w:val="334455"/>
+          <w:sz w:val="19"/>
+        </w:rPr>
+        <w:t>detail</w:t>
+      </w:r>
+      <w:r>
+        <w:rPr/>
+        <w:t xml:space="preserve"> naming the</w:t>
+        <w:br/>
+        <w:t>error.</w:t>
+      </w:r>
+    </w:p>
+    <w:p>
+      <w:pPr>
+        <w:pStyle w:val="Heading2"/>
+      </w:pPr>
+      <w:r>
+        <w:rPr/>
+        <w:t>Local market-data store</w:t>
+      </w:r>
+    </w:p>
+    <w:p>
+      <w:r>
+        <w:rPr>
+          <w:b/>
+        </w:rPr>
+        <w:t>File:</w:t>
+      </w:r>
+      <w:r>
+        <w:rPr/>
+        <w:t xml:space="preserve"> </w:t>
+      </w:r>
+      <w:r>
+        <w:rPr>
+          <w:rFonts w:ascii="Consolas" w:hAnsi="Consolas"/>
+          <w:color w:val="334455"/>
+          <w:sz w:val="19"/>
+        </w:rPr>
+        <w:t>schwab-proxy/market_store.py</w:t>
+      </w:r>
+      <w:r>
+        <w:rPr/>
+        <w:t xml:space="preserve">. </w:t>
+      </w:r>
+      <w:r>
+        <w:rPr>
+          <w:b/>
+        </w:rPr>
+        <w:t>Settings:</w:t>
+      </w:r>
+      <w:r>
+        <w:rPr/>
+        <w:t xml:space="preserve"> </w:t>
+      </w:r>
+      <w:r>
+        <w:rPr>
+          <w:rFonts w:ascii="Consolas" w:hAnsi="Consolas"/>
+          <w:color w:val="334455"/>
+          <w:sz w:val="19"/>
+        </w:rPr>
+        <w:t>config/marketdata.toml</w:t>
+      </w:r>
+      <w:r>
+        <w:rPr/>
+        <w:br/>
+        <w:t xml:space="preserve">(Settings → Configuration → </w:t>
+      </w:r>
+      <w:r>
+        <w:rPr>
+          <w:i/>
+        </w:rPr>
+        <w:t>Local market data</w:t>
+      </w:r>
+      <w:r>
+        <w:rPr/>
+        <w:t>), read on every request, so a saved</w:t>
+        <w:br/>
+        <w:t>change needs no restart. Design:</w:t>
+        <w:br/>
+      </w:r>
+      <w:r>
+        <w:rPr>
+          <w:rFonts w:ascii="Consolas" w:hAnsi="Consolas"/>
+          <w:color w:val="334455"/>
+          <w:sz w:val="19"/>
+        </w:rPr>
+        <w:t>docs/plans/2026-10-03-market-data-store-design.md</w:t>
       </w:r>
       <w:r>
         <w:rPr/>
         <w:t>.</w:t>
       </w:r>
     </w:p>
+    <w:p>
+      <w:r>
+        <w:rPr/>
+        <w:t xml:space="preserve">The proxy keeps what it fetches for </w:t>
+      </w:r>
+      <w:r>
+        <w:rPr>
+          <w:rFonts w:ascii="Consolas" w:hAnsi="Consolas"/>
+          <w:color w:val="334455"/>
+          <w:sz w:val="19"/>
+        </w:rPr>
+        <w:t>/quote</w:t>
+      </w:r>
+      <w:r>
+        <w:rPr/>
+        <w:t xml:space="preserve">, </w:t>
+      </w:r>
+      <w:r>
+        <w:rPr>
+          <w:rFonts w:ascii="Consolas" w:hAnsi="Consolas"/>
+          <w:color w:val="334455"/>
+          <w:sz w:val="19"/>
+        </w:rPr>
+        <w:t>/quotes</w:t>
+      </w:r>
+      <w:r>
+        <w:rPr/>
+        <w:t xml:space="preserve">, </w:t>
+      </w:r>
+      <w:r>
+        <w:rPr>
+          <w:rFonts w:ascii="Consolas" w:hAnsi="Consolas"/>
+          <w:color w:val="334455"/>
+          <w:sz w:val="19"/>
+        </w:rPr>
+        <w:t>/chains</w:t>
+      </w:r>
+      <w:r>
+        <w:rPr/>
+        <w:t xml:space="preserve"> and </w:t>
+      </w:r>
+      <w:r>
+        <w:rPr>
+          <w:b/>
+        </w:rPr>
+        <w:t>daily</w:t>
+      </w:r>
+      <w:r>
+        <w:rPr/>
+        <w:br/>
+      </w:r>
+      <w:r>
+        <w:rPr>
+          <w:rFonts w:ascii="Consolas" w:hAnsi="Consolas"/>
+          <w:color w:val="334455"/>
+          <w:sz w:val="19"/>
+        </w:rPr>
+        <w:t>/pricehistory</w:t>
+      </w:r>
+      <w:r>
+        <w:rPr/>
+        <w:t xml:space="preserve"> in memory (nothing on disk, nothing in Redis; a restart starts</w:t>
+        <w:br/>
+        <w:t xml:space="preserve">empty). Whether it answers from that copy is set by </w:t>
+      </w:r>
+      <w:r>
+        <w:rPr>
+          <w:rFonts w:ascii="Consolas" w:hAnsi="Consolas"/>
+          <w:color w:val="334455"/>
+          <w:sz w:val="19"/>
+        </w:rPr>
+        <w:t>mode</w:t>
+      </w:r>
+      <w:r>
+        <w:rPr/>
+        <w:t>:</w:t>
+      </w:r>
+    </w:p>
+    <w:tbl>
+      <w:tblPr>
+        <w:tblW w:type="auto" w:w="0"/>
+        <w:jc w:val="left"/>
+        <w:tblLayout w:type="autofit"/>
+        <w:tblLook w:firstColumn="1" w:firstRow="1" w:lastColumn="0" w:lastRow="0" w:noHBand="0" w:noVBand="1" w:val="04A0"/>
+        <w:tblBorders>
+          <w:top w:val="single" w:sz="4" w:space="0" w:color="D8DEE9"/>
+          <w:left w:val="single" w:sz="4" w:space="0" w:color="D8DEE9"/>
+          <w:bottom w:val="single" w:sz="4" w:space="0" w:color="D8DEE9"/>
+          <w:right w:val="single" w:sz="4" w:space="0" w:color="D8DEE9"/>
+          <w:insideH w:val="single" w:sz="4" w:space="0" w:color="D8DEE9"/>
+          <w:insideV w:val="single" w:sz="4" w:space="0" w:color="D8DEE9"/>
+        </w:tblBorders>
+      </w:tblPr>
+      <w:tblGrid>
+        <w:gridCol w:w="4320"/>
+        <w:gridCol w:w="4320"/>
+      </w:tblGrid>
+      <w:tr>
+        <w:tc>
+          <w:tcPr>
+            <w:tcW w:type="dxa" w:w="4320"/>
+            <w:shd w:val="clear" w:color="auto" w:fill="EAF2FB"/>
+          </w:tcPr>
+          <w:p>
+            <w:r>
+              <w:rPr>
+                <w:b/>
+              </w:rPr>
+            </w:r>
+            <w:r>
+              <w:rPr>
+                <w:rFonts w:ascii="Consolas" w:hAnsi="Consolas"/>
+                <w:b/>
+                <w:color w:val="334455"/>
+                <w:sz w:val="19"/>
+              </w:rPr>
+              <w:t>mode</w:t>
+            </w:r>
+          </w:p>
+        </w:tc>
+        <w:tc>
+          <w:tcPr>
+            <w:tcW w:type="dxa" w:w="4320"/>
+            <w:shd w:val="clear" w:color="auto" w:fill="EAF2FB"/>
+          </w:tcPr>
+          <w:p>
+            <w:r>
+              <w:rPr>
+                <w:b/>
+              </w:rPr>
+            </w:r>
+            <w:r>
+              <w:rPr>
+                <w:b/>
+              </w:rPr>
+              <w:t>What the proxy does</w:t>
+            </w:r>
+          </w:p>
+        </w:tc>
+      </w:tr>
+      <w:tr>
+        <w:tc>
+          <w:tcPr>
+            <w:tcW w:type="dxa" w:w="4320"/>
+          </w:tcPr>
+          <w:p>
+            <w:r/>
+            <w:r>
+              <w:rPr>
+                <w:rFonts w:ascii="Consolas" w:hAnsi="Consolas"/>
+                <w:color w:val="334455"/>
+                <w:sz w:val="19"/>
+              </w:rPr>
+              <w:t>off</w:t>
+            </w:r>
+          </w:p>
+        </w:tc>
+        <w:tc>
+          <w:tcPr>
+            <w:tcW w:type="dxa" w:w="4320"/>
+          </w:tcPr>
+          <w:p>
+            <w:r/>
+            <w:r>
+              <w:rPr/>
+              <w:t>Sends every request to Schwab.</w:t>
+            </w:r>
+          </w:p>
+        </w:tc>
+      </w:tr>
+      <w:tr>
+        <w:tc>
+          <w:tcPr>
+            <w:tcW w:type="dxa" w:w="4320"/>
+            <w:shd w:val="clear" w:color="auto" w:fill="F4F6FA"/>
+          </w:tcPr>
+          <w:p>
+            <w:r/>
+            <w:r>
+              <w:rPr>
+                <w:rFonts w:ascii="Consolas" w:hAnsi="Consolas"/>
+                <w:color w:val="334455"/>
+                <w:sz w:val="19"/>
+              </w:rPr>
+              <w:t>shadow</w:t>
+            </w:r>
+            <w:r>
+              <w:rPr/>
+              <w:t xml:space="preserve"> (</w:t>
+            </w:r>
+            <w:r>
+              <w:rPr>
+                <w:b/>
+              </w:rPr>
+              <w:t>shipped</w:t>
+            </w:r>
+            <w:r>
+              <w:rPr/>
+              <w:t>)</w:t>
+            </w:r>
+          </w:p>
+        </w:tc>
+        <w:tc>
+          <w:tcPr>
+            <w:tcW w:type="dxa" w:w="4320"/>
+            <w:shd w:val="clear" w:color="auto" w:fill="F4F6FA"/>
+          </w:tcPr>
+          <w:p>
+            <w:r/>
+            <w:r>
+              <w:rPr/>
+              <w:t xml:space="preserve">Sends every request to Schwab and returns Schwab's answer. It also records what </w:t>
+            </w:r>
+            <w:r>
+              <w:rPr>
+                <w:rFonts w:ascii="Consolas" w:hAnsi="Consolas"/>
+                <w:color w:val="334455"/>
+                <w:sz w:val="19"/>
+              </w:rPr>
+              <w:t>on</w:t>
+            </w:r>
+            <w:r>
+              <w:rPr/>
+              <w:t xml:space="preserve"> </w:t>
+            </w:r>
+            <w:r>
+              <w:rPr>
+                <w:i/>
+              </w:rPr>
+              <w:t>would</w:t>
+            </w:r>
+            <w:r>
+              <w:rPr/>
+              <w:t xml:space="preserve"> have answered and whether that matched. No request is answered locally.</w:t>
+            </w:r>
+          </w:p>
+        </w:tc>
+      </w:tr>
+      <w:tr>
+        <w:tc>
+          <w:tcPr>
+            <w:tcW w:type="dxa" w:w="4320"/>
+          </w:tcPr>
+          <w:p>
+            <w:r/>
+            <w:r>
+              <w:rPr>
+                <w:rFonts w:ascii="Consolas" w:hAnsi="Consolas"/>
+                <w:color w:val="334455"/>
+                <w:sz w:val="19"/>
+              </w:rPr>
+              <w:t>on</w:t>
+            </w:r>
+          </w:p>
+        </w:tc>
+        <w:tc>
+          <w:tcPr>
+            <w:tcW w:type="dxa" w:w="4320"/>
+          </w:tcPr>
+          <w:p>
+            <w:r/>
+            <w:r>
+              <w:rPr/>
+              <w:t>Answers a repeat request from the stored copy when the copy is fresh and covers the request.</w:t>
+            </w:r>
+          </w:p>
+        </w:tc>
+      </w:tr>
+    </w:tbl>
+    <w:p/>
+    <w:p>
+      <w:r>
+        <w:rPr/>
+        <w:t xml:space="preserve">Anything else reads as </w:t>
+      </w:r>
+      <w:r>
+        <w:rPr>
+          <w:rFonts w:ascii="Consolas" w:hAnsi="Consolas"/>
+          <w:color w:val="334455"/>
+          <w:sz w:val="19"/>
+        </w:rPr>
+        <w:t>off</w:t>
+      </w:r>
+      <w:r>
+        <w:rPr/>
+        <w:t xml:space="preserve">. Each store also has its own </w:t>
+      </w:r>
+      <w:r>
+        <w:rPr>
+          <w:rFonts w:ascii="Consolas" w:hAnsi="Consolas"/>
+          <w:color w:val="334455"/>
+          <w:sz w:val="19"/>
+        </w:rPr>
+        <w:t>enabled</w:t>
+      </w:r>
+      <w:r>
+        <w:rPr/>
+        <w:t xml:space="preserve"> switch</w:t>
+        <w:br/>
+        <w:t>(</w:t>
+      </w:r>
+      <w:r>
+        <w:rPr>
+          <w:rFonts w:ascii="Consolas" w:hAnsi="Consolas"/>
+          <w:color w:val="334455"/>
+          <w:sz w:val="19"/>
+        </w:rPr>
+        <w:t>[chains]</w:t>
+      </w:r>
+      <w:r>
+        <w:rPr/>
+        <w:t xml:space="preserve">, </w:t>
+      </w:r>
+      <w:r>
+        <w:rPr>
+          <w:rFonts w:ascii="Consolas" w:hAnsi="Consolas"/>
+          <w:color w:val="334455"/>
+          <w:sz w:val="19"/>
+        </w:rPr>
+        <w:t>[quotes]</w:t>
+      </w:r>
+      <w:r>
+        <w:rPr/>
+        <w:t xml:space="preserve">, </w:t>
+      </w:r>
+      <w:r>
+        <w:rPr>
+          <w:rFonts w:ascii="Consolas" w:hAnsi="Consolas"/>
+          <w:color w:val="334455"/>
+          <w:sz w:val="19"/>
+        </w:rPr>
+        <w:t>[bars]</w:t>
+      </w:r>
+      <w:r>
+        <w:rPr/>
+        <w:t>). Intraday price history always goes to Schwab.</w:t>
+      </w:r>
+    </w:p>
+    <w:p>
+      <w:r>
+        <w:rPr>
+          <w:b/>
+        </w:rPr>
+        <w:t xml:space="preserve">Request: </w:t>
+      </w:r>
+      <w:r>
+        <w:rPr>
+          <w:rFonts w:ascii="Consolas" w:hAnsi="Consolas"/>
+          <w:color w:val="334455"/>
+          <w:sz w:val="19"/>
+        </w:rPr>
+        <w:t>maxAge=&lt;seconds&gt;</w:t>
+      </w:r>
+      <w:r>
+        <w:rPr/>
+        <w:t xml:space="preserve"> on </w:t>
+      </w:r>
+      <w:r>
+        <w:rPr>
+          <w:rFonts w:ascii="Consolas" w:hAnsi="Consolas"/>
+          <w:color w:val="334455"/>
+          <w:sz w:val="19"/>
+        </w:rPr>
+        <w:t>/quote</w:t>
+      </w:r>
+      <w:r>
+        <w:rPr/>
+        <w:t xml:space="preserve">, </w:t>
+      </w:r>
+      <w:r>
+        <w:rPr>
+          <w:rFonts w:ascii="Consolas" w:hAnsi="Consolas"/>
+          <w:color w:val="334455"/>
+          <w:sz w:val="19"/>
+        </w:rPr>
+        <w:t>/quotes</w:t>
+      </w:r>
+      <w:r>
+        <w:rPr/>
+        <w:t xml:space="preserve"> and </w:t>
+      </w:r>
+      <w:r>
+        <w:rPr>
+          <w:rFonts w:ascii="Consolas" w:hAnsi="Consolas"/>
+          <w:color w:val="334455"/>
+          <w:sz w:val="19"/>
+        </w:rPr>
+        <w:t>/chains</w:t>
+      </w:r>
+      <w:r>
+        <w:rPr/>
+        <w:t xml:space="preserve"> — the oldest</w:t>
+        <w:br/>
+        <w:t>stored answer this caller will accept. It is a hint, sent as text: a value that is</w:t>
+        <w:br/>
+        <w:t>not a usable number (text, negative, NaN) means "none given" and never fails the</w:t>
+        <w:br/>
+        <w:t xml:space="preserve">request with a 422. It is capped at 3,600. </w:t>
+      </w:r>
+      <w:r>
+        <w:rPr>
+          <w:rFonts w:ascii="Consolas" w:hAnsi="Consolas"/>
+          <w:color w:val="334455"/>
+          <w:sz w:val="19"/>
+        </w:rPr>
+        <w:t>maxAge=0</w:t>
+      </w:r>
+      <w:r>
+        <w:rPr/>
+        <w:t xml:space="preserve"> always fetches. With none</w:t>
+        <w:br/>
+        <w:t xml:space="preserve">given the configured limit applies: chains </w:t>
+      </w:r>
+      <w:r>
+        <w:rPr>
+          <w:rFonts w:ascii="Consolas" w:hAnsi="Consolas"/>
+          <w:color w:val="334455"/>
+          <w:sz w:val="19"/>
+        </w:rPr>
+        <w:t>chains.max_age_sec</w:t>
+      </w:r>
+      <w:r>
+        <w:rPr/>
+        <w:t xml:space="preserve"> (45) while a session</w:t>
+        <w:br/>
+        <w:t xml:space="preserve">is open and </w:t>
+      </w:r>
+      <w:r>
+        <w:rPr>
+          <w:rFonts w:ascii="Consolas" w:hAnsi="Consolas"/>
+          <w:color w:val="334455"/>
+          <w:sz w:val="19"/>
+        </w:rPr>
+        <w:t>chains.closed_max_age_sec</w:t>
+      </w:r>
+      <w:r>
+        <w:rPr/>
+        <w:t xml:space="preserve"> (1,800) while every session is closed;</w:t>
+        <w:br/>
+        <w:t xml:space="preserve">quotes </w:t>
+      </w:r>
+      <w:r>
+        <w:rPr>
+          <w:rFonts w:ascii="Consolas" w:hAnsi="Consolas"/>
+          <w:color w:val="334455"/>
+          <w:sz w:val="19"/>
+        </w:rPr>
+        <w:t>quotes.max_age_sec</w:t>
+      </w:r>
+      <w:r>
+        <w:rPr/>
+        <w:t xml:space="preserve"> (5). </w:t>
+      </w:r>
+      <w:r>
+        <w:rPr>
+          <w:rFonts w:ascii="Consolas" w:hAnsi="Consolas"/>
+          <w:color w:val="334455"/>
+          <w:sz w:val="19"/>
+        </w:rPr>
+        <w:t>proxy_client.SchwabPyProxyClient.get_option_chain</w:t>
+      </w:r>
+      <w:r>
+        <w:rPr/>
+        <w:br/>
+        <w:t xml:space="preserve">takes it as </w:t>
+      </w:r>
+      <w:r>
+        <w:rPr>
+          <w:rFonts w:ascii="Consolas" w:hAnsi="Consolas"/>
+          <w:color w:val="334455"/>
+          <w:sz w:val="19"/>
+        </w:rPr>
+        <w:t>max_age=</w:t>
+      </w:r>
+      <w:r>
+        <w:rPr/>
+        <w:t>.</w:t>
+      </w:r>
+    </w:p>
+    <w:p>
+      <w:r>
+        <w:rPr>
+          <w:b/>
+        </w:rPr>
+        <w:t xml:space="preserve">Request header: </w:t>
+      </w:r>
+      <w:r>
+        <w:rPr>
+          <w:rFonts w:ascii="Consolas" w:hAnsi="Consolas"/>
+          <w:color w:val="334455"/>
+          <w:sz w:val="19"/>
+        </w:rPr>
+        <w:t>X-Caller</w:t>
+      </w:r>
+      <w:r>
+        <w:rPr/>
+        <w:t xml:space="preserve"> — who is asking, for the per-caller counts. Both</w:t>
+        <w:br/>
+        <w:t xml:space="preserve">client classes in </w:t>
+      </w:r>
+      <w:r>
+        <w:rPr>
+          <w:rFonts w:ascii="Consolas" w:hAnsi="Consolas"/>
+          <w:color w:val="334455"/>
+          <w:sz w:val="19"/>
+        </w:rPr>
+        <w:t>proxy_client.py</w:t>
+      </w:r>
+      <w:r>
+        <w:rPr/>
+        <w:t xml:space="preserve"> set it from the service's folder name (or</w:t>
+        <w:br/>
+      </w:r>
+      <w:r>
+        <w:rPr>
+          <w:rFonts w:ascii="Consolas" w:hAnsi="Consolas"/>
+          <w:color w:val="334455"/>
+          <w:sz w:val="19"/>
+        </w:rPr>
+        <w:t>TRADING_CALLER</w:t>
+      </w:r>
+      <w:r>
+        <w:rPr/>
+        <w:t xml:space="preserve">); a caller using plain </w:t>
+      </w:r>
+      <w:r>
+        <w:rPr>
+          <w:rFonts w:ascii="Consolas" w:hAnsi="Consolas"/>
+          <w:color w:val="334455"/>
+          <w:sz w:val="19"/>
+        </w:rPr>
+        <w:t>requests</w:t>
+      </w:r>
+      <w:r>
+        <w:rPr/>
+        <w:t xml:space="preserve"> sets it with</w:t>
+        <w:br/>
+      </w:r>
+      <w:r>
+        <w:rPr>
+          <w:rFonts w:ascii="Consolas" w:hAnsi="Consolas"/>
+          <w:color w:val="334455"/>
+          <w:sz w:val="19"/>
+        </w:rPr>
+        <w:t>proxy_client.caller_label(name)</w:t>
+      </w:r>
+      <w:r>
+        <w:rPr/>
+        <w:t xml:space="preserve">. The proxy keeps letters, digits, </w:t>
+      </w:r>
+      <w:r>
+        <w:rPr>
+          <w:rFonts w:ascii="Consolas" w:hAnsi="Consolas"/>
+          <w:color w:val="334455"/>
+          <w:sz w:val="19"/>
+        </w:rPr>
+        <w:t>_</w:t>
+      </w:r>
+      <w:r>
+        <w:rPr/>
+        <w:t xml:space="preserve">, </w:t>
+      </w:r>
+      <w:r>
+        <w:rPr>
+          <w:rFonts w:ascii="Consolas" w:hAnsi="Consolas"/>
+          <w:color w:val="334455"/>
+          <w:sz w:val="19"/>
+        </w:rPr>
+        <w:t>.</w:t>
+      </w:r>
+      <w:r>
+        <w:rPr/>
+        <w:t xml:space="preserve"> and</w:t>
+        <w:br/>
+      </w:r>
+      <w:r>
+        <w:rPr>
+          <w:rFonts w:ascii="Consolas" w:hAnsi="Consolas"/>
+          <w:color w:val="334455"/>
+          <w:sz w:val="19"/>
+        </w:rPr>
+        <w:t>-</w:t>
+      </w:r>
+      <w:r>
+        <w:rPr/>
+        <w:t xml:space="preserve">, at most 40 characters; a request without it is counted as </w:t>
+      </w:r>
+      <w:r>
+        <w:rPr>
+          <w:rFonts w:ascii="Consolas" w:hAnsi="Consolas"/>
+          <w:color w:val="334455"/>
+          <w:sz w:val="19"/>
+        </w:rPr>
+        <w:t>unknown</w:t>
+      </w:r>
+      <w:r>
+        <w:rPr/>
+        <w:t>; a dev</w:t>
+        <w:br/>
+        <w:t xml:space="preserve">checkout's label is prefixed </w:t>
+      </w:r>
+      <w:r>
+        <w:rPr>
+          <w:rFonts w:ascii="Consolas" w:hAnsi="Consolas"/>
+          <w:color w:val="334455"/>
+          <w:sz w:val="19"/>
+        </w:rPr>
+        <w:t>dev.</w:t>
+      </w:r>
+      <w:r>
+        <w:rPr/>
+        <w:t>. One proxy process counts at most 64 distinct</w:t>
+        <w:br/>
+        <w:t xml:space="preserve">names — a new name past that is counted as </w:t>
+      </w:r>
+      <w:r>
+        <w:rPr>
+          <w:rFonts w:ascii="Consolas" w:hAnsi="Consolas"/>
+          <w:color w:val="334455"/>
+          <w:sz w:val="19"/>
+        </w:rPr>
+        <w:t>other</w:t>
+      </w:r>
+      <w:r>
+        <w:rPr/>
+        <w:t>.</w:t>
+      </w:r>
+    </w:p>
+    <w:p>
+      <w:r>
+        <w:rPr>
+          <w:b/>
+        </w:rPr>
+        <w:t>Response headers</w:t>
+      </w:r>
+      <w:r>
+        <w:rPr/>
+        <w:t xml:space="preserve"> on the four endpoints above, in every mode:</w:t>
+      </w:r>
+    </w:p>
+    <w:tbl>
+      <w:tblPr>
+        <w:tblW w:type="auto" w:w="0"/>
+        <w:jc w:val="left"/>
+        <w:tblLayout w:type="autofit"/>
+        <w:tblLook w:firstColumn="1" w:firstRow="1" w:lastColumn="0" w:lastRow="0" w:noHBand="0" w:noVBand="1" w:val="04A0"/>
+        <w:tblBorders>
+          <w:top w:val="single" w:sz="4" w:space="0" w:color="D8DEE9"/>
+          <w:left w:val="single" w:sz="4" w:space="0" w:color="D8DEE9"/>
+          <w:bottom w:val="single" w:sz="4" w:space="0" w:color="D8DEE9"/>
+          <w:right w:val="single" w:sz="4" w:space="0" w:color="D8DEE9"/>
+          <w:insideH w:val="single" w:sz="4" w:space="0" w:color="D8DEE9"/>
+          <w:insideV w:val="single" w:sz="4" w:space="0" w:color="D8DEE9"/>
+        </w:tblBorders>
+      </w:tblPr>
+      <w:tblGrid>
+        <w:gridCol w:w="4320"/>
+        <w:gridCol w:w="4320"/>
+      </w:tblGrid>
+      <w:tr>
+        <w:tc>
+          <w:tcPr>
+            <w:tcW w:type="dxa" w:w="4320"/>
+            <w:shd w:val="clear" w:color="auto" w:fill="EAF2FB"/>
+          </w:tcPr>
+          <w:p>
+            <w:r>
+              <w:rPr>
+                <w:b/>
+              </w:rPr>
+            </w:r>
+            <w:r>
+              <w:rPr>
+                <w:b/>
+              </w:rPr>
+              <w:t>Header</w:t>
+            </w:r>
+          </w:p>
+        </w:tc>
+        <w:tc>
+          <w:tcPr>
+            <w:tcW w:type="dxa" w:w="4320"/>
+            <w:shd w:val="clear" w:color="auto" w:fill="EAF2FB"/>
+          </w:tcPr>
+          <w:p>
+            <w:r>
+              <w:rPr>
+                <w:b/>
+              </w:rPr>
+            </w:r>
+            <w:r>
+              <w:rPr>
+                <w:b/>
+              </w:rPr>
+              <w:t>Value</w:t>
+            </w:r>
+          </w:p>
+        </w:tc>
+      </w:tr>
+      <w:tr>
+        <w:tc>
+          <w:tcPr>
+            <w:tcW w:type="dxa" w:w="4320"/>
+          </w:tcPr>
+          <w:p>
+            <w:r/>
+            <w:r>
+              <w:rPr>
+                <w:rFonts w:ascii="Consolas" w:hAnsi="Consolas"/>
+                <w:color w:val="334455"/>
+                <w:sz w:val="19"/>
+              </w:rPr>
+              <w:t>X-Store</w:t>
+            </w:r>
+          </w:p>
+        </w:tc>
+        <w:tc>
+          <w:tcPr>
+            <w:tcW w:type="dxa" w:w="4320"/>
+          </w:tcPr>
+          <w:p>
+            <w:r/>
+            <w:r>
+              <w:rPr/>
+              <w:t xml:space="preserve">Answered locally: </w:t>
+            </w:r>
+            <w:r>
+              <w:rPr>
+                <w:rFonts w:ascii="Consolas" w:hAnsi="Consolas"/>
+                <w:color w:val="334455"/>
+                <w:sz w:val="19"/>
+              </w:rPr>
+              <w:t>hit</w:t>
+            </w:r>
+            <w:r>
+              <w:rPr/>
+              <w:t xml:space="preserve"> (the stored answer to this exact request), </w:t>
+            </w:r>
+            <w:r>
+              <w:rPr>
+                <w:rFonts w:ascii="Consolas" w:hAnsi="Consolas"/>
+                <w:color w:val="334455"/>
+                <w:sz w:val="19"/>
+              </w:rPr>
+              <w:t>subset</w:t>
+            </w:r>
+            <w:r>
+              <w:rPr/>
+              <w:t xml:space="preserve"> (a chain cut from a wider stored chain), </w:t>
+            </w:r>
+            <w:r>
+              <w:rPr>
+                <w:rFonts w:ascii="Consolas" w:hAnsi="Consolas"/>
+                <w:color w:val="334455"/>
+                <w:sz w:val="19"/>
+              </w:rPr>
+              <w:t>coalesced</w:t>
+            </w:r>
+            <w:r>
+              <w:rPr/>
+              <w:t xml:space="preserve"> (shared the fetch another identical request was already making), </w:t>
+            </w:r>
+            <w:r>
+              <w:rPr>
+                <w:rFonts w:ascii="Consolas" w:hAnsi="Consolas"/>
+                <w:color w:val="334455"/>
+                <w:sz w:val="19"/>
+              </w:rPr>
+              <w:t>composed</w:t>
+            </w:r>
+            <w:r>
+              <w:rPr/>
+              <w:t xml:space="preserve"> (a daily series whose bar for today was built from the live quote). Fetched from Schwab: </w:t>
+            </w:r>
+            <w:r>
+              <w:rPr>
+                <w:rFonts w:ascii="Consolas" w:hAnsi="Consolas"/>
+                <w:color w:val="334455"/>
+                <w:sz w:val="19"/>
+              </w:rPr>
+              <w:t>miss</w:t>
+            </w:r>
+            <w:r>
+              <w:rPr/>
+              <w:t xml:space="preserve">, </w:t>
+            </w:r>
+            <w:r>
+              <w:rPr>
+                <w:rFonts w:ascii="Consolas" w:hAnsi="Consolas"/>
+                <w:color w:val="334455"/>
+                <w:sz w:val="19"/>
+              </w:rPr>
+              <w:t>partial</w:t>
+            </w:r>
+            <w:r>
+              <w:rPr/>
+              <w:t xml:space="preserve"> (quotes — only the symbols that were missing or too old were fetched), </w:t>
+            </w:r>
+            <w:r>
+              <w:rPr>
+                <w:rFonts w:ascii="Consolas" w:hAnsi="Consolas"/>
+                <w:color w:val="334455"/>
+                <w:sz w:val="19"/>
+              </w:rPr>
+              <w:t>pass</w:t>
+            </w:r>
+            <w:r>
+              <w:rPr/>
+              <w:t xml:space="preserve"> (the store played no part: mode </w:t>
+            </w:r>
+            <w:r>
+              <w:rPr>
+                <w:rFonts w:ascii="Consolas" w:hAnsi="Consolas"/>
+                <w:color w:val="334455"/>
+                <w:sz w:val="19"/>
+              </w:rPr>
+              <w:t>off</w:t>
+            </w:r>
+            <w:r>
+              <w:rPr/>
+              <w:t xml:space="preserve"> or </w:t>
+            </w:r>
+            <w:r>
+              <w:rPr>
+                <w:rFonts w:ascii="Consolas" w:hAnsi="Consolas"/>
+                <w:color w:val="334455"/>
+                <w:sz w:val="19"/>
+              </w:rPr>
+              <w:t>shadow</w:t>
+            </w:r>
+            <w:r>
+              <w:rPr/>
+              <w:t>, an intraday series, or a store fault).</w:t>
+            </w:r>
+          </w:p>
+        </w:tc>
+      </w:tr>
+      <w:tr>
+        <w:tc>
+          <w:tcPr>
+            <w:tcW w:type="dxa" w:w="4320"/>
+            <w:shd w:val="clear" w:color="auto" w:fill="F4F6FA"/>
+          </w:tcPr>
+          <w:p>
+            <w:r/>
+            <w:r>
+              <w:rPr>
+                <w:rFonts w:ascii="Consolas" w:hAnsi="Consolas"/>
+                <w:color w:val="334455"/>
+                <w:sz w:val="19"/>
+              </w:rPr>
+              <w:t>X-Store-Age</w:t>
+            </w:r>
+          </w:p>
+        </w:tc>
+        <w:tc>
+          <w:tcPr>
+            <w:tcW w:type="dxa" w:w="4320"/>
+            <w:shd w:val="clear" w:color="auto" w:fill="F4F6FA"/>
+          </w:tcPr>
+          <w:p>
+            <w:r/>
+            <w:r>
+              <w:rPr/>
+              <w:t xml:space="preserve">Seconds since the data left Schwab, one decimal. </w:t>
+            </w:r>
+            <w:r>
+              <w:rPr>
+                <w:rFonts w:ascii="Consolas" w:hAnsi="Consolas"/>
+                <w:color w:val="334455"/>
+                <w:sz w:val="19"/>
+              </w:rPr>
+              <w:t>0.0</w:t>
+            </w:r>
+            <w:r>
+              <w:rPr/>
+              <w:t xml:space="preserve"> for a fresh fetch. </w:t>
+            </w:r>
+            <w:r>
+              <w:rPr>
+                <w:rFonts w:ascii="Consolas" w:hAnsi="Consolas"/>
+                <w:color w:val="334455"/>
+                <w:sz w:val="19"/>
+              </w:rPr>
+              <w:t>proxy_client</w:t>
+            </w:r>
+            <w:r>
+              <w:rPr/>
+              <w:t xml:space="preserve"> exposes both as </w:t>
+            </w:r>
+            <w:r>
+              <w:rPr>
+                <w:rFonts w:ascii="Consolas" w:hAnsi="Consolas"/>
+                <w:color w:val="334455"/>
+                <w:sz w:val="19"/>
+              </w:rPr>
+              <w:t>FakeResponse.store_kind</w:t>
+            </w:r>
+            <w:r>
+              <w:rPr/>
+              <w:t xml:space="preserve"> / </w:t>
+            </w:r>
+            <w:r>
+              <w:rPr>
+                <w:rFonts w:ascii="Consolas" w:hAnsi="Consolas"/>
+                <w:color w:val="334455"/>
+                <w:sz w:val="19"/>
+              </w:rPr>
+              <w:t>store_age</w:t>
+            </w:r>
+            <w:r>
+              <w:rPr/>
+              <w:t>.</w:t>
+            </w:r>
+          </w:p>
+        </w:tc>
+      </w:tr>
+    </w:tbl>
+    <w:p/>
+    <w:p>
+      <w:r>
+        <w:rPr>
+          <w:b/>
+        </w:rPr>
+        <w:t>Rules the store keeps.</w:t>
+      </w:r>
+      <w:r>
+        <w:rPr/>
+        <w:t xml:space="preserve"> A chain is cut to a narrower date window only when both</w:t>
+        <w:br/>
+        <w:t>the stored chain and the request ask for every strike and both sides; a request with</w:t>
+        <w:br/>
+      </w:r>
+      <w:r>
+        <w:rPr>
+          <w:rFonts w:ascii="Consolas" w:hAnsi="Consolas"/>
+          <w:color w:val="334455"/>
+          <w:sz w:val="19"/>
+        </w:rPr>
+        <w:t>strikeCount</w:t>
+      </w:r>
+      <w:r>
+        <w:rPr/>
+        <w:t xml:space="preserve">, a </w:t>
+      </w:r>
+      <w:r>
+        <w:rPr>
+          <w:rFonts w:ascii="Consolas" w:hAnsi="Consolas"/>
+          <w:color w:val="334455"/>
+          <w:sz w:val="19"/>
+        </w:rPr>
+        <w:t>range</w:t>
+      </w:r>
+      <w:r>
+        <w:rPr/>
+        <w:t xml:space="preserve"> other than </w:t>
+      </w:r>
+      <w:r>
+        <w:rPr>
+          <w:rFonts w:ascii="Consolas" w:hAnsi="Consolas"/>
+          <w:color w:val="334455"/>
+          <w:sz w:val="19"/>
+        </w:rPr>
+        <w:t>ALL</w:t>
+      </w:r>
+      <w:r>
+        <w:rPr/>
+        <w:t xml:space="preserve"> or one contract type is answered only by</w:t>
+        <w:br/>
+        <w:t>its own exact stored copy. An entry stored in one market session is never served in</w:t>
+        <w:br/>
+        <w:t>another. An entry past its limit is never served because Schwab failed — the error</w:t>
+        <w:br/>
+        <w:t>is returned. An empty answer is never stored, and a cut that would hold no</w:t>
+        <w:br/>
+        <w:t>expiration is never served.</w:t>
+      </w:r>
+    </w:p>
+    <w:p>
+      <w:r>
+        <w:rPr>
+          <w:rFonts w:ascii="Consolas" w:hAnsi="Consolas"/>
+          <w:color w:val="334455"/>
+          <w:sz w:val="19"/>
+        </w:rPr>
+        <w:t>/stats/api_calls</w:t>
+      </w:r>
+      <w:r>
+        <w:rPr/>
+        <w:t xml:space="preserve"> gains two keys. </w:t>
+      </w:r>
+      <w:r>
+        <w:rPr>
+          <w:rFonts w:ascii="Consolas" w:hAnsi="Consolas"/>
+          <w:color w:val="334455"/>
+          <w:sz w:val="19"/>
+        </w:rPr>
+        <w:t>today</w:t>
+      </w:r>
+      <w:r>
+        <w:rPr/>
+        <w:t xml:space="preserve"> / </w:t>
+      </w:r>
+      <w:r>
+        <w:rPr>
+          <w:rFonts w:ascii="Consolas" w:hAnsi="Consolas"/>
+          <w:color w:val="334455"/>
+          <w:sz w:val="19"/>
+        </w:rPr>
+        <w:t>last_7_days</w:t>
+      </w:r>
+      <w:r>
+        <w:rPr/>
+        <w:t xml:space="preserve"> / </w:t>
+      </w:r>
+      <w:r>
+        <w:rPr>
+          <w:rFonts w:ascii="Consolas" w:hAnsi="Consolas"/>
+          <w:color w:val="334455"/>
+          <w:sz w:val="19"/>
+        </w:rPr>
+        <w:t>last_30_days</w:t>
+      </w:r>
+      <w:r>
+        <w:rPr/>
+        <w:t xml:space="preserve"> still</w:t>
+        <w:br/>
+        <w:t xml:space="preserve">count calls </w:t>
+      </w:r>
+      <w:r>
+        <w:rPr>
+          <w:b/>
+        </w:rPr>
+        <w:t>sent to Schwab</w:t>
+      </w:r>
+      <w:r>
+        <w:rPr/>
+        <w:t xml:space="preserve"> — a locally answered request is not in them.</w:t>
+      </w:r>
+    </w:p>
+    <w:tbl>
+      <w:tblPr>
+        <w:tblW w:type="auto" w:w="0"/>
+        <w:jc w:val="left"/>
+        <w:tblLayout w:type="autofit"/>
+        <w:tblLook w:firstColumn="1" w:firstRow="1" w:lastColumn="0" w:lastRow="0" w:noHBand="0" w:noVBand="1" w:val="04A0"/>
+        <w:tblBorders>
+          <w:top w:val="single" w:sz="4" w:space="0" w:color="D8DEE9"/>
+          <w:left w:val="single" w:sz="4" w:space="0" w:color="D8DEE9"/>
+          <w:bottom w:val="single" w:sz="4" w:space="0" w:color="D8DEE9"/>
+          <w:right w:val="single" w:sz="4" w:space="0" w:color="D8DEE9"/>
+          <w:insideH w:val="single" w:sz="4" w:space="0" w:color="D8DEE9"/>
+          <w:insideV w:val="single" w:sz="4" w:space="0" w:color="D8DEE9"/>
+        </w:tblBorders>
+      </w:tblPr>
+      <w:tblGrid>
+        <w:gridCol w:w="4320"/>
+        <w:gridCol w:w="4320"/>
+      </w:tblGrid>
+      <w:tr>
+        <w:tc>
+          <w:tcPr>
+            <w:tcW w:type="dxa" w:w="4320"/>
+            <w:shd w:val="clear" w:color="auto" w:fill="EAF2FB"/>
+          </w:tcPr>
+          <w:p>
+            <w:r>
+              <w:rPr>
+                <w:b/>
+              </w:rPr>
+            </w:r>
+            <w:r>
+              <w:rPr>
+                <w:b/>
+              </w:rPr>
+              <w:t>Key</w:t>
+            </w:r>
+          </w:p>
+        </w:tc>
+        <w:tc>
+          <w:tcPr>
+            <w:tcW w:type="dxa" w:w="4320"/>
+            <w:shd w:val="clear" w:color="auto" w:fill="EAF2FB"/>
+          </w:tcPr>
+          <w:p>
+            <w:r>
+              <w:rPr>
+                <w:b/>
+              </w:rPr>
+            </w:r>
+            <w:r>
+              <w:rPr>
+                <w:b/>
+              </w:rPr>
+              <w:t>Contents</w:t>
+            </w:r>
+          </w:p>
+        </w:tc>
+      </w:tr>
+      <w:tr>
+        <w:tc>
+          <w:tcPr>
+            <w:tcW w:type="dxa" w:w="4320"/>
+          </w:tcPr>
+          <w:p>
+            <w:r/>
+            <w:r>
+              <w:rPr>
+                <w:rFonts w:ascii="Consolas" w:hAnsi="Consolas"/>
+                <w:color w:val="334455"/>
+                <w:sz w:val="19"/>
+              </w:rPr>
+              <w:t>store</w:t>
+            </w:r>
+          </w:p>
+        </w:tc>
+        <w:tc>
+          <w:tcPr>
+            <w:tcW w:type="dxa" w:w="4320"/>
+          </w:tcPr>
+          <w:p>
+            <w:r/>
+            <w:r>
+              <w:rPr/>
+              <w:t xml:space="preserve">Today's requests: </w:t>
+            </w:r>
+            <w:r>
+              <w:rPr>
+                <w:rFonts w:ascii="Consolas" w:hAnsi="Consolas"/>
+                <w:color w:val="334455"/>
+                <w:sz w:val="19"/>
+              </w:rPr>
+              <w:t>served_locally</w:t>
+            </w:r>
+            <w:r>
+              <w:rPr/>
+              <w:t xml:space="preserve"> (total answered without a Schwab call), </w:t>
+            </w:r>
+            <w:r>
+              <w:rPr>
+                <w:rFonts w:ascii="Consolas" w:hAnsi="Consolas"/>
+                <w:color w:val="334455"/>
+                <w:sz w:val="19"/>
+              </w:rPr>
+              <w:t>by_outcome</w:t>
+            </w:r>
+            <w:r>
+              <w:rPr/>
+              <w:t xml:space="preserve"> (</w:t>
+            </w:r>
+            <w:r>
+              <w:rPr>
+                <w:rFonts w:ascii="Consolas" w:hAnsi="Consolas"/>
+                <w:color w:val="334455"/>
+                <w:sz w:val="19"/>
+              </w:rPr>
+              <w:t>{outcome: count}</w:t>
+            </w:r>
+            <w:r>
+              <w:rPr/>
+              <w:t xml:space="preserve"> over every row), and </w:t>
+            </w:r>
+            <w:r>
+              <w:rPr>
+                <w:rFonts w:ascii="Consolas" w:hAnsi="Consolas"/>
+                <w:color w:val="334455"/>
+                <w:sz w:val="19"/>
+              </w:rPr>
+              <w:t>rows</w:t>
+            </w:r>
+            <w:r>
+              <w:rPr/>
+              <w:t xml:space="preserve"> — </w:t>
+            </w:r>
+            <w:r>
+              <w:rPr>
+                <w:rFonts w:ascii="Consolas" w:hAnsi="Consolas"/>
+                <w:color w:val="334455"/>
+                <w:sz w:val="19"/>
+              </w:rPr>
+              <w:t>[{endpoint, caller, outcome, n}]</w:t>
+            </w:r>
+            <w:r>
+              <w:rPr/>
+              <w:t xml:space="preserve">, the 500 largest. Outcomes: </w:t>
+            </w:r>
+            <w:r>
+              <w:rPr>
+                <w:rFonts w:ascii="Consolas" w:hAnsi="Consolas"/>
+                <w:color w:val="334455"/>
+                <w:sz w:val="19"/>
+              </w:rPr>
+              <w:t>upstream</w:t>
+            </w:r>
+            <w:r>
+              <w:rPr/>
+              <w:t xml:space="preserve">, </w:t>
+            </w:r>
+            <w:r>
+              <w:rPr>
+                <w:rFonts w:ascii="Consolas" w:hAnsi="Consolas"/>
+                <w:color w:val="334455"/>
+                <w:sz w:val="19"/>
+              </w:rPr>
+              <w:t>hit</w:t>
+            </w:r>
+            <w:r>
+              <w:rPr/>
+              <w:t xml:space="preserve">, </w:t>
+            </w:r>
+            <w:r>
+              <w:rPr>
+                <w:rFonts w:ascii="Consolas" w:hAnsi="Consolas"/>
+                <w:color w:val="334455"/>
+                <w:sz w:val="19"/>
+              </w:rPr>
+              <w:t>subset</w:t>
+            </w:r>
+            <w:r>
+              <w:rPr/>
+              <w:t xml:space="preserve">, </w:t>
+            </w:r>
+            <w:r>
+              <w:rPr>
+                <w:rFonts w:ascii="Consolas" w:hAnsi="Consolas"/>
+                <w:color w:val="334455"/>
+                <w:sz w:val="19"/>
+              </w:rPr>
+              <w:t>coalesced</w:t>
+            </w:r>
+            <w:r>
+              <w:rPr/>
+              <w:t xml:space="preserve">, </w:t>
+            </w:r>
+            <w:r>
+              <w:rPr>
+                <w:rFonts w:ascii="Consolas" w:hAnsi="Consolas"/>
+                <w:color w:val="334455"/>
+                <w:sz w:val="19"/>
+              </w:rPr>
+              <w:t>composed</w:t>
+            </w:r>
+            <w:r>
+              <w:rPr/>
+              <w:t xml:space="preserve">, </w:t>
+            </w:r>
+            <w:r>
+              <w:rPr>
+                <w:rFonts w:ascii="Consolas" w:hAnsi="Consolas"/>
+                <w:color w:val="334455"/>
+                <w:sz w:val="19"/>
+              </w:rPr>
+              <w:t>partial</w:t>
+            </w:r>
+            <w:r>
+              <w:rPr/>
+              <w:t xml:space="preserve">, and in shadow mode the </w:t>
+            </w:r>
+            <w:r>
+              <w:rPr>
+                <w:rFonts w:ascii="Consolas" w:hAnsi="Consolas"/>
+                <w:color w:val="334455"/>
+                <w:sz w:val="19"/>
+              </w:rPr>
+              <w:t>shadow_*</w:t>
+            </w:r>
+            <w:r>
+              <w:rPr/>
+              <w:t xml:space="preserve"> names (for example </w:t>
+            </w:r>
+            <w:r>
+              <w:rPr>
+                <w:rFonts w:ascii="Consolas" w:hAnsi="Consolas"/>
+                <w:color w:val="334455"/>
+                <w:sz w:val="19"/>
+              </w:rPr>
+              <w:t>shadow_hit_match</w:t>
+            </w:r>
+            <w:r>
+              <w:rPr/>
+              <w:t xml:space="preserve">, </w:t>
+            </w:r>
+            <w:r>
+              <w:rPr>
+                <w:rFonts w:ascii="Consolas" w:hAnsi="Consolas"/>
+                <w:color w:val="334455"/>
+                <w:sz w:val="19"/>
+              </w:rPr>
+              <w:t>shadow_subset_mismatch</w:t>
+            </w:r>
+            <w:r>
+              <w:rPr/>
+              <w:t xml:space="preserve">, </w:t>
+            </w:r>
+            <w:r>
+              <w:rPr>
+                <w:rFonts w:ascii="Consolas" w:hAnsi="Consolas"/>
+                <w:color w:val="334455"/>
+                <w:sz w:val="19"/>
+              </w:rPr>
+              <w:t>shadow_bar_match</w:t>
+            </w:r>
+            <w:r>
+              <w:rPr/>
+              <w:t>).</w:t>
+            </w:r>
+          </w:p>
+        </w:tc>
+      </w:tr>
+      <w:tr>
+        <w:tc>
+          <w:tcPr>
+            <w:tcW w:type="dxa" w:w="4320"/>
+            <w:shd w:val="clear" w:color="auto" w:fill="F4F6FA"/>
+          </w:tcPr>
+          <w:p>
+            <w:r/>
+            <w:r>
+              <w:rPr>
+                <w:rFonts w:ascii="Consolas" w:hAnsi="Consolas"/>
+                <w:color w:val="334455"/>
+                <w:sz w:val="19"/>
+              </w:rPr>
+              <w:t>store_degrades</w:t>
+            </w:r>
+          </w:p>
+        </w:tc>
+        <w:tc>
+          <w:tcPr>
+            <w:tcW w:type="dxa" w:w="4320"/>
+            <w:shd w:val="clear" w:color="auto" w:fill="F4F6FA"/>
+          </w:tcPr>
+          <w:p>
+            <w:r/>
+            <w:r>
+              <w:rPr>
+                <w:rFonts w:ascii="Consolas" w:hAnsi="Consolas"/>
+                <w:color w:val="334455"/>
+                <w:sz w:val="19"/>
+              </w:rPr>
+              <w:t>{area: count}</w:t>
+            </w:r>
+            <w:r>
+              <w:rPr/>
+              <w:t xml:space="preserve"> — store faults since this process started that fell back to a plain fetch. Empty is normal.</w:t>
+            </w:r>
+          </w:p>
+        </w:tc>
+      </w:tr>
+    </w:tbl>
+    <w:p/>
     <w:p>
       <w:pPr>
         <w:pStyle w:val="Heading2"/>

</xml_diff>

<commit_message>
docs: record the Accuracy audit fixes in the scorecard, CLAUDE.md, the manuals and the changelog
Scorecard: the three Critical and ten High Accuracy rows are Done with
their commits; server checks SV-12, SV-13, SV-14, SV-24 and SV-25 carry
what was measured on prod; two Medium rows opened while fixing (AC-19,
the chain volatility against the mark; AC-60, the dead feed's numeric
zero). Open burden 270 -> 210.

CLAUDE.md: corrected in place where a fix made a sentence stale, plus
two short sections for the new invariants (one settlement rule; a
session-scoped scorer gets one session).

Manuals and hover help: the 15:05 CT settle pass, and the new shadow
outcome names. Four manuals rebuilt.

Co-Authored-By: Claude Opus 5.5 <noreply@anthropic.com>
</commit_message>
<xml_diff>
--- a/docs/manuals/api-reference/api-reference.docx
+++ b/docs/manuals/api-reference/api-reference.docx
@@ -18932,7 +18932,55 @@
             </w:r>
             <w:r>
               <w:rPr/>
-              <w:t>).</w:t>
+              <w:t xml:space="preserve">, and for a daily series in the session </w:t>
+            </w:r>
+            <w:r>
+              <w:rPr>
+                <w:rFonts w:ascii="Consolas" w:hAnsi="Consolas"/>
+                <w:color w:val="334455"/>
+                <w:sz w:val="19"/>
+              </w:rPr>
+              <w:t>shadow_moving_same</w:t>
+            </w:r>
+            <w:r>
+              <w:rPr/>
+              <w:t xml:space="preserve"> / </w:t>
+            </w:r>
+            <w:r>
+              <w:rPr>
+                <w:rFonts w:ascii="Consolas" w:hAnsi="Consolas"/>
+                <w:color w:val="334455"/>
+                <w:sz w:val="19"/>
+              </w:rPr>
+              <w:t>_under_10bp</w:t>
+            </w:r>
+            <w:r>
+              <w:rPr/>
+              <w:t xml:space="preserve"> / </w:t>
+            </w:r>
+            <w:r>
+              <w:rPr>
+                <w:rFonts w:ascii="Consolas" w:hAnsi="Consolas"/>
+                <w:color w:val="334455"/>
+                <w:sz w:val="19"/>
+              </w:rPr>
+              <w:t>_under_50bp</w:t>
+            </w:r>
+            <w:r>
+              <w:rPr/>
+              <w:t xml:space="preserve"> / </w:t>
+            </w:r>
+            <w:r>
+              <w:rPr>
+                <w:rFonts w:ascii="Consolas" w:hAnsi="Consolas"/>
+                <w:color w:val="334455"/>
+                <w:sz w:val="19"/>
+              </w:rPr>
+              <w:t>_over_50bp</w:t>
+            </w:r>
+            <w:r>
+              <w:rPr/>
+              <w:t xml:space="preserve"> — how far the stored close for today sat from the fresh one).</w:t>
             </w:r>
           </w:p>
         </w:tc>

</xml_diff>

<commit_message>
docs: the audit's remaining Medium findings - scorecard, manuals, proxy notes, changelog
Fourteen more Medium rows Done and two In progress in the scorecard, with the
burden recounted (107 to 79). The API reference, technical reference, user guide
and hover help carry what changed for a reader: the store's state on /health and
the Status card, the queue's slow lane, Rescue applying the service's own
candidate, the Market Scanner's paging, carried rows and the scanner's strike
rules. The proxy's notes, the store's design doc, docs/CI.md and the lint gate's
docstring are corrected in place. compute.py's line ceiling is lowered to the
file. Manuals rebuilt.

Co-Authored-By: Claude Opus 5.5 <noreply@anthropic.com>
</commit_message>
<xml_diff>
--- a/docs/manuals/api-reference/api-reference.docx
+++ b/docs/manuals/api-reference/api-reference.docx
@@ -2986,7 +2986,7 @@
       </w:r>
       <w:r>
         <w:rPr/>
-        <w:t xml:space="preserve"> — if the payload is byte-identical to what's stored, the</w:t>
+        <w:t xml:space="preserve"> — if the payload is the one already stored, the</w:t>
         <w:br/>
         <w:t xml:space="preserve">  whole write </w:t>
       </w:r>
@@ -3000,7 +3000,37 @@
         <w:rPr/>
         <w:t xml:space="preserve"> publish are skipped (no version bump, so GUI pollers don't</w:t>
         <w:br/>
-        <w:t xml:space="preserve">  repaint). Used by tick republishers (header, GEX status).</w:t>
+        <w:t xml:space="preserve">  repaint). Used by tick republishers (header, GEX status). The check reads a</w:t>
+        <w:br/>
+        <w:t xml:space="preserve">  third side key, </w:t>
+      </w:r>
+      <w:r>
+        <w:rPr>
+          <w:rFonts w:ascii="Consolas" w:hAnsi="Consolas"/>
+          <w:color w:val="334455"/>
+          <w:sz w:val="19"/>
+        </w:rPr>
+        <w:t>{key}:sig</w:t>
+      </w:r>
+      <w:r>
+        <w:rPr/>
+        <w:t xml:space="preserve"> (a digest of the stored payload), so the payload is</w:t>
+        <w:br/>
+        <w:t xml:space="preserve">  not fetched back to be compared. A write without </w:t>
+      </w:r>
+      <w:r>
+        <w:rPr>
+          <w:rFonts w:ascii="Consolas" w:hAnsi="Consolas"/>
+          <w:color w:val="334455"/>
+          <w:sz w:val="19"/>
+        </w:rPr>
+        <w:t>skip_unchanged</w:t>
+      </w:r>
+      <w:r>
+        <w:rPr/>
+        <w:t xml:space="preserve"> deletes the</w:t>
+        <w:br/>
+        <w:t xml:space="preserve">  digest; a key that has none yet is compared in full once.</w:t>
       </w:r>
     </w:p>
     <w:p>
@@ -5439,6 +5469,174 @@
     <w:p>
       <w:r>
         <w:rPr/>
+        <w:t>Each command stream has a thread of its own for its blocking read and its</w:t>
+        <w:br/>
+        <w:t xml:space="preserve">handler; scheduled work shares a pool of </w:t>
+      </w:r>
+      <w:r>
+        <w:rPr>
+          <w:rFonts w:ascii="Consolas" w:hAnsi="Consolas"/>
+          <w:color w:val="334455"/>
+          <w:sz w:val="19"/>
+        </w:rPr>
+        <w:t>[pool] workers</w:t>
+      </w:r>
+      <w:r>
+        <w:rPr/>
+        <w:t xml:space="preserve"> threads</w:t>
+        <w:br/>
+        <w:t>(</w:t>
+      </w:r>
+      <w:r>
+        <w:rPr>
+          <w:rFonts w:ascii="Consolas" w:hAnsi="Consolas"/>
+          <w:color w:val="334455"/>
+          <w:sz w:val="19"/>
+        </w:rPr>
+        <w:t>config/services.toml</w:t>
+      </w:r>
+      <w:r>
+        <w:rPr/>
+        <w:t xml:space="preserve">). On </w:t>
+      </w:r>
+      <w:r>
+        <w:rPr>
+          <w:rFonts w:ascii="Consolas" w:hAnsi="Consolas"/>
+          <w:color w:val="334455"/>
+          <w:sz w:val="19"/>
+        </w:rPr>
+        <w:t>cmd:options</w:t>
+      </w:r>
+      <w:r>
+        <w:rPr/>
+        <w:t xml:space="preserve"> the long, self-contained commands</w:t>
+        <w:br/>
+        <w:t>(</w:t>
+      </w:r>
+      <w:r>
+        <w:rPr>
+          <w:rFonts w:ascii="Consolas" w:hAnsi="Consolas"/>
+          <w:color w:val="334455"/>
+          <w:sz w:val="19"/>
+        </w:rPr>
+        <w:t>rescan</w:t>
+      </w:r>
+      <w:r>
+        <w:rPr/>
+        <w:t xml:space="preserve">, </w:t>
+      </w:r>
+      <w:r>
+        <w:rPr>
+          <w:rFonts w:ascii="Consolas" w:hAnsi="Consolas"/>
+          <w:color w:val="334455"/>
+          <w:sz w:val="19"/>
+        </w:rPr>
+        <w:t>swing_scan</w:t>
+      </w:r>
+      <w:r>
+        <w:rPr/>
+        <w:t xml:space="preserve">, </w:t>
+      </w:r>
+      <w:r>
+        <w:rPr>
+          <w:rFonts w:ascii="Consolas" w:hAnsi="Consolas"/>
+          <w:color w:val="334455"/>
+          <w:sz w:val="19"/>
+        </w:rPr>
+        <w:t>gamma_analyze</w:t>
+      </w:r>
+      <w:r>
+        <w:rPr/>
+        <w:t xml:space="preserve">, </w:t>
+      </w:r>
+      <w:r>
+        <w:rPr>
+          <w:rFonts w:ascii="Consolas" w:hAnsi="Consolas"/>
+          <w:color w:val="334455"/>
+          <w:sz w:val="19"/>
+        </w:rPr>
+        <w:t>gamma_explain</w:t>
+      </w:r>
+      <w:r>
+        <w:rPr/>
+        <w:t xml:space="preserve">, </w:t>
+      </w:r>
+      <w:r>
+        <w:rPr>
+          <w:rFonts w:ascii="Consolas" w:hAnsi="Consolas"/>
+          <w:color w:val="334455"/>
+          <w:sz w:val="19"/>
+        </w:rPr>
+        <w:t>gamma_history</w:t>
+      </w:r>
+      <w:r>
+        <w:rPr/>
+        <w:t>,</w:t>
+        <w:br/>
+      </w:r>
+      <w:r>
+        <w:rPr>
+          <w:rFonts w:ascii="Consolas" w:hAnsi="Consolas"/>
+          <w:color w:val="334455"/>
+          <w:sz w:val="19"/>
+        </w:rPr>
+        <w:t>calc_rate</w:t>
+      </w:r>
+      <w:r>
+        <w:rPr/>
+        <w:t xml:space="preserve">, </w:t>
+      </w:r>
+      <w:r>
+        <w:rPr>
+          <w:rFonts w:ascii="Consolas" w:hAnsi="Consolas"/>
+          <w:color w:val="334455"/>
+          <w:sz w:val="19"/>
+        </w:rPr>
+        <w:t>dossier</w:t>
+      </w:r>
+      <w:r>
+        <w:rPr/>
+        <w:t xml:space="preserve">, </w:t>
+      </w:r>
+      <w:r>
+        <w:rPr>
+          <w:rFonts w:ascii="Consolas" w:hAnsi="Consolas"/>
+          <w:color w:val="334455"/>
+          <w:sz w:val="19"/>
+        </w:rPr>
+        <w:t>x_post</w:t>
+      </w:r>
+      <w:r>
+        <w:rPr/>
+        <w:t xml:space="preserve">, </w:t>
+      </w:r>
+      <w:r>
+        <w:rPr>
+          <w:rFonts w:ascii="Consolas" w:hAnsi="Consolas"/>
+          <w:color w:val="334455"/>
+          <w:sz w:val="19"/>
+        </w:rPr>
+        <w:t>x_post_report</w:t>
+      </w:r>
+      <w:r>
+        <w:rPr/>
+        <w:t>) run on a second, serial</w:t>
+        <w:br/>
+      </w:r>
+      <w:r>
+        <w:rPr>
+          <w:b/>
+        </w:rPr>
+        <w:t>slow lane</w:t>
+      </w:r>
+      <w:r>
+        <w:rPr/>
+        <w:t>, so a paper, reprice or rescue command never waits behind one.</w:t>
+      </w:r>
+    </w:p>
+    <w:p>
+      <w:r>
+        <w:rPr/>
         <w:t xml:space="preserve">The consumer drops a command older than </w:t>
       </w:r>
       <w:r>
@@ -10021,6 +10219,20 @@
               </w:rPr>
               <w:t>{position_id, candidate}</w:t>
             </w:r>
+            <w:r>
+              <w:rPr/>
+              <w:t xml:space="preserve"> — the service applies </w:t>
+            </w:r>
+            <w:r>
+              <w:rPr>
+                <w:b/>
+              </w:rPr>
+              <w:t>its own</w:t>
+            </w:r>
+            <w:r>
+              <w:rPr/>
+              <w:t xml:space="preserve"> candidate from the menu it published for the position, found by the echoed candidate's action and contracts; the echo's prices, cash and risk are ignored. No menu, or no matching row, applies nothing</w:t>
+            </w:r>
           </w:p>
         </w:tc>
         <w:tc>
@@ -19124,7 +19336,7 @@
       </w:r>
       <w:r>
         <w:rPr/>
-        <w:t xml:space="preserve"> gains two keys. </w:t>
+        <w:t xml:space="preserve"> gains more keys. </w:t>
       </w:r>
       <w:r>
         <w:rPr>
@@ -19172,7 +19384,135 @@
       </w:r>
       <w:r>
         <w:rPr/>
-        <w:t xml:space="preserve"> — a locally answered request is not in them.</w:t>
+        <w:t xml:space="preserve"> — a locally answered request is not in them. A</w:t>
+        <w:br/>
+        <w:t xml:space="preserve">count that cannot be read is </w:t>
+      </w:r>
+      <w:r>
+        <w:rPr>
+          <w:rFonts w:ascii="Consolas" w:hAnsi="Consolas"/>
+          <w:color w:val="334455"/>
+          <w:sz w:val="19"/>
+        </w:rPr>
+        <w:t>null</w:t>
+      </w:r>
+      <w:r>
+        <w:rPr/>
+        <w:t xml:space="preserve">, never 0. </w:t>
+      </w:r>
+      <w:r>
+        <w:rPr>
+          <w:rFonts w:ascii="Consolas" w:hAnsi="Consolas"/>
+          <w:color w:val="334455"/>
+          <w:sz w:val="19"/>
+        </w:rPr>
+        <w:t>?day=YYYY-MM-DD</w:t>
+      </w:r>
+      <w:r>
+        <w:rPr/>
+        <w:t xml:space="preserve"> returns </w:t>
+      </w:r>
+      <w:r>
+        <w:rPr>
+          <w:rFonts w:ascii="Consolas" w:hAnsi="Consolas"/>
+          <w:color w:val="334455"/>
+          <w:sz w:val="19"/>
+        </w:rPr>
+        <w:t>store</w:t>
+      </w:r>
+      <w:r>
+        <w:rPr/>
+        <w:br/>
+        <w:t>for an earlier day (</w:t>
+      </w:r>
+      <w:r>
+        <w:rPr>
+          <w:rFonts w:ascii="Consolas" w:hAnsi="Consolas"/>
+          <w:color w:val="334455"/>
+          <w:sz w:val="19"/>
+        </w:rPr>
+        <w:t>store_day</w:t>
+      </w:r>
+      <w:r>
+        <w:rPr/>
+        <w:t xml:space="preserve"> names it; an unreadable day is a 400).</w:t>
+        <w:br/>
+      </w:r>
+      <w:r>
+        <w:rPr>
+          <w:rFonts w:ascii="Consolas" w:hAnsi="Consolas"/>
+          <w:color w:val="334455"/>
+          <w:sz w:val="19"/>
+        </w:rPr>
+        <w:t>market_store</w:t>
+      </w:r>
+      <w:r>
+        <w:rPr/>
+        <w:t xml:space="preserve"> is </w:t>
+      </w:r>
+      <w:r>
+        <w:rPr>
+          <w:rFonts w:ascii="Consolas" w:hAnsi="Consolas"/>
+          <w:color w:val="334455"/>
+          <w:sz w:val="19"/>
+        </w:rPr>
+        <w:t>{mode, stores, faults, faults_by_area}</w:t>
+      </w:r>
+      <w:r>
+        <w:rPr/>
+        <w:t xml:space="preserve"> — the same block</w:t>
+        <w:br/>
+      </w:r>
+      <w:r>
+        <w:rPr>
+          <w:rFonts w:ascii="Consolas" w:hAnsi="Consolas"/>
+          <w:color w:val="334455"/>
+          <w:sz w:val="19"/>
+        </w:rPr>
+        <w:t>/health</w:t>
+      </w:r>
+      <w:r>
+        <w:rPr/>
+        <w:t xml:space="preserve"> carries — or </w:t>
+      </w:r>
+      <w:r>
+        <w:rPr>
+          <w:rFonts w:ascii="Consolas" w:hAnsi="Consolas"/>
+          <w:color w:val="334455"/>
+          <w:sz w:val="19"/>
+        </w:rPr>
+        <w:t>null</w:t>
+      </w:r>
+      <w:r>
+        <w:rPr/>
+        <w:t>. A chain request that just missed and whose</w:t>
+        <w:br/>
+        <w:t xml:space="preserve">week-wide refetch failed records the outcome </w:t>
+      </w:r>
+      <w:r>
+        <w:rPr>
+          <w:rFonts w:ascii="Consolas" w:hAnsi="Consolas"/>
+          <w:color w:val="334455"/>
+          <w:sz w:val="19"/>
+        </w:rPr>
+        <w:t>wide_failed</w:t>
+      </w:r>
+      <w:r>
+        <w:rPr/>
+        <w:t xml:space="preserve"> before its own</w:t>
+        <w:br/>
+      </w:r>
+      <w:r>
+        <w:rPr>
+          <w:rFonts w:ascii="Consolas" w:hAnsi="Consolas"/>
+          <w:color w:val="334455"/>
+          <w:sz w:val="19"/>
+        </w:rPr>
+        <w:t>upstream</w:t>
+      </w:r>
+      <w:r>
+        <w:rPr/>
+        <w:t>.</w:t>
       </w:r>
     </w:p>
     <w:tbl>

</xml_diff>

<commit_message>
fix(proxy): a class share is BRK.B in the app and BRK/B at Schwab
Schwab spells a class share with a slash and refuses the dotted form, while
the app's ticker allow-list accepts a dot and refuses a slash. BRK.B could not
be quoted, charted or scanned. Measured through the proxy 2026-10-04: BRK.B,
BF.B, BRK.A and HEI.A came back under errors.invalidSymbols; BRK/B, BF/B,
BRK/A, HEI/A, LEN/B and MOG/A answered.

schwab_symbols.py (pure) translates at TokenManager.api_request, the one call
every marketdata request passes: dot to slash in the symbol and symbols
parameters on the way out, and the answer's symbol names back on the way in
(quote keys, symbol, underlying.symbol, instruments, errors.invalidSymbols).
Only what a request translated is undone. Indices and futures roots are left
alone. The streaming and trader endpoints are not covered.

Not promoted.

Co-Authored-By: Claude Opus 5.5 <noreply@anthropic.com>
</commit_message>
<xml_diff>
--- a/docs/manuals/api-reference/api-reference.docx
+++ b/docs/manuals/api-reference/api-reference.docx
@@ -32,7 +32,7 @@
           <w:color w:val="5B6678"/>
           <w:sz w:val="18"/>
         </w:rPr>
-        <w:t>NeuralStrike · Generated 2026-10-03</w:t>
+        <w:t>NeuralStrike · Generated 2026-10-04</w:t>
       </w:r>
     </w:p>
     <w:p/>
@@ -17504,7 +17504,63 @@
     <w:p>
       <w:r>
         <w:rPr/>
-        <w:t>Each returns Schwab's JSON body as Schwab sent it. A failure is the upstream HTTP</w:t>
+        <w:t>Each returns Schwab's JSON body as Schwab sent it, with one exception: a class</w:t>
+        <w:br/>
+        <w:t>share. Ask for it with a dot (</w:t>
+      </w:r>
+      <w:r>
+        <w:rPr>
+          <w:rFonts w:ascii="Consolas" w:hAnsi="Consolas"/>
+          <w:color w:val="334455"/>
+          <w:sz w:val="19"/>
+        </w:rPr>
+        <w:t>BRK.B</w:t>
+      </w:r>
+      <w:r>
+        <w:rPr/>
+        <w:t xml:space="preserve">, </w:t>
+      </w:r>
+      <w:r>
+        <w:rPr>
+          <w:rFonts w:ascii="Consolas" w:hAnsi="Consolas"/>
+          <w:color w:val="334455"/>
+          <w:sz w:val="19"/>
+        </w:rPr>
+        <w:t>BF.B</w:t>
+      </w:r>
+      <w:r>
+        <w:rPr/>
+        <w:t>). The proxy sends Schwab the slash</w:t>
+        <w:br/>
+        <w:t>form it requires (</w:t>
+      </w:r>
+      <w:r>
+        <w:rPr>
+          <w:rFonts w:ascii="Consolas" w:hAnsi="Consolas"/>
+          <w:color w:val="334455"/>
+          <w:sz w:val="19"/>
+        </w:rPr>
+        <w:t>BRK/B</w:t>
+      </w:r>
+      <w:r>
+        <w:rPr/>
+        <w:t>) and names the symbol with a dot again in the answer,</w:t>
+        <w:br/>
+        <w:t xml:space="preserve">so quote keys and each </w:t>
+      </w:r>
+      <w:r>
+        <w:rPr>
+          <w:rFonts w:ascii="Consolas" w:hAnsi="Consolas"/>
+          <w:color w:val="334455"/>
+          <w:sz w:val="19"/>
+        </w:rPr>
+        <w:t>symbol</w:t>
+      </w:r>
+      <w:r>
+        <w:rPr/>
+        <w:t xml:space="preserve"> field match what was asked. Option contract</w:t>
+        <w:br/>
+        <w:t>symbols are unchanged. A failure is the upstream HTTP</w:t>
         <w:br/>
         <w:t xml:space="preserve">status with </w:t>
       </w:r>

</xml_diff>

<commit_message>
docs: bought/sold on flow alerts - help, manuals, routes, changelog
The Desk and Flow Alerts hover guides, the User Guide, Reference Guide,
Technical Reference and API Reference, the routes file, the config
reference and the changelog. CLAUDE.md gains the one standing rule (the
tally always sums to the contract's volume; unwatched volume is
unlabelled). The API Reference also gains the proxy's two SSE streams,
which it had never documented.

Co-Authored-By: Claude Opus 5.5 <noreply@anthropic.com>
</commit_message>
<xml_diff>
--- a/docs/manuals/api-reference/api-reference.docx
+++ b/docs/manuals/api-reference/api-reference.docx
@@ -648,6 +648,30 @@
                 <w:sz w:val="19"/>
               </w:rPr>
               <w:t>cache:options:flow_alerts</w:t>
+            </w:r>
+            <w:r>
+              <w:rPr/>
+              <w:t xml:space="preserve">, </w:t>
+            </w:r>
+            <w:r>
+              <w:rPr>
+                <w:rFonts w:ascii="Consolas" w:hAnsi="Consolas"/>
+                <w:color w:val="334455"/>
+                <w:sz w:val="19"/>
+              </w:rPr>
+              <w:t>:flow_sides</w:t>
+            </w:r>
+            <w:r>
+              <w:rPr/>
+              <w:t xml:space="preserve">, </w:t>
+            </w:r>
+            <w:r>
+              <w:rPr>
+                <w:rFonts w:ascii="Consolas" w:hAnsi="Consolas"/>
+                <w:color w:val="334455"/>
+                <w:sz w:val="19"/>
+              </w:rPr>
+              <w:t>:flow_followup</w:t>
             </w:r>
           </w:p>
         </w:tc>
@@ -20797,6 +20821,487 @@
       </w:r>
     </w:p>
     <w:p>
+      <w:pPr>
+        <w:pStyle w:val="Heading2"/>
+      </w:pPr>
+      <w:r>
+        <w:rPr/>
+        <w:t>Streaming (server-sent events)</w:t>
+      </w:r>
+    </w:p>
+    <w:p>
+      <w:r>
+        <w:rPr/>
+        <w:t>Two read-only streams fan level-one ticks out from the proxy's one Schwab</w:t>
+        <w:br/>
+        <w:t xml:space="preserve">streaming session. Each is a long-lived </w:t>
+      </w:r>
+      <w:r>
+        <w:rPr>
+          <w:rFonts w:ascii="Consolas" w:hAnsi="Consolas"/>
+          <w:color w:val="334455"/>
+          <w:sz w:val="19"/>
+        </w:rPr>
+        <w:t>GET</w:t>
+      </w:r>
+      <w:r>
+        <w:rPr/>
+        <w:t xml:space="preserve"> answering </w:t>
+      </w:r>
+      <w:r>
+        <w:rPr>
+          <w:rFonts w:ascii="Consolas" w:hAnsi="Consolas"/>
+          <w:color w:val="334455"/>
+          <w:sz w:val="19"/>
+        </w:rPr>
+        <w:t>text/event-stream</w:t>
+      </w:r>
+      <w:r>
+        <w:rPr/>
+        <w:t>: one</w:t>
+        <w:br/>
+      </w:r>
+      <w:r>
+        <w:rPr>
+          <w:rFonts w:ascii="Consolas" w:hAnsi="Consolas"/>
+          <w:color w:val="334455"/>
+          <w:sz w:val="19"/>
+        </w:rPr>
+        <w:t>data: {json}</w:t>
+      </w:r>
+      <w:r>
+        <w:rPr/>
+        <w:t xml:space="preserve"> event per tick, and a </w:t>
+      </w:r>
+      <w:r>
+        <w:rPr>
+          <w:rFonts w:ascii="Consolas" w:hAnsi="Consolas"/>
+          <w:color w:val="334455"/>
+          <w:sz w:val="19"/>
+        </w:rPr>
+        <w:t>: keepalive</w:t>
+      </w:r>
+      <w:r>
+        <w:rPr/>
+        <w:t xml:space="preserve"> comment after 15 seconds of</w:t>
+        <w:br/>
+        <w:t>silence. A consumer should treat about 45 seconds with nothing at all as a dead</w:t>
+        <w:br/>
+        <w:t>connection and reconnect.</w:t>
+      </w:r>
+    </w:p>
+    <w:tbl>
+      <w:tblPr>
+        <w:tblW w:type="auto" w:w="0"/>
+        <w:jc w:val="left"/>
+        <w:tblLayout w:type="autofit"/>
+        <w:tblLook w:firstColumn="1" w:firstRow="1" w:lastColumn="0" w:lastRow="0" w:noHBand="0" w:noVBand="1" w:val="04A0"/>
+        <w:tblBorders>
+          <w:top w:val="single" w:sz="4" w:space="0" w:color="D8DEE9"/>
+          <w:left w:val="single" w:sz="4" w:space="0" w:color="D8DEE9"/>
+          <w:bottom w:val="single" w:sz="4" w:space="0" w:color="D8DEE9"/>
+          <w:right w:val="single" w:sz="4" w:space="0" w:color="D8DEE9"/>
+          <w:insideH w:val="single" w:sz="4" w:space="0" w:color="D8DEE9"/>
+          <w:insideV w:val="single" w:sz="4" w:space="0" w:color="D8DEE9"/>
+        </w:tblBorders>
+      </w:tblPr>
+      <w:tblGrid>
+        <w:gridCol w:w="2880"/>
+        <w:gridCol w:w="2880"/>
+        <w:gridCol w:w="2880"/>
+      </w:tblGrid>
+      <w:tr>
+        <w:tc>
+          <w:tcPr>
+            <w:tcW w:type="dxa" w:w="2880"/>
+            <w:shd w:val="clear" w:color="auto" w:fill="EAF2FB"/>
+          </w:tcPr>
+          <w:p>
+            <w:r>
+              <w:rPr>
+                <w:b/>
+              </w:rPr>
+            </w:r>
+            <w:r>
+              <w:rPr>
+                <w:b/>
+              </w:rPr>
+              <w:t>Endpoint</w:t>
+            </w:r>
+          </w:p>
+        </w:tc>
+        <w:tc>
+          <w:tcPr>
+            <w:tcW w:type="dxa" w:w="2880"/>
+            <w:shd w:val="clear" w:color="auto" w:fill="EAF2FB"/>
+          </w:tcPr>
+          <w:p>
+            <w:r>
+              <w:rPr>
+                <w:b/>
+              </w:rPr>
+            </w:r>
+            <w:r>
+              <w:rPr>
+                <w:b/>
+              </w:rPr>
+              <w:t>Query</w:t>
+            </w:r>
+          </w:p>
+        </w:tc>
+        <w:tc>
+          <w:tcPr>
+            <w:tcW w:type="dxa" w:w="2880"/>
+            <w:shd w:val="clear" w:color="auto" w:fill="EAF2FB"/>
+          </w:tcPr>
+          <w:p>
+            <w:r>
+              <w:rPr>
+                <w:b/>
+              </w:rPr>
+            </w:r>
+            <w:r>
+              <w:rPr>
+                <w:b/>
+              </w:rPr>
+              <w:t>Tick</w:t>
+            </w:r>
+          </w:p>
+        </w:tc>
+      </w:tr>
+      <w:tr>
+        <w:tc>
+          <w:tcPr>
+            <w:tcW w:type="dxa" w:w="2880"/>
+          </w:tcPr>
+          <w:p>
+            <w:r/>
+            <w:r>
+              <w:rPr>
+                <w:rFonts w:ascii="Consolas" w:hAnsi="Consolas"/>
+                <w:color w:val="334455"/>
+                <w:sz w:val="19"/>
+              </w:rPr>
+              <w:t>/stream/quotes</w:t>
+            </w:r>
+          </w:p>
+        </w:tc>
+        <w:tc>
+          <w:tcPr>
+            <w:tcW w:type="dxa" w:w="2880"/>
+          </w:tcPr>
+          <w:p>
+            <w:r/>
+            <w:r>
+              <w:rPr>
+                <w:rFonts w:ascii="Consolas" w:hAnsi="Consolas"/>
+                <w:color w:val="334455"/>
+                <w:sz w:val="19"/>
+              </w:rPr>
+              <w:t>symbols=SPY,QQQ</w:t>
+            </w:r>
+          </w:p>
+        </w:tc>
+        <w:tc>
+          <w:tcPr>
+            <w:tcW w:type="dxa" w:w="2880"/>
+          </w:tcPr>
+          <w:p>
+            <w:r/>
+            <w:r>
+              <w:rPr>
+                <w:rFonts w:ascii="Consolas" w:hAnsi="Consolas"/>
+                <w:color w:val="334455"/>
+                <w:sz w:val="19"/>
+              </w:rPr>
+              <w:t>{symbol, last, net_change, bid, ask, bid_size, ask_size, last_size, total_volume}</w:t>
+            </w:r>
+          </w:p>
+        </w:tc>
+      </w:tr>
+      <w:tr>
+        <w:tc>
+          <w:tcPr>
+            <w:tcW w:type="dxa" w:w="2880"/>
+            <w:shd w:val="clear" w:color="auto" w:fill="F4F6FA"/>
+          </w:tcPr>
+          <w:p>
+            <w:r/>
+            <w:r>
+              <w:rPr>
+                <w:rFonts w:ascii="Consolas" w:hAnsi="Consolas"/>
+                <w:color w:val="334455"/>
+                <w:sz w:val="19"/>
+              </w:rPr>
+              <w:t>/stream/options</w:t>
+            </w:r>
+          </w:p>
+        </w:tc>
+        <w:tc>
+          <w:tcPr>
+            <w:tcW w:type="dxa" w:w="2880"/>
+            <w:shd w:val="clear" w:color="auto" w:fill="F4F6FA"/>
+          </w:tcPr>
+          <w:p>
+            <w:r/>
+            <w:r>
+              <w:rPr>
+                <w:rFonts w:ascii="Consolas" w:hAnsi="Consolas"/>
+                <w:color w:val="334455"/>
+                <w:sz w:val="19"/>
+              </w:rPr>
+              <w:t>symbols=&lt;contract symbol&gt;,…</w:t>
+            </w:r>
+          </w:p>
+        </w:tc>
+        <w:tc>
+          <w:tcPr>
+            <w:tcW w:type="dxa" w:w="2880"/>
+            <w:shd w:val="clear" w:color="auto" w:fill="F4F6FA"/>
+          </w:tcPr>
+          <w:p>
+            <w:r/>
+            <w:r>
+              <w:rPr>
+                <w:rFonts w:ascii="Consolas" w:hAnsi="Consolas"/>
+                <w:color w:val="334455"/>
+                <w:sz w:val="19"/>
+              </w:rPr>
+              <w:t>{symbol, last, last_size, bid, ask, total_volume}</w:t>
+            </w:r>
+          </w:p>
+        </w:tc>
+      </w:tr>
+    </w:tbl>
+    <w:p/>
+    <w:p>
+      <w:pPr>
+        <w:pStyle w:val="ListBullet"/>
+      </w:pPr>
+      <w:r>
+        <w:t xml:space="preserve">Every value is a float or </w:t>
+      </w:r>
+      <w:r>
+        <w:rPr>
+          <w:rFonts w:ascii="Consolas" w:hAnsi="Consolas"/>
+          <w:color w:val="334455"/>
+          <w:sz w:val="19"/>
+        </w:rPr>
+        <w:t>null</w:t>
+      </w:r>
+      <w:r>
+        <w:t xml:space="preserve">. </w:t>
+      </w:r>
+      <w:r>
+        <w:rPr>
+          <w:b/>
+        </w:rPr>
+        <w:t>A tick after the first carries only the fields</w:t>
+        <w:br/>
+        <w:t xml:space="preserve">  that changed</w:t>
+      </w:r>
+      <w:r>
+        <w:t>, so a consumer must merge ticks per symbol.</w:t>
+      </w:r>
+    </w:p>
+    <w:p>
+      <w:pPr>
+        <w:pStyle w:val="ListBullet"/>
+      </w:pPr>
+      <w:r>
+        <w:t>A contract symbol is Schwab's 21-character form and is case- and space-sensitive:</w:t>
+        <w:br/>
+        <w:t xml:space="preserve">  </w:t>
+      </w:r>
+      <w:r>
+        <w:rPr>
+          <w:rFonts w:ascii="Consolas" w:hAnsi="Consolas"/>
+          <w:color w:val="334455"/>
+          <w:sz w:val="19"/>
+        </w:rPr>
+        <w:t>SPY   261009C00770000</w:t>
+      </w:r>
+      <w:r>
+        <w:t>. A symbol Schwab does not know is accepted without an</w:t>
+        <w:br/>
+        <w:t xml:space="preserve">  error and never carries a real quote, so a typo looks subscribed.</w:t>
+      </w:r>
+    </w:p>
+    <w:p>
+      <w:pPr>
+        <w:pStyle w:val="ListBullet"/>
+      </w:pPr>
+      <w:r>
+        <w:rPr>
+          <w:rFonts w:ascii="Consolas" w:hAnsi="Consolas"/>
+          <w:color w:val="334455"/>
+          <w:sz w:val="19"/>
+        </w:rPr>
+        <w:t>total_volume</w:t>
+      </w:r>
+      <w:r>
+        <w:t xml:space="preserve"> is the day's cumulative volume. Level one merges rapid trades, so</w:t>
+        <w:br/>
+        <w:t xml:space="preserve">  </w:t>
+      </w:r>
+      <w:r>
+        <w:rPr>
+          <w:rFonts w:ascii="Consolas" w:hAnsi="Consolas"/>
+          <w:color w:val="334455"/>
+          <w:sz w:val="19"/>
+        </w:rPr>
+        <w:t>last_size</w:t>
+      </w:r>
+      <w:r>
+        <w:t xml:space="preserve"> is one trade of several; the </w:t>
+      </w:r>
+      <w:r>
+        <w:rPr>
+          <w:b/>
+        </w:rPr>
+        <w:t>change</w:t>
+      </w:r>
+      <w:r>
+        <w:t xml:space="preserve"> in </w:t>
+      </w:r>
+      <w:r>
+        <w:rPr>
+          <w:rFonts w:ascii="Consolas" w:hAnsi="Consolas"/>
+          <w:color w:val="334455"/>
+          <w:sz w:val="19"/>
+        </w:rPr>
+        <w:t>total_volume</w:t>
+      </w:r>
+      <w:r>
+        <w:t xml:space="preserve"> is the only</w:t>
+        <w:br/>
+        <w:t xml:space="preserve">  complete size.</w:t>
+      </w:r>
+    </w:p>
+    <w:p>
+      <w:pPr>
+        <w:pStyle w:val="ListBullet"/>
+      </w:pPr>
+      <w:r>
+        <w:t>The whole set travels in the query string. Keep it to a few hundred contracts</w:t>
+        <w:br/>
+        <w:t xml:space="preserve">  (</w:t>
+      </w:r>
+      <w:r>
+        <w:rPr>
+          <w:rFonts w:ascii="Consolas" w:hAnsi="Consolas"/>
+          <w:color w:val="334455"/>
+          <w:sz w:val="19"/>
+        </w:rPr>
+        <w:t>options_svc</w:t>
+      </w:r>
+      <w:r>
+        <w:t xml:space="preserve"> never sends more than 500), and remember Schwab's own limit of 3,000</w:t>
+        <w:br/>
+        <w:t xml:space="preserve">  streamed option symbols, shared with paper-trade tracking.</w:t>
+      </w:r>
+    </w:p>
+    <w:p>
+      <w:pPr>
+        <w:pStyle w:val="ListBullet"/>
+      </w:pPr>
+      <w:r>
+        <w:t>A flow subscription can never drop a leg the paper-trade tracker is following.</w:t>
+      </w:r>
+    </w:p>
+    <w:p>
+      <w:r>
+        <w:rPr/>
+        <w:t xml:space="preserve">Consumers today: </w:t>
+      </w:r>
+      <w:r>
+        <w:rPr>
+          <w:rFonts w:ascii="Consolas" w:hAnsi="Consolas"/>
+          <w:color w:val="334455"/>
+          <w:sz w:val="19"/>
+        </w:rPr>
+        <w:t>portfolio_svc</w:t>
+      </w:r>
+      <w:r>
+        <w:rPr/>
+        <w:t xml:space="preserve"> and </w:t>
+      </w:r>
+      <w:r>
+        <w:rPr>
+          <w:rFonts w:ascii="Consolas" w:hAnsi="Consolas"/>
+          <w:color w:val="334455"/>
+          <w:sz w:val="19"/>
+        </w:rPr>
+        <w:t>sentiment_svc</w:t>
+      </w:r>
+      <w:r>
+        <w:rPr/>
+        <w:t xml:space="preserve"> (</w:t>
+      </w:r>
+      <w:r>
+        <w:rPr>
+          <w:rFonts w:ascii="Consolas" w:hAnsi="Consolas"/>
+          <w:color w:val="334455"/>
+          <w:sz w:val="19"/>
+        </w:rPr>
+        <w:t>/stream/quotes</w:t>
+      </w:r>
+      <w:r>
+        <w:rPr/>
+        <w:t>),</w:t>
+        <w:br/>
+      </w:r>
+      <w:r>
+        <w:rPr>
+          <w:rFonts w:ascii="Consolas" w:hAnsi="Consolas"/>
+          <w:color w:val="334455"/>
+          <w:sz w:val="19"/>
+        </w:rPr>
+        <w:t>sentiment_svc</w:t>
+      </w:r>
+      <w:r>
+        <w:rPr/>
+        <w:t xml:space="preserve"> and </w:t>
+      </w:r>
+      <w:r>
+        <w:rPr>
+          <w:rFonts w:ascii="Consolas" w:hAnsi="Consolas"/>
+          <w:color w:val="334455"/>
+          <w:sz w:val="19"/>
+        </w:rPr>
+        <w:t>options_svc/flow_stream.py</w:t>
+      </w:r>
+      <w:r>
+        <w:rPr/>
+        <w:t xml:space="preserve"> (</w:t>
+      </w:r>
+      <w:r>
+        <w:rPr>
+          <w:rFonts w:ascii="Consolas" w:hAnsi="Consolas"/>
+          <w:color w:val="334455"/>
+          <w:sz w:val="19"/>
+        </w:rPr>
+        <w:t>/stream/options</w:t>
+      </w:r>
+      <w:r>
+        <w:rPr/>
+        <w:t>).</w:t>
+        <w:br/>
+      </w:r>
+      <w:r>
+        <w:rPr>
+          <w:rFonts w:ascii="Consolas" w:hAnsi="Consolas"/>
+          <w:color w:val="334455"/>
+          <w:sz w:val="19"/>
+        </w:rPr>
+        <w:t>services/_sse.py</w:t>
+      </w:r>
+      <w:r>
+        <w:rPr/>
+        <w:t xml:space="preserve"> has the line parser and the reconnect backoff.</w:t>
+      </w:r>
+    </w:p>
+    <w:p>
       <w:r>
         <w:br/>
       </w:r>
@@ -21037,6 +21542,28 @@
           <w:color w:val="223344"/>
           <w:sz w:val="18"/>
         </w:rPr>
+        <w:t>cache:options:flow_sides       events:options:flow_sides    (bought/sold estimate per contract alert, today)</w:t>
+      </w:r>
+      <w:r>
+        <w:br/>
+      </w:r>
+      <w:r>
+        <w:rPr>
+          <w:rFonts w:ascii="Consolas" w:hAnsi="Consolas"/>
+          <w:color w:val="223344"/>
+          <w:sz w:val="18"/>
+        </w:rPr>
+        <w:t>cache:options:flow_followup    events:options:flow_followup (previous session's flagged contracts + next-day open interest)</w:t>
+      </w:r>
+      <w:r>
+        <w:br/>
+      </w:r>
+      <w:r>
+        <w:rPr>
+          <w:rFonts w:ascii="Consolas" w:hAnsi="Consolas"/>
+          <w:color w:val="223344"/>
+          <w:sz w:val="18"/>
+        </w:rPr>
         <w:t>cache:options:hiro             events:options:hiro          (HIRO-model hedging flow, per-symbol summary; no reader yet)</w:t>
       </w:r>
       <w:r>
@@ -21894,7 +22421,482 @@
       </w:r>
       <w:r>
         <w:rPr/>
-        <w:t>) while the model is unvalidated.</w:t>
+        <w:t xml:space="preserve">) while the model is unvalidated. A </w:t>
+      </w:r>
+      <w:r>
+        <w:rPr>
+          <w:rFonts w:ascii="Consolas" w:hAnsi="Consolas"/>
+          <w:color w:val="334455"/>
+          <w:sz w:val="19"/>
+        </w:rPr>
+        <w:t>uoa</w:t>
+      </w:r>
+      <w:r>
+        <w:rPr/>
+        <w:t xml:space="preserve"> or </w:t>
+      </w:r>
+      <w:r>
+        <w:rPr>
+          <w:rFonts w:ascii="Consolas" w:hAnsi="Consolas"/>
+          <w:color w:val="334455"/>
+          <w:sz w:val="19"/>
+        </w:rPr>
+        <w:t>big_delta</w:t>
+      </w:r>
+      <w:r>
+        <w:rPr/>
+        <w:t xml:space="preserve"> alert also carries</w:t>
+        <w:br/>
+      </w:r>
+      <w:r>
+        <w:rPr>
+          <w:rFonts w:ascii="Consolas" w:hAnsi="Consolas"/>
+          <w:color w:val="334455"/>
+          <w:sz w:val="19"/>
+        </w:rPr>
+        <w:t>osi</w:t>
+      </w:r>
+      <w:r>
+        <w:rPr/>
+        <w:t>, the contract's own Schwab symbol (</w:t>
+      </w:r>
+      <w:r>
+        <w:rPr>
+          <w:rFonts w:ascii="Consolas" w:hAnsi="Consolas"/>
+          <w:color w:val="334455"/>
+          <w:sz w:val="19"/>
+        </w:rPr>
+        <w:t>null</w:t>
+      </w:r>
+      <w:r>
+        <w:rPr/>
+        <w:t xml:space="preserve"> when the chain row had none).</w:t>
+      </w:r>
+    </w:p>
+    <w:p>
+      <w:r>
+        <w:rPr>
+          <w:rFonts w:ascii="Consolas" w:hAnsi="Consolas"/>
+          <w:color w:val="334455"/>
+          <w:sz w:val="19"/>
+        </w:rPr>
+        <w:t>cache:options:flow_sides</w:t>
+      </w:r>
+      <w:r>
+        <w:rPr/>
+        <w:t xml:space="preserve"> is </w:t>
+      </w:r>
+      <w:r>
+        <w:rPr>
+          <w:rFonts w:ascii="Consolas" w:hAnsi="Consolas"/>
+          <w:color w:val="334455"/>
+          <w:sz w:val="19"/>
+        </w:rPr>
+        <w:t>{date, public, contracts: {&lt;alert id&gt;: {poll,</w:t>
+        <w:br/>
+        <w:t>stream, volume}}}</w:t>
+      </w:r>
+      <w:r>
+        <w:rPr/>
+        <w:t xml:space="preserve">. </w:t>
+      </w:r>
+      <w:r>
+        <w:rPr>
+          <w:rFonts w:ascii="Consolas" w:hAnsi="Consolas"/>
+          <w:color w:val="334455"/>
+          <w:sz w:val="19"/>
+        </w:rPr>
+        <w:t>poll</w:t>
+      </w:r>
+      <w:r>
+        <w:rPr/>
+        <w:t xml:space="preserve"> and </w:t>
+      </w:r>
+      <w:r>
+        <w:rPr>
+          <w:rFonts w:ascii="Consolas" w:hAnsi="Consolas"/>
+          <w:color w:val="334455"/>
+          <w:sz w:val="19"/>
+        </w:rPr>
+        <w:t>stream</w:t>
+      </w:r>
+      <w:r>
+        <w:rPr/>
+        <w:t xml:space="preserve"> are each </w:t>
+      </w:r>
+      <w:r>
+        <w:rPr>
+          <w:rFonts w:ascii="Consolas" w:hAnsi="Consolas"/>
+          <w:color w:val="334455"/>
+          <w:sz w:val="19"/>
+        </w:rPr>
+        <w:t>{bought, sold, unlabelled}</w:t>
+      </w:r>
+      <w:r>
+        <w:rPr/>
+        <w:t xml:space="preserve"> in</w:t>
+        <w:br/>
+        <w:t xml:space="preserve">contracts; </w:t>
+      </w:r>
+      <w:r>
+        <w:rPr>
+          <w:rFonts w:ascii="Consolas" w:hAnsi="Consolas"/>
+          <w:color w:val="334455"/>
+          <w:sz w:val="19"/>
+        </w:rPr>
+        <w:t>stream</w:t>
+      </w:r>
+      <w:r>
+        <w:rPr/>
+        <w:t xml:space="preserve"> is </w:t>
+      </w:r>
+      <w:r>
+        <w:rPr>
+          <w:rFonts w:ascii="Consolas" w:hAnsi="Consolas"/>
+          <w:color w:val="334455"/>
+          <w:sz w:val="19"/>
+        </w:rPr>
+        <w:t>null</w:t>
+      </w:r>
+      <w:r>
+        <w:rPr/>
+        <w:t xml:space="preserve"> until the contract has been streamed; </w:t>
+      </w:r>
+      <w:r>
+        <w:rPr>
+          <w:rFonts w:ascii="Consolas" w:hAnsi="Consolas"/>
+          <w:color w:val="334455"/>
+          <w:sz w:val="19"/>
+        </w:rPr>
+        <w:t>volume</w:t>
+      </w:r>
+      <w:r>
+        <w:rPr/>
+        <w:t xml:space="preserve"> is the</w:t>
+        <w:br/>
+        <w:t xml:space="preserve">contract's volume for the day and equals the sum of </w:t>
+      </w:r>
+      <w:r>
+        <w:rPr>
+          <w:rFonts w:ascii="Consolas" w:hAnsi="Consolas"/>
+          <w:color w:val="334455"/>
+          <w:sz w:val="19"/>
+        </w:rPr>
+        <w:t>poll</w:t>
+      </w:r>
+      <w:r>
+        <w:rPr/>
+        <w:t xml:space="preserve">. It is an </w:t>
+      </w:r>
+      <w:r>
+        <w:rPr>
+          <w:b/>
+        </w:rPr>
+        <w:t>estimate</w:t>
+      </w:r>
+      <w:r>
+        <w:rPr/>
+        <w:br/>
+        <w:t xml:space="preserve">(see the Technical Reference, </w:t>
+      </w:r>
+      <w:r>
+        <w:rPr>
+          <w:i/>
+        </w:rPr>
+        <w:t>Bought / sold estimate on flow alerts</w:t>
+      </w:r>
+      <w:r>
+        <w:rPr/>
+        <w:t>). Three rules</w:t>
+        <w:br/>
+        <w:t>for a reader:</w:t>
+      </w:r>
+    </w:p>
+    <w:p>
+      <w:pPr>
+        <w:pStyle w:val="ListBullet"/>
+      </w:pPr>
+      <w:r>
+        <w:t xml:space="preserve">Join it to </w:t>
+      </w:r>
+      <w:r>
+        <w:rPr>
+          <w:rFonts w:ascii="Consolas" w:hAnsi="Consolas"/>
+          <w:color w:val="334455"/>
+          <w:sz w:val="19"/>
+        </w:rPr>
+        <w:t>flow_alerts</w:t>
+      </w:r>
+      <w:r>
+        <w:t xml:space="preserve"> by alert id </w:t>
+      </w:r>
+      <w:r>
+        <w:rPr>
+          <w:b/>
+        </w:rPr>
+        <w:t xml:space="preserve">and check that </w:t>
+      </w:r>
+      <w:r>
+        <w:rPr>
+          <w:rFonts w:ascii="Consolas" w:hAnsi="Consolas"/>
+          <w:color w:val="334455"/>
+          <w:sz w:val="19"/>
+        </w:rPr>
+        <w:t>date</w:t>
+      </w:r>
+      <w:r>
+        <w:rPr>
+          <w:b/>
+        </w:rPr>
+        <w:t xml:space="preserve"> matches</w:t>
+      </w:r>
+      <w:r>
+        <w:t>: it is</w:t>
+        <w:br/>
+        <w:t xml:space="preserve">  published only once a contract is flagged, so a quiet morning still holds</w:t>
+        <w:br/>
+        <w:t xml:space="preserve">  yesterday's.</w:t>
+      </w:r>
+    </w:p>
+    <w:p>
+      <w:pPr>
+        <w:pStyle w:val="ListBullet"/>
+      </w:pPr>
+      <w:r>
+        <w:t xml:space="preserve">It is written with </w:t>
+      </w:r>
+      <w:r>
+        <w:rPr>
+          <w:rFonts w:ascii="Consolas" w:hAnsi="Consolas"/>
+          <w:color w:val="334455"/>
+          <w:sz w:val="19"/>
+        </w:rPr>
+        <w:t>skip_unchanged</w:t>
+      </w:r>
+      <w:r>
+        <w:t xml:space="preserve"> and carries no timestamp of its own.</w:t>
+      </w:r>
+    </w:p>
+    <w:p>
+      <w:pPr>
+        <w:pStyle w:val="ListBullet"/>
+      </w:pPr>
+      <w:r>
+        <w:t xml:space="preserve">On the public origin show it only when </w:t>
+      </w:r>
+      <w:r>
+        <w:rPr>
+          <w:rFonts w:ascii="Consolas" w:hAnsi="Consolas"/>
+          <w:color w:val="334455"/>
+          <w:sz w:val="19"/>
+        </w:rPr>
+        <w:t>public</w:t>
+      </w:r>
+      <w:r>
+        <w:t xml:space="preserve"> is exactly </w:t>
+      </w:r>
+      <w:r>
+        <w:rPr>
+          <w:rFonts w:ascii="Consolas" w:hAnsi="Consolas"/>
+          <w:color w:val="334455"/>
+          <w:sz w:val="19"/>
+        </w:rPr>
+        <w:t>true</w:t>
+      </w:r>
+      <w:r>
+        <w:t>. Go through</w:t>
+        <w:br/>
+        <w:t xml:space="preserve">  </w:t>
+      </w:r>
+      <w:r>
+        <w:rPr>
+          <w:rFonts w:ascii="Consolas" w:hAnsi="Consolas"/>
+          <w:color w:val="334455"/>
+          <w:sz w:val="19"/>
+        </w:rPr>
+        <w:t>webgui/pages/options/flow.sides_view_shown</w:t>
+      </w:r>
+      <w:r>
+        <w:t>; a missing flag is closed.</w:t>
+      </w:r>
+    </w:p>
+    <w:p>
+      <w:r>
+        <w:rPr>
+          <w:rFonts w:ascii="Consolas" w:hAnsi="Consolas"/>
+          <w:color w:val="334455"/>
+          <w:sz w:val="19"/>
+        </w:rPr>
+        <w:t>cache:options:flow_followup</w:t>
+      </w:r>
+      <w:r>
+        <w:rPr/>
+        <w:t xml:space="preserve"> is </w:t>
+      </w:r>
+      <w:r>
+        <w:rPr>
+          <w:rFonts w:ascii="Consolas" w:hAnsi="Consolas"/>
+          <w:color w:val="334455"/>
+          <w:sz w:val="19"/>
+        </w:rPr>
+        <w:t>{date, public, rows: [...]}</w:t>
+      </w:r>
+      <w:r>
+        <w:rPr/>
+        <w:t xml:space="preserve">, where </w:t>
+      </w:r>
+      <w:r>
+        <w:rPr>
+          <w:rFonts w:ascii="Consolas" w:hAnsi="Consolas"/>
+          <w:color w:val="334455"/>
+          <w:sz w:val="19"/>
+        </w:rPr>
+        <w:t>date</w:t>
+      </w:r>
+      <w:r>
+        <w:rPr/>
+        <w:t xml:space="preserve"> is</w:t>
+        <w:br/>
+        <w:t xml:space="preserve">the </w:t>
+      </w:r>
+      <w:r>
+        <w:rPr>
+          <w:b/>
+        </w:rPr>
+        <w:t>previous</w:t>
+      </w:r>
+      <w:r>
+        <w:rPr/>
+        <w:t xml:space="preserve"> session and each row is a </w:t>
+      </w:r>
+      <w:r>
+        <w:rPr>
+          <w:rFonts w:ascii="Consolas" w:hAnsi="Consolas"/>
+          <w:color w:val="334455"/>
+          <w:sz w:val="19"/>
+        </w:rPr>
+        <w:t>flow_contract_days</w:t>
+      </w:r>
+      <w:r>
+        <w:rPr/>
+        <w:t xml:space="preserve"> row: </w:t>
+      </w:r>
+      <w:r>
+        <w:rPr>
+          <w:rFonts w:ascii="Consolas" w:hAnsi="Consolas"/>
+          <w:color w:val="334455"/>
+          <w:sz w:val="19"/>
+        </w:rPr>
+        <w:t>session_date,</w:t>
+        <w:br/>
+        <w:t>alert_id, symbol, osi, side, strike, expiry, alert_type, fired_ts, oi_prev, volume,</w:t>
+        <w:br/>
+        <w:t>poll_bought, poll_sold, poll_unlabelled, stream_bought, stream_sold,</w:t>
+        <w:br/>
+        <w:t>stream_unlabelled, oi_next, oi_next_date, verdict, oi_ratio</w:t>
+      </w:r>
+      <w:r>
+        <w:rPr/>
+        <w:t xml:space="preserve">. </w:t>
+      </w:r>
+      <w:r>
+        <w:rPr>
+          <w:rFonts w:ascii="Consolas" w:hAnsi="Consolas"/>
+          <w:color w:val="334455"/>
+          <w:sz w:val="19"/>
+        </w:rPr>
+        <w:t>verdict</w:t>
+      </w:r>
+      <w:r>
+        <w:rPr/>
+        <w:t xml:space="preserve"> is </w:t>
+      </w:r>
+      <w:r>
+        <w:rPr>
+          <w:rFonts w:ascii="Consolas" w:hAnsi="Consolas"/>
+          <w:color w:val="334455"/>
+          <w:sz w:val="19"/>
+        </w:rPr>
+        <w:t>opened</w:t>
+      </w:r>
+      <w:r>
+        <w:rPr/>
+        <w:t>,</w:t>
+        <w:br/>
+      </w:r>
+      <w:r>
+        <w:rPr>
+          <w:rFonts w:ascii="Consolas" w:hAnsi="Consolas"/>
+          <w:color w:val="334455"/>
+          <w:sz w:val="19"/>
+        </w:rPr>
+        <w:t>closed</w:t>
+      </w:r>
+      <w:r>
+        <w:rPr/>
+        <w:t xml:space="preserve">, </w:t>
+      </w:r>
+      <w:r>
+        <w:rPr>
+          <w:rFonts w:ascii="Consolas" w:hAnsi="Consolas"/>
+          <w:color w:val="334455"/>
+          <w:sz w:val="19"/>
+        </w:rPr>
+        <w:t>mixed</w:t>
+      </w:r>
+      <w:r>
+        <w:rPr/>
+        <w:t xml:space="preserve">, </w:t>
+      </w:r>
+      <w:r>
+        <w:rPr>
+          <w:rFonts w:ascii="Consolas" w:hAnsi="Consolas"/>
+          <w:color w:val="334455"/>
+          <w:sz w:val="19"/>
+        </w:rPr>
+        <w:t>expired</w:t>
+      </w:r>
+      <w:r>
+        <w:rPr/>
+        <w:t xml:space="preserve">, </w:t>
+      </w:r>
+      <w:r>
+        <w:rPr>
+          <w:rFonts w:ascii="Consolas" w:hAnsi="Consolas"/>
+          <w:color w:val="334455"/>
+          <w:sz w:val="19"/>
+        </w:rPr>
+        <w:t>none</w:t>
+      </w:r>
+      <w:r>
+        <w:rPr/>
+        <w:t xml:space="preserve">, or </w:t>
+      </w:r>
+      <w:r>
+        <w:rPr>
+          <w:rFonts w:ascii="Consolas" w:hAnsi="Consolas"/>
+          <w:color w:val="334455"/>
+          <w:sz w:val="19"/>
+        </w:rPr>
+        <w:t>null</w:t>
+      </w:r>
+      <w:r>
+        <w:rPr/>
+        <w:t xml:space="preserve"> while the next open interest has not</w:t>
+        <w:br/>
+        <w:t xml:space="preserve">been read. The same </w:t>
+      </w:r>
+      <w:r>
+        <w:rPr>
+          <w:rFonts w:ascii="Consolas" w:hAnsi="Consolas"/>
+          <w:color w:val="334455"/>
+          <w:sz w:val="19"/>
+        </w:rPr>
+        <w:t>public</w:t>
+      </w:r>
+      <w:r>
+        <w:rPr/>
+        <w:t xml:space="preserve"> rule applies.</w:t>
       </w:r>
     </w:p>
     <w:p>

</xml_diff>

<commit_message>
feat(options): keep the poll's tally at the moment of a flow alert
The first live session could not compare the two bought/sold sources
fairly: the poll covered a contract's whole day, the stream only what
followed the alert, and at the median half the volume predated the alert.

- flow_contract_days gains at_bought / at_sold / at_unlabelled: the poll's
  tally when the alert was registered. Written once, never updated, NULL
  when unknown. An existing table is migrated by ALTER TABLE.
- flow_sides_tick snapshots it at registration, restores it after a
  restart, and publishes it in cache:options:flow_sides as at_alert. No
  screen changes.
- tools/flow_sides_report.py (read-only, run by hand) compares
  poll-since-the-alert with stream-since-the-alert over the same window.

The changelog also records the first live session's measurements.

Co-Authored-By: Claude Opus 5.5 <noreply@anthropic.com>
</commit_message>
<xml_diff>
--- a/docs/manuals/api-reference/api-reference.docx
+++ b/docs/manuals/api-reference/api-reference.docx
@@ -22664,7 +22664,7 @@
         </w:rPr>
         <w:t>{date, public, contracts: {&lt;alert id&gt;: {poll,</w:t>
         <w:br/>
-        <w:t>stream, volume}}}</w:t>
+        <w:t>stream, volume, at_alert}}}</w:t>
       </w:r>
       <w:r>
         <w:rPr/>
@@ -22680,6 +22680,18 @@
       </w:r>
       <w:r>
         <w:rPr/>
+        <w:t xml:space="preserve">, </w:t>
+      </w:r>
+      <w:r>
+        <w:rPr>
+          <w:rFonts w:ascii="Consolas" w:hAnsi="Consolas"/>
+          <w:color w:val="334455"/>
+          <w:sz w:val="19"/>
+        </w:rPr>
+        <w:t>stream</w:t>
+      </w:r>
+      <w:r>
+        <w:rPr/>
         <w:t xml:space="preserve"> and </w:t>
       </w:r>
       <w:r>
@@ -22688,25 +22700,140 @@
           <w:color w:val="334455"/>
           <w:sz w:val="19"/>
         </w:rPr>
+        <w:t>at_alert</w:t>
+      </w:r>
+      <w:r>
+        <w:rPr/>
+        <w:t xml:space="preserve"> are each </w:t>
+      </w:r>
+      <w:r>
+        <w:rPr>
+          <w:rFonts w:ascii="Consolas" w:hAnsi="Consolas"/>
+          <w:color w:val="334455"/>
+          <w:sz w:val="19"/>
+        </w:rPr>
+        <w:t>{bought,</w:t>
+        <w:br/>
+        <w:t>sold, unlabelled}</w:t>
+      </w:r>
+      <w:r>
+        <w:rPr/>
+        <w:t xml:space="preserve"> in contracts; </w:t>
+      </w:r>
+      <w:r>
+        <w:rPr>
+          <w:rFonts w:ascii="Consolas" w:hAnsi="Consolas"/>
+          <w:color w:val="334455"/>
+          <w:sz w:val="19"/>
+        </w:rPr>
         <w:t>stream</w:t>
       </w:r>
       <w:r>
         <w:rPr/>
-        <w:t xml:space="preserve"> are each </w:t>
-      </w:r>
-      <w:r>
-        <w:rPr>
-          <w:rFonts w:ascii="Consolas" w:hAnsi="Consolas"/>
-          <w:color w:val="334455"/>
-          <w:sz w:val="19"/>
-        </w:rPr>
-        <w:t>{bought, sold, unlabelled}</w:t>
-      </w:r>
-      <w:r>
-        <w:rPr/>
-        <w:t xml:space="preserve"> in</w:t>
+        <w:t xml:space="preserve"> is </w:t>
+      </w:r>
+      <w:r>
+        <w:rPr>
+          <w:rFonts w:ascii="Consolas" w:hAnsi="Consolas"/>
+          <w:color w:val="334455"/>
+          <w:sz w:val="19"/>
+        </w:rPr>
+        <w:t>null</w:t>
+      </w:r>
+      <w:r>
+        <w:rPr/>
+        <w:t xml:space="preserve"> until the contract has been</w:t>
         <w:br/>
-        <w:t xml:space="preserve">contracts; </w:t>
+        <w:t xml:space="preserve">streamed; </w:t>
+      </w:r>
+      <w:r>
+        <w:rPr>
+          <w:rFonts w:ascii="Consolas" w:hAnsi="Consolas"/>
+          <w:color w:val="334455"/>
+          <w:sz w:val="19"/>
+        </w:rPr>
+        <w:t>volume</w:t>
+      </w:r>
+      <w:r>
+        <w:rPr/>
+        <w:t xml:space="preserve"> is the contract's volume for the day and equals the sum of</w:t>
+        <w:br/>
+      </w:r>
+      <w:r>
+        <w:rPr>
+          <w:rFonts w:ascii="Consolas" w:hAnsi="Consolas"/>
+          <w:color w:val="334455"/>
+          <w:sz w:val="19"/>
+        </w:rPr>
+        <w:t>poll</w:t>
+      </w:r>
+      <w:r>
+        <w:rPr/>
+        <w:t xml:space="preserve">. </w:t>
+      </w:r>
+      <w:r>
+        <w:rPr>
+          <w:rFonts w:ascii="Consolas" w:hAnsi="Consolas"/>
+          <w:color w:val="334455"/>
+          <w:sz w:val="19"/>
+        </w:rPr>
+        <w:t>at_alert</w:t>
+      </w:r>
+      <w:r>
+        <w:rPr/>
+        <w:t xml:space="preserve"> is </w:t>
+      </w:r>
+      <w:r>
+        <w:rPr>
+          <w:rFonts w:ascii="Consolas" w:hAnsi="Consolas"/>
+          <w:color w:val="334455"/>
+          <w:sz w:val="19"/>
+        </w:rPr>
+        <w:t>poll</w:t>
+      </w:r>
+      <w:r>
+        <w:rPr/>
+        <w:t xml:space="preserve"> as it stood the minute the alert fired and never</w:t>
+        <w:br/>
+        <w:t xml:space="preserve">changes; it is </w:t>
+      </w:r>
+      <w:r>
+        <w:rPr>
+          <w:rFonts w:ascii="Consolas" w:hAnsi="Consolas"/>
+          <w:color w:val="334455"/>
+          <w:sz w:val="19"/>
+        </w:rPr>
+        <w:t>null</w:t>
+      </w:r>
+      <w:r>
+        <w:rPr/>
+        <w:t xml:space="preserve"> when that is not known. </w:t>
+      </w:r>
+      <w:r>
+        <w:rPr>
+          <w:rFonts w:ascii="Consolas" w:hAnsi="Consolas"/>
+          <w:color w:val="334455"/>
+          <w:sz w:val="19"/>
+        </w:rPr>
+        <w:t>poll</w:t>
+      </w:r>
+      <w:r>
+        <w:rPr/>
+        <w:t xml:space="preserve"> minus </w:t>
+      </w:r>
+      <w:r>
+        <w:rPr>
+          <w:rFonts w:ascii="Consolas" w:hAnsi="Consolas"/>
+          <w:color w:val="334455"/>
+          <w:sz w:val="19"/>
+        </w:rPr>
+        <w:t>at_alert</w:t>
+      </w:r>
+      <w:r>
+        <w:rPr/>
+        <w:t xml:space="preserve"> is the poll's</w:t>
+        <w:br/>
+        <w:t xml:space="preserve">reading over the window </w:t>
       </w:r>
       <w:r>
         <w:rPr>
@@ -22718,45 +22845,7 @@
       </w:r>
       <w:r>
         <w:rPr/>
-        <w:t xml:space="preserve"> is </w:t>
-      </w:r>
-      <w:r>
-        <w:rPr>
-          <w:rFonts w:ascii="Consolas" w:hAnsi="Consolas"/>
-          <w:color w:val="334455"/>
-          <w:sz w:val="19"/>
-        </w:rPr>
-        <w:t>null</w:t>
-      </w:r>
-      <w:r>
-        <w:rPr/>
-        <w:t xml:space="preserve"> until the contract has been streamed; </w:t>
-      </w:r>
-      <w:r>
-        <w:rPr>
-          <w:rFonts w:ascii="Consolas" w:hAnsi="Consolas"/>
-          <w:color w:val="334455"/>
-          <w:sz w:val="19"/>
-        </w:rPr>
-        <w:t>volume</w:t>
-      </w:r>
-      <w:r>
-        <w:rPr/>
-        <w:t xml:space="preserve"> is the</w:t>
-        <w:br/>
-        <w:t xml:space="preserve">contract's volume for the day and equals the sum of </w:t>
-      </w:r>
-      <w:r>
-        <w:rPr>
-          <w:rFonts w:ascii="Consolas" w:hAnsi="Consolas"/>
-          <w:color w:val="334455"/>
-          <w:sz w:val="19"/>
-        </w:rPr>
-        <w:t>poll</w:t>
-      </w:r>
-      <w:r>
-        <w:rPr/>
-        <w:t xml:space="preserve">. It is an </w:t>
+        <w:t xml:space="preserve"> covers. It is an </w:t>
       </w:r>
       <w:r>
         <w:rPr>
@@ -22963,7 +23052,9 @@
         <w:br/>
         <w:t>poll_bought, poll_sold, poll_unlabelled, stream_bought, stream_sold,</w:t>
         <w:br/>
-        <w:t>stream_unlabelled, oi_next, oi_next_date, verdict, oi_ratio</w:t>
+        <w:t>stream_unlabelled, at_bought, at_sold, at_unlabelled, oi_next, oi_next_date,</w:t>
+        <w:br/>
+        <w:t>verdict, oi_ratio</w:t>
       </w:r>
       <w:r>
         <w:rPr/>

</xml_diff>

<commit_message>
docs: the Market read scorecard - help, manuals, routes, changelog
Co-Authored-By: Claude Opus 5.5 <noreply@anthropic.com>
</commit_message>
<xml_diff>
--- a/docs/manuals/api-reference/api-reference.docx
+++ b/docs/manuals/api-reference/api-reference.docx
@@ -903,6 +903,22 @@
                 <w:sz w:val="19"/>
               </w:rPr>
               <w:t>:summary</w:t>
+            </w:r>
+            <w:r>
+              <w:rPr/>
+              <w:t xml:space="preserve">, </w:t>
+            </w:r>
+            <w:r>
+              <w:rPr>
+                <w:rFonts w:ascii="Consolas" w:hAnsi="Consolas"/>
+                <w:color w:val="334455"/>
+                <w:sz w:val="19"/>
+              </w:rPr>
+              <w:t>:read</w:t>
+            </w:r>
+            <w:r>
+              <w:rPr/>
+              <w:t xml:space="preserve"> (the Desk's Market read panel)</w:t>
             </w:r>
           </w:p>
         </w:tc>
@@ -21478,6 +21494,496 @@
     </w:p>
     <w:p>
       <w:pPr>
+        <w:pStyle w:val="Heading2"/>
+      </w:pPr>
+      <w:r>
+        <w:rPr/>
+        <w:t>The Market read view</w:t>
+      </w:r>
+    </w:p>
+    <w:p>
+      <w:r>
+        <w:rPr>
+          <w:rFonts w:ascii="Consolas" w:hAnsi="Consolas"/>
+          <w:color w:val="334455"/>
+          <w:sz w:val="19"/>
+        </w:rPr>
+        <w:t>cache:market:read</w:t>
+      </w:r>
+      <w:r>
+        <w:rPr/>
+        <w:t xml:space="preserve"> is one reading of the Desk's scorecard, replaced on each clock</w:t>
+        <w:br/>
+        <w:t>slot in the regular session:</w:t>
+      </w:r>
+    </w:p>
+    <w:p>
+      <w:pPr>
+        <w:spacing w:before="80" w:after="160"/>
+        <w:ind w:left="216"/>
+        <w:shd w:val="clear" w:color="auto" w:fill="F4F6FA"/>
+      </w:pPr>
+      <w:r>
+        <w:rPr>
+          <w:rFonts w:ascii="Consolas" w:hAnsi="Consolas"/>
+          <w:color w:val="223344"/>
+          <w:sz w:val="18"/>
+        </w:rPr>
+        <w:t>{date, ts, slot, interval_min, next_slot, final, public, tally, rows, history}</w:t>
+      </w:r>
+    </w:p>
+    <w:p>
+      <w:pPr>
+        <w:pStyle w:val="ListBullet"/>
+      </w:pPr>
+      <w:r>
+        <w:rPr>
+          <w:rFonts w:ascii="Consolas" w:hAnsi="Consolas"/>
+          <w:color w:val="334455"/>
+          <w:sz w:val="19"/>
+        </w:rPr>
+        <w:t>slot</w:t>
+      </w:r>
+      <w:r>
+        <w:t xml:space="preserve"> and </w:t>
+      </w:r>
+      <w:r>
+        <w:rPr>
+          <w:rFonts w:ascii="Consolas" w:hAnsi="Consolas"/>
+          <w:color w:val="334455"/>
+          <w:sz w:val="19"/>
+        </w:rPr>
+        <w:t>next_slot</w:t>
+      </w:r>
+      <w:r>
+        <w:t xml:space="preserve"> are </w:t>
+      </w:r>
+      <w:r>
+        <w:rPr>
+          <w:rFonts w:ascii="Consolas" w:hAnsi="Consolas"/>
+          <w:color w:val="334455"/>
+          <w:sz w:val="19"/>
+        </w:rPr>
+        <w:t>"HH:MM"</w:t>
+      </w:r>
+      <w:r>
+        <w:t xml:space="preserve"> Central; </w:t>
+      </w:r>
+      <w:r>
+        <w:rPr>
+          <w:rFonts w:ascii="Consolas" w:hAnsi="Consolas"/>
+          <w:color w:val="334455"/>
+          <w:sz w:val="19"/>
+        </w:rPr>
+        <w:t>next_slot</w:t>
+      </w:r>
+      <w:r>
+        <w:t xml:space="preserve"> is </w:t>
+      </w:r>
+      <w:r>
+        <w:rPr>
+          <w:rFonts w:ascii="Consolas" w:hAnsi="Consolas"/>
+          <w:color w:val="334455"/>
+          <w:sz w:val="19"/>
+        </w:rPr>
+        <w:t>null</w:t>
+      </w:r>
+      <w:r>
+        <w:t xml:space="preserve"> after the close</w:t>
+        <w:br/>
+        <w:t xml:space="preserve">  reading, which has </w:t>
+      </w:r>
+      <w:r>
+        <w:rPr>
+          <w:rFonts w:ascii="Consolas" w:hAnsi="Consolas"/>
+          <w:color w:val="334455"/>
+          <w:sz w:val="19"/>
+        </w:rPr>
+        <w:t>final: true</w:t>
+      </w:r>
+      <w:r>
+        <w:t>.</w:t>
+      </w:r>
+    </w:p>
+    <w:p>
+      <w:pPr>
+        <w:pStyle w:val="ListBullet"/>
+      </w:pPr>
+      <w:r>
+        <w:rPr>
+          <w:rFonts w:ascii="Consolas" w:hAnsi="Consolas"/>
+          <w:color w:val="334455"/>
+          <w:sz w:val="19"/>
+        </w:rPr>
+        <w:t>tally</w:t>
+      </w:r>
+      <w:r>
+        <w:t xml:space="preserve"> is </w:t>
+      </w:r>
+      <w:r>
+        <w:rPr>
+          <w:rFonts w:ascii="Consolas" w:hAnsi="Consolas"/>
+          <w:color w:val="334455"/>
+          <w:sz w:val="19"/>
+        </w:rPr>
+        <w:t>{tailwind, headwind, neutral, none}</w:t>
+      </w:r>
+      <w:r>
+        <w:t xml:space="preserve"> counts.</w:t>
+      </w:r>
+    </w:p>
+    <w:p>
+      <w:pPr>
+        <w:pStyle w:val="ListBullet"/>
+      </w:pPr>
+      <w:r>
+        <w:rPr>
+          <w:rFonts w:ascii="Consolas" w:hAnsi="Consolas"/>
+          <w:color w:val="334455"/>
+          <w:sz w:val="19"/>
+        </w:rPr>
+        <w:t>rows</w:t>
+      </w:r>
+      <w:r>
+        <w:t xml:space="preserve"> is six objects in a fixed order — </w:t>
+      </w:r>
+      <w:r>
+        <w:rPr>
+          <w:rFonts w:ascii="Consolas" w:hAnsi="Consolas"/>
+          <w:color w:val="334455"/>
+          <w:sz w:val="19"/>
+        </w:rPr>
+        <w:t>direction</w:t>
+      </w:r>
+      <w:r>
+        <w:t xml:space="preserve">, </w:t>
+      </w:r>
+      <w:r>
+        <w:rPr>
+          <w:rFonts w:ascii="Consolas" w:hAnsi="Consolas"/>
+          <w:color w:val="334455"/>
+          <w:sz w:val="19"/>
+        </w:rPr>
+        <w:t>breadth</w:t>
+      </w:r>
+      <w:r>
+        <w:t xml:space="preserve">, </w:t>
+      </w:r>
+      <w:r>
+        <w:rPr>
+          <w:rFonts w:ascii="Consolas" w:hAnsi="Consolas"/>
+          <w:color w:val="334455"/>
+          <w:sz w:val="19"/>
+        </w:rPr>
+        <w:t>structure</w:t>
+      </w:r>
+      <w:r>
+        <w:t>,</w:t>
+        <w:br/>
+        <w:t xml:space="preserve">  </w:t>
+      </w:r>
+      <w:r>
+        <w:rPr>
+          <w:rFonts w:ascii="Consolas" w:hAnsi="Consolas"/>
+          <w:color w:val="334455"/>
+          <w:sz w:val="19"/>
+        </w:rPr>
+        <w:t>volatility</w:t>
+      </w:r>
+      <w:r>
+        <w:t xml:space="preserve">, </w:t>
+      </w:r>
+      <w:r>
+        <w:rPr>
+          <w:rFonts w:ascii="Consolas" w:hAnsi="Consolas"/>
+          <w:color w:val="334455"/>
+          <w:sz w:val="19"/>
+        </w:rPr>
+        <w:t>flow</w:t>
+      </w:r>
+      <w:r>
+        <w:t xml:space="preserve">, </w:t>
+      </w:r>
+      <w:r>
+        <w:rPr>
+          <w:rFonts w:ascii="Consolas" w:hAnsi="Consolas"/>
+          <w:color w:val="334455"/>
+          <w:sz w:val="19"/>
+        </w:rPr>
+        <w:t>cross_asset</w:t>
+      </w:r>
+      <w:r>
+        <w:t xml:space="preserve"> — each </w:t>
+      </w:r>
+      <w:r>
+        <w:rPr>
+          <w:rFonts w:ascii="Consolas" w:hAnsi="Consolas"/>
+          <w:color w:val="334455"/>
+          <w:sz w:val="19"/>
+        </w:rPr>
+        <w:t>{key, verdict, facts, prev}</w:t>
+      </w:r>
+      <w:r>
+        <w:t xml:space="preserve">. </w:t>
+      </w:r>
+      <w:r>
+        <w:rPr>
+          <w:rFonts w:ascii="Consolas" w:hAnsi="Consolas"/>
+          <w:color w:val="334455"/>
+          <w:sz w:val="19"/>
+        </w:rPr>
+        <w:t>verdict</w:t>
+      </w:r>
+      <w:r>
+        <w:br/>
+        <w:t xml:space="preserve">  is </w:t>
+      </w:r>
+      <w:r>
+        <w:rPr>
+          <w:rFonts w:ascii="Consolas" w:hAnsi="Consolas"/>
+          <w:color w:val="334455"/>
+          <w:sz w:val="19"/>
+        </w:rPr>
+        <w:t>tailwind</w:t>
+      </w:r>
+      <w:r>
+        <w:t xml:space="preserve">, </w:t>
+      </w:r>
+      <w:r>
+        <w:rPr>
+          <w:rFonts w:ascii="Consolas" w:hAnsi="Consolas"/>
+          <w:color w:val="334455"/>
+          <w:sz w:val="19"/>
+        </w:rPr>
+        <w:t>headwind</w:t>
+      </w:r>
+      <w:r>
+        <w:t xml:space="preserve">, </w:t>
+      </w:r>
+      <w:r>
+        <w:rPr>
+          <w:rFonts w:ascii="Consolas" w:hAnsi="Consolas"/>
+          <w:color w:val="334455"/>
+          <w:sz w:val="19"/>
+        </w:rPr>
+        <w:t>neutral</w:t>
+      </w:r>
+      <w:r>
+        <w:t xml:space="preserve"> or </w:t>
+      </w:r>
+      <w:r>
+        <w:rPr>
+          <w:rFonts w:ascii="Consolas" w:hAnsi="Consolas"/>
+          <w:color w:val="334455"/>
+          <w:sz w:val="19"/>
+        </w:rPr>
+        <w:t>none</w:t>
+      </w:r>
+      <w:r>
+        <w:t xml:space="preserve">. </w:t>
+      </w:r>
+      <w:r>
+        <w:rPr>
+          <w:rFonts w:ascii="Consolas" w:hAnsi="Consolas"/>
+          <w:color w:val="334455"/>
+          <w:sz w:val="19"/>
+        </w:rPr>
+        <w:t>none</w:t>
+      </w:r>
+      <w:r>
+        <w:rPr>
+          <w:b/>
+        </w:rPr>
+        <w:t xml:space="preserve"> means no reading and must</w:t>
+        <w:br/>
+        <w:t xml:space="preserve">  never be shown or counted as </w:t>
+      </w:r>
+      <w:r>
+        <w:rPr>
+          <w:rFonts w:ascii="Consolas" w:hAnsi="Consolas"/>
+          <w:color w:val="334455"/>
+          <w:sz w:val="19"/>
+        </w:rPr>
+        <w:t>neutral</w:t>
+      </w:r>
+      <w:r>
+        <w:rPr>
+          <w:b/>
+        </w:rPr>
+        <w:t>.</w:t>
+      </w:r>
+      <w:r>
+        <w:rPr>
+          <w:rFonts w:ascii="Consolas" w:hAnsi="Consolas"/>
+          <w:color w:val="334455"/>
+          <w:sz w:val="19"/>
+        </w:rPr>
+        <w:t>facts</w:t>
+      </w:r>
+      <w:r>
+        <w:t xml:space="preserve"> are the numbers the verdict was</w:t>
+        <w:br/>
+        <w:t xml:space="preserve">  decided from, and differ per row; </w:t>
+      </w:r>
+      <w:r>
+        <w:rPr>
+          <w:rFonts w:ascii="Consolas" w:hAnsi="Consolas"/>
+          <w:color w:val="334455"/>
+          <w:sz w:val="19"/>
+        </w:rPr>
+        <w:t>prev</w:t>
+      </w:r>
+      <w:r>
+        <w:t xml:space="preserve"> is the same row's </w:t>
+      </w:r>
+      <w:r>
+        <w:rPr>
+          <w:rFonts w:ascii="Consolas" w:hAnsi="Consolas"/>
+          <w:color w:val="334455"/>
+          <w:sz w:val="19"/>
+        </w:rPr>
+        <w:t>{verdict, facts}</w:t>
+      </w:r>
+      <w:r>
+        <w:t xml:space="preserve"> at the</w:t>
+        <w:br/>
+        <w:t xml:space="preserve">  previous slot, or </w:t>
+      </w:r>
+      <w:r>
+        <w:rPr>
+          <w:rFonts w:ascii="Consolas" w:hAnsi="Consolas"/>
+          <w:color w:val="334455"/>
+          <w:sz w:val="19"/>
+        </w:rPr>
+        <w:t>null</w:t>
+      </w:r>
+      <w:r>
+        <w:t xml:space="preserve">. The </w:t>
+      </w:r>
+      <w:r>
+        <w:rPr>
+          <w:rFonts w:ascii="Consolas" w:hAnsi="Consolas"/>
+          <w:color w:val="334455"/>
+          <w:sz w:val="19"/>
+        </w:rPr>
+        <w:t>flow</w:t>
+      </w:r>
+      <w:r>
+        <w:t xml:space="preserve"> row carries </w:t>
+      </w:r>
+      <w:r>
+        <w:rPr>
+          <w:rFonts w:ascii="Consolas" w:hAnsi="Consolas"/>
+          <w:color w:val="334455"/>
+          <w:sz w:val="19"/>
+        </w:rPr>
+        <w:t>estimate: true</w:t>
+      </w:r>
+      <w:r>
+        <w:t>.</w:t>
+      </w:r>
+    </w:p>
+    <w:p>
+      <w:pPr>
+        <w:pStyle w:val="ListBullet"/>
+      </w:pPr>
+      <w:r>
+        <w:rPr>
+          <w:rFonts w:ascii="Consolas" w:hAnsi="Consolas"/>
+          <w:color w:val="334455"/>
+          <w:sz w:val="19"/>
+        </w:rPr>
+        <w:t>history</w:t>
+      </w:r>
+      <w:r>
+        <w:t xml:space="preserve"> is </w:t>
+      </w:r>
+      <w:r>
+        <w:rPr>
+          <w:rFonts w:ascii="Consolas" w:hAnsi="Consolas"/>
+          <w:color w:val="334455"/>
+          <w:sz w:val="19"/>
+        </w:rPr>
+        <w:t>[{slot, verdicts: {key: code}}]</w:t>
+      </w:r>
+      <w:r>
+        <w:t xml:space="preserve"> for the day.</w:t>
+      </w:r>
+    </w:p>
+    <w:p>
+      <w:r>
+        <w:rPr/>
+        <w:t xml:space="preserve">A reader must check </w:t>
+      </w:r>
+      <w:r>
+        <w:rPr>
+          <w:rFonts w:ascii="Consolas" w:hAnsi="Consolas"/>
+          <w:color w:val="334455"/>
+          <w:sz w:val="19"/>
+        </w:rPr>
+        <w:t>date</w:t>
+      </w:r>
+      <w:r>
+        <w:rPr/>
+        <w:t xml:space="preserve"> against today, treat a reading older than two</w:t>
+        <w:br/>
+      </w:r>
+      <w:r>
+        <w:rPr>
+          <w:rFonts w:ascii="Consolas" w:hAnsi="Consolas"/>
+          <w:color w:val="334455"/>
+          <w:sz w:val="19"/>
+        </w:rPr>
+        <w:t>interval_min</w:t>
+      </w:r>
+      <w:r>
+        <w:rPr/>
+        <w:t xml:space="preserve"> in the session as stopped, and on the public origin show it only when</w:t>
+        <w:br/>
+      </w:r>
+      <w:r>
+        <w:rPr>
+          <w:rFonts w:ascii="Consolas" w:hAnsi="Consolas"/>
+          <w:color w:val="334455"/>
+          <w:sz w:val="19"/>
+        </w:rPr>
+        <w:t>public</w:t>
+      </w:r>
+      <w:r>
+        <w:rPr/>
+        <w:t xml:space="preserve"> is exactly </w:t>
+      </w:r>
+      <w:r>
+        <w:rPr>
+          <w:rFonts w:ascii="Consolas" w:hAnsi="Consolas"/>
+          <w:color w:val="334455"/>
+          <w:sz w:val="19"/>
+        </w:rPr>
+        <w:t>true</w:t>
+      </w:r>
+      <w:r>
+        <w:rPr/>
+        <w:t>. The rules and thresholds are in the Technical Reference,</w:t>
+        <w:br/>
+      </w:r>
+      <w:r>
+        <w:rPr>
+          <w:i/>
+        </w:rPr>
+        <w:t>Market read</w:t>
+      </w:r>
+      <w:r>
+        <w:rPr/>
+        <w:t>.</w:t>
+      </w:r>
+    </w:p>
+    <w:p>
+      <w:r>
+        <w:br/>
+      </w:r>
+    </w:p>
+    <w:p>
+      <w:pPr>
         <w:pStyle w:val="Heading1"/>
       </w:pPr>
       <w:r>
@@ -23325,6 +23831,17 @@
           <w:sz w:val="18"/>
         </w:rPr>
         <w:t>cache:market:summary           events:market:summary          (MarketSummary)</w:t>
+      </w:r>
+      <w:r>
+        <w:br/>
+      </w:r>
+      <w:r>
+        <w:rPr>
+          <w:rFonts w:ascii="Consolas" w:hAnsi="Consolas"/>
+          <w:color w:val="223344"/>
+          <w:sz w:val="18"/>
+        </w:rPr>
+        <w:t>cache:market:read              events:market:read             (MarketRead - the Desk's six readings)</w:t>
       </w:r>
       <w:r>
         <w:br/>

</xml_diff>

<commit_message>
docs(scanner): the other-structures tables in the help, the manuals and the route notes
The hover guide, the User Guide, the Reference Guide, the Technical Reference
(the four gates and what the measurement found clears them) and the API
reference (the five candidate lists, the two new funnel buckets). Two
invariants in CLAUDE.md: the structures pass never enters the credit lists,
and its cap is per family.

Co-Authored-By: Claude Opus 5.5 <noreply@anthropic.com>
</commit_message>
<xml_diff>
--- a/docs/manuals/api-reference/api-reference.docx
+++ b/docs/manuals/api-reference/api-reference.docx
@@ -11184,7 +11184,19 @@
         <w:rPr/>
         <w:t xml:space="preserve"> (the 0-DTE, swing and Directional</w:t>
         <w:br/>
-        <w:t xml:space="preserve">lists), </w:t>
+        <w:t xml:space="preserve">lists and the two </w:t>
+      </w:r>
+      <w:r>
+        <w:rPr>
+          <w:rFonts w:ascii="Consolas" w:hAnsi="Consolas"/>
+          <w:color w:val="334455"/>
+          <w:sz w:val="19"/>
+        </w:rPr>
+        <w:t>structures_*</w:t>
+      </w:r>
+      <w:r>
+        <w:rPr/>
+        <w:t xml:space="preserve"> lists), </w:t>
       </w:r>
       <w:r>
         <w:rPr>
@@ -11689,142 +11701,110 @@
           <w:color w:val="334455"/>
           <w:sz w:val="19"/>
         </w:rPr>
-        <w:t>cache:options:scan_day</w:t>
-      </w:r>
-      <w:r>
-        <w:rPr/>
-        <w:t xml:space="preserve"> — the day union the Market Scanner and the Symbol</w:t>
-        <w:br/>
-        <w:t xml:space="preserve">Dossier render: </w:t>
-      </w:r>
-      <w:r>
-        <w:rPr>
-          <w:rFonts w:ascii="Consolas" w:hAnsi="Consolas"/>
-          <w:color w:val="334455"/>
-          <w:sz w:val="19"/>
-        </w:rPr>
-        <w:t>{date, scan_seq, signals_0dte[], signals_swing[],</w:t>
-        <w:br/>
-        <w:t>signals_directional[], setups, truncated?}</w:t>
-      </w:r>
-      <w:r>
-        <w:rPr/>
-        <w:t xml:space="preserve">. </w:t>
-      </w:r>
-      <w:r>
-        <w:rPr>
-          <w:rFonts w:ascii="Consolas" w:hAnsi="Consolas"/>
-          <w:color w:val="334455"/>
-          <w:sz w:val="19"/>
-        </w:rPr>
-        <w:t>date</w:t>
-      </w:r>
-      <w:r>
-        <w:rPr/>
-        <w:t xml:space="preserve"> is the </w:t>
+        <w:t>cache:options:scan</w:t>
+      </w:r>
+      <w:r>
+        <w:rPr/>
+        <w:t xml:space="preserve"> carries five candidate lists. </w:t>
+      </w:r>
+      <w:r>
+        <w:rPr>
+          <w:rFonts w:ascii="Consolas" w:hAnsi="Consolas"/>
+          <w:color w:val="334455"/>
+          <w:sz w:val="19"/>
+        </w:rPr>
+        <w:t>signals_0dte</w:t>
+      </w:r>
+      <w:r>
+        <w:rPr/>
+        <w:t xml:space="preserve"> and</w:t>
+        <w:br/>
+      </w:r>
+      <w:r>
+        <w:rPr>
+          <w:rFonts w:ascii="Consolas" w:hAnsi="Consolas"/>
+          <w:color w:val="334455"/>
+          <w:sz w:val="19"/>
+        </w:rPr>
+        <w:t>signals_swing</w:t>
+      </w:r>
+      <w:r>
+        <w:rPr/>
+        <w:t xml:space="preserve"> are credit spreads and iron condors in the engine's flat shape</w:t>
+        <w:br/>
+        <w:t>(</w:t>
+      </w:r>
+      <w:r>
+        <w:rPr>
+          <w:rFonts w:ascii="Consolas" w:hAnsi="Consolas"/>
+          <w:color w:val="334455"/>
+          <w:sz w:val="19"/>
+        </w:rPr>
+        <w:t>short_strike</w:t>
+      </w:r>
+      <w:r>
+        <w:rPr/>
+        <w:t xml:space="preserve"> / </w:t>
+      </w:r>
+      <w:r>
+        <w:rPr>
+          <w:rFonts w:ascii="Consolas" w:hAnsi="Consolas"/>
+          <w:color w:val="334455"/>
+          <w:sz w:val="19"/>
+        </w:rPr>
+        <w:t>long_strike</w:t>
+      </w:r>
+      <w:r>
+        <w:rPr/>
+        <w:t>, per-share dollars, the premium composite).</w:t>
+        <w:br/>
+      </w:r>
+      <w:r>
+        <w:rPr>
+          <w:rFonts w:ascii="Consolas" w:hAnsi="Consolas"/>
+          <w:color w:val="334455"/>
+          <w:sz w:val="19"/>
+        </w:rPr>
+        <w:t>signals_directional</w:t>
+      </w:r>
+      <w:r>
+        <w:rPr/>
+        <w:t xml:space="preserve">, </w:t>
+      </w:r>
+      <w:r>
+        <w:rPr>
+          <w:rFonts w:ascii="Consolas" w:hAnsi="Consolas"/>
+          <w:color w:val="334455"/>
+          <w:sz w:val="19"/>
+        </w:rPr>
+        <w:t>structures_0dte</w:t>
+      </w:r>
+      <w:r>
+        <w:rPr/>
+        <w:t xml:space="preserve"> and </w:t>
+      </w:r>
+      <w:r>
+        <w:rPr>
+          <w:rFonts w:ascii="Consolas" w:hAnsi="Consolas"/>
+          <w:color w:val="334455"/>
+          <w:sz w:val="19"/>
+        </w:rPr>
+        <w:t>structures_swing</w:t>
+      </w:r>
+      <w:r>
+        <w:rPr/>
+        <w:t xml:space="preserve"> are the</w:t>
+        <w:br/>
       </w:r>
       <w:r>
         <w:rPr>
           <w:b/>
         </w:rPr>
-        <w:t>Central</w:t>
-      </w:r>
-      <w:r>
-        <w:rPr/>
-        <w:t xml:space="preserve"> trading date —</w:t>
-        <w:br/>
-        <w:t xml:space="preserve">check it before trusting any row's </w:t>
-      </w:r>
-      <w:r>
-        <w:rPr>
-          <w:rFonts w:ascii="Consolas" w:hAnsi="Consolas"/>
-          <w:color w:val="334455"/>
-          <w:sz w:val="19"/>
-        </w:rPr>
-        <w:t>live</w:t>
-      </w:r>
-      <w:r>
-        <w:rPr/>
-        <w:t>, because a failed first merge of a new day</w:t>
-        <w:br/>
-        <w:t xml:space="preserve">leaves yesterday's envelope in place. </w:t>
-      </w:r>
-      <w:r>
-        <w:rPr>
-          <w:rFonts w:ascii="Consolas" w:hAnsi="Consolas"/>
-          <w:color w:val="334455"/>
-          <w:sz w:val="19"/>
-        </w:rPr>
-        <w:t>scan_seq</w:t>
-      </w:r>
-      <w:r>
-        <w:rPr/>
-        <w:t xml:space="preserve"> is this scan's 1-based number within</w:t>
-        <w:br/>
-        <w:t xml:space="preserve">the day. Each row is the scan's row plus </w:t>
-      </w:r>
-      <w:r>
-        <w:rPr>
-          <w:rFonts w:ascii="Consolas" w:hAnsi="Consolas"/>
-          <w:color w:val="334455"/>
-          <w:sz w:val="19"/>
-        </w:rPr>
-        <w:t>live</w:t>
-      </w:r>
-      <w:r>
-        <w:rPr/>
-        <w:t xml:space="preserve">, </w:t>
-      </w:r>
-      <w:r>
-        <w:rPr>
-          <w:rFonts w:ascii="Consolas" w:hAnsi="Consolas"/>
-          <w:color w:val="334455"/>
-          <w:sz w:val="19"/>
-        </w:rPr>
-        <w:t>stale_since</w:t>
-      </w:r>
-      <w:r>
-        <w:rPr/>
-        <w:t xml:space="preserve"> (when it dropped out;</w:t>
-        <w:br/>
-      </w:r>
-      <w:r>
-        <w:rPr>
-          <w:rFonts w:ascii="Consolas" w:hAnsi="Consolas"/>
-          <w:color w:val="334455"/>
-          <w:sz w:val="19"/>
-        </w:rPr>
-        <w:t>null</w:t>
-      </w:r>
-      <w:r>
-        <w:rPr/>
-        <w:t xml:space="preserve"> while live) and </w:t>
-      </w:r>
-      <w:r>
-        <w:rPr>
-          <w:rFonts w:ascii="Consolas" w:hAnsi="Consolas"/>
-          <w:color w:val="334455"/>
-          <w:sz w:val="19"/>
-        </w:rPr>
-        <w:t>setup_key</w:t>
-      </w:r>
-      <w:r>
-        <w:rPr/>
-        <w:t xml:space="preserve"> — </w:t>
-      </w:r>
-      <w:r>
-        <w:rPr>
-          <w:rFonts w:ascii="Consolas" w:hAnsi="Consolas"/>
-          <w:color w:val="334455"/>
-          <w:sz w:val="19"/>
-        </w:rPr>
-        <w:t>SYMBOL|TYPE|EXPIRATION</w:t>
-      </w:r>
-      <w:r>
-        <w:rPr/>
-        <w:t>, strikes excluded</w:t>
-        <w:br/>
-        <w:t xml:space="preserve">(the row's front expiration — its </w:t>
+        <w:t>normalized</w:t>
+      </w:r>
+      <w:r>
+        <w:rPr/>
+        <w:t xml:space="preserve"> shape: a </w:t>
       </w:r>
       <w:r>
         <w:rPr>
@@ -11836,229 +11816,157 @@
       </w:r>
       <w:r>
         <w:rPr/>
-        <w:t xml:space="preserve"> only when the top-level field is</w:t>
-        <w:br/>
-        <w:t xml:space="preserve">unreadable), or </w:t>
-      </w:r>
-      <w:r>
-        <w:rPr>
-          <w:rFonts w:ascii="Consolas" w:hAnsi="Consolas"/>
-          <w:color w:val="334455"/>
-          <w:sz w:val="19"/>
-        </w:rPr>
-        <w:t>null</w:t>
-      </w:r>
-      <w:r>
-        <w:rPr/>
-        <w:t xml:space="preserve"> when a part is</w:t>
-        <w:br/>
-        <w:t xml:space="preserve">missing. ⚠ </w:t>
-      </w:r>
-      <w:r>
-        <w:rPr>
-          <w:rFonts w:ascii="Consolas" w:hAnsi="Consolas"/>
-          <w:color w:val="334455"/>
-          <w:sz w:val="19"/>
-        </w:rPr>
-        <w:t>setup_key</w:t>
-      </w:r>
-      <w:r>
-        <w:rPr/>
-        <w:t xml:space="preserve"> is a </w:t>
-      </w:r>
-      <w:r>
-        <w:rPr>
-          <w:b/>
-        </w:rPr>
-        <w:t xml:space="preserve">lookup into </w:t>
-      </w:r>
-      <w:r>
-        <w:rPr>
-          <w:rFonts w:ascii="Consolas" w:hAnsi="Consolas"/>
-          <w:color w:val="334455"/>
-          <w:sz w:val="19"/>
-        </w:rPr>
-        <w:t>setups</w:t>
-      </w:r>
-      <w:r>
-        <w:rPr>
-          <w:b/>
-        </w:rPr>
-        <w:t>, never a row key</w:t>
-      </w:r>
-      <w:r>
-        <w:rPr/>
-        <w:t>: row identity</w:t>
-        <w:br/>
-        <w:t xml:space="preserve">stays </w:t>
-      </w:r>
-      <w:r>
-        <w:rPr>
-          <w:rFonts w:ascii="Consolas" w:hAnsi="Consolas"/>
-          <w:color w:val="334455"/>
-          <w:sz w:val="19"/>
-        </w:rPr>
-        <w:t>id</w:t>
-      </w:r>
-      <w:r>
-        <w:rPr/>
-        <w:t>, and two adjacent strikes on one expiry are two rows sharing one entry.</w:t>
-        <w:br/>
-      </w:r>
-      <w:r>
-        <w:rPr>
-          <w:rFonts w:ascii="Consolas" w:hAnsi="Consolas"/>
-          <w:color w:val="334455"/>
-          <w:sz w:val="19"/>
-        </w:rPr>
-        <w:t>setups</w:t>
-      </w:r>
-      <w:r>
-        <w:rPr/>
-        <w:t xml:space="preserve"> is </w:t>
-      </w:r>
-      <w:r>
-        <w:rPr>
-          <w:rFonts w:ascii="Consolas" w:hAnsi="Consolas"/>
-          <w:color w:val="334455"/>
-          <w:sz w:val="19"/>
-        </w:rPr>
-        <w:t>{setup_key: {seen, scores[], gaps, last_seq, last_live, first_seen |</w:t>
-        <w:br/>
-        <w:t>age_unknown}}</w:t>
-      </w:r>
-      <w:r>
-        <w:rPr/>
-        <w:t xml:space="preserve"> — </w:t>
-      </w:r>
-      <w:r>
-        <w:rPr>
-          <w:rFonts w:ascii="Consolas" w:hAnsi="Consolas"/>
-          <w:color w:val="334455"/>
-          <w:sz w:val="19"/>
-        </w:rPr>
-        <w:t>seen</w:t>
-      </w:r>
-      <w:r>
-        <w:rPr/>
-        <w:t xml:space="preserve"> the scans it was live in, </w:t>
-      </w:r>
-      <w:r>
-        <w:rPr>
-          <w:rFonts w:ascii="Consolas" w:hAnsi="Consolas"/>
-          <w:color w:val="334455"/>
-          <w:sz w:val="19"/>
-        </w:rPr>
-        <w:t>scores</w:t>
-      </w:r>
-      <w:r>
-        <w:rPr/>
-        <w:t xml:space="preserve"> its best composite per</w:t>
-        <w:br/>
-        <w:t xml:space="preserve">scan (the last 40), </w:t>
-      </w:r>
-      <w:r>
-        <w:rPr>
-          <w:rFonts w:ascii="Consolas" w:hAnsi="Consolas"/>
-          <w:color w:val="334455"/>
-          <w:sz w:val="19"/>
-        </w:rPr>
-        <w:t>gaps</w:t>
-      </w:r>
-      <w:r>
-        <w:rPr/>
-        <w:t xml:space="preserve"> how many times it went absent and came back. A setup whose</w:t>
-        <w:br/>
-        <w:t xml:space="preserve">start was not observed (the map rebuilt mid-session) carries </w:t>
-      </w:r>
-      <w:r>
-        <w:rPr>
-          <w:rFonts w:ascii="Consolas" w:hAnsi="Consolas"/>
-          <w:color w:val="334455"/>
-          <w:sz w:val="19"/>
-        </w:rPr>
-        <w:t>age_unknown: true</w:t>
-      </w:r>
-      <w:r>
-        <w:rPr/>
-        <w:t xml:space="preserve"> and</w:t>
-        <w:br/>
-      </w:r>
-      <w:r>
-        <w:rPr>
-          <w:b/>
-        </w:rPr>
-        <w:t>no</w:t>
-      </w:r>
-      <w:r>
-        <w:rPr/>
-        <w:t xml:space="preserve"> </w:t>
-      </w:r>
-      <w:r>
-        <w:rPr>
-          <w:rFonts w:ascii="Consolas" w:hAnsi="Consolas"/>
-          <w:color w:val="334455"/>
-          <w:sz w:val="19"/>
-        </w:rPr>
-        <w:t>first_seen</w:t>
-      </w:r>
-      <w:r>
-        <w:rPr/>
-        <w:t>; nothing is ever stamped with the current time to fill the gap.</w:t>
-        <w:br/>
-      </w:r>
-      <w:r>
-        <w:rPr>
-          <w:rFonts w:ascii="Consolas" w:hAnsi="Consolas"/>
-          <w:color w:val="334455"/>
-          <w:sz w:val="19"/>
-        </w:rPr>
-        <w:t>setups</w:t>
-      </w:r>
-      <w:r>
-        <w:rPr/>
-        <w:t xml:space="preserve"> is always present; an empty map on a scan whose persistence step failed</w:t>
-        <w:br/>
-        <w:t xml:space="preserve">(degrade </w:t>
-      </w:r>
-      <w:r>
-        <w:rPr>
-          <w:rFonts w:ascii="Consolas" w:hAnsi="Consolas"/>
-          <w:color w:val="334455"/>
-          <w:sz w:val="19"/>
-        </w:rPr>
-        <w:t>options.merge_setups</w:t>
-      </w:r>
-      <w:r>
-        <w:rPr/>
-        <w:t xml:space="preserve">) means "no reading", never "all new". </w:t>
-      </w:r>
-      <w:r>
-        <w:rPr>
-          <w:rFonts w:ascii="Consolas" w:hAnsi="Consolas"/>
-          <w:color w:val="334455"/>
-          <w:sz w:val="19"/>
-        </w:rPr>
-        <w:t>truncated</w:t>
-      </w:r>
-      <w:r>
-        <w:rPr/>
-        <w:br/>
-        <w:t>(</w:t>
-      </w:r>
-      <w:r>
-        <w:rPr>
-          <w:rFonts w:ascii="Consolas" w:hAnsi="Consolas"/>
-          <w:color w:val="334455"/>
-          <w:sz w:val="19"/>
-        </w:rPr>
-        <w:t>{list: n_dropped}</w:t>
-      </w:r>
-      <w:r>
-        <w:rPr/>
-        <w:t>) appears only when the 2000-per-list cap evicted stale rows; the</w:t>
-        <w:br/>
-        <w:t>map is trimmed after the rows and never loses an entry a surviving row references.</w:t>
+        <w:t xml:space="preserve"> list, per-contract dollars, </w:t>
+      </w:r>
+      <w:r>
+        <w:rPr>
+          <w:rFonts w:ascii="Consolas" w:hAnsi="Consolas"/>
+          <w:color w:val="334455"/>
+          <w:sz w:val="19"/>
+        </w:rPr>
+        <w:t>rr</w:t>
+      </w:r>
+      <w:r>
+        <w:rPr/>
+        <w:t xml:space="preserve"> (a ratio),</w:t>
+        <w:br/>
+      </w:r>
+      <w:r>
+        <w:rPr>
+          <w:rFonts w:ascii="Consolas" w:hAnsi="Consolas"/>
+          <w:color w:val="334455"/>
+          <w:sz w:val="19"/>
+        </w:rPr>
+        <w:t>breakevens</w:t>
+      </w:r>
+      <w:r>
+        <w:rPr/>
+        <w:t xml:space="preserve"> (a list) and the Fit + Quality score. The two </w:t>
+      </w:r>
+      <w:r>
+        <w:rPr>
+          <w:rFonts w:ascii="Consolas" w:hAnsi="Consolas"/>
+          <w:color w:val="334455"/>
+          <w:sz w:val="19"/>
+        </w:rPr>
+        <w:t>structures_*</w:t>
+      </w:r>
+      <w:r>
+        <w:rPr/>
+        <w:t xml:space="preserve"> lists</w:t>
+        <w:br/>
+        <w:t>(since 2026-10-06) hold everything else the 0-DTE and Swing windows build — debit</w:t>
+        <w:br/>
+        <w:t>spreads, straddles and strangles, butterflies and condors, and on Swing calendars</w:t>
+        <w:br/>
+        <w:t xml:space="preserve">and diagonals. Each of their rows also carries </w:t>
+      </w:r>
+      <w:r>
+        <w:rPr>
+          <w:rFonts w:ascii="Consolas" w:hAnsi="Consolas"/>
+          <w:color w:val="334455"/>
+          <w:sz w:val="19"/>
+        </w:rPr>
+        <w:t>group</w:t>
+      </w:r>
+      <w:r>
+        <w:rPr/>
+        <w:t xml:space="preserve"> (</w:t>
+      </w:r>
+      <w:r>
+        <w:rPr>
+          <w:rFonts w:ascii="Consolas" w:hAnsi="Consolas"/>
+          <w:color w:val="334455"/>
+          <w:sz w:val="19"/>
+        </w:rPr>
+        <w:t>VERTICAL</w:t>
+      </w:r>
+      <w:r>
+        <w:rPr/>
+        <w:t xml:space="preserve"> / </w:t>
+      </w:r>
+      <w:r>
+        <w:rPr>
+          <w:rFonts w:ascii="Consolas" w:hAnsi="Consolas"/>
+          <w:color w:val="334455"/>
+          <w:sz w:val="19"/>
+        </w:rPr>
+        <w:t>STRADDLE</w:t>
+      </w:r>
+      <w:r>
+        <w:rPr/>
+        <w:t xml:space="preserve"> /</w:t>
+        <w:br/>
+      </w:r>
+      <w:r>
+        <w:rPr>
+          <w:rFonts w:ascii="Consolas" w:hAnsi="Consolas"/>
+          <w:color w:val="334455"/>
+          <w:sz w:val="19"/>
+        </w:rPr>
+        <w:t>BUTTERFLY</w:t>
+      </w:r>
+      <w:r>
+        <w:rPr/>
+        <w:t xml:space="preserve"> / </w:t>
+      </w:r>
+      <w:r>
+        <w:rPr>
+          <w:rFonts w:ascii="Consolas" w:hAnsi="Consolas"/>
+          <w:color w:val="334455"/>
+          <w:sz w:val="19"/>
+        </w:rPr>
+        <w:t>CALENDAR</w:t>
+      </w:r>
+      <w:r>
+        <w:rPr/>
+        <w:t>, the family that built it) and, when it buys premium and</w:t>
+        <w:br/>
+        <w:t xml:space="preserve">was kept through an earnings report, </w:t>
+      </w:r>
+      <w:r>
+        <w:rPr>
+          <w:rFonts w:ascii="Consolas" w:hAnsi="Consolas"/>
+          <w:color w:val="334455"/>
+          <w:sz w:val="19"/>
+        </w:rPr>
+        <w:t>spans_earnings: true</w:t>
+      </w:r>
+      <w:r>
+        <w:rPr/>
+        <w:t xml:space="preserve"> with </w:t>
+      </w:r>
+      <w:r>
+        <w:rPr>
+          <w:rFonts w:ascii="Consolas" w:hAnsi="Consolas"/>
+          <w:color w:val="334455"/>
+          <w:sz w:val="19"/>
+        </w:rPr>
+        <w:t>earnings_date</w:t>
+      </w:r>
+      <w:r>
+        <w:rPr/>
+        <w:t>.</w:t>
+        <w:br/>
+        <w:t>A payload cached before the two lists existed validates with both empty. They are</w:t>
+        <w:br/>
+        <w:t xml:space="preserve">not recorded, not pushed and not counted by </w:t>
+      </w:r>
+      <w:r>
+        <w:rPr>
+          <w:rFonts w:ascii="Consolas" w:hAnsi="Consolas"/>
+          <w:color w:val="334455"/>
+          <w:sz w:val="19"/>
+        </w:rPr>
+        <w:t>compute.build_matrix</w:t>
+      </w:r>
+      <w:r>
+        <w:rPr/>
+        <w:t>. Do not assume</w:t>
+        <w:br/>
+        <w:t>one shape across the five lists, and do not rank a row of one shape against a row</w:t>
+        <w:br/>
+        <w:t>of the other.</w:t>
       </w:r>
     </w:p>
     <w:p>
@@ -12068,6 +11976,385 @@
           <w:color w:val="334455"/>
           <w:sz w:val="19"/>
         </w:rPr>
+        <w:t>cache:options:scan_day</w:t>
+      </w:r>
+      <w:r>
+        <w:rPr/>
+        <w:t xml:space="preserve"> — the day union the Market Scanner and the Symbol</w:t>
+        <w:br/>
+        <w:t xml:space="preserve">Dossier render: </w:t>
+      </w:r>
+      <w:r>
+        <w:rPr>
+          <w:rFonts w:ascii="Consolas" w:hAnsi="Consolas"/>
+          <w:color w:val="334455"/>
+          <w:sz w:val="19"/>
+        </w:rPr>
+        <w:t>{date, scan_seq, signals_0dte[], signals_swing[],</w:t>
+        <w:br/>
+        <w:t>signals_directional[], structures_0dte[], structures_swing[], setups, truncated?}</w:t>
+      </w:r>
+      <w:r>
+        <w:rPr/>
+        <w:t xml:space="preserve">. </w:t>
+      </w:r>
+      <w:r>
+        <w:rPr>
+          <w:rFonts w:ascii="Consolas" w:hAnsi="Consolas"/>
+          <w:color w:val="334455"/>
+          <w:sz w:val="19"/>
+        </w:rPr>
+        <w:t>date</w:t>
+      </w:r>
+      <w:r>
+        <w:rPr/>
+        <w:t xml:space="preserve"> is the </w:t>
+      </w:r>
+      <w:r>
+        <w:rPr>
+          <w:b/>
+        </w:rPr>
+        <w:t>Central</w:t>
+      </w:r>
+      <w:r>
+        <w:rPr/>
+        <w:t xml:space="preserve"> trading date —</w:t>
+        <w:br/>
+        <w:t xml:space="preserve">check it before trusting any row's </w:t>
+      </w:r>
+      <w:r>
+        <w:rPr>
+          <w:rFonts w:ascii="Consolas" w:hAnsi="Consolas"/>
+          <w:color w:val="334455"/>
+          <w:sz w:val="19"/>
+        </w:rPr>
+        <w:t>live</w:t>
+      </w:r>
+      <w:r>
+        <w:rPr/>
+        <w:t>, because a failed first merge of a new day</w:t>
+        <w:br/>
+        <w:t xml:space="preserve">leaves yesterday's envelope in place. </w:t>
+      </w:r>
+      <w:r>
+        <w:rPr>
+          <w:rFonts w:ascii="Consolas" w:hAnsi="Consolas"/>
+          <w:color w:val="334455"/>
+          <w:sz w:val="19"/>
+        </w:rPr>
+        <w:t>scan_seq</w:t>
+      </w:r>
+      <w:r>
+        <w:rPr/>
+        <w:t xml:space="preserve"> is this scan's 1-based number within</w:t>
+        <w:br/>
+        <w:t xml:space="preserve">the day. Each row is the scan's row plus </w:t>
+      </w:r>
+      <w:r>
+        <w:rPr>
+          <w:rFonts w:ascii="Consolas" w:hAnsi="Consolas"/>
+          <w:color w:val="334455"/>
+          <w:sz w:val="19"/>
+        </w:rPr>
+        <w:t>live</w:t>
+      </w:r>
+      <w:r>
+        <w:rPr/>
+        <w:t xml:space="preserve">, </w:t>
+      </w:r>
+      <w:r>
+        <w:rPr>
+          <w:rFonts w:ascii="Consolas" w:hAnsi="Consolas"/>
+          <w:color w:val="334455"/>
+          <w:sz w:val="19"/>
+        </w:rPr>
+        <w:t>stale_since</w:t>
+      </w:r>
+      <w:r>
+        <w:rPr/>
+        <w:t xml:space="preserve"> (when it dropped out;</w:t>
+        <w:br/>
+      </w:r>
+      <w:r>
+        <w:rPr>
+          <w:rFonts w:ascii="Consolas" w:hAnsi="Consolas"/>
+          <w:color w:val="334455"/>
+          <w:sz w:val="19"/>
+        </w:rPr>
+        <w:t>null</w:t>
+      </w:r>
+      <w:r>
+        <w:rPr/>
+        <w:t xml:space="preserve"> while live) and </w:t>
+      </w:r>
+      <w:r>
+        <w:rPr>
+          <w:rFonts w:ascii="Consolas" w:hAnsi="Consolas"/>
+          <w:color w:val="334455"/>
+          <w:sz w:val="19"/>
+        </w:rPr>
+        <w:t>setup_key</w:t>
+      </w:r>
+      <w:r>
+        <w:rPr/>
+        <w:t xml:space="preserve"> — </w:t>
+      </w:r>
+      <w:r>
+        <w:rPr>
+          <w:rFonts w:ascii="Consolas" w:hAnsi="Consolas"/>
+          <w:color w:val="334455"/>
+          <w:sz w:val="19"/>
+        </w:rPr>
+        <w:t>SYMBOL|TYPE|EXPIRATION</w:t>
+      </w:r>
+      <w:r>
+        <w:rPr/>
+        <w:t>, strikes excluded</w:t>
+        <w:br/>
+        <w:t xml:space="preserve">(the row's front expiration — its </w:t>
+      </w:r>
+      <w:r>
+        <w:rPr>
+          <w:rFonts w:ascii="Consolas" w:hAnsi="Consolas"/>
+          <w:color w:val="334455"/>
+          <w:sz w:val="19"/>
+        </w:rPr>
+        <w:t>legs</w:t>
+      </w:r>
+      <w:r>
+        <w:rPr/>
+        <w:t xml:space="preserve"> only when the top-level field is</w:t>
+        <w:br/>
+        <w:t xml:space="preserve">unreadable), or </w:t>
+      </w:r>
+      <w:r>
+        <w:rPr>
+          <w:rFonts w:ascii="Consolas" w:hAnsi="Consolas"/>
+          <w:color w:val="334455"/>
+          <w:sz w:val="19"/>
+        </w:rPr>
+        <w:t>null</w:t>
+      </w:r>
+      <w:r>
+        <w:rPr/>
+        <w:t xml:space="preserve"> when a part is</w:t>
+        <w:br/>
+        <w:t xml:space="preserve">missing. ⚠ </w:t>
+      </w:r>
+      <w:r>
+        <w:rPr>
+          <w:rFonts w:ascii="Consolas" w:hAnsi="Consolas"/>
+          <w:color w:val="334455"/>
+          <w:sz w:val="19"/>
+        </w:rPr>
+        <w:t>setup_key</w:t>
+      </w:r>
+      <w:r>
+        <w:rPr/>
+        <w:t xml:space="preserve"> is a </w:t>
+      </w:r>
+      <w:r>
+        <w:rPr>
+          <w:b/>
+        </w:rPr>
+        <w:t xml:space="preserve">lookup into </w:t>
+      </w:r>
+      <w:r>
+        <w:rPr>
+          <w:rFonts w:ascii="Consolas" w:hAnsi="Consolas"/>
+          <w:color w:val="334455"/>
+          <w:sz w:val="19"/>
+        </w:rPr>
+        <w:t>setups</w:t>
+      </w:r>
+      <w:r>
+        <w:rPr>
+          <w:b/>
+        </w:rPr>
+        <w:t>, never a row key</w:t>
+      </w:r>
+      <w:r>
+        <w:rPr/>
+        <w:t>: row identity</w:t>
+        <w:br/>
+        <w:t xml:space="preserve">stays </w:t>
+      </w:r>
+      <w:r>
+        <w:rPr>
+          <w:rFonts w:ascii="Consolas" w:hAnsi="Consolas"/>
+          <w:color w:val="334455"/>
+          <w:sz w:val="19"/>
+        </w:rPr>
+        <w:t>id</w:t>
+      </w:r>
+      <w:r>
+        <w:rPr/>
+        <w:t>, and two adjacent strikes on one expiry are two rows sharing one entry.</w:t>
+        <w:br/>
+      </w:r>
+      <w:r>
+        <w:rPr>
+          <w:rFonts w:ascii="Consolas" w:hAnsi="Consolas"/>
+          <w:color w:val="334455"/>
+          <w:sz w:val="19"/>
+        </w:rPr>
+        <w:t>setups</w:t>
+      </w:r>
+      <w:r>
+        <w:rPr/>
+        <w:t xml:space="preserve"> is </w:t>
+      </w:r>
+      <w:r>
+        <w:rPr>
+          <w:rFonts w:ascii="Consolas" w:hAnsi="Consolas"/>
+          <w:color w:val="334455"/>
+          <w:sz w:val="19"/>
+        </w:rPr>
+        <w:t>{setup_key: {seen, scores[], gaps, last_seq, last_live, first_seen |</w:t>
+        <w:br/>
+        <w:t>age_unknown}}</w:t>
+      </w:r>
+      <w:r>
+        <w:rPr/>
+        <w:t xml:space="preserve"> — </w:t>
+      </w:r>
+      <w:r>
+        <w:rPr>
+          <w:rFonts w:ascii="Consolas" w:hAnsi="Consolas"/>
+          <w:color w:val="334455"/>
+          <w:sz w:val="19"/>
+        </w:rPr>
+        <w:t>seen</w:t>
+      </w:r>
+      <w:r>
+        <w:rPr/>
+        <w:t xml:space="preserve"> the scans it was live in, </w:t>
+      </w:r>
+      <w:r>
+        <w:rPr>
+          <w:rFonts w:ascii="Consolas" w:hAnsi="Consolas"/>
+          <w:color w:val="334455"/>
+          <w:sz w:val="19"/>
+        </w:rPr>
+        <w:t>scores</w:t>
+      </w:r>
+      <w:r>
+        <w:rPr/>
+        <w:t xml:space="preserve"> its best composite per</w:t>
+        <w:br/>
+        <w:t xml:space="preserve">scan (the last 40), </w:t>
+      </w:r>
+      <w:r>
+        <w:rPr>
+          <w:rFonts w:ascii="Consolas" w:hAnsi="Consolas"/>
+          <w:color w:val="334455"/>
+          <w:sz w:val="19"/>
+        </w:rPr>
+        <w:t>gaps</w:t>
+      </w:r>
+      <w:r>
+        <w:rPr/>
+        <w:t xml:space="preserve"> how many times it went absent and came back. A setup whose</w:t>
+        <w:br/>
+        <w:t xml:space="preserve">start was not observed (the map rebuilt mid-session) carries </w:t>
+      </w:r>
+      <w:r>
+        <w:rPr>
+          <w:rFonts w:ascii="Consolas" w:hAnsi="Consolas"/>
+          <w:color w:val="334455"/>
+          <w:sz w:val="19"/>
+        </w:rPr>
+        <w:t>age_unknown: true</w:t>
+      </w:r>
+      <w:r>
+        <w:rPr/>
+        <w:t xml:space="preserve"> and</w:t>
+        <w:br/>
+      </w:r>
+      <w:r>
+        <w:rPr>
+          <w:b/>
+        </w:rPr>
+        <w:t>no</w:t>
+      </w:r>
+      <w:r>
+        <w:rPr/>
+        <w:t xml:space="preserve"> </w:t>
+      </w:r>
+      <w:r>
+        <w:rPr>
+          <w:rFonts w:ascii="Consolas" w:hAnsi="Consolas"/>
+          <w:color w:val="334455"/>
+          <w:sz w:val="19"/>
+        </w:rPr>
+        <w:t>first_seen</w:t>
+      </w:r>
+      <w:r>
+        <w:rPr/>
+        <w:t>; nothing is ever stamped with the current time to fill the gap.</w:t>
+        <w:br/>
+      </w:r>
+      <w:r>
+        <w:rPr>
+          <w:rFonts w:ascii="Consolas" w:hAnsi="Consolas"/>
+          <w:color w:val="334455"/>
+          <w:sz w:val="19"/>
+        </w:rPr>
+        <w:t>setups</w:t>
+      </w:r>
+      <w:r>
+        <w:rPr/>
+        <w:t xml:space="preserve"> is always present; an empty map on a scan whose persistence step failed</w:t>
+        <w:br/>
+        <w:t xml:space="preserve">(degrade </w:t>
+      </w:r>
+      <w:r>
+        <w:rPr>
+          <w:rFonts w:ascii="Consolas" w:hAnsi="Consolas"/>
+          <w:color w:val="334455"/>
+          <w:sz w:val="19"/>
+        </w:rPr>
+        <w:t>options.merge_setups</w:t>
+      </w:r>
+      <w:r>
+        <w:rPr/>
+        <w:t xml:space="preserve">) means "no reading", never "all new". </w:t>
+      </w:r>
+      <w:r>
+        <w:rPr>
+          <w:rFonts w:ascii="Consolas" w:hAnsi="Consolas"/>
+          <w:color w:val="334455"/>
+          <w:sz w:val="19"/>
+        </w:rPr>
+        <w:t>truncated</w:t>
+      </w:r>
+      <w:r>
+        <w:rPr/>
+        <w:br/>
+        <w:t>(</w:t>
+      </w:r>
+      <w:r>
+        <w:rPr>
+          <w:rFonts w:ascii="Consolas" w:hAnsi="Consolas"/>
+          <w:color w:val="334455"/>
+          <w:sz w:val="19"/>
+        </w:rPr>
+        <w:t>{list: n_dropped}</w:t>
+      </w:r>
+      <w:r>
+        <w:rPr/>
+        <w:t>) appears only when the 2000-per-list cap evicted stale rows; the</w:t>
+        <w:br/>
+        <w:t>map is trimmed after the rows and never loses an entry a surviving row references.</w:t>
+      </w:r>
+    </w:p>
+    <w:p>
+      <w:r>
+        <w:rPr>
+          <w:rFonts w:ascii="Consolas" w:hAnsi="Consolas"/>
+          <w:color w:val="334455"/>
+          <w:sz w:val="19"/>
+        </w:rPr>
         <w:t>cache:options:scan_funnel</w:t>
       </w:r>
       <w:r>
@@ -12246,6 +12533,97 @@
       </w:r>
       <w:r>
         <w:rPr/>
+        <w:t xml:space="preserve"> / </w:t>
+      </w:r>
+      <w:r>
+        <w:rPr>
+          <w:rFonts w:ascii="Consolas" w:hAnsi="Consolas"/>
+          <w:color w:val="334455"/>
+          <w:sz w:val="19"/>
+        </w:rPr>
+        <w:t>STRUCT_0DTE</w:t>
+      </w:r>
+      <w:r>
+        <w:rPr/>
+        <w:t xml:space="preserve"> / </w:t>
+      </w:r>
+      <w:r>
+        <w:rPr>
+          <w:rFonts w:ascii="Consolas" w:hAnsi="Consolas"/>
+          <w:color w:val="334455"/>
+          <w:sz w:val="19"/>
+        </w:rPr>
+        <w:t>STRUCT_SWING</w:t>
+      </w:r>
+      <w:r>
+        <w:rPr/>
+        <w:t xml:space="preserve">. The two </w:t>
+      </w:r>
+      <w:r>
+        <w:rPr>
+          <w:rFonts w:ascii="Consolas" w:hAnsi="Consolas"/>
+          <w:color w:val="334455"/>
+          <w:sz w:val="19"/>
+        </w:rPr>
+        <w:t>STRUCT_*</w:t>
+      </w:r>
+      <w:r>
+        <w:rPr/>
+        <w:t xml:space="preserve"> buckets (since</w:t>
+        <w:br/>
+        <w:t>2026-10-06; a funnel written before then has neither) are flat, like</w:t>
+        <w:br/>
+      </w:r>
+      <w:r>
+        <w:rPr>
+          <w:rFonts w:ascii="Consolas" w:hAnsi="Consolas"/>
+          <w:color w:val="334455"/>
+          <w:sz w:val="19"/>
+        </w:rPr>
+        <w:t>DIRECTIONAL</w:t>
+      </w:r>
+      <w:r>
+        <w:rPr/>
+        <w:t xml:space="preserve">: </w:t>
+      </w:r>
+      <w:r>
+        <w:rPr>
+          <w:rFonts w:ascii="Consolas" w:hAnsi="Consolas"/>
+          <w:color w:val="334455"/>
+          <w:sz w:val="19"/>
+        </w:rPr>
+        <w:t>{built, vol_gate, earnings, score_cut, capped, outside_rth,</w:t>
+        <w:br/>
+        <w:t>emitted, build_failed}</w:t>
+      </w:r>
+      <w:r>
+        <w:rPr/>
+        <w:t xml:space="preserve">, with </w:t>
+      </w:r>
+      <w:r>
+        <w:rPr>
+          <w:rFonts w:ascii="Consolas" w:hAnsi="Consolas"/>
+          <w:color w:val="334455"/>
+          <w:sz w:val="19"/>
+        </w:rPr>
+        <w:t>built == vol_gate + earnings + score_cut + capped</w:t>
+        <w:br/>
+        <w:t>+ outside_rth + emitted</w:t>
+      </w:r>
+      <w:r>
+        <w:rPr/>
+        <w:t xml:space="preserve"> unless </w:t>
+      </w:r>
+      <w:r>
+        <w:rPr>
+          <w:rFonts w:ascii="Consolas" w:hAnsi="Consolas"/>
+          <w:color w:val="334455"/>
+          <w:sz w:val="19"/>
+        </w:rPr>
+        <w:t>build_failed</w:t>
+      </w:r>
+      <w:r>
+        <w:rPr/>
         <w:t xml:space="preserve">. </w:t>
       </w:r>
       <w:r>
@@ -12254,11 +12632,55 @@
           <w:color w:val="334455"/>
           <w:sz w:val="19"/>
         </w:rPr>
+        <w:t>earnings</w:t>
+      </w:r>
+      <w:r>
+        <w:rPr/>
+        <w:t xml:space="preserve"> counts candidates that</w:t>
+        <w:br/>
+        <w:t>sell premium (or whose vega could not be read) and would be held through a report.</w:t>
+        <w:br/>
+        <w:t xml:space="preserve">A window the scan had no chain for leaves its </w:t>
+      </w:r>
+      <w:r>
+        <w:rPr>
+          <w:rFonts w:ascii="Consolas" w:hAnsi="Consolas"/>
+          <w:color w:val="334455"/>
+          <w:sz w:val="19"/>
+        </w:rPr>
+        <w:t>STRUCT_*</w:t>
+      </w:r>
+      <w:r>
+        <w:rPr/>
+        <w:t xml:space="preserve"> bucket at zero; the credit</w:t>
+        <w:br/>
+        <w:t>bucket for the same window (</w:t>
+      </w:r>
+      <w:r>
+        <w:rPr>
+          <w:rFonts w:ascii="Consolas" w:hAnsi="Consolas"/>
+          <w:color w:val="334455"/>
+          <w:sz w:val="19"/>
+        </w:rPr>
+        <w:t>chain: false</w:t>
+      </w:r>
+      <w:r>
+        <w:rPr/>
+        <w:t xml:space="preserve">) says why. </w:t>
+      </w:r>
+      <w:r>
+        <w:rPr>
+          <w:rFonts w:ascii="Consolas" w:hAnsi="Consolas"/>
+          <w:color w:val="334455"/>
+          <w:sz w:val="19"/>
+        </w:rPr>
         <w:t>outside_rth</w:t>
       </w:r>
       <w:r>
         <w:rPr/>
-        <w:t xml:space="preserve"> (a spread bucket's </w:t>
+        <w:t xml:space="preserve"> (a spread</w:t>
+        <w:br/>
+        <w:t xml:space="preserve">bucket's </w:t>
       </w:r>
       <w:r>
         <w:rPr>
@@ -12270,20 +12692,7 @@
       </w:r>
       <w:r>
         <w:rPr/>
-        <w:t>, the</w:t>
-        <w:br/>
-      </w:r>
-      <w:r>
-        <w:rPr>
-          <w:rFonts w:ascii="Consolas" w:hAnsi="Consolas"/>
-          <w:color w:val="334455"/>
-          <w:sz w:val="19"/>
-        </w:rPr>
-        <w:t>DIRECTIONAL</w:t>
-      </w:r>
-      <w:r>
-        <w:rPr/>
-        <w:t xml:space="preserve"> bucket's own </w:t>
+        <w:t xml:space="preserve">, a flat bucket's own </w:t>
       </w:r>
       <w:r>
         <w:rPr>
@@ -12295,10 +12704,11 @@
       </w:r>
       <w:r>
         <w:rPr/>
-        <w:t>) counts the rows held back because the</w:t>
-        <w:br/>
-        <w:t>scan finished outside the regular 08:30–15:00 CT session; outside it all three of</w:t>
-        <w:br/>
+        <w:t>) counts the rows</w:t>
+        <w:br/>
+        <w:t>held back because the scan finished outside the regular 08:30–15:00 CT session;</w:t>
+        <w:br/>
+        <w:t xml:space="preserve">outside it all five of </w:t>
       </w:r>
       <w:r>
         <w:rPr>
@@ -12310,7 +12720,8 @@
       </w:r>
       <w:r>
         <w:rPr/>
-        <w:t xml:space="preserve">'s signal lists are empty and </w:t>
+        <w:t>'s candidate lists are empty and</w:t>
+        <w:br/>
       </w:r>
       <w:r>
         <w:rPr>
@@ -12322,9 +12733,7 @@
       </w:r>
       <w:r>
         <w:rPr/>
-        <w:t xml:space="preserve"> carries the reason. A</w:t>
-        <w:br/>
-        <w:t>funnel written before 2026-10-02 has no such key.</w:t>
+        <w:t xml:space="preserve"> carries the reason. A funnel written before 2026-10-02 has no such key.</w:t>
         <w:br/>
         <w:t xml:space="preserve">Written after every scan with </w:t>
       </w:r>

</xml_diff>

<commit_message>
docs(scanner): ratio backspreads in the help, the manuals and the changelog
Says the two things the measurement showed a reader needs: only backspreads
entered for a credit are listed and their probability of profit is mostly the
chance of keeping that credit, and the put version scores higher than the
call version because of how the score treats a stock falling to zero.

Co-Authored-By: Claude Opus 5.5 <noreply@anthropic.com>
</commit_message>
<xml_diff>
--- a/docs/manuals/api-reference/api-reference.docx
+++ b/docs/manuals/api-reference/api-reference.docx
@@ -32,7 +32,7 @@
           <w:color w:val="5B6678"/>
           <w:sz w:val="18"/>
         </w:rPr>
-        <w:t>NeuralStrike · Generated 2026-10-06</w:t>
+        <w:t>NeuralStrike · Generated 2026-10-07</w:t>
       </w:r>
     </w:p>
     <w:p/>
@@ -11859,7 +11859,9 @@
         <w:br/>
         <w:t>spreads, straddles and strangles, butterflies and condors, and on Swing calendars</w:t>
         <w:br/>
-        <w:t xml:space="preserve">and diagonals. Each of their rows also carries </w:t>
+        <w:t>and diagonals, and since 2026-10-07 ratio backspreads. Each of their rows also</w:t>
+        <w:br/>
+        <w:t xml:space="preserve">carries </w:t>
       </w:r>
       <w:r>
         <w:rPr>
@@ -11895,8 +11897,7 @@
       </w:r>
       <w:r>
         <w:rPr/>
-        <w:t xml:space="preserve"> /</w:t>
-        <w:br/>
+        <w:t xml:space="preserve"> / </w:t>
       </w:r>
       <w:r>
         <w:rPr>
@@ -11920,7 +11921,35 @@
       </w:r>
       <w:r>
         <w:rPr/>
-        <w:t>, the family that built it) and, when it buys premium and</w:t>
+        <w:t xml:space="preserve"> / </w:t>
+      </w:r>
+      <w:r>
+        <w:rPr>
+          <w:rFonts w:ascii="Consolas" w:hAnsi="Consolas"/>
+          <w:color w:val="334455"/>
+          <w:sz w:val="19"/>
+        </w:rPr>
+        <w:t>RATIO</w:t>
+      </w:r>
+      <w:r>
+        <w:rPr/>
+        <w:t>,</w:t>
+        <w:br/>
+        <w:t xml:space="preserve">the family that built it), on a backspread </w:t>
+      </w:r>
+      <w:r>
+        <w:rPr>
+          <w:rFonts w:ascii="Consolas" w:hAnsi="Consolas"/>
+          <w:color w:val="334455"/>
+          <w:sz w:val="19"/>
+        </w:rPr>
+        <w:t>target_breakeven</w:t>
+      </w:r>
+      <w:r>
+        <w:rPr/>
+        <w:t xml:space="preserve"> (the far</w:t>
+        <w:br/>
+        <w:t>breakeven, the one the score reads), and, when it buys premium and</w:t>
         <w:br/>
         <w:t xml:space="preserve">was kept through an earnings report, </w:t>
       </w:r>

</xml_diff>

<commit_message>
docs(scanner): tracked structures in the help, the manuals, the design and the invariants
The hover guides, four manuals, the routes page, the changelog, the design
doc's Capture section (rewritten to what was built), the plan's status and
both CLAUDE.md files. The Captured Signals sections also lose the control
names the page dropped in September (Refresh marks, Close selected, Rec),
and the docs-coverage test now pins the button's real name.

Co-Authored-By: Claude Opus 5.5 <noreply@anthropic.com>
</commit_message>
<xml_diff>
--- a/docs/manuals/api-reference/api-reference.docx
+++ b/docs/manuals/api-reference/api-reference.docx
@@ -1588,6 +1588,18 @@
                 <w:sz w:val="19"/>
               </w:rPr>
               <w:t>:captured_closed</w:t>
+            </w:r>
+            <w:r>
+              <w:rPr/>
+              <w:t xml:space="preserve">, </w:t>
+            </w:r>
+            <w:r>
+              <w:rPr>
+                <w:rFonts w:ascii="Consolas" w:hAnsi="Consolas"/>
+                <w:color w:val="334455"/>
+                <w:sz w:val="19"/>
+              </w:rPr>
+              <w:t>:tracked</w:t>
             </w:r>
           </w:p>
         </w:tc>
@@ -11979,7 +11991,7 @@
         <w:br/>
         <w:t>A payload cached before the two lists existed validates with both empty. They are</w:t>
         <w:br/>
-        <w:t xml:space="preserve">not recorded, not pushed and not counted by </w:t>
+        <w:t xml:space="preserve">not pushed and not counted by </w:t>
       </w:r>
       <w:r>
         <w:rPr>
@@ -11991,11 +12003,488 @@
       </w:r>
       <w:r>
         <w:rPr/>
-        <w:t>. Do not assume</w:t>
-        <w:br/>
-        <w:t>one shape across the five lists, and do not rank a row of one shape against a row</w:t>
-        <w:br/>
-        <w:t>of the other.</w:t>
+        <w:t>; they are recorded as</w:t>
+        <w:br/>
+        <w:t>tracked rows (</w:t>
+      </w:r>
+      <w:r>
+        <w:rPr>
+          <w:rFonts w:ascii="Consolas" w:hAnsi="Consolas"/>
+          <w:color w:val="334455"/>
+          <w:sz w:val="19"/>
+        </w:rPr>
+        <w:t>cache:options:tracked</w:t>
+      </w:r>
+      <w:r>
+        <w:rPr/>
+        <w:t>, below). Do not assume one shape across the</w:t>
+        <w:br/>
+        <w:t>five lists, and do not rank a row of one shape against a row of the other.</w:t>
+      </w:r>
+    </w:p>
+    <w:p>
+      <w:r>
+        <w:rPr>
+          <w:rFonts w:ascii="Consolas" w:hAnsi="Consolas"/>
+          <w:color w:val="334455"/>
+          <w:sz w:val="19"/>
+        </w:rPr>
+        <w:t>cache:options:tracked</w:t>
+      </w:r>
+      <w:r>
+        <w:rPr/>
+        <w:t xml:space="preserve"> — the scanner's structures that are recorded to be</w:t>
+        <w:br/>
+        <w:t>measured, never traded (</w:t>
+      </w:r>
+      <w:r>
+        <w:rPr>
+          <w:rFonts w:ascii="Consolas" w:hAnsi="Consolas"/>
+          <w:color w:val="334455"/>
+          <w:sz w:val="19"/>
+        </w:rPr>
+        <w:t>services/options_svc/tracked.view</w:t>
+      </w:r>
+      <w:r>
+        <w:rPr/>
+        <w:t>). Published at</w:t>
+        <w:br/>
+        <w:t>service start, after each tracked cycle (every 15 minutes in session) and on</w:t>
+        <w:br/>
+      </w:r>
+      <w:r>
+        <w:rPr>
+          <w:rFonts w:ascii="Consolas" w:hAnsi="Consolas"/>
+          <w:color w:val="334455"/>
+          <w:sz w:val="19"/>
+        </w:rPr>
+        <w:t>captured_reload</w:t>
+      </w:r>
+      <w:r>
+        <w:rPr/>
+        <w:t>; an unchanged view is not rewritten.</w:t>
+      </w:r>
+    </w:p>
+    <w:p>
+      <w:pPr>
+        <w:spacing w:before="80" w:after="160"/>
+        <w:ind w:left="216"/>
+        <w:shd w:val="clear" w:color="auto" w:fill="F4F6FA"/>
+      </w:pPr>
+      <w:r>
+        <w:rPr>
+          <w:rFonts w:ascii="Consolas" w:hAnsi="Consolas"/>
+          <w:color w:val="223344"/>
+          <w:sz w:val="18"/>
+        </w:rPr>
+        <w:t>{date, counts: {open, closed, closed_today},</w:t>
+      </w:r>
+      <w:r>
+        <w:br/>
+      </w:r>
+      <w:r>
+        <w:rPr>
+          <w:rFonts w:ascii="Consolas" w:hAnsi="Consolas"/>
+          <w:color w:val="223344"/>
+          <w:sz w:val="18"/>
+        </w:rPr>
+        <w:t xml:space="preserve"> open:  [{signal_id, symbol, strategy, family, scanner_type, expiration,</w:t>
+      </w:r>
+      <w:r>
+        <w:br/>
+      </w:r>
+      <w:r>
+        <w:rPr>
+          <w:rFonts w:ascii="Consolas" w:hAnsi="Consolas"/>
+          <w:color w:val="223344"/>
+          <w:sz w:val="18"/>
+        </w:rPr>
+        <w:t xml:space="preserve">          dte_at_entry, entry_credit, entry_max_loss, entry_max_profit,</w:t>
+      </w:r>
+      <w:r>
+        <w:br/>
+      </w:r>
+      <w:r>
+        <w:rPr>
+          <w:rFonts w:ascii="Consolas" w:hAnsi="Consolas"/>
+          <w:color w:val="223344"/>
+          <w:sz w:val="18"/>
+        </w:rPr>
+        <w:t xml:space="preserve">          entry_score, entry_grade, entry_underlying, unbounded,</w:t>
+      </w:r>
+      <w:r>
+        <w:br/>
+      </w:r>
+      <w:r>
+        <w:rPr>
+          <w:rFonts w:ascii="Consolas" w:hAnsi="Consolas"/>
+          <w:color w:val="223344"/>
+          <w:sz w:val="18"/>
+        </w:rPr>
+        <w:t xml:space="preserve">          entry_spans_earnings, first_seen_ts, current_value, unrealized_pnl,</w:t>
+      </w:r>
+      <w:r>
+        <w:br/>
+      </w:r>
+      <w:r>
+        <w:rPr>
+          <w:rFonts w:ascii="Consolas" w:hAnsi="Consolas"/>
+          <w:color w:val="223344"/>
+          <w:sz w:val="18"/>
+        </w:rPr>
+        <w:t xml:space="preserve">          current_underlying, recommendation, recommendation_reason,</w:t>
+      </w:r>
+      <w:r>
+        <w:br/>
+      </w:r>
+      <w:r>
+        <w:rPr>
+          <w:rFonts w:ascii="Consolas" w:hAnsi="Consolas"/>
+          <w:color w:val="223344"/>
+          <w:sz w:val="18"/>
+        </w:rPr>
+        <w:t xml:space="preserve">          last_mark_ts, legs: [{kind, side, strike, expiration, qty, ...}]}],</w:t>
+      </w:r>
+      <w:r>
+        <w:br/>
+      </w:r>
+      <w:r>
+        <w:rPr>
+          <w:rFonts w:ascii="Consolas" w:hAnsi="Consolas"/>
+          <w:color w:val="223344"/>
+          <w:sz w:val="18"/>
+        </w:rPr>
+        <w:t xml:space="preserve"> closed_today: [{signal_id, symbol, strategy, exit_reason, exit_value,</w:t>
+      </w:r>
+      <w:r>
+        <w:br/>
+      </w:r>
+      <w:r>
+        <w:rPr>
+          <w:rFonts w:ascii="Consolas" w:hAnsi="Consolas"/>
+          <w:color w:val="223344"/>
+          <w:sz w:val="18"/>
+        </w:rPr>
+        <w:t xml:space="preserve">                 realized_pnl, close_ts, ...}],</w:t>
+      </w:r>
+      <w:r>
+        <w:br/>
+      </w:r>
+      <w:r>
+        <w:rPr>
+          <w:rFonts w:ascii="Consolas" w:hAnsi="Consolas"/>
+          <w:color w:val="223344"/>
+          <w:sz w:val="18"/>
+        </w:rPr>
+        <w:t xml:space="preserve"> stats: [{strategy, family, n, wins, win_pct, total_pnl, avg_r, unmarkable,</w:t>
+      </w:r>
+      <w:r>
+        <w:br/>
+      </w:r>
+      <w:r>
+        <w:rPr>
+          <w:rFonts w:ascii="Consolas" w:hAnsi="Consolas"/>
+          <w:color w:val="223344"/>
+          <w:sz w:val="18"/>
+        </w:rPr>
+        <w:t xml:space="preserve">          unbounded, through_earnings}]}</w:t>
+      </w:r>
+    </w:p>
+    <w:p>
+      <w:r>
+        <w:rPr>
+          <w:rFonts w:ascii="Consolas" w:hAnsi="Consolas"/>
+          <w:color w:val="334455"/>
+          <w:sz w:val="19"/>
+        </w:rPr>
+        <w:t>entry_credit</w:t>
+      </w:r>
+      <w:r>
+        <w:rPr/>
+        <w:t xml:space="preserve">, </w:t>
+      </w:r>
+      <w:r>
+        <w:rPr>
+          <w:rFonts w:ascii="Consolas" w:hAnsi="Consolas"/>
+          <w:color w:val="334455"/>
+          <w:sz w:val="19"/>
+        </w:rPr>
+        <w:t>current_value</w:t>
+      </w:r>
+      <w:r>
+        <w:rPr/>
+        <w:t xml:space="preserve">, </w:t>
+      </w:r>
+      <w:r>
+        <w:rPr>
+          <w:rFonts w:ascii="Consolas" w:hAnsi="Consolas"/>
+          <w:color w:val="334455"/>
+          <w:sz w:val="19"/>
+        </w:rPr>
+        <w:t>exit_value</w:t>
+      </w:r>
+      <w:r>
+        <w:rPr/>
+        <w:t xml:space="preserve">, </w:t>
+      </w:r>
+      <w:r>
+        <w:rPr>
+          <w:rFonts w:ascii="Consolas" w:hAnsi="Consolas"/>
+          <w:color w:val="334455"/>
+          <w:sz w:val="19"/>
+        </w:rPr>
+        <w:t>entry_max_loss</w:t>
+      </w:r>
+      <w:r>
+        <w:rPr/>
+        <w:t xml:space="preserve"> and</w:t>
+        <w:br/>
+      </w:r>
+      <w:r>
+        <w:rPr>
+          <w:rFonts w:ascii="Consolas" w:hAnsi="Consolas"/>
+          <w:color w:val="334455"/>
+          <w:sz w:val="19"/>
+        </w:rPr>
+        <w:t>entry_max_profit</w:t>
+      </w:r>
+      <w:r>
+        <w:rPr/>
+        <w:t xml:space="preserve"> are per share. </w:t>
+      </w:r>
+      <w:r>
+        <w:rPr>
+          <w:rFonts w:ascii="Consolas" w:hAnsi="Consolas"/>
+          <w:color w:val="334455"/>
+          <w:sz w:val="19"/>
+        </w:rPr>
+        <w:t>entry_credit</w:t>
+      </w:r>
+      <w:r>
+        <w:rPr/>
+        <w:t xml:space="preserve"> is signed (a debit is negative),</w:t>
+        <w:br/>
+        <w:t xml:space="preserve">and </w:t>
+      </w:r>
+      <w:r>
+        <w:rPr>
+          <w:rFonts w:ascii="Consolas" w:hAnsi="Consolas"/>
+          <w:color w:val="334455"/>
+          <w:sz w:val="19"/>
+        </w:rPr>
+        <w:t>current_value</w:t>
+      </w:r>
+      <w:r>
+        <w:rPr/>
+        <w:t xml:space="preserve"> / </w:t>
+      </w:r>
+      <w:r>
+        <w:rPr>
+          <w:rFonts w:ascii="Consolas" w:hAnsi="Consolas"/>
+          <w:color w:val="334455"/>
+          <w:sz w:val="19"/>
+        </w:rPr>
+        <w:t>exit_value</w:t>
+      </w:r>
+      <w:r>
+        <w:rPr/>
+        <w:t xml:space="preserve"> are the cost to close, so a position worth</w:t>
+        <w:br/>
+        <w:t xml:space="preserve">money carries a negative one. </w:t>
+      </w:r>
+      <w:r>
+        <w:rPr>
+          <w:rFonts w:ascii="Consolas" w:hAnsi="Consolas"/>
+          <w:color w:val="334455"/>
+          <w:sz w:val="19"/>
+        </w:rPr>
+        <w:t>unrealized_pnl</w:t>
+      </w:r>
+      <w:r>
+        <w:rPr/>
+        <w:t xml:space="preserve"> and </w:t>
+      </w:r>
+      <w:r>
+        <w:rPr>
+          <w:rFonts w:ascii="Consolas" w:hAnsi="Consolas"/>
+          <w:color w:val="334455"/>
+          <w:sz w:val="19"/>
+        </w:rPr>
+        <w:t>realized_pnl</w:t>
+      </w:r>
+      <w:r>
+        <w:rPr/>
+        <w:t xml:space="preserve"> are dollars for</w:t>
+        <w:br/>
+        <w:t xml:space="preserve">one contract. </w:t>
+      </w:r>
+      <w:r>
+        <w:rPr>
+          <w:rFonts w:ascii="Consolas" w:hAnsi="Consolas"/>
+          <w:color w:val="334455"/>
+          <w:sz w:val="19"/>
+        </w:rPr>
+        <w:t>realized_pnl: null</w:t>
+      </w:r>
+      <w:r>
+        <w:rPr/>
+        <w:t xml:space="preserve"> with </w:t>
+      </w:r>
+      <w:r>
+        <w:rPr>
+          <w:rFonts w:ascii="Consolas" w:hAnsi="Consolas"/>
+          <w:color w:val="334455"/>
+          <w:sz w:val="19"/>
+        </w:rPr>
+        <w:t>exit_reason: "UNMARKABLE"</w:t>
+      </w:r>
+      <w:r>
+        <w:rPr/>
+        <w:t xml:space="preserve"> means the row</w:t>
+        <w:br/>
+        <w:t xml:space="preserve">has no result; it is not a zero. </w:t>
+      </w:r>
+      <w:r>
+        <w:rPr>
+          <w:rFonts w:ascii="Consolas" w:hAnsi="Consolas"/>
+          <w:color w:val="334455"/>
+          <w:sz w:val="19"/>
+        </w:rPr>
+        <w:t>expiration</w:t>
+      </w:r>
+      <w:r>
+        <w:rPr/>
+        <w:t xml:space="preserve"> is the FRONT expiration; a calendar's</w:t>
+        <w:br/>
+        <w:t>back month is on its second leg.</w:t>
+      </w:r>
+    </w:p>
+    <w:p>
+      <w:r>
+        <w:rPr>
+          <w:b/>
+        </w:rPr>
+        <w:t xml:space="preserve">Reading </w:t>
+      </w:r>
+      <w:r>
+        <w:rPr>
+          <w:rFonts w:ascii="Consolas" w:hAnsi="Consolas"/>
+          <w:color w:val="334455"/>
+          <w:sz w:val="19"/>
+        </w:rPr>
+        <w:t>signals.db</w:t>
+      </w:r>
+      <w:r>
+        <w:rPr>
+          <w:b/>
+        </w:rPr>
+        <w:t xml:space="preserve"> yourself.</w:t>
+      </w:r>
+      <w:r>
+        <w:rPr/>
+        <w:t xml:space="preserve"> Tracked rows have </w:t>
+      </w:r>
+      <w:r>
+        <w:rPr>
+          <w:rFonts w:ascii="Consolas" w:hAnsi="Consolas"/>
+          <w:color w:val="334455"/>
+          <w:sz w:val="19"/>
+        </w:rPr>
+        <w:t>scanner_type</w:t>
+      </w:r>
+      <w:r>
+        <w:rPr/>
+        <w:t xml:space="preserve"> </w:t>
+      </w:r>
+      <w:r>
+        <w:rPr>
+          <w:rFonts w:ascii="Consolas" w:hAnsi="Consolas"/>
+          <w:color w:val="334455"/>
+          <w:sz w:val="19"/>
+        </w:rPr>
+        <w:t>0DTE_STRUCT</w:t>
+      </w:r>
+      <w:r>
+        <w:rPr/>
+        <w:br/>
+        <w:t xml:space="preserve">or </w:t>
+      </w:r>
+      <w:r>
+        <w:rPr>
+          <w:rFonts w:ascii="Consolas" w:hAnsi="Consolas"/>
+          <w:color w:val="334455"/>
+          <w:sz w:val="19"/>
+        </w:rPr>
+        <w:t>SWING_STRUCT</w:t>
+      </w:r>
+      <w:r>
+        <w:rPr/>
+        <w:t xml:space="preserve"> (</w:t>
+      </w:r>
+      <w:r>
+        <w:rPr>
+          <w:rFonts w:ascii="Consolas" w:hAnsi="Consolas"/>
+          <w:color w:val="334455"/>
+          <w:sz w:val="19"/>
+        </w:rPr>
+        <w:t>shared.structures.TRACKED_SCANNER_TYPES</w:t>
+      </w:r>
+      <w:r>
+        <w:rPr/>
+        <w:t>) and no strike</w:t>
+        <w:br/>
+        <w:t xml:space="preserve">columns. Every multi-row reader in </w:t>
+      </w:r>
+      <w:r>
+        <w:rPr>
+          <w:rFonts w:ascii="Consolas" w:hAnsi="Consolas"/>
+          <w:color w:val="334455"/>
+          <w:sz w:val="19"/>
+        </w:rPr>
+        <w:t>signal_db</w:t>
+      </w:r>
+      <w:r>
+        <w:rPr/>
+        <w:t xml:space="preserve"> leaves them out unless called with</w:t>
+        <w:br/>
+      </w:r>
+      <w:r>
+        <w:rPr>
+          <w:rFonts w:ascii="Consolas" w:hAnsi="Consolas"/>
+          <w:color w:val="334455"/>
+          <w:sz w:val="19"/>
+        </w:rPr>
+        <w:t>tracked=True</w:t>
+      </w:r>
+      <w:r>
+        <w:rPr/>
+        <w:t xml:space="preserve">, which returns only them. A query of your own over </w:t>
+      </w:r>
+      <w:r>
+        <w:rPr>
+          <w:rFonts w:ascii="Consolas" w:hAnsi="Consolas"/>
+          <w:color w:val="334455"/>
+          <w:sz w:val="19"/>
+        </w:rPr>
+        <w:t>signals</w:t>
+      </w:r>
+      <w:r>
+        <w:rPr/>
+        <w:t xml:space="preserve"> must</w:t>
+        <w:br/>
+        <w:t xml:space="preserve">add </w:t>
+      </w:r>
+      <w:r>
+        <w:rPr>
+          <w:rFonts w:ascii="Consolas" w:hAnsi="Consolas"/>
+          <w:color w:val="334455"/>
+          <w:sz w:val="19"/>
+        </w:rPr>
+        <w:t>shared.structures.not_tracked_sql(prefix)</w:t>
+      </w:r>
+      <w:r>
+        <w:rPr/>
+        <w:t xml:space="preserve"> unless it means to read them.</w:t>
       </w:r>
     </w:p>
     <w:p>

</xml_diff>

<commit_message>
docs(desk): Headlines in the fourth panel, no positions on the Desk
The User Guide, Reference Guide, Technical Reference and API Reference
no longer describe a Positions panel or a spoken position alert on the
Desk, and say where positions are shown instead. The route reference
and the two webgui reference files follow, CLAUDE.md names the one new
Tier-1 config read, and the CHANGELOG has the entry.

Co-Authored-By: Claude Opus 5.5 <noreply@anthropic.com>
</commit_message>
<xml_diff>
--- a/docs/manuals/api-reference/api-reference.docx
+++ b/docs/manuals/api-reference/api-reference.docx
@@ -32,7 +32,7 @@
           <w:color w:val="5B6678"/>
           <w:sz w:val="18"/>
         </w:rPr>
-        <w:t>NeuralStrike · Generated 2026-10-07</w:t>
+        <w:t>NeuralStrike · Generated 2026-10-11</w:t>
       </w:r>
     </w:p>
     <w:p/>
@@ -799,7 +799,7 @@
             </w:r>
             <w:r>
               <w:rPr/>
-              <w:t>); also the Desk's headlines strip (</w:t>
+              <w:t>); also the Desk's Headlines panel (</w:t>
             </w:r>
             <w:r>
               <w:rPr>

</xml_diff>

<commit_message>
docs: renewing the Schwab sign-in in the app
The manuals, the two environment references and both CLAUDE.md files
describe the Authorize dialog, the two proxy routes behind it, and the
rule that a token refresh does not extend the 7-day sign-in.

Co-Authored-By: Claude Opus 5.5 <noreply@anthropic.com>
</commit_message>
<xml_diff>
--- a/docs/manuals/api-reference/api-reference.docx
+++ b/docs/manuals/api-reference/api-reference.docx
@@ -22732,7 +22732,7 @@
             </w:r>
             <w:r>
               <w:rPr/>
-              <w:t xml:space="preserve"> is what the daily sign-in check reads (null when unknown). </w:t>
+              <w:t xml:space="preserve"> is what the daily sign-in check reads (null when unknown); it counts down from 168 at the sign-in and a token refresh does not reset it. </w:t>
             </w:r>
             <w:r>
               <w:rPr>
@@ -22876,6 +22876,137 @@
             <w:r>
               <w:rPr/>
               <w:t xml:space="preserve"> for tokens</w:t>
+            </w:r>
+          </w:p>
+        </w:tc>
+      </w:tr>
+      <w:tr>
+        <w:tc>
+          <w:tcPr>
+            <w:tcW w:type="dxa" w:w="2880"/>
+            <w:shd w:val="clear" w:color="auto" w:fill="F4F6FA"/>
+          </w:tcPr>
+          <w:p>
+            <w:r/>
+            <w:r>
+              <w:rPr>
+                <w:rFonts w:ascii="Consolas" w:hAnsi="Consolas"/>
+                <w:color w:val="334455"/>
+                <w:sz w:val="19"/>
+              </w:rPr>
+              <w:t>/auth/info</w:t>
+            </w:r>
+          </w:p>
+        </w:tc>
+        <w:tc>
+          <w:tcPr>
+            <w:tcW w:type="dxa" w:w="2880"/>
+            <w:shd w:val="clear" w:color="auto" w:fill="F4F6FA"/>
+          </w:tcPr>
+          <w:p>
+            <w:r/>
+            <w:r>
+              <w:rPr/>
+              <w:t>GET</w:t>
+            </w:r>
+          </w:p>
+        </w:tc>
+        <w:tc>
+          <w:tcPr>
+            <w:tcW w:type="dxa" w:w="2880"/>
+            <w:shd w:val="clear" w:color="auto" w:fill="F4F6FA"/>
+          </w:tcPr>
+          <w:p>
+            <w:r/>
+            <w:r>
+              <w:rPr>
+                <w:rFonts w:ascii="Consolas" w:hAnsi="Consolas"/>
+                <w:color w:val="334455"/>
+                <w:sz w:val="19"/>
+              </w:rPr>
+              <w:t>{auth_url, callback_url}</w:t>
+            </w:r>
+            <w:r>
+              <w:rPr/>
+              <w:t xml:space="preserve"> — Schwab's login link for this app, for the web app's Authorize dialog. Carries the app key (a public client id), never the secret</w:t>
+            </w:r>
+          </w:p>
+        </w:tc>
+      </w:tr>
+      <w:tr>
+        <w:tc>
+          <w:tcPr>
+            <w:tcW w:type="dxa" w:w="2880"/>
+          </w:tcPr>
+          <w:p>
+            <w:r/>
+            <w:r>
+              <w:rPr>
+                <w:rFonts w:ascii="Consolas" w:hAnsi="Consolas"/>
+                <w:color w:val="334455"/>
+                <w:sz w:val="19"/>
+              </w:rPr>
+              <w:t>/auth/exchange</w:t>
+            </w:r>
+          </w:p>
+        </w:tc>
+        <w:tc>
+          <w:tcPr>
+            <w:tcW w:type="dxa" w:w="2880"/>
+          </w:tcPr>
+          <w:p>
+            <w:r/>
+            <w:r>
+              <w:rPr/>
+              <w:t>POST</w:t>
+            </w:r>
+          </w:p>
+        </w:tc>
+        <w:tc>
+          <w:tcPr>
+            <w:tcW w:type="dxa" w:w="2880"/>
+          </w:tcPr>
+          <w:p>
+            <w:r/>
+            <w:r>
+              <w:rPr/>
+              <w:t xml:space="preserve">Body </w:t>
+            </w:r>
+            <w:r>
+              <w:rPr>
+                <w:rFonts w:ascii="Consolas" w:hAnsi="Consolas"/>
+                <w:color w:val="334455"/>
+                <w:sz w:val="19"/>
+              </w:rPr>
+              <w:t>{"url": "&lt;the address Schwab redirected to&gt;"}</w:t>
+            </w:r>
+            <w:r>
+              <w:rPr/>
+              <w:t xml:space="preserve">. Signs in and answers </w:t>
+            </w:r>
+            <w:r>
+              <w:rPr>
+                <w:rFonts w:ascii="Consolas" w:hAnsi="Consolas"/>
+                <w:color w:val="334455"/>
+                <w:sz w:val="19"/>
+              </w:rPr>
+              <w:t>{"ok": true}</w:t>
+            </w:r>
+            <w:r>
+              <w:rPr/>
+              <w:t xml:space="preserve">; </w:t>
+            </w:r>
+            <w:r>
+              <w:rPr>
+                <w:rFonts w:ascii="Consolas" w:hAnsi="Consolas"/>
+                <w:color w:val="334455"/>
+                <w:sz w:val="19"/>
+              </w:rPr>
+              <w:t>{"ok": false, "error": ...}</w:t>
+            </w:r>
+            <w:r>
+              <w:rPr/>
+              <w:t xml:space="preserve"> with 400 when the address holds no code, 502 when Schwab refuses it. A POST so the one-time code is not in the access log</w:t>
             </w:r>
           </w:p>
         </w:tc>

</xml_diff>

<commit_message>
docs(manuals): architecture diagrams in the Technical and API References
Five diagrams, each drawn once in docs/manuals/diagrams/make_diagrams.py
(matplotlib, SVG + PNG): the system overview, one request end to end, the
systemd start order, the one-minute GEX collection with tee, and the planned
raw feed (unbuilt parts dashed). A manual places one with
{{diagram: <name> | Caption}}: build_docs inlines the SVG into the HTML (each
manual stays one self-contained file the app can serve) and embeds the PNG in
the .docx. The inlined SVG loses matplotlib's global <style> and gets ids of
its own. The two stale ASCII tier pictures (five services of seven) are
replaced, and the Technical Reference gains a section on the one-minute
collection, tee and cache:feed:shadow. tests/test_manual_diagrams.py pins it.

Co-Authored-By: Claude Opus 5.5 <noreply@anthropic.com>
</commit_message>
<xml_diff>
--- a/docs/manuals/api-reference/api-reference.docx
+++ b/docs/manuals/api-reference/api-reference.docx
@@ -32,7 +32,7 @@
           <w:color w:val="5B6678"/>
           <w:sz w:val="18"/>
         </w:rPr>
-        <w:t>NeuralStrike · Generated 2026-10-13</w:t>
+        <w:t>NeuralStrike · Generated 2026-10-15</w:t>
       </w:r>
     </w:p>
     <w:p/>
@@ -2174,83 +2174,54 @@
     </w:p>
     <w:p>
       <w:pPr>
-        <w:spacing w:before="80" w:after="160"/>
-        <w:ind w:left="216"/>
-        <w:shd w:val="clear" w:color="auto" w:fill="F4F6FA"/>
+        <w:jc w:val="center"/>
       </w:pPr>
       <w:r>
-        <w:rPr>
-          <w:rFonts w:ascii="Consolas" w:hAnsi="Consolas"/>
-          <w:color w:val="223344"/>
-          <w:sz w:val="18"/>
-        </w:rPr>
-        <w:t>TIER 1  GUI (webgui, :8500)  ──enqueue command──▶  cmd:{domain}  (Redis Stream)</w:t>
-      </w:r>
-      <w:r>
-        <w:br/>
-      </w:r>
-      <w:r>
-        <w:rPr>
-          <w:rFonts w:ascii="Consolas" w:hAnsi="Consolas"/>
-          <w:color w:val="223344"/>
-          <w:sz w:val="18"/>
-        </w:rPr>
-        <w:t xml:space="preserve">        ▲                                                  │</w:t>
-      </w:r>
-      <w:r>
-        <w:br/>
-      </w:r>
-      <w:r>
-        <w:rPr>
-          <w:rFonts w:ascii="Consolas" w:hAnsi="Consolas"/>
-          <w:color w:val="223344"/>
-          <w:sz w:val="18"/>
-        </w:rPr>
-        <w:t xml:space="preserve">        │  read cache / subscribe events                   ▼</w:t>
-      </w:r>
-      <w:r>
-        <w:br/>
-      </w:r>
-      <w:r>
-        <w:rPr>
-          <w:rFonts w:ascii="Consolas" w:hAnsi="Consolas"/>
-          <w:color w:val="223344"/>
-          <w:sz w:val="18"/>
-        </w:rPr>
-        <w:t>TIER 3  Redis (:6379)  ◀──cache_set + publish──  TIER 2  services</w:t>
-      </w:r>
-      <w:r>
-        <w:br/>
-      </w:r>
-      <w:r>
-        <w:rPr>
-          <w:rFonts w:ascii="Consolas" w:hAnsi="Consolas"/>
-          <w:color w:val="223344"/>
-          <w:sz w:val="18"/>
-        </w:rPr>
-        <w:t xml:space="preserve">        ▲                                                  │</w:t>
-      </w:r>
-      <w:r>
-        <w:br/>
-      </w:r>
-      <w:r>
-        <w:rPr>
-          <w:rFonts w:ascii="Consolas" w:hAnsi="Consolas"/>
-          <w:color w:val="223344"/>
-          <w:sz w:val="18"/>
-        </w:rPr>
-        <w:t xml:space="preserve">        │                                                  ▼  market data</w:t>
-      </w:r>
-      <w:r>
-        <w:br/>
-      </w:r>
-      <w:r>
-        <w:rPr>
-          <w:rFonts w:ascii="Consolas" w:hAnsi="Consolas"/>
-          <w:color w:val="223344"/>
-          <w:sz w:val="18"/>
-        </w:rPr>
-        <w:t xml:space="preserve">        └──────────────  schwab-proxy (:8100)  ◀───────────┘</w:t>
+        <w:drawing>
+          <wp:inline xmlns:a="http://schemas.openxmlformats.org/drawingml/2006/main" xmlns:pic="http://schemas.openxmlformats.org/drawingml/2006/picture">
+            <wp:extent cx="5760720" cy="4205326"/>
+            <wp:docPr id="1" name="Picture 1"/>
+            <wp:cNvGraphicFramePr>
+              <a:graphicFrameLocks noChangeAspect="1"/>
+            </wp:cNvGraphicFramePr>
+            <a:graphic>
+              <a:graphicData uri="http://schemas.openxmlformats.org/drawingml/2006/picture">
+                <pic:pic>
+                  <pic:nvPicPr>
+                    <pic:cNvPr id="0" name="system-overview.png"/>
+                    <pic:cNvPicPr/>
+                  </pic:nvPicPr>
+                  <pic:blipFill>
+                    <a:blip r:embed="rId9"/>
+                    <a:stretch>
+                      <a:fillRect/>
+                    </a:stretch>
+                  </pic:blipFill>
+                  <pic:spPr>
+                    <a:xfrm>
+                      <a:off x="0" y="0"/>
+                      <a:ext cx="5760720" cy="4205326"/>
+                    </a:xfrm>
+                    <a:prstGeom prst="rect"/>
+                  </pic:spPr>
+                </pic:pic>
+              </a:graphicData>
+            </a:graphic>
+          </wp:inline>
+        </w:drawing>
+      </w:r>
+    </w:p>
+    <w:p>
+      <w:pPr>
+        <w:jc w:val="center"/>
+      </w:pPr>
+      <w:r>
+        <w:rPr>
+          <w:i/>
+          <w:color w:val="5B6678"/>
+          <w:sz w:val="17"/>
+        </w:rPr>
+        <w:t>The processes, the three tiers and what each one talks to</w:t>
       </w:r>
     </w:p>
     <w:p>
@@ -7113,6 +7084,208 @@
         <w:rPr>
           <w:b/>
         </w:rPr>
+        <w:t>GEX collection and the raw feed.</w:t>
+      </w:r>
+      <w:r>
+        <w:rPr/>
+        <w:t xml:space="preserve"> Each one-minute poll is</w:t>
+        <w:br/>
+      </w:r>
+      <w:r>
+        <w:rPr>
+          <w:rFonts w:ascii="Consolas" w:hAnsi="Consolas"/>
+          <w:color w:val="334455"/>
+          <w:sz w:val="19"/>
+        </w:rPr>
+        <w:t>gex_collector.fetch_minute</w:t>
+      </w:r>
+      <w:r>
+        <w:rPr/>
+        <w:t xml:space="preserve"> (the chains, through the proxy) then </w:t>
+      </w:r>
+      <w:r>
+        <w:rPr>
+          <w:rFonts w:ascii="Consolas" w:hAnsi="Consolas"/>
+          <w:color w:val="334455"/>
+          <w:sz w:val="19"/>
+        </w:rPr>
+        <w:t>derive_minute</w:t>
+      </w:r>
+      <w:r>
+        <w:rPr/>
+        <w:br/>
+        <w:t xml:space="preserve">(the rows in </w:t>
+      </w:r>
+      <w:r>
+        <w:rPr>
+          <w:rFonts w:ascii="Consolas" w:hAnsi="Consolas"/>
+          <w:color w:val="334455"/>
+          <w:sz w:val="19"/>
+        </w:rPr>
+        <w:t>gex_history.db</w:t>
+      </w:r>
+      <w:r>
+        <w:rPr/>
+        <w:t xml:space="preserve">, priced at the minute). In </w:t>
+      </w:r>
+      <w:r>
+        <w:rPr>
+          <w:rFonts w:ascii="Consolas" w:hAnsi="Consolas"/>
+          <w:color w:val="334455"/>
+          <w:sz w:val="19"/>
+        </w:rPr>
+        <w:t>config/feed.toml</w:t>
+      </w:r>
+      <w:r>
+        <w:rPr/>
+        <w:br/>
+      </w:r>
+      <w:r>
+        <w:rPr>
+          <w:rFonts w:ascii="Consolas" w:hAnsi="Consolas"/>
+          <w:color w:val="334455"/>
+          <w:sz w:val="19"/>
+        </w:rPr>
+        <w:t>[feed] mode = "tee"</w:t>
+      </w:r>
+      <w:r>
+        <w:rPr/>
+        <w:t xml:space="preserve"> the fetched minute is also written to the raw chain store</w:t>
+        <w:br/>
+        <w:t>(</w:t>
+      </w:r>
+      <w:r>
+        <w:rPr>
+          <w:rFonts w:ascii="Consolas" w:hAnsi="Consolas"/>
+          <w:color w:val="334455"/>
+          <w:sz w:val="19"/>
+        </w:rPr>
+        <w:t>shared/raw_store.py</w:t>
+      </w:r>
+      <w:r>
+        <w:rPr/>
+        <w:t xml:space="preserve">: one SQLite file per session, tables </w:t>
+      </w:r>
+      <w:r>
+        <w:rPr>
+          <w:rFonts w:ascii="Consolas" w:hAnsi="Consolas"/>
+          <w:color w:val="334455"/>
+          <w:sz w:val="19"/>
+        </w:rPr>
+        <w:t>chains</w:t>
+      </w:r>
+      <w:r>
+        <w:rPr/>
+        <w:t xml:space="preserve">, </w:t>
+      </w:r>
+      <w:r>
+        <w:rPr>
+          <w:rFonts w:ascii="Consolas" w:hAnsi="Consolas"/>
+          <w:color w:val="334455"/>
+          <w:sz w:val="19"/>
+        </w:rPr>
+        <w:t>minutes</w:t>
+      </w:r>
+      <w:r>
+        <w:rPr/>
+        <w:t>,</w:t>
+        <w:br/>
+      </w:r>
+      <w:r>
+        <w:rPr>
+          <w:rFonts w:ascii="Consolas" w:hAnsi="Consolas"/>
+          <w:color w:val="334455"/>
+          <w:sz w:val="19"/>
+        </w:rPr>
+        <w:t>gaps</w:t>
+      </w:r>
+      <w:r>
+        <w:rPr/>
+        <w:t>), and a shadow check re-derives it and publishes its counts and timings to</w:t>
+        <w:br/>
+      </w:r>
+      <w:r>
+        <w:rPr>
+          <w:rFonts w:ascii="Consolas" w:hAnsi="Consolas"/>
+          <w:color w:val="334455"/>
+          <w:sz w:val="19"/>
+        </w:rPr>
+        <w:t>cache:feed:shadow</w:t>
+      </w:r>
+      <w:r>
+        <w:rPr/>
+        <w:t xml:space="preserve">. It adds no Schwab call. The Technical Reference's </w:t>
+      </w:r>
+      <w:r>
+        <w:rPr>
+          <w:i/>
+        </w:rPr>
+        <w:t>The</w:t>
+        <w:br/>
+        <w:t>one-minute GEX collection and the raw feed</w:t>
+      </w:r>
+      <w:r>
+        <w:rPr/>
+        <w:t xml:space="preserve"> has the diagrams and fields.</w:t>
+      </w:r>
+    </w:p>
+    <w:p>
+      <w:pPr>
+        <w:jc w:val="center"/>
+      </w:pPr>
+      <w:r>
+        <w:drawing>
+          <wp:inline xmlns:a="http://schemas.openxmlformats.org/drawingml/2006/main" xmlns:pic="http://schemas.openxmlformats.org/drawingml/2006/picture">
+            <wp:extent cx="5760720" cy="2880360"/>
+            <wp:docPr id="2" name="Picture 2"/>
+            <wp:cNvGraphicFramePr>
+              <a:graphicFrameLocks noChangeAspect="1"/>
+            </wp:cNvGraphicFramePr>
+            <a:graphic>
+              <a:graphicData uri="http://schemas.openxmlformats.org/drawingml/2006/picture">
+                <pic:pic>
+                  <pic:nvPicPr>
+                    <pic:cNvPr id="0" name="minute-collection.png"/>
+                    <pic:cNvPicPr/>
+                  </pic:nvPicPr>
+                  <pic:blipFill>
+                    <a:blip r:embed="rId10"/>
+                    <a:stretch>
+                      <a:fillRect/>
+                    </a:stretch>
+                  </pic:blipFill>
+                  <pic:spPr>
+                    <a:xfrm>
+                      <a:off x="0" y="0"/>
+                      <a:ext cx="5760720" cy="2880360"/>
+                    </a:xfrm>
+                    <a:prstGeom prst="rect"/>
+                  </pic:spPr>
+                </pic:pic>
+              </a:graphicData>
+            </a:graphic>
+          </wp:inline>
+        </w:drawing>
+      </w:r>
+    </w:p>
+    <w:p>
+      <w:pPr>
+        <w:jc w:val="center"/>
+      </w:pPr>
+      <w:r>
+        <w:rPr>
+          <w:i/>
+          <w:color w:val="5B6678"/>
+          <w:sz w:val="17"/>
+        </w:rPr>
+        <w:t>The one-minute collection today, and what tee adds beside it</w:t>
+      </w:r>
+    </w:p>
+    <w:p>
+      <w:r>
+        <w:rPr>
+          <w:b/>
+        </w:rPr>
         <w:t>Commands (</w:t>
       </w:r>
       <w:r>
@@ -27906,6 +28079,17 @@
           <w:color w:val="223344"/>
           <w:sz w:val="18"/>
         </w:rPr>
+        <w:t>cache:feed:shadow                                           (config/feed.toml mode "tee" only: the shadow check's counts and timings)</w:t>
+      </w:r>
+      <w:r>
+        <w:br/>
+      </w:r>
+      <w:r>
+        <w:rPr>
+          <w:rFonts w:ascii="Consolas" w:hAnsi="Consolas"/>
+          <w:color w:val="223344"/>
+          <w:sz w:val="18"/>
+        </w:rPr>
         <w:t>cache:options:x_log                                         (every X post attempt, newest first, last 100)</w:t>
       </w:r>
       <w:r>
@@ -29738,6 +29922,58 @@
       <w:r>
         <w:rPr/>
         <w:t>End-to-End Flow Example</w:t>
+      </w:r>
+    </w:p>
+    <w:p>
+      <w:pPr>
+        <w:jc w:val="center"/>
+      </w:pPr>
+      <w:r>
+        <w:drawing>
+          <wp:inline xmlns:a="http://schemas.openxmlformats.org/drawingml/2006/main" xmlns:pic="http://schemas.openxmlformats.org/drawingml/2006/picture">
+            <wp:extent cx="5760720" cy="1497787"/>
+            <wp:docPr id="3" name="Picture 3"/>
+            <wp:cNvGraphicFramePr>
+              <a:graphicFrameLocks noChangeAspect="1"/>
+            </wp:cNvGraphicFramePr>
+            <a:graphic>
+              <a:graphicData uri="http://schemas.openxmlformats.org/drawingml/2006/picture">
+                <pic:pic>
+                  <pic:nvPicPr>
+                    <pic:cNvPr id="0" name="request-flow.png"/>
+                    <pic:cNvPicPr/>
+                  </pic:nvPicPr>
+                  <pic:blipFill>
+                    <a:blip r:embed="rId11"/>
+                    <a:stretch>
+                      <a:fillRect/>
+                    </a:stretch>
+                  </pic:blipFill>
+                  <pic:spPr>
+                    <a:xfrm>
+                      <a:off x="0" y="0"/>
+                      <a:ext cx="5760720" cy="1497787"/>
+                    </a:xfrm>
+                    <a:prstGeom prst="rect"/>
+                  </pic:spPr>
+                </pic:pic>
+              </a:graphicData>
+            </a:graphic>
+          </wp:inline>
+        </w:drawing>
+      </w:r>
+    </w:p>
+    <w:p>
+      <w:pPr>
+        <w:jc w:val="center"/>
+      </w:pPr>
+      <w:r>
+        <w:rPr>
+          <w:i/>
+          <w:color w:val="5B6678"/>
+          <w:sz w:val="17"/>
+        </w:rPr>
+        <w:t>One request, from a click to the repaint</w:t>
       </w:r>
     </w:p>
     <w:p>
@@ -31639,7 +31875,7 @@
     </w:tbl>
     <w:p/>
     <w:sectPr>
-      <w:footerReference w:type="default" r:id="rId9"/>
+      <w:footerReference w:type="default" r:id="rId12"/>
       <w:pgSz w:w="12240" w:h="15840"/>
       <w:pgMar w:top="1440" w:right="1800" w:bottom="1440" w:left="1800" w:header="720" w:footer="720" w:gutter="0"/>
       <w:cols w:space="720"/>

</xml_diff>

<commit_message>
feat(desk): status inside the header buttons, and a glow while new
The Market read and Market report buttons now carry their one-line status
as a caption inside the button (kit.button caption=). Either button glows
(a pulsing cyan box-shadow, static under reduced motion) while its latest
update is under five minutes old: the read's ts, and the report's new
published_ts, which is latest.html's mtime so a market_svc restart
republishing the same report does not read as new.

The window is config/market_read.toml glow_min (0 = never), carried on
cache:market:read because Tier 1 reads no service config; the Desk's
GLOW_FRESH_MIN fallback is pinned to that default. Help text, four manuals
and the CHANGELOG updated.

Co-Authored-By: Claude Opus 5.5 <noreply@anthropic.com>
</commit_message>
<xml_diff>
--- a/docs/manuals/api-reference/api-reference.docx
+++ b/docs/manuals/api-reference/api-reference.docx
@@ -32,7 +32,7 @@
           <w:color w:val="5B6678"/>
           <w:sz w:val="18"/>
         </w:rPr>
-        <w:t>NeuralStrike · Generated 2026-10-15</w:t>
+        <w:t>NeuralStrike · Generated 2026-10-16</w:t>
       </w:r>
     </w:p>
     <w:p/>
@@ -5524,7 +5524,43 @@
             </w:r>
             <w:r>
               <w:rPr/>
-              <w:t>, the report itself, which the Desk frames in a dialog; the version changes with the report and is omitted when the stamp is unknown). Empty until a report has been published.</w:t>
+              <w:t xml:space="preserve">, the report itself, which the Desk frames in a dialog; the version changes with the report and is omitted when the stamp is unknown), </w:t>
+            </w:r>
+            <w:r>
+              <w:rPr>
+                <w:rFonts w:ascii="Consolas" w:hAnsi="Consolas"/>
+                <w:color w:val="334455"/>
+                <w:sz w:val="19"/>
+              </w:rPr>
+              <w:t>published_ts</w:t>
+            </w:r>
+            <w:r>
+              <w:rPr/>
+              <w:t xml:space="preserve"> (unix seconds </w:t>
+            </w:r>
+            <w:r>
+              <w:rPr>
+                <w:rFonts w:ascii="Consolas" w:hAnsi="Consolas"/>
+                <w:color w:val="334455"/>
+                <w:sz w:val="19"/>
+              </w:rPr>
+              <w:t>latest.html</w:t>
+            </w:r>
+            <w:r>
+              <w:rPr/>
+              <w:t xml:space="preserve"> was written, so a restart republishing the same report keeps its time; </w:t>
+            </w:r>
+            <w:r>
+              <w:rPr>
+                <w:rFonts w:ascii="Consolas" w:hAnsi="Consolas"/>
+                <w:color w:val="334455"/>
+                <w:sz w:val="19"/>
+              </w:rPr>
+              <w:t>0</w:t>
+            </w:r>
+            <w:r>
+              <w:rPr/>
+              <w:t xml:space="preserve"> = unknown). Empty until a report has been published.</w:t>
             </w:r>
           </w:p>
         </w:tc>
@@ -26981,7 +27017,7 @@
           <w:color w:val="223344"/>
           <w:sz w:val="18"/>
         </w:rPr>
-        <w:t>{enabled, date, ts, slot, interval_min, next_slot, final, public, tally, rows, history}</w:t>
+        <w:t>{enabled, date, ts, slot, interval_min, glow_min, next_slot, final, public, tally, rows, history}</w:t>
       </w:r>
     </w:p>
     <w:p>
@@ -27090,6 +27126,46 @@
       <w:r>
         <w:rPr/>
         <w:t>.</w:t>
+      </w:r>
+    </w:p>
+    <w:p>
+      <w:pPr>
+        <w:pStyle w:val="ListBullet"/>
+      </w:pPr>
+      <w:r>
+        <w:rPr>
+          <w:rFonts w:ascii="Consolas" w:hAnsi="Consolas"/>
+          <w:color w:val="334455"/>
+          <w:sz w:val="19"/>
+        </w:rPr>
+        <w:t>glow_min</w:t>
+      </w:r>
+      <w:r>
+        <w:t xml:space="preserve"> is how many minutes the Desk's two header buttons glow after a new</w:t>
+        <w:br/>
+        <w:t xml:space="preserve">  reading or report (</w:t>
+      </w:r>
+      <w:r>
+        <w:rPr>
+          <w:rFonts w:ascii="Consolas" w:hAnsi="Consolas"/>
+          <w:color w:val="334455"/>
+          <w:sz w:val="19"/>
+        </w:rPr>
+        <w:t>config/market_read.toml</w:t>
+      </w:r>
+      <w:r>
+        <w:t xml:space="preserve">); </w:t>
+      </w:r>
+      <w:r>
+        <w:rPr>
+          <w:rFonts w:ascii="Consolas" w:hAnsi="Consolas"/>
+          <w:color w:val="334455"/>
+          <w:sz w:val="19"/>
+        </w:rPr>
+        <w:t>0</w:t>
+      </w:r>
+      <w:r>
+        <w:t xml:space="preserve"> = never.</w:t>
       </w:r>
     </w:p>
     <w:p>

</xml_diff>

<commit_message>
fix(scalp): final review - late flat opens, one run at a time, evening scorecard, frozen rules
- After 09:35 a flat open or a missing opening bar keeps its own note and
  inputs; "missed the call window" only for a morning with a direction.
- One lock around scalp_call.run (and the scorecard republish): the 08:36
  slot and a Refresh never build and fetch side by side.
- The nightly branch republishes the current view with a fresh scorecard
  (only that field; no build, no fetch).
- No call is built before the [slots.scalp] time (a Refresh at 08:35 waits).
- Each call freezes its rules; grading walks it under them (simulate takes
  optional rules, the study's path unchanged), not the evening's config.
- The nightly top-up starts one bar before the store's latest.
- min_samples / walk-forward wording now says what the code does; a blank
  futures or volatility input can be saved in Settings.

Co-Authored-By: Claude Opus 5.5 <noreply@anthropic.com>
</commit_message>
<xml_diff>
--- a/docs/manuals/api-reference/api-reference.docx
+++ b/docs/manuals/api-reference/api-reference.docx
@@ -7198,7 +7198,21 @@
       </w:r>
       <w:r>
         <w:rPr/>
-        <w:t>: bar top-up, study rebuild, grading).</w:t>
+        <w:t>: bar top-up, study rebuild, grading,</w:t>
+        <w:br/>
+        <w:t xml:space="preserve">then the scorecard republished into </w:t>
+      </w:r>
+      <w:r>
+        <w:rPr>
+          <w:rFonts w:ascii="Consolas" w:hAnsi="Consolas"/>
+          <w:color w:val="334455"/>
+          <w:sz w:val="19"/>
+        </w:rPr>
+        <w:t>cache:options:scalp</w:t>
+      </w:r>
+      <w:r>
+        <w:rPr/>
+        <w:t>).</w:t>
       </w:r>
     </w:p>
     <w:p>
@@ -9472,7 +9486,7 @@
             </w:r>
             <w:r>
               <w:rPr/>
-              <w:t xml:space="preserve"> now: before 08:35 CT or on a closed day it republishes the last call under a </w:t>
+              <w:t xml:space="preserve"> now: before the 08:36 CT call time or on a closed day it republishes the last call under a </w:t>
             </w:r>
             <w:r>
               <w:rPr>
@@ -14300,7 +14314,57 @@
         <w:rPr/>
         <w:t>, carrying the last call) by</w:t>
         <w:br/>
-        <w:t>every other run.</w:t>
+        <w:t xml:space="preserve">every other run. After the nightly grading it is republished with only </w:t>
+      </w:r>
+      <w:r>
+        <w:rPr>
+          <w:rFonts w:ascii="Consolas" w:hAnsi="Consolas"/>
+          <w:color w:val="334455"/>
+          <w:sz w:val="19"/>
+        </w:rPr>
+        <w:t>scorecard</w:t>
+      </w:r>
+      <w:r>
+        <w:rPr/>
+        <w:br/>
+        <w:t>replaced (</w:t>
+      </w:r>
+      <w:r>
+        <w:rPr>
+          <w:rFonts w:ascii="Consolas" w:hAnsi="Consolas"/>
+          <w:color w:val="334455"/>
+          <w:sz w:val="19"/>
+        </w:rPr>
+        <w:t>scalp_call.republish_scorecard</w:t>
+      </w:r>
+      <w:r>
+        <w:rPr/>
+        <w:t xml:space="preserve">: no build, no fetch, </w:t>
+      </w:r>
+      <w:r>
+        <w:rPr>
+          <w:rFonts w:ascii="Consolas" w:hAnsi="Consolas"/>
+          <w:color w:val="334455"/>
+          <w:sz w:val="19"/>
+        </w:rPr>
+        <w:t>symbols</w:t>
+      </w:r>
+      <w:r>
+        <w:rPr/>
+        <w:t xml:space="preserve"> unchanged).</w:t>
+        <w:br/>
+      </w:r>
+      <w:r>
+        <w:rPr>
+          <w:rFonts w:ascii="Consolas" w:hAnsi="Consolas"/>
+          <w:color w:val="334455"/>
+          <w:sz w:val="19"/>
+        </w:rPr>
+        <w:t>scalp_call.run</w:t>
+      </w:r>
+      <w:r>
+        <w:rPr/>
+        <w:t xml:space="preserve"> and that republish hold one lock, so two builds never run at once.</w:t>
       </w:r>
     </w:p>
     <w:p>
@@ -14358,7 +14422,21 @@
       </w:r>
       <w:r>
         <w:rPr/>
-        <w:t xml:space="preserve"> (a trading day before 08:35 CT),</w:t>
+        <w:t xml:space="preserve"> (a trading day before the call</w:t>
+        <w:br/>
+        <w:t xml:space="preserve">  time: the later of the 08:35 entry and the </w:t>
+      </w:r>
+      <w:r>
+        <w:rPr>
+          <w:rFonts w:ascii="Consolas" w:hAnsi="Consolas"/>
+          <w:color w:val="334455"/>
+          <w:sz w:val="19"/>
+        </w:rPr>
+        <w:t>[slots.scalp]</w:t>
+      </w:r>
+      <w:r>
+        <w:rPr/>
+        <w:t xml:space="preserve"> time, so 08:36 CT),</w:t>
         <w:br/>
         <w:t xml:space="preserve">  </w:t>
       </w:r>
@@ -15534,7 +15612,69 @@
             </w:r>
             <w:r>
               <w:rPr/>
-              <w:t>), why there are no points, and when the call was made</w:t>
+              <w:t xml:space="preserve">), why there are no points, and when the call was made. </w:t>
+            </w:r>
+            <w:r>
+              <w:rPr>
+                <w:rFonts w:ascii="Consolas" w:hAnsi="Consolas"/>
+                <w:color w:val="334455"/>
+                <w:sz w:val="19"/>
+              </w:rPr>
+              <w:t>missed the call window</w:t>
+            </w:r>
+            <w:r>
+              <w:rPr/>
+              <w:t xml:space="preserve"> is only for a morning that had a direction; after the window a flat open or a missing bar keeps its own note, with its inputs, and no </w:t>
+            </w:r>
+            <w:r>
+              <w:rPr>
+                <w:rFonts w:ascii="Consolas" w:hAnsi="Consolas"/>
+                <w:color w:val="334455"/>
+                <w:sz w:val="19"/>
+              </w:rPr>
+              <w:t>made_at</w:t>
+            </w:r>
+          </w:p>
+        </w:tc>
+      </w:tr>
+      <w:tr>
+        <w:tc>
+          <w:tcPr>
+            <w:tcW w:type="dxa" w:w="4320"/>
+          </w:tcPr>
+          <w:p>
+            <w:r/>
+            <w:r>
+              <w:rPr>
+                <w:rFonts w:ascii="Consolas" w:hAnsi="Consolas"/>
+                <w:color w:val="334455"/>
+                <w:sz w:val="19"/>
+              </w:rPr>
+              <w:t>rules</w:t>
+            </w:r>
+          </w:p>
+        </w:tc>
+        <w:tc>
+          <w:tcPr>
+            <w:tcW w:type="dxa" w:w="4320"/>
+          </w:tcPr>
+          <w:p>
+            <w:r/>
+            <w:r>
+              <w:rPr/>
+              <w:t xml:space="preserve">on a called symbol only (one with roles): </w:t>
+            </w:r>
+            <w:r>
+              <w:rPr>
+                <w:rFonts w:ascii="Consolas" w:hAnsi="Consolas"/>
+                <w:color w:val="334455"/>
+                <w:sz w:val="19"/>
+              </w:rPr>
+              <w:t>{target_pct, stop_pct, time_stop_min, min_premium, iv_scale}</w:t>
+            </w:r>
+            <w:r>
+              <w:rPr/>
+              <w:t xml:space="preserve"> as they were when the call was made. Grading walks the trade under these, never the evening's config</w:t>
             </w:r>
           </w:p>
         </w:tc>

</xml_diff>

<commit_message>
docs(scalp): intraday scorecard shape and small corrections
Co-Authored-By: Claude Opus 5.5 <noreply@anthropic.com>
</commit_message>
<xml_diff>
--- a/docs/manuals/api-reference/api-reference.docx
+++ b/docs/manuals/api-reference/api-reference.docx
@@ -14738,12 +14738,13 @@
           <w:color w:val="334455"/>
           <w:sz w:val="19"/>
         </w:rPr>
-        <w:t>{days, window, symbols: {SYMBOL: {days, edge, caution, roles}}}</w:t>
-      </w:r>
-      <w:r>
-        <w:rPr/>
-        <w:br/>
-        <w:t xml:space="preserve">  from the graded record, or </w:t>
+        <w:t>{days, window, symbols: {SYMBOL: {days, edge, caution, roles}},</w:t>
+        <w:br/>
+        <w:t xml:space="preserve">  intraday}</w:t>
+      </w:r>
+      <w:r>
+        <w:rPr/>
+        <w:t xml:space="preserve"> from the graded record, or </w:t>
       </w:r>
       <w:r>
         <w:rPr>
@@ -14756,6 +14757,223 @@
       <w:r>
         <w:rPr/>
         <w:t xml:space="preserve"> when nothing has been graded. </w:t>
+      </w:r>
+      <w:r>
+        <w:rPr>
+          <w:rFonts w:ascii="Consolas" w:hAnsi="Consolas"/>
+          <w:color w:val="334455"/>
+          <w:sz w:val="19"/>
+        </w:rPr>
+        <w:t>intraday</w:t>
+      </w:r>
+      <w:r>
+        <w:rPr/>
+        <w:br/>
+        <w:t xml:space="preserve">  is present only once 15-minute calls have graded days: </w:t>
+      </w:r>
+      <w:r>
+        <w:rPr>
+          <w:rFonts w:ascii="Consolas" w:hAnsi="Consolas"/>
+          <w:color w:val="334455"/>
+          <w:sz w:val="19"/>
+        </w:rPr>
+        <w:t>{days, window, symbols:</w:t>
+        <w:br/>
+        <w:t xml:space="preserve">  {SYMBOL: {days, blocks: {block: {days, edge, caution, by_word}}}}}</w:t>
+      </w:r>
+      <w:r>
+        <w:rPr/>
+        <w:t xml:space="preserve">. </w:t>
+      </w:r>
+      <w:r>
+        <w:rPr>
+          <w:rFonts w:ascii="Consolas" w:hAnsi="Consolas"/>
+          <w:color w:val="334455"/>
+          <w:sz w:val="19"/>
+        </w:rPr>
+        <w:t>days</w:t>
+      </w:r>
+      <w:r>
+        <w:rPr/>
+        <w:t xml:space="preserve"> is</w:t>
+        <w:br/>
+        <w:t xml:space="preserve">  distinct days throughout (the 08:36 sections count role-days). In a block, </w:t>
+      </w:r>
+      <w:r>
+        <w:rPr>
+          <w:rFonts w:ascii="Consolas" w:hAnsi="Consolas"/>
+          <w:color w:val="334455"/>
+          <w:sz w:val="19"/>
+        </w:rPr>
+        <w:t>edge</w:t>
+      </w:r>
+      <w:r>
+        <w:rPr/>
+        <w:br/>
+        <w:t xml:space="preserve">  and </w:t>
+      </w:r>
+      <w:r>
+        <w:rPr>
+          <w:rFonts w:ascii="Consolas" w:hAnsi="Consolas"/>
+          <w:color w:val="334455"/>
+          <w:sz w:val="19"/>
+        </w:rPr>
+        <w:t>caution</w:t>
+      </w:r>
+      <w:r>
+        <w:rPr/>
+        <w:t xml:space="preserve"> are </w:t>
+      </w:r>
+      <w:r>
+        <w:rPr>
+          <w:rFonts w:ascii="Consolas" w:hAnsi="Consolas"/>
+          <w:color w:val="334455"/>
+          <w:sz w:val="19"/>
+        </w:rPr>
+        <w:t>{days, rows, wins, rate, p_base}</w:t>
+      </w:r>
+      <w:r>
+        <w:rPr/>
+        <w:t xml:space="preserve"> (</w:t>
+      </w:r>
+      <w:r>
+        <w:rPr>
+          <w:rFonts w:ascii="Consolas" w:hAnsi="Consolas"/>
+          <w:color w:val="334455"/>
+          <w:sz w:val="19"/>
+        </w:rPr>
+        <w:t>rows</w:t>
+      </w:r>
+      <w:r>
+        <w:rPr/>
+        <w:t xml:space="preserve"> is slot-roles; </w:t>
+      </w:r>
+      <w:r>
+        <w:rPr>
+          <w:rFonts w:ascii="Consolas" w:hAnsi="Consolas"/>
+          <w:color w:val="334455"/>
+          <w:sz w:val="19"/>
+        </w:rPr>
+        <w:t>rate</w:t>
+      </w:r>
+      <w:r>
+        <w:rPr/>
+        <w:br/>
+        <w:t xml:space="preserve">  and </w:t>
+      </w:r>
+      <w:r>
+        <w:rPr>
+          <w:rFonts w:ascii="Consolas" w:hAnsi="Consolas"/>
+          <w:color w:val="334455"/>
+          <w:sz w:val="19"/>
+        </w:rPr>
+        <w:t>p_base</w:t>
+      </w:r>
+      <w:r>
+        <w:rPr/>
+        <w:t xml:space="preserve"> are </w:t>
+      </w:r>
+      <w:r>
+        <w:rPr>
+          <w:rFonts w:ascii="Consolas" w:hAnsi="Consolas"/>
+          <w:color w:val="334455"/>
+          <w:sz w:val="19"/>
+        </w:rPr>
+        <w:t>null</w:t>
+      </w:r>
+      <w:r>
+        <w:rPr/>
+        <w:t xml:space="preserve"> with none) and </w:t>
+      </w:r>
+      <w:r>
+        <w:rPr>
+          <w:rFonts w:ascii="Consolas" w:hAnsi="Consolas"/>
+          <w:color w:val="334455"/>
+          <w:sz w:val="19"/>
+        </w:rPr>
+        <w:t>by_word</w:t>
+      </w:r>
+      <w:r>
+        <w:rPr/>
+        <w:t xml:space="preserve"> is </w:t>
+      </w:r>
+      <w:r>
+        <w:rPr>
+          <w:rFonts w:ascii="Consolas" w:hAnsi="Consolas"/>
+          <w:color w:val="334455"/>
+          <w:sz w:val="19"/>
+        </w:rPr>
+        <w:t>{Confirms, Mixed, Contradicts}</w:t>
+      </w:r>
+      <w:r>
+        <w:rPr/>
+        <w:t>,</w:t>
+        <w:br/>
+        <w:t xml:space="preserve">  each </w:t>
+      </w:r>
+      <w:r>
+        <w:rPr>
+          <w:rFonts w:ascii="Consolas" w:hAnsi="Consolas"/>
+          <w:color w:val="334455"/>
+          <w:sz w:val="19"/>
+        </w:rPr>
+        <w:t>{days, rows, wins, win_rate}</w:t>
+      </w:r>
+      <w:r>
+        <w:rPr/>
+        <w:t xml:space="preserve"> for the long-with-the-move role. With no 08:36</w:t>
+        <w:br/>
+        <w:t xml:space="preserve">  grades the scorecard can be </w:t>
+      </w:r>
+      <w:r>
+        <w:rPr>
+          <w:rFonts w:ascii="Consolas" w:hAnsi="Consolas"/>
+          <w:color w:val="334455"/>
+          <w:sz w:val="19"/>
+        </w:rPr>
+        <w:t>{"intraday": ...}</w:t>
+      </w:r>
+      <w:r>
+        <w:rPr/>
+        <w:t xml:space="preserve"> alone (no </w:t>
+      </w:r>
+      <w:r>
+        <w:rPr>
+          <w:rFonts w:ascii="Consolas" w:hAnsi="Consolas"/>
+          <w:color w:val="334455"/>
+          <w:sz w:val="19"/>
+        </w:rPr>
+        <w:t>days</w:t>
+      </w:r>
+      <w:r>
+        <w:rPr/>
+        <w:t xml:space="preserve">, </w:t>
+      </w:r>
+      <w:r>
+        <w:rPr>
+          <w:rFonts w:ascii="Consolas" w:hAnsi="Consolas"/>
+          <w:color w:val="334455"/>
+          <w:sz w:val="19"/>
+        </w:rPr>
+        <w:t>window</w:t>
+      </w:r>
+      <w:r>
+        <w:rPr/>
+        <w:t xml:space="preserve"> or</w:t>
+        <w:br/>
+        <w:t xml:space="preserve">  </w:t>
+      </w:r>
+      <w:r>
+        <w:rPr>
+          <w:rFonts w:ascii="Consolas" w:hAnsi="Consolas"/>
+          <w:color w:val="334455"/>
+          <w:sz w:val="19"/>
+        </w:rPr>
+        <w:t>symbols</w:t>
+      </w:r>
+      <w:r>
+        <w:rPr/>
+        <w:t xml:space="preserve"> at the top). On an 08:36 card </w:t>
       </w:r>
       <w:r>
         <w:rPr>
@@ -17130,6 +17348,114 @@
           <w:sz w:val="19"/>
         </w:rPr>
         <w:t>error</w:t>
+      </w:r>
+      <w:r>
+        <w:rPr/>
+        <w:t xml:space="preserve">) for flow, net premium and the dealer read. The </w:t>
+      </w:r>
+      <w:r>
+        <w:rPr>
+          <w:b/>
+        </w:rPr>
+        <w:t>sentiment</w:t>
+      </w:r>
+      <w:r>
+        <w:rPr/>
+        <w:br/>
+        <w:t xml:space="preserve">component differs: its </w:t>
+      </w:r>
+      <w:r>
+        <w:rPr>
+          <w:rFonts w:ascii="Consolas" w:hAnsi="Consolas"/>
+          <w:color w:val="334455"/>
+          <w:sz w:val="19"/>
+        </w:rPr>
+        <w:t>raw.state</w:t>
+      </w:r>
+      <w:r>
+        <w:rPr/>
+        <w:t xml:space="preserve"> is the regime name (</w:t>
+      </w:r>
+      <w:r>
+        <w:rPr>
+          <w:rFonts w:ascii="Consolas" w:hAnsi="Consolas"/>
+          <w:color w:val="334455"/>
+          <w:sz w:val="19"/>
+        </w:rPr>
+        <w:t>bullish</w:t>
+      </w:r>
+      <w:r>
+        <w:rPr/>
+        <w:t xml:space="preserve">, </w:t>
+      </w:r>
+      <w:r>
+        <w:rPr>
+          <w:rFonts w:ascii="Consolas" w:hAnsi="Consolas"/>
+          <w:color w:val="334455"/>
+          <w:sz w:val="19"/>
+        </w:rPr>
+        <w:t>neutral</w:t>
+      </w:r>
+      <w:r>
+        <w:rPr/>
+        <w:t>, ... or</w:t>
+        <w:br/>
+      </w:r>
+      <w:r>
+        <w:rPr>
+          <w:rFonts w:ascii="Consolas" w:hAnsi="Consolas"/>
+          <w:color w:val="334455"/>
+          <w:sz w:val="19"/>
+        </w:rPr>
+        <w:t>null</w:t>
+      </w:r>
+      <w:r>
+        <w:rPr/>
+        <w:t xml:space="preserve">) and its status is in </w:t>
+      </w:r>
+      <w:r>
+        <w:rPr>
+          <w:rFonts w:ascii="Consolas" w:hAnsi="Consolas"/>
+          <w:color w:val="334455"/>
+          <w:sz w:val="19"/>
+        </w:rPr>
+        <w:t>raw.source</w:t>
+      </w:r>
+      <w:r>
+        <w:rPr/>
+        <w:t xml:space="preserve"> (</w:t>
+      </w:r>
+      <w:r>
+        <w:rPr>
+          <w:rFonts w:ascii="Consolas" w:hAnsi="Consolas"/>
+          <w:color w:val="334455"/>
+          <w:sz w:val="19"/>
+        </w:rPr>
+        <w:t>ok</w:t>
+      </w:r>
+      <w:r>
+        <w:rPr/>
+        <w:t xml:space="preserve">, </w:t>
+      </w:r>
+      <w:r>
+        <w:rPr>
+          <w:rFonts w:ascii="Consolas" w:hAnsi="Consolas"/>
+          <w:color w:val="334455"/>
+          <w:sz w:val="19"/>
+        </w:rPr>
+        <w:t>absent</w:t>
+      </w:r>
+      <w:r>
+        <w:rPr/>
+        <w:t xml:space="preserve"> or </w:t>
+      </w:r>
+      <w:r>
+        <w:rPr>
+          <w:rFonts w:ascii="Consolas" w:hAnsi="Consolas"/>
+          <w:color w:val="334455"/>
+          <w:sz w:val="19"/>
+        </w:rPr>
+        <w:t>stale</w:t>
       </w:r>
       <w:r>
         <w:rPr/>

</xml_diff>

<commit_message>
docs(scalp): final review — half days, n of 4 sources, room from the entry spot, made_at, the top-up hole rule
Technical Reference, User Guide, Reference Guide, API Reference (rebuilt),
webgui-routes, page_help and one CHANGELOG line.

Co-Authored-By: Claude Opus 5.5 <noreply@anthropic.com>
</commit_message>
<xml_diff>
--- a/docs/manuals/api-reference/api-reference.docx
+++ b/docs/manuals/api-reference/api-reference.docx
@@ -16434,7 +16434,7 @@
           <w:color w:val="223344"/>
           <w:sz w:val="18"/>
         </w:rPr>
-        <w:t>{day, slot, next_slot, latest, timeline}</w:t>
+        <w:t>{day, slot, next_slot, time_stop_min, latest, timeline}</w:t>
       </w:r>
       <w:r>
         <w:br/>
@@ -16478,7 +16478,7 @@
           <w:color w:val="223344"/>
           <w:sz w:val="18"/>
         </w:rPr>
-        <w:t xml:space="preserve">             first slot after 13:51</w:t>
+        <w:t xml:space="preserve">             first slot after 13:51; on an early close, a slot whose trade would pass</w:t>
       </w:r>
       <w:r>
         <w:br/>
@@ -16489,7 +16489,7 @@
           <w:color w:val="223344"/>
           <w:sz w:val="18"/>
         </w:rPr>
-        <w:t xml:space="preserve">  latest     {symbol: entry}        the slot's call for each symbol</w:t>
+        <w:t xml:space="preserve">             the close is skipped</w:t>
       </w:r>
       <w:r>
         <w:br/>
@@ -16500,7 +16500,7 @@
           <w:color w:val="223344"/>
           <w:sz w:val="18"/>
         </w:rPr>
-        <w:t xml:space="preserve">  timeline   [{slot, symbols: {symbol: {direction, highlight, word,</w:t>
+        <w:t xml:space="preserve">  time_stop_min  the configured time stop: the page ends a slot that made no trade</w:t>
       </w:r>
       <w:r>
         <w:br/>
@@ -16511,7 +16511,7 @@
           <w:color w:val="223344"/>
           <w:sz w:val="18"/>
         </w:rPr>
-        <w:t xml:space="preserve">              edge_p, edge_p_base, n_days, note}}}]   one row per slot published today,</w:t>
+        <w:t xml:space="preserve">             (every symbol flat or short of bars) at its entry plus this (60 when absent)</w:t>
       </w:r>
       <w:r>
         <w:br/>
@@ -16522,6 +16522,39 @@
           <w:color w:val="223344"/>
           <w:sz w:val="18"/>
         </w:rPr>
+        <w:t xml:space="preserve">  latest     {symbol: entry}        the slot's call for each symbol</w:t>
+      </w:r>
+      <w:r>
+        <w:br/>
+      </w:r>
+      <w:r>
+        <w:rPr>
+          <w:rFonts w:ascii="Consolas" w:hAnsi="Consolas"/>
+          <w:color w:val="223344"/>
+          <w:sz w:val="18"/>
+        </w:rPr>
+        <w:t xml:space="preserve">  timeline   [{slot, symbols: {symbol: {direction, highlight, word,</w:t>
+      </w:r>
+      <w:r>
+        <w:br/>
+      </w:r>
+      <w:r>
+        <w:rPr>
+          <w:rFonts w:ascii="Consolas" w:hAnsi="Consolas"/>
+          <w:color w:val="223344"/>
+          <w:sz w:val="18"/>
+        </w:rPr>
+        <w:t xml:space="preserve">              edge_p, edge_p_base, n_days, note}}}]   one row per slot published today,</w:t>
+      </w:r>
+      <w:r>
+        <w:br/>
+      </w:r>
+      <w:r>
+        <w:rPr>
+          <w:rFonts w:ascii="Consolas" w:hAnsi="Consolas"/>
+          <w:color w:val="223344"/>
+          <w:sz w:val="18"/>
+        </w:rPr>
         <w:t xml:space="preserve">              oldest first</w:t>
       </w:r>
     </w:p>
@@ -16922,7 +16955,23 @@
         <w:rPr/>
         <w:t xml:space="preserve"> is the slot floored to</w:t>
         <w:br/>
-        <w:t xml:space="preserve">the 5-minute boundary. Its inputs are </w:t>
+        <w:t xml:space="preserve">the 5-minute boundary. </w:t>
+      </w:r>
+      <w:r>
+        <w:rPr>
+          <w:rFonts w:ascii="Consolas" w:hAnsi="Consolas"/>
+          <w:color w:val="334455"/>
+          <w:sz w:val="19"/>
+        </w:rPr>
+        <w:t>made_at</w:t>
+      </w:r>
+      <w:r>
+        <w:rPr/>
+        <w:t xml:space="preserve"> is the wall clock when the entry was built (the slot's</w:t>
+        <w:br/>
+        <w:t>window is judged by the scheduler's tick, which can be earlier by the wait for the run</w:t>
+        <w:br/>
+        <w:t xml:space="preserve">lock). Its inputs are </w:t>
       </w:r>
       <w:r>
         <w:rPr>
@@ -17127,7 +17176,35 @@
         <w:rPr/>
         <w:t xml:space="preserve"> (the</w:t>
         <w:br/>
-        <w:t xml:space="preserve">slot's trade was already over when it was built) or </w:t>
+        <w:t xml:space="preserve">slot's trade was already over when it was built), </w:t>
+      </w:r>
+      <w:r>
+        <w:rPr>
+          <w:rFonts w:ascii="Consolas" w:hAnsi="Consolas"/>
+          <w:color w:val="334455"/>
+          <w:sz w:val="19"/>
+        </w:rPr>
+        <w:t>the market closes early today</w:t>
+      </w:r>
+      <w:r>
+        <w:rPr/>
+        <w:t xml:space="preserve"> (a</w:t>
+        <w:br/>
+        <w:t xml:space="preserve">half day in </w:t>
+      </w:r>
+      <w:r>
+        <w:rPr>
+          <w:rFonts w:ascii="Consolas" w:hAnsi="Consolas"/>
+          <w:color w:val="334455"/>
+          <w:sz w:val="19"/>
+        </w:rPr>
+        <w:t>[intraday] early_close_days</w:t>
+      </w:r>
+      <w:r>
+        <w:rPr/>
+        <w:t>, and the slot's trade would pass the early</w:t>
+        <w:br/>
+        <w:t xml:space="preserve">close: no roles, nothing fetched or frozen) or </w:t>
       </w:r>
       <w:r>
         <w:rPr>
@@ -17161,9 +17238,9 @@
           <w:color w:val="334455"/>
           <w:sz w:val="19"/>
         </w:rPr>
-        <w:t>{flow, netprem, dealer, sentiment, score, word, dealer_line,</w:t>
-        <w:br/>
-        <w:t>truncated}</w:t>
+        <w:t>{flow, netprem, dealer, sentiment, score, word, n_present,</w:t>
+        <w:br/>
+        <w:t>n_sources, word_note, dealer_line, truncated}</w:t>
       </w:r>
       <w:r>
         <w:rPr/>
@@ -17175,7 +17252,9 @@
           <w:color w:val="334455"/>
           <w:sz w:val="19"/>
         </w:rPr>
-        <w:t>{verdict, raw, stale}</w:t>
+        <w:t>{verdict, raw,</w:t>
+        <w:br/>
+        <w:t>stale}</w:t>
       </w:r>
       <w:r>
         <w:rPr/>
@@ -17215,8 +17294,7 @@
       </w:r>
       <w:r>
         <w:rPr/>
-        <w:br/>
-        <w:t xml:space="preserve">disagrees, </w:t>
+        <w:t xml:space="preserve"> disagrees, </w:t>
       </w:r>
       <w:r>
         <w:rPr>
@@ -17240,7 +17318,8 @@
       </w:r>
       <w:r>
         <w:rPr/>
-        <w:t xml:space="preserve"> no reading; </w:t>
+        <w:br/>
+        <w:t xml:space="preserve">no reading; </w:t>
       </w:r>
       <w:r>
         <w:rPr>
@@ -17252,9 +17331,7 @@
       </w:r>
       <w:r>
         <w:rPr/>
-        <w:t xml:space="preserve"> holds the values it was</w:t>
-        <w:br/>
-        <w:t xml:space="preserve">made from, with a </w:t>
+        <w:t xml:space="preserve"> holds the values it was made from, with a </w:t>
       </w:r>
       <w:r>
         <w:rPr>
@@ -17290,6 +17367,19 @@
       </w:r>
       <w:r>
         <w:rPr/>
+        <w:t>,</w:t>
+        <w:br/>
+      </w:r>
+      <w:r>
+        <w:rPr>
+          <w:rFonts w:ascii="Consolas" w:hAnsi="Consolas"/>
+          <w:color w:val="334455"/>
+          <w:sz w:val="19"/>
+        </w:rPr>
+        <w:t>stale</w:t>
+      </w:r>
+      <w:r>
+        <w:rPr/>
         <w:t xml:space="preserve">, </w:t>
       </w:r>
       <w:r>
@@ -17298,10 +17388,244 @@
           <w:color w:val="334455"/>
           <w:sz w:val="19"/>
         </w:rPr>
+        <w:t>stale_point</w:t>
+      </w:r>
+      <w:r>
+        <w:rPr/>
+        <w:t xml:space="preserve">, </w:t>
+      </w:r>
+      <w:r>
+        <w:rPr>
+          <w:rFonts w:ascii="Consolas" w:hAnsi="Consolas"/>
+          <w:color w:val="334455"/>
+          <w:sz w:val="19"/>
+        </w:rPr>
+        <w:t>no_reading</w:t>
+      </w:r>
+      <w:r>
+        <w:rPr/>
+        <w:t xml:space="preserve">, </w:t>
+      </w:r>
+      <w:r>
+        <w:rPr>
+          <w:rFonts w:ascii="Consolas" w:hAnsi="Consolas"/>
+          <w:color w:val="334455"/>
+          <w:sz w:val="19"/>
+        </w:rPr>
+        <w:t>no_entry_ts</w:t>
+      </w:r>
+      <w:r>
+        <w:rPr/>
+        <w:t xml:space="preserve">, </w:t>
+      </w:r>
+      <w:r>
+        <w:rPr>
+          <w:rFonts w:ascii="Consolas" w:hAnsi="Consolas"/>
+          <w:color w:val="334455"/>
+          <w:sz w:val="19"/>
+        </w:rPr>
+        <w:t>other_day</w:t>
+      </w:r>
+      <w:r>
+        <w:rPr/>
+        <w:t xml:space="preserve">, </w:t>
+      </w:r>
+      <w:r>
+        <w:rPr>
+          <w:rFonts w:ascii="Consolas" w:hAnsi="Consolas"/>
+          <w:color w:val="334455"/>
+          <w:sz w:val="19"/>
+        </w:rPr>
+        <w:t>error</w:t>
+      </w:r>
+      <w:r>
+        <w:rPr/>
+        <w:t>) for flow,</w:t>
+        <w:br/>
+        <w:t xml:space="preserve">net premium and the dealer read (flow is </w:t>
+      </w:r>
+      <w:r>
+        <w:rPr>
+          <w:rFonts w:ascii="Consolas" w:hAnsi="Consolas"/>
+          <w:color w:val="334455"/>
+          <w:sz w:val="19"/>
+        </w:rPr>
+        <w:t>other_day</w:t>
+      </w:r>
+      <w:r>
+        <w:rPr/>
+        <w:t>, and stale, when the flow view's</w:t>
+        <w:br/>
+      </w:r>
+      <w:r>
+        <w:rPr>
+          <w:rFonts w:ascii="Consolas" w:hAnsi="Consolas"/>
+          <w:color w:val="334455"/>
+          <w:sz w:val="19"/>
+        </w:rPr>
+        <w:t>date</w:t>
+      </w:r>
+      <w:r>
+        <w:rPr/>
+        <w:t xml:space="preserve"> is not the slot's day). The </w:t>
+      </w:r>
+      <w:r>
+        <w:rPr>
+          <w:b/>
+        </w:rPr>
+        <w:t>sentiment</w:t>
+      </w:r>
+      <w:r>
+        <w:rPr/>
+        <w:t xml:space="preserve"> component differs: its </w:t>
+      </w:r>
+      <w:r>
+        <w:rPr>
+          <w:rFonts w:ascii="Consolas" w:hAnsi="Consolas"/>
+          <w:color w:val="334455"/>
+          <w:sz w:val="19"/>
+        </w:rPr>
+        <w:t>raw.state</w:t>
+      </w:r>
+      <w:r>
+        <w:rPr/>
+        <w:t xml:space="preserve"> is</w:t>
+        <w:br/>
+        <w:t>the regime name (</w:t>
+      </w:r>
+      <w:r>
+        <w:rPr>
+          <w:rFonts w:ascii="Consolas" w:hAnsi="Consolas"/>
+          <w:color w:val="334455"/>
+          <w:sz w:val="19"/>
+        </w:rPr>
+        <w:t>bullish</w:t>
+      </w:r>
+      <w:r>
+        <w:rPr/>
+        <w:t xml:space="preserve">, </w:t>
+      </w:r>
+      <w:r>
+        <w:rPr>
+          <w:rFonts w:ascii="Consolas" w:hAnsi="Consolas"/>
+          <w:color w:val="334455"/>
+          <w:sz w:val="19"/>
+        </w:rPr>
+        <w:t>neutral</w:t>
+      </w:r>
+      <w:r>
+        <w:rPr/>
+        <w:t xml:space="preserve">, ... or </w:t>
+      </w:r>
+      <w:r>
+        <w:rPr>
+          <w:rFonts w:ascii="Consolas" w:hAnsi="Consolas"/>
+          <w:color w:val="334455"/>
+          <w:sz w:val="19"/>
+        </w:rPr>
+        <w:t>null</w:t>
+      </w:r>
+      <w:r>
+        <w:rPr/>
+        <w:t xml:space="preserve">) and its status is in </w:t>
+      </w:r>
+      <w:r>
+        <w:rPr>
+          <w:rFonts w:ascii="Consolas" w:hAnsi="Consolas"/>
+          <w:color w:val="334455"/>
+          <w:sz w:val="19"/>
+        </w:rPr>
+        <w:t>raw.source</w:t>
+      </w:r>
+      <w:r>
+        <w:rPr/>
+        <w:br/>
+        <w:t>(</w:t>
+      </w:r>
+      <w:r>
+        <w:rPr>
+          <w:rFonts w:ascii="Consolas" w:hAnsi="Consolas"/>
+          <w:color w:val="334455"/>
+          <w:sz w:val="19"/>
+        </w:rPr>
+        <w:t>ok</w:t>
+      </w:r>
+      <w:r>
+        <w:rPr/>
+        <w:t xml:space="preserve">, </w:t>
+      </w:r>
+      <w:r>
+        <w:rPr>
+          <w:rFonts w:ascii="Consolas" w:hAnsi="Consolas"/>
+          <w:color w:val="334455"/>
+          <w:sz w:val="19"/>
+        </w:rPr>
+        <w:t>absent</w:t>
+      </w:r>
+      <w:r>
+        <w:rPr/>
+        <w:t xml:space="preserve"> or </w:t>
+      </w:r>
+      <w:r>
+        <w:rPr>
+          <w:rFonts w:ascii="Consolas" w:hAnsi="Consolas"/>
+          <w:color w:val="334455"/>
+          <w:sz w:val="19"/>
+        </w:rPr>
         <w:t>stale</w:t>
       </w:r>
       <w:r>
         <w:rPr/>
+        <w:t xml:space="preserve">). </w:t>
+      </w:r>
+      <w:r>
+        <w:rPr>
+          <w:rFonts w:ascii="Consolas" w:hAnsi="Consolas"/>
+          <w:color w:val="334455"/>
+          <w:sz w:val="19"/>
+        </w:rPr>
+        <w:t>score</w:t>
+      </w:r>
+      <w:r>
+        <w:rPr/>
+        <w:t xml:space="preserve"> is the weighted mean in -1..1 (</w:t>
+      </w:r>
+      <w:r>
+        <w:rPr>
+          <w:rFonts w:ascii="Consolas" w:hAnsi="Consolas"/>
+          <w:color w:val="334455"/>
+          <w:sz w:val="19"/>
+        </w:rPr>
+        <w:t>ScalpView</w:t>
+      </w:r>
+      <w:r>
+        <w:rPr/>
+        <w:t xml:space="preserve"> rejects</w:t>
+        <w:br/>
+        <w:t xml:space="preserve">one outside it) and </w:t>
+      </w:r>
+      <w:r>
+        <w:rPr>
+          <w:rFonts w:ascii="Consolas" w:hAnsi="Consolas"/>
+          <w:color w:val="334455"/>
+          <w:sz w:val="19"/>
+        </w:rPr>
+        <w:t>word</w:t>
+      </w:r>
+      <w:r>
+        <w:rPr/>
+        <w:t xml:space="preserve"> is </w:t>
+      </w:r>
+      <w:r>
+        <w:rPr>
+          <w:rFonts w:ascii="Consolas" w:hAnsi="Consolas"/>
+          <w:color w:val="334455"/>
+          <w:sz w:val="19"/>
+        </w:rPr>
+        <w:t>Confirms</w:t>
+      </w:r>
+      <w:r>
+        <w:rPr/>
         <w:t xml:space="preserve">, </w:t>
       </w:r>
       <w:r>
@@ -17310,7 +17634,269 @@
           <w:color w:val="334455"/>
           <w:sz w:val="19"/>
         </w:rPr>
-        <w:t>stale_point</w:t>
+        <w:t>Mixed</w:t>
+      </w:r>
+      <w:r>
+        <w:rPr/>
+        <w:t xml:space="preserve"> or </w:t>
+      </w:r>
+      <w:r>
+        <w:rPr>
+          <w:rFonts w:ascii="Consolas" w:hAnsi="Consolas"/>
+          <w:color w:val="334455"/>
+          <w:sz w:val="19"/>
+        </w:rPr>
+        <w:t>Contradicts</w:t>
+      </w:r>
+      <w:r>
+        <w:rPr/>
+        <w:t xml:space="preserve">. </w:t>
+      </w:r>
+      <w:r>
+        <w:rPr>
+          <w:rFonts w:ascii="Consolas" w:hAnsi="Consolas"/>
+          <w:color w:val="334455"/>
+          <w:sz w:val="19"/>
+        </w:rPr>
+        <w:t>n_present</w:t>
+      </w:r>
+      <w:r>
+        <w:rPr/>
+        <w:t xml:space="preserve"> is how</w:t>
+        <w:br/>
+        <w:t xml:space="preserve">many of the </w:t>
+      </w:r>
+      <w:r>
+        <w:rPr>
+          <w:rFonts w:ascii="Consolas" w:hAnsi="Consolas"/>
+          <w:color w:val="334455"/>
+          <w:sz w:val="19"/>
+        </w:rPr>
+        <w:t>n_sources</w:t>
+      </w:r>
+      <w:r>
+        <w:rPr/>
+        <w:t xml:space="preserve"> (4) components gave a reading (a zero weight does not count);</w:t>
+        <w:br/>
+        <w:t xml:space="preserve">with fewer than </w:t>
+      </w:r>
+      <w:r>
+        <w:rPr>
+          <w:rFonts w:ascii="Consolas" w:hAnsi="Consolas"/>
+          <w:color w:val="334455"/>
+          <w:sz w:val="19"/>
+        </w:rPr>
+        <w:t>[confirm] min_sources</w:t>
+      </w:r>
+      <w:r>
+        <w:rPr/>
+        <w:t xml:space="preserve"> (2) </w:t>
+      </w:r>
+      <w:r>
+        <w:rPr>
+          <w:rFonts w:ascii="Consolas" w:hAnsi="Consolas"/>
+          <w:color w:val="334455"/>
+          <w:sz w:val="19"/>
+        </w:rPr>
+        <w:t>score</w:t>
+      </w:r>
+      <w:r>
+        <w:rPr/>
+        <w:t xml:space="preserve"> and </w:t>
+      </w:r>
+      <w:r>
+        <w:rPr>
+          <w:rFonts w:ascii="Consolas" w:hAnsi="Consolas"/>
+          <w:color w:val="334455"/>
+          <w:sz w:val="19"/>
+        </w:rPr>
+        <w:t>word</w:t>
+      </w:r>
+      <w:r>
+        <w:rPr/>
+        <w:t xml:space="preserve"> are </w:t>
+      </w:r>
+      <w:r>
+        <w:rPr>
+          <w:rFonts w:ascii="Consolas" w:hAnsi="Consolas"/>
+          <w:color w:val="334455"/>
+          <w:sz w:val="19"/>
+        </w:rPr>
+        <w:t>null</w:t>
+      </w:r>
+      <w:r>
+        <w:rPr/>
+        <w:t xml:space="preserve"> and</w:t>
+        <w:br/>
+      </w:r>
+      <w:r>
+        <w:rPr>
+          <w:rFonts w:ascii="Consolas" w:hAnsi="Consolas"/>
+          <w:color w:val="334455"/>
+          <w:sz w:val="19"/>
+        </w:rPr>
+        <w:t>word_note</w:t>
+      </w:r>
+      <w:r>
+        <w:rPr/>
+        <w:t xml:space="preserve"> is </w:t>
+      </w:r>
+      <w:r>
+        <w:rPr>
+          <w:rFonts w:ascii="Consolas" w:hAnsi="Consolas"/>
+          <w:color w:val="334455"/>
+          <w:sz w:val="19"/>
+        </w:rPr>
+        <w:t>"too few sources"</w:t>
+      </w:r>
+      <w:r>
+        <w:rPr/>
+        <w:t xml:space="preserve"> (else </w:t>
+      </w:r>
+      <w:r>
+        <w:rPr>
+          <w:rFonts w:ascii="Consolas" w:hAnsi="Consolas"/>
+          <w:color w:val="334455"/>
+          <w:sz w:val="19"/>
+        </w:rPr>
+        <w:t>null</w:t>
+      </w:r>
+      <w:r>
+        <w:rPr/>
+        <w:t xml:space="preserve">). </w:t>
+      </w:r>
+      <w:r>
+        <w:rPr>
+          <w:b/>
+        </w:rPr>
+        <w:t>It is not in the probability</w:t>
+      </w:r>
+      <w:r>
+        <w:rPr/>
+        <w:t xml:space="preserve"> and</w:t>
+        <w:br/>
+        <w:t xml:space="preserve">the page never prints the score. The dealer component's </w:t>
+      </w:r>
+      <w:r>
+        <w:rPr>
+          <w:rFonts w:ascii="Consolas" w:hAnsi="Consolas"/>
+          <w:color w:val="334455"/>
+          <w:sz w:val="19"/>
+        </w:rPr>
+        <w:t>raw</w:t>
+      </w:r>
+      <w:r>
+        <w:rPr/>
+        <w:t xml:space="preserve"> carries the matrix row's</w:t>
+        <w:br/>
+      </w:r>
+      <w:r>
+        <w:rPr>
+          <w:rFonts w:ascii="Consolas" w:hAnsi="Consolas"/>
+          <w:color w:val="334455"/>
+          <w:sz w:val="19"/>
+        </w:rPr>
+        <w:t>spot</w:t>
+      </w:r>
+      <w:r>
+        <w:rPr/>
+        <w:t xml:space="preserve">, walls, </w:t>
+      </w:r>
+      <w:r>
+        <w:rPr>
+          <w:rFonts w:ascii="Consolas" w:hAnsi="Consolas"/>
+          <w:color w:val="334455"/>
+          <w:sz w:val="19"/>
+        </w:rPr>
+        <w:t>flip</w:t>
+      </w:r>
+      <w:r>
+        <w:rPr/>
+        <w:t xml:space="preserve"> and </w:t>
+      </w:r>
+      <w:r>
+        <w:rPr>
+          <w:rFonts w:ascii="Consolas" w:hAnsi="Consolas"/>
+          <w:color w:val="334455"/>
+          <w:sz w:val="19"/>
+        </w:rPr>
+        <w:t>net_gex</w:t>
+      </w:r>
+      <w:r>
+        <w:rPr/>
+        <w:t xml:space="preserve">, then </w:t>
+      </w:r>
+      <w:r>
+        <w:rPr>
+          <w:rFonts w:ascii="Consolas" w:hAnsi="Consolas"/>
+          <w:color w:val="334455"/>
+          <w:sz w:val="19"/>
+        </w:rPr>
+        <w:t>room_spot</w:t>
+      </w:r>
+      <w:r>
+        <w:rPr/>
+        <w:t xml:space="preserve"> (the price the room is measured</w:t>
+        <w:br/>
+        <w:t xml:space="preserve">from) and </w:t>
+      </w:r>
+      <w:r>
+        <w:rPr>
+          <w:rFonts w:ascii="Consolas" w:hAnsi="Consolas"/>
+          <w:color w:val="334455"/>
+          <w:sz w:val="19"/>
+        </w:rPr>
+        <w:t>room_spot_source</w:t>
+      </w:r>
+      <w:r>
+        <w:rPr/>
+        <w:t xml:space="preserve"> (</w:t>
+      </w:r>
+      <w:r>
+        <w:rPr>
+          <w:rFonts w:ascii="Consolas" w:hAnsi="Consolas"/>
+          <w:color w:val="334455"/>
+          <w:sz w:val="19"/>
+        </w:rPr>
+        <w:t>entry</w:t>
+      </w:r>
+      <w:r>
+        <w:rPr/>
+        <w:t xml:space="preserve">: the call's own </w:t>
+      </w:r>
+      <w:r>
+        <w:rPr>
+          <w:rFonts w:ascii="Consolas" w:hAnsi="Consolas"/>
+          <w:color w:val="334455"/>
+          <w:sz w:val="19"/>
+        </w:rPr>
+        <w:t>entry_spot</w:t>
+      </w:r>
+      <w:r>
+        <w:rPr/>
+        <w:t xml:space="preserve">; </w:t>
+      </w:r>
+      <w:r>
+        <w:rPr>
+          <w:rFonts w:ascii="Consolas" w:hAnsi="Consolas"/>
+          <w:color w:val="334455"/>
+          <w:sz w:val="19"/>
+        </w:rPr>
+        <w:t>matrix</w:t>
+      </w:r>
+      <w:r>
+        <w:rPr/>
+        <w:t>: none was</w:t>
+        <w:br/>
+        <w:t xml:space="preserve">given), </w:t>
+      </w:r>
+      <w:r>
+        <w:rPr>
+          <w:rFonts w:ascii="Consolas" w:hAnsi="Consolas"/>
+          <w:color w:val="334455"/>
+          <w:sz w:val="19"/>
+        </w:rPr>
+        <w:t>wall_kind</w:t>
       </w:r>
       <w:r>
         <w:rPr/>
@@ -17322,20 +17908,7 @@
           <w:color w:val="334455"/>
           <w:sz w:val="19"/>
         </w:rPr>
-        <w:t>no_reading</w:t>
-      </w:r>
-      <w:r>
-        <w:rPr/>
-        <w:t>,</w:t>
-        <w:br/>
-      </w:r>
-      <w:r>
-        <w:rPr>
-          <w:rFonts w:ascii="Consolas" w:hAnsi="Consolas"/>
-          <w:color w:val="334455"/>
-          <w:sz w:val="19"/>
-        </w:rPr>
-        <w:t>no_entry_ts</w:t>
+        <w:t>wall</w:t>
       </w:r>
       <w:r>
         <w:rPr/>
@@ -17347,42 +17920,7 @@
           <w:color w:val="334455"/>
           <w:sz w:val="19"/>
         </w:rPr>
-        <w:t>error</w:t>
-      </w:r>
-      <w:r>
-        <w:rPr/>
-        <w:t xml:space="preserve">) for flow, net premium and the dealer read. The </w:t>
-      </w:r>
-      <w:r>
-        <w:rPr>
-          <w:b/>
-        </w:rPr>
-        <w:t>sentiment</w:t>
-      </w:r>
-      <w:r>
-        <w:rPr/>
-        <w:br/>
-        <w:t xml:space="preserve">component differs: its </w:t>
-      </w:r>
-      <w:r>
-        <w:rPr>
-          <w:rFonts w:ascii="Consolas" w:hAnsi="Consolas"/>
-          <w:color w:val="334455"/>
-          <w:sz w:val="19"/>
-        </w:rPr>
-        <w:t>raw.state</w:t>
-      </w:r>
-      <w:r>
-        <w:rPr/>
-        <w:t xml:space="preserve"> is the regime name (</w:t>
-      </w:r>
-      <w:r>
-        <w:rPr>
-          <w:rFonts w:ascii="Consolas" w:hAnsi="Consolas"/>
-          <w:color w:val="334455"/>
-          <w:sz w:val="19"/>
-        </w:rPr>
-        <w:t>bullish</w:t>
+        <w:t>room</w:t>
       </w:r>
       <w:r>
         <w:rPr/>
@@ -17394,44 +17932,7 @@
           <w:color w:val="334455"/>
           <w:sz w:val="19"/>
         </w:rPr>
-        <w:t>neutral</w:t>
-      </w:r>
-      <w:r>
-        <w:rPr/>
-        <w:t>, ... or</w:t>
-        <w:br/>
-      </w:r>
-      <w:r>
-        <w:rPr>
-          <w:rFonts w:ascii="Consolas" w:hAnsi="Consolas"/>
-          <w:color w:val="334455"/>
-          <w:sz w:val="19"/>
-        </w:rPr>
-        <w:t>null</w:t>
-      </w:r>
-      <w:r>
-        <w:rPr/>
-        <w:t xml:space="preserve">) and its status is in </w:t>
-      </w:r>
-      <w:r>
-        <w:rPr>
-          <w:rFonts w:ascii="Consolas" w:hAnsi="Consolas"/>
-          <w:color w:val="334455"/>
-          <w:sz w:val="19"/>
-        </w:rPr>
-        <w:t>raw.source</w:t>
-      </w:r>
-      <w:r>
-        <w:rPr/>
-        <w:t xml:space="preserve"> (</w:t>
-      </w:r>
-      <w:r>
-        <w:rPr>
-          <w:rFonts w:ascii="Consolas" w:hAnsi="Consolas"/>
-          <w:color w:val="334455"/>
-          <w:sz w:val="19"/>
-        </w:rPr>
-        <w:t>ok</w:t>
+        <w:t>room_pct</w:t>
       </w:r>
       <w:r>
         <w:rPr/>
@@ -17443,69 +17944,7 @@
           <w:color w:val="334455"/>
           <w:sz w:val="19"/>
         </w:rPr>
-        <w:t>absent</w:t>
-      </w:r>
-      <w:r>
-        <w:rPr/>
-        <w:t xml:space="preserve"> or </w:t>
-      </w:r>
-      <w:r>
-        <w:rPr>
-          <w:rFonts w:ascii="Consolas" w:hAnsi="Consolas"/>
-          <w:color w:val="334455"/>
-          <w:sz w:val="19"/>
-        </w:rPr>
-        <w:t>stale</w:t>
-      </w:r>
-      <w:r>
-        <w:rPr/>
-        <w:t xml:space="preserve">). </w:t>
-      </w:r>
-      <w:r>
-        <w:rPr>
-          <w:rFonts w:ascii="Consolas" w:hAnsi="Consolas"/>
-          <w:color w:val="334455"/>
-          <w:sz w:val="19"/>
-        </w:rPr>
-        <w:t>score</w:t>
-      </w:r>
-      <w:r>
-        <w:rPr/>
-        <w:t xml:space="preserve"> is the weighted mean in -1..1 (</w:t>
-      </w:r>
-      <w:r>
-        <w:rPr>
-          <w:rFonts w:ascii="Consolas" w:hAnsi="Consolas"/>
-          <w:color w:val="334455"/>
-          <w:sz w:val="19"/>
-        </w:rPr>
-        <w:t>ScalpView</w:t>
-      </w:r>
-      <w:r>
-        <w:rPr/>
-        <w:t xml:space="preserve"> rejects one</w:t>
-        <w:br/>
-        <w:t xml:space="preserve">outside it) and </w:t>
-      </w:r>
-      <w:r>
-        <w:rPr>
-          <w:rFonts w:ascii="Consolas" w:hAnsi="Consolas"/>
-          <w:color w:val="334455"/>
-          <w:sz w:val="19"/>
-        </w:rPr>
-        <w:t>word</w:t>
-      </w:r>
-      <w:r>
-        <w:rPr/>
-        <w:t xml:space="preserve"> is </w:t>
-      </w:r>
-      <w:r>
-        <w:rPr>
-          <w:rFonts w:ascii="Consolas" w:hAnsi="Consolas"/>
-          <w:color w:val="334455"/>
-          <w:sz w:val="19"/>
-        </w:rPr>
-        <w:t>Confirms</w:t>
+        <w:t>win_points</w:t>
       </w:r>
       <w:r>
         <w:rPr/>
@@ -17517,69 +17956,7 @@
           <w:color w:val="334455"/>
           <w:sz w:val="19"/>
         </w:rPr>
-        <w:t>Mixed</w:t>
-      </w:r>
-      <w:r>
-        <w:rPr/>
-        <w:t xml:space="preserve"> or </w:t>
-      </w:r>
-      <w:r>
-        <w:rPr>
-          <w:rFonts w:ascii="Consolas" w:hAnsi="Consolas"/>
-          <w:color w:val="334455"/>
-          <w:sz w:val="19"/>
-        </w:rPr>
-        <w:t>Contradicts</w:t>
-      </w:r>
-      <w:r>
-        <w:rPr/>
-        <w:t xml:space="preserve"> (both </w:t>
-      </w:r>
-      <w:r>
-        <w:rPr>
-          <w:rFonts w:ascii="Consolas" w:hAnsi="Consolas"/>
-          <w:color w:val="334455"/>
-          <w:sz w:val="19"/>
-        </w:rPr>
-        <w:t>null</w:t>
-      </w:r>
-      <w:r>
-        <w:rPr/>
-        <w:t xml:space="preserve"> when no</w:t>
-        <w:br/>
-        <w:t xml:space="preserve">component had a reading). </w:t>
-      </w:r>
-      <w:r>
-        <w:rPr>
-          <w:b/>
-        </w:rPr>
-        <w:t>It is not in the probability</w:t>
-      </w:r>
-      <w:r>
-        <w:rPr/>
-        <w:t xml:space="preserve"> and the page never prints the</w:t>
-        <w:br/>
-        <w:t xml:space="preserve">score. The dealer component's </w:t>
-      </w:r>
-      <w:r>
-        <w:rPr>
-          <w:rFonts w:ascii="Consolas" w:hAnsi="Consolas"/>
-          <w:color w:val="334455"/>
-          <w:sz w:val="19"/>
-        </w:rPr>
-        <w:t>raw</w:t>
-      </w:r>
-      <w:r>
-        <w:rPr/>
-        <w:t xml:space="preserve"> carries </w:t>
-      </w:r>
-      <w:r>
-        <w:rPr>
-          <w:rFonts w:ascii="Consolas" w:hAnsi="Consolas"/>
-          <w:color w:val="334455"/>
-          <w:sz w:val="19"/>
-        </w:rPr>
-        <w:t>wall_kind</w:t>
+        <w:t>own_verdict</w:t>
       </w:r>
       <w:r>
         <w:rPr/>
@@ -17591,60 +17968,13 @@
           <w:color w:val="334455"/>
           <w:sz w:val="19"/>
         </w:rPr>
-        <w:t>wall</w:t>
-      </w:r>
-      <w:r>
-        <w:rPr/>
-        <w:t xml:space="preserve">, </w:t>
-      </w:r>
-      <w:r>
-        <w:rPr>
-          <w:rFonts w:ascii="Consolas" w:hAnsi="Consolas"/>
-          <w:color w:val="334455"/>
-          <w:sz w:val="19"/>
-        </w:rPr>
-        <w:t>room</w:t>
-      </w:r>
-      <w:r>
-        <w:rPr/>
-        <w:t xml:space="preserve">, </w:t>
-      </w:r>
-      <w:r>
-        <w:rPr>
-          <w:rFonts w:ascii="Consolas" w:hAnsi="Consolas"/>
-          <w:color w:val="334455"/>
-          <w:sz w:val="19"/>
-        </w:rPr>
-        <w:t>room_pct</w:t>
-      </w:r>
-      <w:r>
-        <w:rPr/>
-        <w:t>,</w:t>
-        <w:br/>
-      </w:r>
-      <w:r>
-        <w:rPr>
-          <w:rFonts w:ascii="Consolas" w:hAnsi="Consolas"/>
-          <w:color w:val="334455"/>
-          <w:sz w:val="19"/>
-        </w:rPr>
-        <w:t>win_points</w:t>
-      </w:r>
-      <w:r>
-        <w:rPr/>
-        <w:t xml:space="preserve">, </w:t>
-      </w:r>
-      <w:r>
-        <w:rPr>
-          <w:rFonts w:ascii="Consolas" w:hAnsi="Consolas"/>
-          <w:color w:val="334455"/>
-          <w:sz w:val="19"/>
-        </w:rPr>
-        <w:t>breadth {with_room, of, share, verdict}</w:t>
-      </w:r>
-      <w:r>
-        <w:rPr/>
-        <w:t xml:space="preserve">, </w:t>
+        <w:t>breadth</w:t>
+        <w:br/>
+        <w:t>{with_room, of, share, verdict}</w:t>
+      </w:r>
+      <w:r>
+        <w:rPr/>
+        <w:t xml:space="preserve"> (the big ten at their own matrix spots), </w:t>
       </w:r>
       <w:r>
         <w:rPr>
@@ -17656,8 +17986,8 @@
       </w:r>
       <w:r>
         <w:rPr/>
-        <w:t xml:space="preserve"> and</w:t>
-        <w:br/>
+        <w:br/>
+        <w:t xml:space="preserve">and </w:t>
       </w:r>
       <w:r>
         <w:rPr>
@@ -18002,7 +18332,19 @@
             </w:r>
             <w:r>
               <w:rPr/>
-              <w:t xml:space="preserve"> (backfill and the nightly top-up)</w:t>
+              <w:t xml:space="preserve"> (backfill, the nightly top-up, and each 15-minute slot's </w:t>
+            </w:r>
+            <w:r>
+              <w:rPr>
+                <w:rFonts w:ascii="Consolas" w:hAnsi="Consolas"/>
+                <w:color w:val="334455"/>
+                <w:sz w:val="19"/>
+              </w:rPr>
+              <w:t>top_up_today</w:t>
+            </w:r>
+            <w:r>
+              <w:rPr/>
+              <w:t>, which starts one bar before the latest stored bar when that is from an earlier day, so no hole is ever skipped)</w:t>
             </w:r>
           </w:p>
         </w:tc>
@@ -18854,7 +19196,43 @@
             </w:r>
             <w:r>
               <w:rPr/>
-              <w:t xml:space="preserve"> of walls, flip, net GEX, net premium levels, sentiment and flow counts for the symbol and the big ten). Written for every slot </w:t>
+              <w:t xml:space="preserve"> of each source's </w:t>
+            </w:r>
+            <w:r>
+              <w:rPr>
+                <w:rFonts w:ascii="Consolas" w:hAnsi="Consolas"/>
+                <w:color w:val="334455"/>
+                <w:sz w:val="19"/>
+              </w:rPr>
+              <w:t>{state, age_min}</w:t>
+            </w:r>
+            <w:r>
+              <w:rPr/>
+              <w:t xml:space="preserve"> and of walls, flip, net GEX, net premium levels, sentiment (with its </w:t>
+            </w:r>
+            <w:r>
+              <w:rPr>
+                <w:rFonts w:ascii="Consolas" w:hAnsi="Consolas"/>
+                <w:color w:val="334455"/>
+                <w:sz w:val="19"/>
+              </w:rPr>
+              <w:t>age_min</w:t>
+            </w:r>
+            <w:r>
+              <w:rPr/>
+              <w:t xml:space="preserve">) and flow counts for the symbol and the big ten; a flow list of another day is recorded as </w:t>
+            </w:r>
+            <w:r>
+              <w:rPr>
+                <w:rFonts w:ascii="Consolas" w:hAnsi="Consolas"/>
+                <w:color w:val="334455"/>
+                <w:sz w:val="19"/>
+              </w:rPr>
+              <w:t>{date, state: "other_day"}</w:t>
+            </w:r>
+            <w:r>
+              <w:rPr/>
+              <w:t xml:space="preserve"> with no counts). Written for every slot </w:t>
             </w:r>
             <w:r>
               <w:rPr>

</xml_diff>

<commit_message>
docs: trade ideas in the Ledger and the weekly review
Manuals (User, Reference, Technical, API), page_help, the routes doc, the
config-files reference, the CHANGELOG and one CLAUDE.md invariant now describe
the trade-idea rows, their 5-minute marks, the /eod third book and the weekly
review as built. Rebuilt the manuals.

Fixes found in review: the Paper Ledger guide no longer says idea rows are held
to "the risk limits below" (the bullet is above) and restores the "New trades
must fit" lead that test_ledger_limits_documented locates; "every idea is booked"
now says it holds while [idea_trades] enabled is on; /eod's TRADE_IDEAS_NOTE no
longer claims open trades are absent from columns that count them by entry date.

Co-Authored-By: Claude Sonnet 5.5 <noreply@anthropic.com>
</commit_message>
<xml_diff>
--- a/docs/manuals/api-reference/api-reference.docx
+++ b/docs/manuals/api-reference/api-reference.docx
@@ -9028,6 +9028,70 @@
               </w:rPr>
               <w:t>{trade_id, debit}</w:t>
             </w:r>
+            <w:r>
+              <w:rPr/>
+              <w:t xml:space="preserve"> — on a trade-idea row (</w:t>
+            </w:r>
+            <w:r>
+              <w:rPr>
+                <w:rFonts w:ascii="Consolas" w:hAnsi="Consolas"/>
+                <w:color w:val="334455"/>
+                <w:sz w:val="19"/>
+              </w:rPr>
+              <w:t>source == "trade_idea"</w:t>
+            </w:r>
+            <w:r>
+              <w:rPr/>
+              <w:t xml:space="preserve">) the close is booked by </w:t>
+            </w:r>
+            <w:r>
+              <w:rPr>
+                <w:rFonts w:ascii="Consolas" w:hAnsi="Consolas"/>
+                <w:color w:val="334455"/>
+                <w:sz w:val="19"/>
+              </w:rPr>
+              <w:t>idea_ledger.manual_close</w:t>
+            </w:r>
+            <w:r>
+              <w:rPr/>
+              <w:t xml:space="preserve">, exit reason </w:t>
+            </w:r>
+            <w:r>
+              <w:rPr>
+                <w:rFonts w:ascii="Consolas" w:hAnsi="Consolas"/>
+                <w:color w:val="334455"/>
+                <w:sz w:val="19"/>
+              </w:rPr>
+              <w:t>MANUAL</w:t>
+            </w:r>
+            <w:r>
+              <w:rPr/>
+              <w:t xml:space="preserve">, and the typed </w:t>
+            </w:r>
+            <w:r>
+              <w:rPr>
+                <w:rFonts w:ascii="Consolas" w:hAnsi="Consolas"/>
+                <w:color w:val="334455"/>
+                <w:sz w:val="19"/>
+              </w:rPr>
+              <w:t>debit</w:t>
+            </w:r>
+            <w:r>
+              <w:rPr/>
+              <w:t xml:space="preserve"> is the stored </w:t>
+            </w:r>
+            <w:r>
+              <w:rPr>
+                <w:rFonts w:ascii="Consolas" w:hAnsi="Consolas"/>
+                <w:color w:val="334455"/>
+                <w:sz w:val="19"/>
+              </w:rPr>
+              <w:t>exit_debit</w:t>
+            </w:r>
+            <w:r>
+              <w:rPr/>
+              <w:t xml:space="preserve"> (the Ledger's convention: paid for a credit row, received for a debit row)</w:t>
+            </w:r>
           </w:p>
         </w:tc>
         <w:tc>
@@ -9125,7 +9189,29 @@
             <w:r/>
             <w:r>
               <w:rPr/>
-              <w:t>—</w:t>
+              <w:t xml:space="preserve">— (deletes every CLOSED / EXPIRED row </w:t>
+            </w:r>
+            <w:r>
+              <w:rPr>
+                <w:b/>
+              </w:rPr>
+              <w:t>except trade-idea rows</w:t>
+            </w:r>
+            <w:r>
+              <w:rPr/>
+              <w:t xml:space="preserve">, which are the weekly review's evidence; </w:t>
+            </w:r>
+            <w:r>
+              <w:rPr>
+                <w:rFonts w:ascii="Consolas" w:hAnsi="Consolas"/>
+                <w:color w:val="334455"/>
+                <w:sz w:val="19"/>
+              </w:rPr>
+              <w:t>paper_delete</w:t>
+            </w:r>
+            <w:r>
+              <w:rPr/>
+              <w:t xml:space="preserve"> of a single idea row still removes it)</w:t>
             </w:r>
           </w:p>
         </w:tc>
@@ -14279,7 +14365,469 @@
       </w:r>
       <w:r>
         <w:rPr/>
-        <w:t>), never a raise. No TTL.</w:t>
+        <w:t xml:space="preserve">), never a raise. No TTL. </w:t>
+      </w:r>
+      <w:r>
+        <w:rPr>
+          <w:b/>
+        </w:rPr>
+        <w:t>Trade-idea rows are not in it</w:t>
+      </w:r>
+      <w:r>
+        <w:rPr/>
+        <w:t>: they</w:t>
+        <w:br/>
+        <w:t xml:space="preserve">are left out of </w:t>
+      </w:r>
+      <w:r>
+        <w:rPr>
+          <w:rFonts w:ascii="Consolas" w:hAnsi="Consolas"/>
+          <w:color w:val="334455"/>
+          <w:sz w:val="19"/>
+        </w:rPr>
+        <w:t>open</w:t>
+      </w:r>
+      <w:r>
+        <w:rPr/>
+        <w:t xml:space="preserve"> and out of </w:t>
+      </w:r>
+      <w:r>
+        <w:rPr>
+          <w:rFonts w:ascii="Consolas" w:hAnsi="Consolas"/>
+          <w:color w:val="334455"/>
+          <w:sz w:val="19"/>
+        </w:rPr>
+        <w:t>realized_pnl</w:t>
+      </w:r>
+      <w:r>
+        <w:rPr/>
+        <w:t xml:space="preserve"> (so out of </w:t>
+      </w:r>
+      <w:r>
+        <w:rPr>
+          <w:rFonts w:ascii="Consolas" w:hAnsi="Consolas"/>
+          <w:color w:val="334455"/>
+          <w:sz w:val="19"/>
+        </w:rPr>
+        <w:t>equity</w:t>
+      </w:r>
+      <w:r>
+        <w:rPr/>
+        <w:t>), because they</w:t>
+        <w:br/>
+        <w:t>are not held to the caps.</w:t>
+      </w:r>
+    </w:p>
+    <w:p>
+      <w:r>
+        <w:rPr>
+          <w:b/>
+        </w:rPr>
+        <w:t xml:space="preserve">Trade-idea rows on </w:t>
+      </w:r>
+      <w:r>
+        <w:rPr>
+          <w:rFonts w:ascii="Consolas" w:hAnsi="Consolas"/>
+          <w:color w:val="334455"/>
+          <w:sz w:val="19"/>
+        </w:rPr>
+        <w:t>cache:options:paper_trades</w:t>
+      </w:r>
+      <w:r>
+        <w:rPr>
+          <w:b/>
+        </w:rPr>
+        <w:t>.</w:t>
+      </w:r>
+      <w:r>
+        <w:rPr/>
+        <w:t xml:space="preserve"> The hourly trade idea</w:t>
+        <w:br/>
+        <w:t>(</w:t>
+      </w:r>
+      <w:r>
+        <w:rPr>
+          <w:rFonts w:ascii="Consolas" w:hAnsi="Consolas"/>
+          <w:color w:val="334455"/>
+          <w:sz w:val="19"/>
+        </w:rPr>
+        <w:t>handlers.run_trade_idea</w:t>
+      </w:r>
+      <w:r>
+        <w:rPr/>
+        <w:t xml:space="preserve">) books each posted idea as an ordinary row of </w:t>
+      </w:r>
+      <w:r>
+        <w:rPr>
+          <w:rFonts w:ascii="Consolas" w:hAnsi="Consolas"/>
+          <w:color w:val="334455"/>
+          <w:sz w:val="19"/>
+        </w:rPr>
+        <w:t>trades.db</w:t>
+      </w:r>
+      <w:r>
+        <w:rPr/>
+        <w:br/>
+        <w:t xml:space="preserve">with </w:t>
+      </w:r>
+      <w:r>
+        <w:rPr>
+          <w:rFonts w:ascii="Consolas" w:hAnsi="Consolas"/>
+          <w:color w:val="334455"/>
+          <w:sz w:val="19"/>
+        </w:rPr>
+        <w:t>source = "trade_idea"</w:t>
+      </w:r>
+      <w:r>
+        <w:rPr/>
+        <w:t xml:space="preserve"> (the only marker; </w:t>
+      </w:r>
+      <w:r>
+        <w:rPr>
+          <w:rFonts w:ascii="Consolas" w:hAnsi="Consolas"/>
+          <w:color w:val="334455"/>
+          <w:sz w:val="19"/>
+        </w:rPr>
+        <w:t>notes</w:t>
+      </w:r>
+      <w:r>
+        <w:rPr/>
+        <w:t xml:space="preserve"> reads "Trade idea") through</w:t>
+        <w:br/>
+      </w:r>
+      <w:r>
+        <w:rPr>
+          <w:rFonts w:ascii="Consolas" w:hAnsi="Consolas"/>
+          <w:color w:val="334455"/>
+          <w:sz w:val="19"/>
+        </w:rPr>
+        <w:t>idea_ledger.book</w:t>
+      </w:r>
+      <w:r>
+        <w:rPr/>
+        <w:t>, which evaluates no cap. Beyond the Ledger's usual fields it carries</w:t>
+        <w:br/>
+      </w:r>
+      <w:r>
+        <w:rPr>
+          <w:rFonts w:ascii="Consolas" w:hAnsi="Consolas"/>
+          <w:color w:val="334455"/>
+          <w:sz w:val="19"/>
+        </w:rPr>
+        <w:t>idea_id</w:t>
+      </w:r>
+      <w:r>
+        <w:rPr/>
+        <w:t xml:space="preserve">, </w:t>
+      </w:r>
+      <w:r>
+        <w:rPr>
+          <w:rFonts w:ascii="Consolas" w:hAnsi="Consolas"/>
+          <w:color w:val="334455"/>
+          <w:sz w:val="19"/>
+        </w:rPr>
+        <w:t>idea_posted</w:t>
+      </w:r>
+      <w:r>
+        <w:rPr/>
+        <w:t xml:space="preserve">, </w:t>
+      </w:r>
+      <w:r>
+        <w:rPr>
+          <w:rFonts w:ascii="Consolas" w:hAnsi="Consolas"/>
+          <w:color w:val="334455"/>
+          <w:sz w:val="19"/>
+        </w:rPr>
+        <w:t>idea_grade</w:t>
+      </w:r>
+      <w:r>
+        <w:rPr/>
+        <w:t xml:space="preserve">, </w:t>
+      </w:r>
+      <w:r>
+        <w:rPr>
+          <w:rFonts w:ascii="Consolas" w:hAnsi="Consolas"/>
+          <w:color w:val="334455"/>
+          <w:sz w:val="19"/>
+        </w:rPr>
+        <w:t>idea_score</w:t>
+      </w:r>
+      <w:r>
+        <w:rPr/>
+        <w:t xml:space="preserve">, </w:t>
+      </w:r>
+      <w:r>
+        <w:rPr>
+          <w:rFonts w:ascii="Consolas" w:hAnsi="Consolas"/>
+          <w:color w:val="334455"/>
+          <w:sz w:val="19"/>
+        </w:rPr>
+        <w:t>idea_label</w:t>
+      </w:r>
+      <w:r>
+        <w:rPr/>
+        <w:t xml:space="preserve">, </w:t>
+      </w:r>
+      <w:r>
+        <w:rPr>
+          <w:rFonts w:ascii="Consolas" w:hAnsi="Consolas"/>
+          <w:color w:val="334455"/>
+          <w:sz w:val="19"/>
+        </w:rPr>
+        <w:t>target_pnl</w:t>
+      </w:r>
+      <w:r>
+        <w:rPr/>
+        <w:t xml:space="preserve"> and</w:t>
+        <w:br/>
+      </w:r>
+      <w:r>
+        <w:rPr>
+          <w:rFonts w:ascii="Consolas" w:hAnsi="Consolas"/>
+          <w:color w:val="334455"/>
+          <w:sz w:val="19"/>
+        </w:rPr>
+        <w:t>stop_pnl</w:t>
+      </w:r>
+      <w:r>
+        <w:rPr/>
+        <w:t xml:space="preserve"> (dollars per contract, positive), </w:t>
+      </w:r>
+      <w:r>
+        <w:rPr>
+          <w:rFonts w:ascii="Consolas" w:hAnsi="Consolas"/>
+          <w:color w:val="334455"/>
+          <w:sz w:val="19"/>
+        </w:rPr>
+        <w:t>last_mark_pnl</w:t>
+      </w:r>
+      <w:r>
+        <w:rPr/>
+        <w:t xml:space="preserve"> / </w:t>
+      </w:r>
+      <w:r>
+        <w:rPr>
+          <w:rFonts w:ascii="Consolas" w:hAnsi="Consolas"/>
+          <w:color w:val="334455"/>
+          <w:sz w:val="19"/>
+        </w:rPr>
+        <w:t>last_mark_at</w:t>
+      </w:r>
+      <w:r>
+        <w:rPr/>
+        <w:t xml:space="preserve"> (the latest</w:t>
+        <w:br/>
+        <w:t xml:space="preserve">5-minute mark, per contract), </w:t>
+      </w:r>
+      <w:r>
+        <w:rPr>
+          <w:rFonts w:ascii="Consolas" w:hAnsi="Consolas"/>
+          <w:color w:val="334455"/>
+          <w:sz w:val="19"/>
+        </w:rPr>
+        <w:t>mae_pnl</w:t>
+      </w:r>
+      <w:r>
+        <w:rPr/>
+        <w:t xml:space="preserve"> / </w:t>
+      </w:r>
+      <w:r>
+        <w:rPr>
+          <w:rFonts w:ascii="Consolas" w:hAnsi="Consolas"/>
+          <w:color w:val="334455"/>
+          <w:sz w:val="19"/>
+        </w:rPr>
+        <w:t>mae_at</w:t>
+      </w:r>
+      <w:r>
+        <w:rPr/>
+        <w:t xml:space="preserve"> (the worst point, per contract, </w:t>
+      </w:r>
+      <w:r>
+        <w:rPr>
+          <w:rFonts w:ascii="Consolas" w:hAnsi="Consolas"/>
+          <w:color w:val="334455"/>
+          <w:sz w:val="19"/>
+        </w:rPr>
+        <w:t>0.0</w:t>
+      </w:r>
+      <w:r>
+        <w:rPr/>
+        <w:br/>
+        <w:t xml:space="preserve">until a mark goes negative), </w:t>
+      </w:r>
+      <w:r>
+        <w:rPr>
+          <w:rFonts w:ascii="Consolas" w:hAnsi="Consolas"/>
+          <w:color w:val="334455"/>
+          <w:sz w:val="19"/>
+        </w:rPr>
+        <w:t>exit_time</w:t>
+      </w:r>
+      <w:r>
+        <w:rPr/>
+        <w:t xml:space="preserve"> and </w:t>
+      </w:r>
+      <w:r>
+        <w:rPr>
+          <w:rFonts w:ascii="Consolas" w:hAnsi="Consolas"/>
+          <w:color w:val="334455"/>
+          <w:sz w:val="19"/>
+        </w:rPr>
+        <w:t>exit_reason</w:t>
+      </w:r>
+      <w:r>
+        <w:rPr/>
+        <w:t xml:space="preserve"> (</w:t>
+      </w:r>
+      <w:r>
+        <w:rPr>
+          <w:rFonts w:ascii="Consolas" w:hAnsi="Consolas"/>
+          <w:color w:val="334455"/>
+          <w:sz w:val="19"/>
+        </w:rPr>
+        <w:t>TARGET</w:t>
+      </w:r>
+      <w:r>
+        <w:rPr/>
+        <w:t xml:space="preserve"> · </w:t>
+      </w:r>
+      <w:r>
+        <w:rPr>
+          <w:rFonts w:ascii="Consolas" w:hAnsi="Consolas"/>
+          <w:color w:val="334455"/>
+          <w:sz w:val="19"/>
+        </w:rPr>
+        <w:t>STOP</w:t>
+      </w:r>
+      <w:r>
+        <w:rPr/>
+        <w:t xml:space="preserve"> · </w:t>
+      </w:r>
+      <w:r>
+        <w:rPr>
+          <w:rFonts w:ascii="Consolas" w:hAnsi="Consolas"/>
+          <w:color w:val="334455"/>
+          <w:sz w:val="19"/>
+        </w:rPr>
+        <w:t>EXPIRED</w:t>
+      </w:r>
+      <w:r>
+        <w:rPr/>
+        <w:t xml:space="preserve"> ·</w:t>
+        <w:br/>
+      </w:r>
+      <w:r>
+        <w:rPr>
+          <w:rFonts w:ascii="Consolas" w:hAnsi="Consolas"/>
+          <w:color w:val="334455"/>
+          <w:sz w:val="19"/>
+        </w:rPr>
+        <w:t>MANUAL</w:t>
+      </w:r>
+      <w:r>
+        <w:rPr/>
+        <w:t xml:space="preserve">), </w:t>
+      </w:r>
+      <w:r>
+        <w:rPr>
+          <w:rFonts w:ascii="Consolas" w:hAnsi="Consolas"/>
+          <w:color w:val="334455"/>
+          <w:sz w:val="19"/>
+        </w:rPr>
+        <w:t>exit_debit</w:t>
+      </w:r>
+      <w:r>
+        <w:rPr/>
+        <w:t xml:space="preserve"> and </w:t>
+      </w:r>
+      <w:r>
+        <w:rPr>
+          <w:rFonts w:ascii="Consolas" w:hAnsi="Consolas"/>
+          <w:color w:val="334455"/>
+          <w:sz w:val="19"/>
+        </w:rPr>
+        <w:t>exit_debit_total</w:t>
+      </w:r>
+      <w:r>
+        <w:rPr/>
+        <w:t xml:space="preserve">. An OPEN idea row's </w:t>
+      </w:r>
+      <w:r>
+        <w:rPr>
+          <w:rFonts w:ascii="Consolas" w:hAnsi="Consolas"/>
+          <w:color w:val="334455"/>
+          <w:sz w:val="19"/>
+        </w:rPr>
+        <w:t>unrealized_pnl</w:t>
+      </w:r>
+      <w:r>
+        <w:rPr/>
+        <w:t xml:space="preserve"> is</w:t>
+        <w:br/>
+      </w:r>
+      <w:r>
+        <w:rPr>
+          <w:rFonts w:ascii="Consolas" w:hAnsi="Consolas"/>
+          <w:color w:val="334455"/>
+          <w:sz w:val="19"/>
+        </w:rPr>
+        <w:t>last_mark_pnl x quantity</w:t>
+      </w:r>
+      <w:r>
+        <w:rPr/>
+        <w:t xml:space="preserve"> at any hour. The 5-minute cycle (</w:t>
+      </w:r>
+      <w:r>
+        <w:rPr>
+          <w:rFonts w:ascii="Consolas" w:hAnsi="Consolas"/>
+          <w:color w:val="334455"/>
+          <w:sz w:val="19"/>
+        </w:rPr>
+        <w:t>scheduler.idea_marks_due</w:t>
+      </w:r>
+      <w:r>
+        <w:rPr/>
+        <w:t xml:space="preserve"> →</w:t>
+        <w:br/>
+      </w:r>
+      <w:r>
+        <w:rPr>
+          <w:rFonts w:ascii="Consolas" w:hAnsi="Consolas"/>
+          <w:color w:val="334455"/>
+          <w:sz w:val="19"/>
+        </w:rPr>
+        <w:t>handlers.run_idea_marks_and_publish</w:t>
+      </w:r>
+      <w:r>
+        <w:rPr/>
+        <w:t xml:space="preserve">, gated by </w:t>
+      </w:r>
+      <w:r>
+        <w:rPr>
+          <w:rFonts w:ascii="Consolas" w:hAnsi="Consolas"/>
+          <w:color w:val="334455"/>
+          <w:sz w:val="19"/>
+        </w:rPr>
+        <w:t>[idea_trades] mark_interval_min</w:t>
+      </w:r>
+      <w:r>
+        <w:rPr/>
+        <w:t>)</w:t>
+        <w:br/>
+        <w:t xml:space="preserve">republishes the view without a chain reprice, and a mark appends no </w:t>
+      </w:r>
+      <w:r>
+        <w:rPr>
+          <w:rFonts w:ascii="Consolas" w:hAnsi="Consolas"/>
+          <w:color w:val="334455"/>
+          <w:sz w:val="19"/>
+        </w:rPr>
+        <w:t>trade_events</w:t>
+      </w:r>
+      <w:r>
+        <w:rPr/>
+        <w:t xml:space="preserve"> row.</w:t>
       </w:r>
     </w:p>
     <w:p>

</xml_diff>

<commit_message>
docs: trade-idea final fixes in the manuals, config reference and changelog
The 2026-10-20 CHANGELOG entry is corrected in place: no review_max_tokens,
the per-suggestion number check and what it does not prove, exit 2 for a
view with no rows, a hand close lowering the worst point, the quiet minutes
derived from the scan offset, the /eod Paper Trades table and tile and the
dossier leaving idea rows out, and the whole-word idea tables; the two
deferred items now done are removed. The four manuals (rebuilt),
config-files.md and webgui-routes.md say the same.

Co-Authored-By: Claude Opus 5.5 <noreply@anthropic.com>
</commit_message>
<xml_diff>
--- a/docs/manuals/api-reference/api-reference.docx
+++ b/docs/manuals/api-reference/api-reference.docx
@@ -32,7 +32,7 @@
           <w:color w:val="5B6678"/>
           <w:sz w:val="18"/>
         </w:rPr>
-        <w:t>NeuralStrike · Generated 2026-10-20</w:t>
+        <w:t>NeuralStrike · Generated 2026-10-21</w:t>
       </w:r>
     </w:p>
     <w:p/>
@@ -14654,7 +14654,7 @@
       <w:r>
         <w:rPr/>
         <w:br/>
-        <w:t xml:space="preserve">until a mark goes negative), </w:t>
+        <w:t xml:space="preserve">until a mark goes negative; a settlement or a hand close lowers it too), </w:t>
       </w:r>
       <w:r>
         <w:rPr>
@@ -14666,7 +14666,8 @@
       </w:r>
       <w:r>
         <w:rPr/>
-        <w:t xml:space="preserve"> and </w:t>
+        <w:t xml:space="preserve"> and</w:t>
+        <w:br/>
       </w:r>
       <w:r>
         <w:rPr>

</xml_diff>